<commit_message>
Paper on the full held-out sets: non-inferiority framing, NN-PPI-cascade ablation, CB threshold caveat
- Table/figure/text read from final_results_full.json and streaming_results_full.json
- Headline: at 50% calls no significant difference from the stronger full-call setting,
  significantly above Sonnet+NN-PPI; fused > NN-PPI-decided cascade on the same queries
- Dossier: NN-PPI ClaimBuster test size (p.5), CLEF split counts; removed the cut [2] claim
- verify_paper_numbers.py checks the new numbers and the direction of every significance claim

Co-Authored-By: Claude Opus 5.5 <noreply@anthropic.com>
</commit_message>
<xml_diff>
--- a/paper/cascade_kics_draft.docx
+++ b/paper/cascade_kics_draft.docx
@@ -172,7 +172,7 @@
           <w:i w:val="0"/>
           <w:sz w:val="18"/>
         </w:rPr>
-        <w:t>팩트체크 필요성 탐지(check-worthiness detection)는 유입되는 모든 문장에 적용되므로, 대형 언어 모델(LLM)을 모든 문장에 호출하면 비용과 지연이 크다. 선행 연구 NN-PPI는 소형 LLM 점수를 이웃 문장의 잔차로 보정하였다. 본 논문은 CLEF 2024와 ClaimBuster에서 NN-PPI를 재현하고, 같은 라벨과 문장 임베딩으로 분류기를 직접 학습하면 LLM 없이도 NN-PPI와 유의한 차이가 없는 정확도를 얻음을 보인다. 이어 저비용 분류기가 모든 문장을 판정하고 불확실한 문장만 LLM에 질의하되, LLM의 판정으로 교체하지 않고 두 점수를 결합하는 결합형 캐스케이드를 제안한다. 보정 세트에서 정확도가 포화되는 호출률 50%(전량 호출과 0.7%p 이내)를 적용한 결과, 테스트 정확도는 CLEF 0.900, ClaimBuster 0.851로 LLM 전량 호출(임계값 조정 0.877, 0.830; NN-PPI 적용 0.874, 0.836)과 같거나 높았다. 결합형은 교체형 캐스케이드보다 평균 정확도가 높아, 라벨에 담긴 판정 기준과 LLM의 일반 지식이 상호 보완적임을 시사한다.</w:t>
+        <w:t>팩트체크 필요성 탐지(check-worthiness detection)는 유입되는 모든 문장에 적용되므로, 대형 언어 모델(LLM)을 모든 문장에 호출하면 비용과 지연이 크다. 선행 연구 NN-PPI는 소형 LLM 점수를 이웃 문장의 잔차로 보정하였다. 본 논문은 CLEF 2024와 ClaimBuster에서 NN-PPI를 재현하고, 같은 라벨과 문장 임베딩으로 분류기를 직접 학습하면 LLM 없이도 NN-PPI와 같거나 높은 정확도를 얻음을 보인다. 이어 저비용 분류기가 모든 문장을 판정하고 불확실한 문장만 LLM에 질의하되, LLM의 판정으로 교체하지 않고 두 점수를 결합하는 결합형 캐스케이드를 제안한다. 보정 세트에서 정확도가 포화되는 호출률 50%에서 테스트 정확도는 CLEF 0.923, ClaimBuster 0.846으로, LLM 전량 호출 중 더 높은 설정(0.915, 0.835)과 유의한 차이가 없었고 NN-PPI를 적용한 전량 호출(0.897, 0.826)보다 유의하게 높았다. 결합형은 모든 호출률에서 교체형 캐스케이드보다 평균 정확도가 높아, 라벨에 담긴 판정 기준과 LLM의 일반 지식이 상호 보완적임을 시사한다.</w:t>
       </w:r>
     </w:p>
     <w:p>
@@ -219,7 +219,7 @@
           <w:i w:val="0"/>
           <w:sz w:val="18"/>
         </w:rPr>
-        <w:t>팩트체크 필요성 탐지는 유입되는 모든 문장에 적용되므로, 실제 서비스 운영사는 모든 문장에 LLM을 적용하는 것이 비현실적이라고 보고하였다[1]. NN-PPI[1]는 소형 LLM의 점수를 라벨이 있는 보정 세트 중 의미적으로 가까운 이웃의 잔차로 보정한다. 같은 연구진은 파인튜닝한 소형 인코더가 LLM과 경쟁할 수 있으나 관용적 표현에서는 LLM이 앞선다고 보고하고, 인코더의 확신이 낮을 때만 LLM에 넘기는 하이브리드를 향후 과제로 제시하였다[2]. 일반적인 캐스케이드[4]는 불확실한 입력을 더 큰 LLM에 넘기되 그 답으로 교체하고, LabelFusion[3]은 인코더와 LLM의 출력을 결합하지만 모든 입력에 LLM을 호출한다. 위임한 입력에서 두 모델의 출력을 선택적으로 결합하는 캐스케이드도 일반 분류 과제에서 제안되었다[8]. 본 논문은 [2]의 하이브리드를 구현하되, 결합 가중치를 라벨로 학습하여 LLM과 라벨의 판정 기준 차이까지 반영한다.</w:t>
+        <w:t>팩트체크 필요성 탐지는 유입되는 모든 문장에 적용되므로, 실제 서비스 운영사는 모든 문장에 LLM을 적용하는 것이 비현실적이라고 보고하였다[1]. NN-PPI[1]는 소형 LLM의 점수를 라벨이 있는 보정 세트 중 의미적으로 가까운 이웃의 잔차로 보정한다. 같은 연구진은 인코더의 확신이 낮을 때만 LLM에 넘기는 하이브리드를 향후 과제로 제시하였다[2]. 일반적인 캐스케이드[4]는 불확실한 입력을 더 큰 LLM에 넘기되 그 답으로 교체하고, LabelFusion[3]은 인코더와 LLM의 출력을 결합하지만 모든 입력에 LLM을 호출한다. 위임한 입력에서 두 모델의 출력을 선택적으로 결합하는 캐스케이드도 일반 분류 과제에서 제안되었다[8]. 본 논문은 [2]의 하이브리드를 구현하되, 결합 가중치를 라벨로 학습하여 LLM과 라벨의 판정 기준 차이까지 반영한다.</w:t>
       </w:r>
     </w:p>
     <w:p>
@@ -237,7 +237,7 @@
           <w:i w:val="0"/>
           <w:sz w:val="18"/>
         </w:rPr>
-        <w:t>본 논문의 기여는 다음과 같다. (1) NN-PPI를 재현하고, 같은 라벨과 임베딩으로 학습한 분류기가 LLM 없이 유의한 차이가 없는 정확도를 냄을 보인다. (2) 상용 LLM을 모든 문장에 적용해도 팩트체크가 필요한 문장을 과소 판정함을 보인다. (3) 저비용 분류기의 판정을 유지하면서 불확실한 문장에서만 LLM 점수를 결합하는 결합형 캐스케이드를 제안하고, 호출을 절반으로 줄여도 전량 호출에 준하는 정확도를 얻음을 보인다.</w:t>
+        <w:t>본 논문의 기여는 다음과 같다. (1) NN-PPI를 재현하고, 같은 라벨과 임베딩으로 학습한 분류기가 LLM 없이 NN-PPI와 같거나 높은 정확도를 냄을 보인다. (2) 상용 LLM을 모든 문장에 적용해도 팩트체크가 필요한 문장을 과소 판정함을 보인다. (3) 저비용 분류기의 판정을 유지하면서 불확실한 문장에서만 LLM 점수를 결합하는 결합형 캐스케이드를 제안하고, 호출을 절반으로 줄여도 전량 호출과 유의한 차이가 없는 정확도를 얻음을 보인다.</w:t>
       </w:r>
     </w:p>
     <w:p>
@@ -450,7 +450,7 @@
           <w:i w:val="0"/>
           <w:sz w:val="18"/>
         </w:rPr>
-        <w:t>실험에는 CLEF 2024 CheckThat! Task 1 영어 데이터(보정 2,405문장, 테스트는 dev-test 318문장)와 ClaimBuster 데이터(보정은 2012년 토론 1,314문장, 테스트는 비용상 2016년 토론 중 무작위 800문장)를 사용하였다[5,6]. NN-PPI는 원 논문의 Gemma 3 4B 설정으로 재현하였고(NN-PPI 적용 후 가중 F1 CLEF 0.835, ClaimBuster 0.796; 원 논문 0.827, 0.760), 이웃 수 k는 보정 세트 내부 검증으로 선택하였다(두 데이터셋 모두 k=10). LLM은 Claude Sonnet 5이며, NN-PPI의 판정 기준 프롬프트로 40문장씩 묶어 채점하였으며 문장 단위 채점과 AUC가 같았다(CLEF 69문장, 0.991 대 0.990). LLM 임계값, 결합 계수, k는 모두 보정 세트 안에서만 정하였고 임베딩 SVM은 기본 하이퍼파라미터를 사용하였다. 보정 세트의 80%를 비복원 추출하여 5회 반복한 평균을 보고하며, 방법 간 차이는 1회차 예측에 대한 McNemar 검정으로 평가하였다.</w:t>
+        <w:t>실험에는 CLEF 2024 CheckThat! Task 1 영어 데이터(보정 2,405문장, 테스트는 dev·dev-test·공식 test를 합친 1,691문장)와 ClaimBuster 데이터(보정은 2012년 토론 1,314문장, 테스트는 2016년 토론 2,745문장)를 사용하였다[5,6]. NN-PPI는 원 논문의 Gemma 3 4B 설정으로 재현하였고(원 논문과 같은 CLEF dev-test와 ClaimBuster 2016년 분할에서 NN-PPI 적용 후 가중 F1 CLEF 0.835, ClaimBuster 0.785; 원 논문 0.827, 0.760), 이웃 수 k는 보정 세트 내부 검증으로 선택하였다(두 데이터셋 모두 k=10). LLM은 Claude Sonnet 5이며 NN-PPI의 판정 기준 프롬프트로 40문장씩 묶어 채점하였다(문장 단위 채점과 AUC 0.991 대 0.990). LLM 임계값, 결합 계수, k는 모두 보정 세트 안에서만 정하였고 임베딩 SVM은 기본 하이퍼파라미터를 사용하였다. 보정 세트의 80%를 비복원 추출하여 5회 반복한 평균을 보고하며, 방법 간 차이는 1회차 예측에 대한 McNemar 검정으로 평가하였다.</w:t>
       </w:r>
     </w:p>
     <w:p>
@@ -592,7 +592,7 @@
                 <w:i w:val="0"/>
                 <w:sz w:val="16"/>
               </w:rPr>
-              <w:t>Gemma 3 4B</w:t>
+              <w:t>Gemma 3 4B + NN-PPI [1]</w:t>
             </w:r>
           </w:p>
         </w:tc>
@@ -636,7 +636,7 @@
                 <w:i w:val="0"/>
                 <w:sz w:val="16"/>
               </w:rPr>
-              <w:t>0.780</w:t>
+              <w:t>0.834</w:t>
             </w:r>
           </w:p>
         </w:tc>
@@ -658,97 +658,7 @@
                 <w:i w:val="0"/>
                 <w:sz w:val="16"/>
               </w:rPr>
-              <w:t>0.744</w:t>
-            </w:r>
-          </w:p>
-        </w:tc>
-      </w:tr>
-      <w:tr>
-        <w:tc>
-          <w:tcPr>
-            <w:tcW w:type="dxa" w:w="2211"/>
-          </w:tcPr>
-          <w:p>
-            <w:pPr>
-              <w:autoSpaceDE w:val="0"/>
-              <w:autoSpaceDN w:val="0"/>
-              <w:jc w:val="left"/>
-            </w:pPr>
-            <w:r/>
-            <w:r>
-              <w:rPr>
-                <w:rFonts w:ascii="함초롬바탕" w:hAnsi="함초롬바탕" w:eastAsia="함초롬바탕"/>
-                <w:b w:val="0"/>
-                <w:i w:val="0"/>
-                <w:sz w:val="16"/>
-              </w:rPr>
-              <w:t xml:space="preserve">  + NN-PPI [1]</w:t>
-            </w:r>
-          </w:p>
-        </w:tc>
-        <w:tc>
-          <w:tcPr>
-            <w:tcW w:type="dxa" w:w="737"/>
-          </w:tcPr>
-          <w:p>
-            <w:pPr>
-              <w:autoSpaceDE w:val="0"/>
-              <w:autoSpaceDN w:val="0"/>
-              <w:jc w:val="center"/>
-            </w:pPr>
-            <w:r/>
-            <w:r>
-              <w:rPr>
-                <w:rFonts w:ascii="함초롬바탕" w:hAnsi="함초롬바탕" w:eastAsia="함초롬바탕"/>
-                <w:b w:val="0"/>
-                <w:i w:val="0"/>
-                <w:sz w:val="16"/>
-              </w:rPr>
-              <w:t>0%</w:t>
-            </w:r>
-          </w:p>
-        </w:tc>
-        <w:tc>
-          <w:tcPr>
-            <w:tcW w:type="dxa" w:w="737"/>
-          </w:tcPr>
-          <w:p>
-            <w:pPr>
-              <w:autoSpaceDE w:val="0"/>
-              <w:autoSpaceDN w:val="0"/>
-              <w:jc w:val="center"/>
-            </w:pPr>
-            <w:r/>
-            <w:r>
-              <w:rPr>
-                <w:rFonts w:ascii="함초롬바탕" w:hAnsi="함초롬바탕" w:eastAsia="함초롬바탕"/>
-                <w:b w:val="0"/>
-                <w:i w:val="0"/>
-                <w:sz w:val="16"/>
-              </w:rPr>
-              <w:t>0.833</w:t>
-            </w:r>
-          </w:p>
-        </w:tc>
-        <w:tc>
-          <w:tcPr>
-            <w:tcW w:type="dxa" w:w="964"/>
-          </w:tcPr>
-          <w:p>
-            <w:pPr>
-              <w:autoSpaceDE w:val="0"/>
-              <w:autoSpaceDN w:val="0"/>
-              <w:jc w:val="center"/>
-            </w:pPr>
-            <w:r/>
-            <w:r>
-              <w:rPr>
-                <w:rFonts w:ascii="함초롬바탕" w:hAnsi="함초롬바탕" w:eastAsia="함초롬바탕"/>
-                <w:b w:val="0"/>
-                <w:i w:val="0"/>
-                <w:sz w:val="16"/>
-              </w:rPr>
-              <w:t>0.799</w:t>
+              <w:t>0.785</w:t>
             </w:r>
           </w:p>
         </w:tc>
@@ -816,7 +726,7 @@
                 <w:i w:val="0"/>
                 <w:sz w:val="16"/>
               </w:rPr>
-              <w:t>0.851</w:t>
+              <w:t>0.859</w:t>
             </w:r>
           </w:p>
         </w:tc>
@@ -838,7 +748,7 @@
                 <w:i w:val="0"/>
                 <w:sz w:val="16"/>
               </w:rPr>
-              <w:t>0.796</w:t>
+              <w:t>0.790</w:t>
             </w:r>
           </w:p>
         </w:tc>
@@ -906,7 +816,7 @@
                 <w:i w:val="0"/>
                 <w:sz w:val="16"/>
               </w:rPr>
-              <w:t>0.821</w:t>
+              <w:t>0.896</w:t>
             </w:r>
           </w:p>
         </w:tc>
@@ -928,7 +838,7 @@
                 <w:i w:val="0"/>
                 <w:sz w:val="16"/>
               </w:rPr>
-              <w:t>0.807</w:t>
+              <w:t>0.835</w:t>
             </w:r>
           </w:p>
         </w:tc>
@@ -996,7 +906,7 @@
                 <w:i w:val="0"/>
                 <w:sz w:val="16"/>
               </w:rPr>
-              <w:t>0.877</w:t>
+              <w:t>0.915</w:t>
             </w:r>
           </w:p>
         </w:tc>
@@ -1086,7 +996,7 @@
                 <w:i w:val="0"/>
                 <w:sz w:val="16"/>
               </w:rPr>
-              <w:t>0.874</w:t>
+              <w:t>0.897</w:t>
             </w:r>
           </w:p>
         </w:tc>
@@ -1108,7 +1018,7 @@
                 <w:i w:val="0"/>
                 <w:sz w:val="16"/>
               </w:rPr>
-              <w:t>0.836</w:t>
+              <w:t>0.826</w:t>
             </w:r>
           </w:p>
         </w:tc>
@@ -1176,7 +1086,7 @@
                 <w:i w:val="0"/>
                 <w:sz w:val="16"/>
               </w:rPr>
-              <w:t>0.891</w:t>
+              <w:t>0.916</w:t>
             </w:r>
           </w:p>
         </w:tc>
@@ -1198,7 +1108,7 @@
                 <w:i w:val="0"/>
                 <w:sz w:val="16"/>
               </w:rPr>
-              <w:t>0.836</w:t>
+              <w:t>0.835</w:t>
             </w:r>
           </w:p>
         </w:tc>
@@ -1266,7 +1176,7 @@
                 <w:i w:val="0"/>
                 <w:sz w:val="16"/>
               </w:rPr>
-              <w:t>0.900</w:t>
+              <w:t>0.923</w:t>
             </w:r>
           </w:p>
         </w:tc>
@@ -1288,97 +1198,7 @@
                 <w:i w:val="0"/>
                 <w:sz w:val="16"/>
               </w:rPr>
-              <w:t>0.851</w:t>
-            </w:r>
-          </w:p>
-        </w:tc>
-      </w:tr>
-      <w:tr>
-        <w:tc>
-          <w:tcPr>
-            <w:tcW w:type="dxa" w:w="2211"/>
-          </w:tcPr>
-          <w:p>
-            <w:pPr>
-              <w:autoSpaceDE w:val="0"/>
-              <w:autoSpaceDN w:val="0"/>
-              <w:jc w:val="left"/>
-            </w:pPr>
-            <w:r/>
-            <w:r>
-              <w:rPr>
-                <w:rFonts w:ascii="함초롬바탕" w:hAnsi="함초롬바탕" w:eastAsia="함초롬바탕"/>
-                <w:b/>
-                <w:i w:val="0"/>
-                <w:sz w:val="16"/>
-              </w:rPr>
-              <w:t>결합형 캐스케이드 (제안)</w:t>
-            </w:r>
-          </w:p>
-        </w:tc>
-        <w:tc>
-          <w:tcPr>
-            <w:tcW w:type="dxa" w:w="737"/>
-          </w:tcPr>
-          <w:p>
-            <w:pPr>
-              <w:autoSpaceDE w:val="0"/>
-              <w:autoSpaceDN w:val="0"/>
-              <w:jc w:val="center"/>
-            </w:pPr>
-            <w:r/>
-            <w:r>
-              <w:rPr>
-                <w:rFonts w:ascii="함초롬바탕" w:hAnsi="함초롬바탕" w:eastAsia="함초롬바탕"/>
-                <w:b/>
-                <w:i w:val="0"/>
-                <w:sz w:val="16"/>
-              </w:rPr>
-              <w:t>100%</w:t>
-            </w:r>
-          </w:p>
-        </w:tc>
-        <w:tc>
-          <w:tcPr>
-            <w:tcW w:type="dxa" w:w="737"/>
-          </w:tcPr>
-          <w:p>
-            <w:pPr>
-              <w:autoSpaceDE w:val="0"/>
-              <w:autoSpaceDN w:val="0"/>
-              <w:jc w:val="center"/>
-            </w:pPr>
-            <w:r/>
-            <w:r>
-              <w:rPr>
-                <w:rFonts w:ascii="함초롬바탕" w:hAnsi="함초롬바탕" w:eastAsia="함초롬바탕"/>
-                <w:b/>
-                <w:i w:val="0"/>
-                <w:sz w:val="16"/>
-              </w:rPr>
-              <w:t>0.900</w:t>
-            </w:r>
-          </w:p>
-        </w:tc>
-        <w:tc>
-          <w:tcPr>
-            <w:tcW w:type="dxa" w:w="964"/>
-          </w:tcPr>
-          <w:p>
-            <w:pPr>
-              <w:autoSpaceDE w:val="0"/>
-              <w:autoSpaceDN w:val="0"/>
-              <w:jc w:val="center"/>
-            </w:pPr>
-            <w:r/>
-            <w:r>
-              <w:rPr>
-                <w:rFonts w:ascii="함초롬바탕" w:hAnsi="함초롬바탕" w:eastAsia="함초롬바탕"/>
-                <w:b/>
-                <w:i w:val="0"/>
-                <w:sz w:val="16"/>
-              </w:rPr>
-              <w:t>0.855</w:t>
+              <w:t>0.846</w:t>
             </w:r>
           </w:p>
         </w:tc>
@@ -1399,7 +1219,7 @@
           <w:i w:val="0"/>
           <w:sz w:val="18"/>
         </w:rPr>
-        <w:t>표 1에서 임베딩 SVM은 LLM 없이 NN-PPI와 차이가 유의하지 않았다(CLEF p=0.63, ClaimBuster p=0.67). LLM을 그대로 쓰면 팩트체크가 필요한 문장을 과소 판정하여 해당 클래스 재현율이 CLEF 0.50, ClaimBuster 0.33(정밀도 0.95, 0.92)에 그쳤고, 라벨로 임계값을 조정하자 각각 0.90, 0.81로 개선되었다. 이는 LLM의 판정 기준과 데이터셋 라벨 사이에 차이가 있음을 시사한다.</w:t>
+        <w:t>표 1에서 임베딩 SVM은 LLM 없이 NN-PPI보다 CLEF에서 유의하게 높았고(p=0.013) ClaimBuster에서는 차이가 유의하지 않았다(p=0.79). LLM을 그대로 쓰면 팩트체크가 필요한 문장을 과소 판정하여 해당 클래스 재현율이 CLEF 0.61, ClaimBuster 0.42(정밀도 0.98, 0.91)에 그쳤고, 라벨로 임계값을 조정하자 각각 0.94, 0.86으로 개선되었다. 이는 LLM의 판정 기준과 데이터셋 라벨 사이에 차이가 있음을 시사한다. 한편 ClaimBuster에서는 클래스 균형인 보정 세트와 달리 테스트의 팩트체크 필요 문장이 27%여서, 임계값 조정 후 정확도는 오히려 0.5%p 낮아졌다.</w:t>
       </w:r>
     </w:p>
     <w:p>
@@ -1412,7 +1232,7 @@
       <w:r>
         <w:drawing>
           <wp:inline xmlns:a="http://schemas.openxmlformats.org/drawingml/2006/main" xmlns:pic="http://schemas.openxmlformats.org/drawingml/2006/picture">
-            <wp:extent cx="2951999" cy="1711458"/>
+            <wp:extent cx="2951999" cy="1563630"/>
             <wp:docPr id="3" name="Picture 3"/>
             <wp:cNvGraphicFramePr>
               <a:graphicFrameLocks noChangeAspect="1"/>
@@ -1421,7 +1241,7 @@
               <a:graphicData uri="http://schemas.openxmlformats.org/drawingml/2006/picture">
                 <pic:pic>
                   <pic:nvPicPr>
-                    <pic:cNvPr id="0" name="cascade_budget.png"/>
+                    <pic:cNvPr id="0" name="cascade_budget_full.png"/>
                     <pic:cNvPicPr/>
                   </pic:nvPicPr>
                   <pic:blipFill>
@@ -1433,7 +1253,7 @@
                   <pic:spPr>
                     <a:xfrm>
                       <a:off x="0" y="0"/>
-                      <a:ext cx="2951999" cy="1711458"/>
+                      <a:ext cx="2951999" cy="1563630"/>
                     </a:xfrm>
                     <a:prstGeom prst="rect"/>
                   </pic:spPr>
@@ -1476,7 +1296,7 @@
           <w:i w:val="0"/>
           <w:sz w:val="18"/>
         </w:rPr>
-        <w:t>호출률 50%는 테스트가 아닌 보정 세트로 정하였다. 보정 세트의 교차적합 예측에서 결합형 정확도는 50% 이후 0.1%p 이하로만 올라 포화되었고 전량 호출과의 차이는 0.7%p 이내였다(CLEF 0.839 대 0.845, ClaimBuster 0.837 대 0.837). 이 호출률에서 테스트 정확도는 임계값 조정 전량 호출보다 ClaimBuster에서 유의하게 높았고(p=0.004) CLEF에서는 2.3%p 높았으나 유의하지 않았으며(p=0.12), NN-PPI 적용 전량 호출보다는 2.6%p, 1.5%p 높았으나 유의하지 않았다(p=0.07, 0.06). 보정 세트에서는 이러한 초과 성능이 뚜렷하지 않아 데이터 분할에 따라 달라질 수 있다. 보정 세트에서 정한 |d| 임계값으로 문장마다 라우팅해도 정확도는 비슷하였다(CLEF 0.897, 실제 호출 44%; ClaimBuster 0.851, 49%). 교체형은 호출률이 높아질수록 분류기가 확신하는 문장의 판정까지 바꾸어 전량 호출 수준으로 되돌아갔다. 분류기 확신도 상위 절반에서 교체형은 옳은 판정 28건을 틀리게, 16건을 옳게 바꾸었으나 결합형은 2건만 틀리게 바꾸었다(ClaimBuster 1회차). 이는 교체가 옳은 답을 해칠 수 있다는 보고[7]와 일치한다. 결합형은 LLM을 호출하는 모든 호출률에서 교체형보다 평균 정확도가 높았고 ClaimBuster의 호출률 30~50%에서 유의하였다(p≤0.024).</w:t>
+        <w:t>호출률 50%는 테스트가 아닌 보정 세트의 교차적합 예측으로 정하였다. 보정 세트에서 결합형 정확도는 50% 이후 0.1%p 이하로만 올라 포화되었고 전량 호출과의 차이는 0.7%p 이내였다. 이 호출률에서 결합형의 테스트 정확도는 LLM 전량 호출 중 더 높은 설정보다 0.8%p, 1.1%p 높았으나 유의하지 않았고(p=0.22, 0.18), NN-PPI 적용 전량 호출보다는 2.6%p, 2.0%p 유의하게 높았다(p&lt;0.001). 호출률을 100%로 올리면 정확도가 0.1%p, 0.6%p 더 올랐고, ClaimBuster에서는 이 차이가 유의하였다(p=0.006). 테스트 문장을 모으지 않고 보정 세트의 |d| 임계값으로 문장마다 라우팅해도 정확도는 0.920, 0.845(실제 호출 38%, 49%)였다. 교체형은 호출률이 높아질수록 분류기가 확신하는 문장까지 바꾸어, 확신도 상위 절반에서 옳은 판정 94건을 틀리게, 틀린 판정 66건을 옳게 바꾸었으나 결합형은 각각 9건, 26건이었다(ClaimBuster 1회차). 이는 교체가 옳은 답을 해칠 수 있다는 보고[7]와 일치한다. 결합형은 LLM을 호출하는 모든 호출률에서 교체형보다 평균 정확도가 높았고(ClaimBuster 30~50%, CLEF 20~30%에서 유의, p≤0.023), 같은 문장을 질의하고 NN-PPI로 판정하는 캐스케이드(0.898, 0.824)보다도 유의하게 높아(p&lt;0.001) 차이는 판정 방식에서 온다.</w:t>
       </w:r>
     </w:p>
     <w:p>
@@ -1511,7 +1331,7 @@
           <w:i w:val="0"/>
           <w:sz w:val="18"/>
         </w:rPr>
-        <w:t>팩트체크 필요성 탐지에서 라벨로 학습한 저비용 분류기와 LLM은 서로 다른 정보를 가지며, 불확실한 문장에서만 LLM을 호출해 두 점수를 결합하면 호출을 절반으로 줄여도 전량 호출에 준하는 정확도를 얻는다. 출처가 겹치는[5] 영어 두 데이터셋과 단일 LLM으로 평가하였고 비용을 호출률로만 보고하였다는 한계가 있다.</w:t>
+        <w:t>팩트체크 필요성 탐지에서 라벨로 학습한 저비용 분류기와 LLM은 서로 다른 정보를 가지며, 불확실한 문장에서만 LLM을 호출해 두 점수를 결합하면 호출을 절반으로 줄여도 전량 호출과 유의한 차이가 없는 정확도를 얻는다. 출처가 겹치는[5] 영어 두 데이터셋과 단일 LLM으로 평가하였고 비용을 호출률로만 보고하였다는 한계가 있다.</w:t>
       </w:r>
     </w:p>
     <w:p>

</xml_diff>

<commit_message>
Terminology pass (호출 not 질의, one name per concept, 이하 결합형/교체형) and non-breaking hyphens in body text
Co-Authored-By: Claude Opus 5.5 <noreply@anthropic.com>
</commit_message>
<xml_diff>
--- a/paper/cascade_kics_draft.docx
+++ b/paper/cascade_kics_draft.docx
@@ -101,9 +101,15 @@
           <w:i w:val="0"/>
           <w:sz w:val="25"/>
         </w:rPr>
-        <w:t>Cost-Efficient Check-Worthy Claim Detection via Selective Fusion</w:t>
+        <w:t xml:space="preserve">Cost</w:t>
+        <w:noBreakHyphen/>
+        <w:t xml:space="preserve">Efficient Check</w:t>
+        <w:noBreakHyphen/>
+        <w:t xml:space="preserve">Worthy Claim Detection via Selective Fusion</w:t>
         <w:br/>
-        <w:t>of a Low-Cost Classifier and a Large Language Model</w:t>
+        <w:t xml:space="preserve">of a Low</w:t>
+        <w:noBreakHyphen/>
+        <w:t xml:space="preserve">Cost Classifier and a Large Language Model</w:t>
       </w:r>
     </w:p>
     <w:p>
@@ -172,7 +178,17 @@
           <w:i w:val="0"/>
           <w:sz w:val="18"/>
         </w:rPr>
-        <w:t>팩트체크 필요성 탐지(check-worthiness detection)는 유입되는 모든 문장에 적용되므로, 대형 언어 모델(LLM)을 모든 문장에 호출하면 비용과 지연이 크다. 선행 연구 NN-PPI는 소형 LLM 점수를 이웃 문장의 잔차로 보정하였다. 본 논문은 CLEF 2024와 ClaimBuster에서 NN-PPI를 재현하고, 같은 라벨과 문장 임베딩으로 분류기를 직접 학습하면 LLM 없이도 NN-PPI와 같거나 높은 정확도를 얻음을 보인다. 이어 저비용 분류기가 모든 문장을 판정하고 불확실한 문장만 LLM에 질의하되, LLM의 판정으로 교체하지 않고 두 점수를 결합하는 결합형 캐스케이드를 제안한다. 보정 세트에서 정확도가 포화되는 호출률 50%에서 테스트 정확도는 CLEF 0.923, ClaimBuster 0.846으로, LLM 전량 호출 중 더 높은 설정(0.915, 0.835)과 유의한 차이가 없었고 NN-PPI를 적용한 전량 호출(0.897, 0.826)보다 유의하게 높았다. 결합형은 모든 호출률에서 교체형 캐스케이드보다 평균 정확도가 높아, 라벨에 담긴 판정 기준과 LLM의 일반 지식이 상호 보완적임을 시사한다.</w:t>
+        <w:t xml:space="preserve">팩트체크 필요성 탐지(check</w:t>
+        <w:noBreakHyphen/>
+        <w:t xml:space="preserve">worthiness detection)는 유입되는 모든 문장에 적용되므로, 대형 언어 모델(LLM)을 모든 문장에 호출하면 비용과 지연이 크다. 선행 연구 NN</w:t>
+        <w:noBreakHyphen/>
+        <w:t xml:space="preserve">PPI는 소형 LLM 점수를 이웃 문장의 잔차로 보정하였다. 본 논문은 CLEF 2024와 ClaimBuster에서 NN</w:t>
+        <w:noBreakHyphen/>
+        <w:t xml:space="preserve">PPI를 재현하고, 같은 라벨과 문장 임베딩으로 분류기를 직접 학습하면 LLM 없이도 NN</w:t>
+        <w:noBreakHyphen/>
+        <w:t xml:space="preserve">PPI와 같거나 높은 정확도를 얻음을 보인다. 이어 저비용 분류기가 모든 문장을 판정하고 불확실한 문장에만 LLM을 호출하되, LLM의 판정으로 교체하지 않고 두 점수를 결합하는 결합형 캐스케이드를 제안한다. 보정 세트에서 정확도가 포화되는 호출률 50%에서 테스트 정확도는 CLEF 0.923, ClaimBuster 0.846으로, LLM 전량 호출 중 더 높은 설정(0.915, 0.835)과 유의한 차이가 없었고 NN</w:t>
+        <w:noBreakHyphen/>
+        <w:t xml:space="preserve">PPI 적용 전량 호출(0.897, 0.826)보다 유의하게 높았다. 결합형은 모든 호출률에서 교체형 캐스케이드보다 평균 정확도가 높아, 라벨에 담긴 판정 기준과 LLM의 일반 지식이 상호 보완적임을 시사한다.</w:t>
       </w:r>
     </w:p>
     <w:p>
@@ -219,7 +235,9 @@
           <w:i w:val="0"/>
           <w:sz w:val="18"/>
         </w:rPr>
-        <w:t>팩트체크 필요성 탐지는 유입되는 모든 문장에 적용되므로, 실제 서비스 운영사는 모든 문장에 LLM을 적용하는 것이 비현실적이라고 보고하였다[1]. NN-PPI[1]는 소형 LLM의 점수를 라벨이 있는 보정 세트 중 의미적으로 가까운 이웃의 잔차로 보정한다. 같은 연구진은 인코더의 확신이 낮을 때만 LLM에 넘기는 하이브리드를 향후 과제로 제시하였다[2]. 일반적인 캐스케이드[4]는 불확실한 입력을 더 큰 LLM에 넘기되 그 답으로 교체하고, LabelFusion[3]은 인코더와 LLM의 출력을 결합하지만 모든 입력에 LLM을 호출한다. 위임한 입력에서 두 모델의 출력을 선택적으로 결합하는 캐스케이드도 일반 분류 과제에서 제안되었다[8]. 본 논문은 [2]의 하이브리드를 구현하되, 결합 가중치를 라벨로 학습하여 LLM과 라벨의 판정 기준 차이까지 반영한다.</w:t>
+        <w:t xml:space="preserve">팩트체크 필요성 탐지는 유입되는 모든 문장에 적용되므로, 실제 서비스 운영사는 모든 문장에 LLM을 적용하는 것이 비현실적이라고 보고하였다[1]. NN</w:t>
+        <w:noBreakHyphen/>
+        <w:t xml:space="preserve">PPI[1]는 소형 LLM의 점수를 라벨이 있는 보정 세트 중 의미적으로 가까운 이웃의 잔차로 보정한다. 같은 연구진은 인코더의 확신이 낮을 때만 LLM에 넘기는 하이브리드를 향후 과제로 제시하였다[2]. 일반적인 캐스케이드[4]는 불확실한 입력을 더 큰 LLM에 넘기되 그 답으로 교체하고, LabelFusion[3]은 인코더와 LLM의 출력을 결합하지만 모든 입력에 LLM을 호출한다. 위임한 입력에서 두 모델의 출력을 선택적으로 결합하는 캐스케이드도 일반 분류 과제에서 제안되었다[8]. 본 논문은 [2]의 하이브리드를 구현하되, 결합 가중치를 라벨로 학습하여 LLM과 라벨의 판정 기준 차이까지 반영한다.</w:t>
       </w:r>
     </w:p>
     <w:p>
@@ -237,7 +255,11 @@
           <w:i w:val="0"/>
           <w:sz w:val="18"/>
         </w:rPr>
-        <w:t>본 논문의 기여는 다음과 같다. (1) NN-PPI를 재현하고, 같은 라벨과 임베딩으로 학습한 분류기가 LLM 없이 NN-PPI와 같거나 높은 정확도를 냄을 보인다. (2) 상용 LLM을 모든 문장에 적용해도 팩트체크가 필요한 문장을 과소 판정함을 보인다. (3) 저비용 분류기의 판정을 유지하면서 불확실한 문장에서만 LLM 점수를 결합하는 결합형 캐스케이드를 제안하고, 호출을 절반으로 줄여도 전량 호출과 유의한 차이가 없는 정확도를 얻음을 보인다.</w:t>
+        <w:t xml:space="preserve">본 논문의 기여는 다음과 같다. (1) NN</w:t>
+        <w:noBreakHyphen/>
+        <w:t xml:space="preserve">PPI를 재현하고, 같은 라벨과 임베딩으로 학습한 분류기가 LLM 없이 NN</w:t>
+        <w:noBreakHyphen/>
+        <w:t xml:space="preserve">PPI와 같거나 높은 정확도를 냄을 보인다. (2) 상용 LLM을 모든 문장에 적용해도 팩트체크가 필요한 문장을 과소 판정함을 보인다. (3) 저비용 분류기의 판정을 유지하면서 불확실한 문장에서만 LLM 점수를 결합하는 결합형 캐스케이드를 제안하고, 호출을 절반으로 줄여도 전량 호출과 유의한 차이가 없는 정확도를 얻음을 보인다.</w:t>
       </w:r>
     </w:p>
     <w:p>
@@ -272,7 +294,19 @@
           <w:i w:val="0"/>
           <w:sz w:val="18"/>
         </w:rPr>
-        <w:t>문장 x가 팩트체크가 필요한지 y∈{0,1}을 판정하며, NN-PPI와 같은 라벨이 있는 보정 세트 L을 사용한다. 저비용 분류기(이하 임베딩 SVM)는 NN-PPI가 이웃 검색에 쓰는 문장 임베딩(all-MiniLM-L6-v2)을 입력으로 하는 RBF-SVM이며, 클래스 불균형을 고려한 가중치로 L에서 학습한다. 결정값 d(x)는 양수일수록 팩트체크가 필요함을 뜻하며, 추론은 CPU에서 문장당 약 6 ms이다.</w:t>
+        <w:t xml:space="preserve">문장 x가 팩트체크가 필요한지 y∈{0,1}을 판정하며, NN</w:t>
+        <w:noBreakHyphen/>
+        <w:t xml:space="preserve">PPI와 같은 라벨이 있는 보정 세트 L을 사용한다. 저비용 분류기(이하 임베딩 SVM)는 NN</w:t>
+        <w:noBreakHyphen/>
+        <w:t xml:space="preserve">PPI가 이웃 검색에 쓰는 문장 임베딩(all</w:t>
+        <w:noBreakHyphen/>
+        <w:t xml:space="preserve">MiniLM</w:t>
+        <w:noBreakHyphen/>
+        <w:t xml:space="preserve">L6</w:t>
+        <w:noBreakHyphen/>
+        <w:t xml:space="preserve">v2)을 입력으로 하는 RBF</w:t>
+        <w:noBreakHyphen/>
+        <w:t xml:space="preserve">SVM이며, 클래스 불균형을 고려한 가중치로 L에서 학습한다. 결정값 d(x)는 양수일수록 팩트체크가 필요함을 뜻하며, 추론은 CPU에서 문장당 약 6 ms이다.</w:t>
       </w:r>
     </w:p>
     <w:p>
@@ -290,7 +324,7 @@
           <w:i w:val="0"/>
           <w:sz w:val="18"/>
         </w:rPr>
-        <w:t>결합형 캐스케이드는 |d(x)|가 작은 순서, 즉 분류기가 가장 불확실한 문장부터 전체의 ρ 비율만큼 LLM에 질의하여 점수 s(x)∈[0,1]을 얻는다. 질의한 문장은 식 (1)로, 나머지는 d(x)&gt;0 여부로 판정한다.</w:t>
+        <w:t>결합형 캐스케이드(이하 결합형)는 |d(x)|가 작은 순서, 즉 분류기가 가장 불확실한 문장부터 전체의 ρ 비율만큼 LLM을 호출하여 점수 s(x)∈[0,1]을 얻는다. 호출한 문장은 식 (1)로, 나머지는 d(x)&gt;0 여부로 판정한다.</w:t>
       </w:r>
     </w:p>
     <w:p>
@@ -415,7 +449,7 @@
           <w:i w:val="0"/>
           <w:sz w:val="18"/>
         </w:rPr>
-        <w:t>은 조건이 참이면 1인 지시함수이다. 비교 대상인 교체형 캐스케이드는 같은 문장을 선택하되, LLM 점수에 L에서 고른 임계값만 적용하여 판정한다.</w:t>
+        <w:t>은 조건이 참이면 1인 지시함수이다. 비교 대상인 교체형 캐스케이드(이하 교체형)는 같은 문장을 선택하되, LLM 점수에 L에서 고른 임계값만 적용하여 판정한다.</w:t>
       </w:r>
     </w:p>
     <w:p>
@@ -450,7 +484,17 @@
           <w:i w:val="0"/>
           <w:sz w:val="18"/>
         </w:rPr>
-        <w:t>실험에는 CLEF 2024 CheckThat! Task 1 영어 데이터(보정 2,405문장, 테스트는 dev·dev-test·공식 test를 합친 1,691문장)와 ClaimBuster 데이터(보정은 2012년 토론 1,314문장, 테스트는 2016년 토론 2,745문장)를 사용하였다[5,6]. NN-PPI는 원 논문의 Gemma 3 4B 설정으로 재현하였고(원 논문과 같은 CLEF dev-test와 ClaimBuster 2016년 분할에서 NN-PPI 적용 후 가중 F1 CLEF 0.835, ClaimBuster 0.785; 원 논문 0.827, 0.760), 이웃 수 k는 보정 세트 내부 검증으로 선택하였다(두 데이터셋 모두 k=10). LLM은 Claude Sonnet 5이며 NN-PPI의 판정 기준 프롬프트로 40문장씩 묶어 채점하였다(문장 단위 채점과 AUC 0.991 대 0.990). LLM 임계값, 결합 계수, k는 모두 보정 세트 안에서만 정하였고 임베딩 SVM은 기본 하이퍼파라미터를 사용하였다. 보정 세트의 80%를 비복원 추출하여 5회 반복한 평균을 보고하며, 방법 간 차이는 1회차 예측에 대한 McNemar 검정으로 평가하였다.</w:t>
+        <w:t xml:space="preserve">실험에는 CLEF 2024 CheckThat! Task 1 영어 데이터(보정 2,405문장, 테스트는 dev·dev</w:t>
+        <w:noBreakHyphen/>
+        <w:t xml:space="preserve">test·공식 test를 합친 1,691문장)와 ClaimBuster 데이터(보정은 2012년 토론 1,314문장, 테스트는 2016년 토론 2,745문장)를 사용하였다[5,6]. NN</w:t>
+        <w:noBreakHyphen/>
+        <w:t xml:space="preserve">PPI는 원 논문의 Gemma 3 4B 설정으로 재현하였고(원 논문과 같은 CLEF dev</w:t>
+        <w:noBreakHyphen/>
+        <w:t xml:space="preserve">test와 ClaimBuster 2016년 분할에서 NN</w:t>
+        <w:noBreakHyphen/>
+        <w:t xml:space="preserve">PPI 적용 후 가중 F1 CLEF 0.835, ClaimBuster 0.785; 원 논문 0.827, 0.760), 이웃 수 k는 보정 세트 내부 검증으로 선택하였다(두 데이터셋 모두 k=10). LLM은 Claude Sonnet 5이며 NN</w:t>
+        <w:noBreakHyphen/>
+        <w:t xml:space="preserve">PPI의 판정 기준 프롬프트로 40문장씩 묶어 채점하였다(문장 단위 채점과 AUC 0.991 대 0.990). LLM 임계값, 결합 계수, k는 모두 보정 세트 안에서만 정하였고 임베딩 SVM은 기본 하이퍼파라미터를 사용하였다. 보정 세트의 80%를 비복원 추출하여 5회 반복한 평균을 보고하며, 방법 간 차이는 1회차 예측에 대한 McNemar 검정으로 평가하였다.</w:t>
       </w:r>
     </w:p>
     <w:p>
@@ -467,7 +511,7 @@
           <w:i w:val="0"/>
           <w:sz w:val="17"/>
         </w:rPr>
-        <w:t>표 1. 방법별 테스트 정확도 (5회 평균, 호출률 = LLM에 질의한 문장 비율)</w:t>
+        <w:t>표 1. 방법별 테스트 정확도 (5회 평균, 호출률 = LLM을 호출한 문장 비율)</w:t>
       </w:r>
     </w:p>
     <w:tbl>
@@ -592,7 +636,9 @@
                 <w:i w:val="0"/>
                 <w:sz w:val="16"/>
               </w:rPr>
-              <w:t>Gemma 3 4B + NN-PPI [1]</w:t>
+              <w:t xml:space="preserve">Gemma 3 4B + NN</w:t>
+              <w:noBreakHyphen/>
+              <w:t xml:space="preserve">PPI [1]</w:t>
             </w:r>
           </w:p>
         </w:tc>
@@ -772,7 +818,7 @@
                 <w:i w:val="0"/>
                 <w:sz w:val="16"/>
               </w:rPr>
-              <w:t>Sonnet 5 전량 호출</w:t>
+              <w:t>LLM 전량 호출</w:t>
             </w:r>
           </w:p>
         </w:tc>
@@ -952,7 +998,9 @@
                 <w:i w:val="0"/>
                 <w:sz w:val="16"/>
               </w:rPr>
-              <w:t xml:space="preserve">  + NN-PPI [1]</w:t>
+              <w:t xml:space="preserve">  + NN</w:t>
+              <w:noBreakHyphen/>
+              <w:t xml:space="preserve">PPI [1]</w:t>
             </w:r>
           </w:p>
         </w:tc>
@@ -1219,7 +1267,9 @@
           <w:i w:val="0"/>
           <w:sz w:val="18"/>
         </w:rPr>
-        <w:t>표 1에서 임베딩 SVM은 LLM 없이 NN-PPI보다 CLEF에서 유의하게 높았고(p=0.013) ClaimBuster에서는 차이가 유의하지 않았다(p=0.79). LLM을 그대로 쓰면 팩트체크가 필요한 문장을 과소 판정하여 해당 클래스 재현율이 CLEF 0.61, ClaimBuster 0.42(정밀도 0.98, 0.91)에 그쳤고, 라벨로 임계값을 조정하자 각각 0.94, 0.86으로 개선되었다. 이는 LLM의 판정 기준과 데이터셋 라벨 사이에 차이가 있음을 시사한다. 한편 ClaimBuster에서는 클래스 균형인 보정 세트와 달리 테스트의 팩트체크 필요 문장이 27%여서, 임계값 조정 후 정확도는 오히려 0.5%p 낮아졌다.</w:t>
+        <w:t xml:space="preserve">표 1에서 임베딩 SVM은 LLM 없이 NN</w:t>
+        <w:noBreakHyphen/>
+        <w:t xml:space="preserve">PPI보다 CLEF에서 유의하게 높았고(p=0.013) ClaimBuster에서는 차이가 유의하지 않았다(p=0.79). LLM을 그대로 쓰면 팩트체크가 필요한 문장을 과소 판정하여 해당 클래스 재현율이 CLEF 0.61, ClaimBuster 0.42(정밀도 0.98, 0.91)에 그쳤고, 라벨로 임계값을 조정하자 각각 0.94, 0.86으로 개선되었다. 이는 LLM의 판정 기준과 데이터셋 라벨 사이에 차이가 있음을 시사한다. 한편 ClaimBuster에서는 클래스 균형인 보정 세트와 달리 테스트의 팩트체크가 필요한 문장이 27%여서, 임계값 조정 후 정확도는 오히려 0.5%p 낮아졌다.</w:t>
       </w:r>
     </w:p>
     <w:p>
@@ -1296,7 +1346,11 @@
           <w:i w:val="0"/>
           <w:sz w:val="18"/>
         </w:rPr>
-        <w:t>호출률 50%는 테스트가 아닌 보정 세트의 교차적합 예측으로 정하였다. 보정 세트에서 결합형 정확도는 50% 이후 0.1%p 이하로만 올라 포화되었고 전량 호출과의 차이는 0.7%p 이내였다. 이 호출률에서 결합형의 테스트 정확도는 LLM 전량 호출 중 더 높은 설정보다 0.8%p, 1.1%p 높았으나 유의하지 않았고(p=0.22, 0.18), NN-PPI 적용 전량 호출보다는 2.6%p, 2.0%p 유의하게 높았다(p&lt;0.001). 호출률을 100%로 올리면 정확도가 0.1%p, 0.6%p 더 올랐고, ClaimBuster에서는 이 차이가 유의하였다(p=0.006). 테스트 문장을 모으지 않고 보정 세트의 |d| 임계값으로 문장마다 라우팅해도 정확도는 0.920, 0.845(실제 호출 38%, 49%)였다. 교체형은 호출률이 높아질수록 분류기가 확신하는 문장까지 바꾸어, 확신도 상위 절반에서 옳은 판정 94건을 틀리게, 틀린 판정 66건을 옳게 바꾸었으나 결합형은 각각 9건, 26건이었다(ClaimBuster 1회차). 이는 교체가 옳은 답을 해칠 수 있다는 보고[7]와 일치한다. 결합형은 LLM을 호출하는 모든 호출률에서 교체형보다 평균 정확도가 높았고(ClaimBuster 30~50%, CLEF 20~30%에서 유의, p≤0.023), 같은 문장을 질의하고 NN-PPI로 판정하는 캐스케이드(0.898, 0.824)보다도 유의하게 높아(p&lt;0.001) 차이는 판정 방식에서 온다.</w:t>
+        <w:t xml:space="preserve">호출률 50%는 테스트가 아닌 보정 세트의 교차적합 예측으로 정하였다. 보정 세트에서 결합형 정확도는 50% 이후 0.1%p 이하로만 올라 포화되었고 전량 호출과의 차이는 0.7%p 이내였다. 이 호출률에서 결합형의 테스트 정확도는 LLM 전량 호출 중 더 높은 설정보다 0.8%p, 1.1%p 높았으나 유의하지 않았고(p=0.22, 0.18), NN</w:t>
+        <w:noBreakHyphen/>
+        <w:t xml:space="preserve">PPI 적용 전량 호출보다는 2.6%p, 2.0%p 유의하게 높았다(p&lt;0.001). 호출률을 100%로 올리면 정확도가 0.1%p, 0.6%p 더 올랐고, ClaimBuster에서는 이 차이가 유의하였다(p=0.006). 테스트 문장을 모으지 않고 보정 세트의 |d| 임계값으로 문장마다 라우팅해도 정확도는 0.920, 0.845(실제 호출 38%, 49%)였다. 교체형은 호출률이 높아질수록 임베딩 SVM이 확신하는 문장까지 바꾸어, 확신도 상위 절반에서 옳은 판정 94건을 틀리게, 틀린 판정 66건을 옳게 바꾸었으나 결합형은 각각 9건, 26건이었다(ClaimBuster 1회차). 이는 교체가 옳은 답을 해칠 수 있다는 보고[7]와 일치한다. 결합형은 LLM을 호출하는 모든 호출률에서 교체형보다 평균 정확도가 높았고(ClaimBuster 30~50%, CLEF 20~30%에서 유의, p≤0.023), 같은 문장에 LLM을 호출하고 NN</w:t>
+        <w:noBreakHyphen/>
+        <w:t xml:space="preserve">PPI로 판정하는 캐스케이드(0.898, 0.824)보다도 유의하게 높아(p&lt;0.001) 차이는 판정 방식에서 온다.</w:t>
       </w:r>
     </w:p>
     <w:p>

</xml_diff>

<commit_message>
Readability pass: method diagram (Fig. 1), subsections 2.1/2.2/3.1/3.2, halved-calls headline, dagger marks in Table 1
- Fig. 1: TikZ pipeline, fusion step the only accented node; results figure becomes Fig. 2
- Table 1 marks baselines the fused cascade (50%) beats significantly; verifier checks whole rows
- Space: dropped streaming sentence and batch-AUC parenthetical, [6] as 'et al.'
- Flow fixes from full read-through (subjects, 실험 결과, 팩트체크 서비스 운영사)

Co-Authored-By: Claude Opus 5.5 <noreply@anthropic.com>
</commit_message>
<xml_diff>
--- a/paper/cascade_kics_draft.docx
+++ b/paper/cascade_kics_draft.docx
@@ -180,15 +180,13 @@
         </w:rPr>
         <w:t xml:space="preserve">팩트체크 필요성 탐지(check</w:t>
         <w:noBreakHyphen/>
-        <w:t xml:space="preserve">worthiness detection)는 유입되는 모든 문장에 적용되므로, 대형 언어 모델(LLM)을 모든 문장에 호출하면 비용과 지연이 크다. 선행 연구 NN</w:t>
+        <w:t xml:space="preserve">worthiness detection)는 유입되는 모든 문장에 적용되므로, 대형 언어 모델(LLM)을 모든 문장에 호출하면 비용과 지연이 크다. 본 논문은 소형 LLM 점수를 이웃 문장의 잔차로 보정하는 선행 연구 NN</w:t>
         <w:noBreakHyphen/>
-        <w:t xml:space="preserve">PPI는 소형 LLM 점수를 이웃 문장의 잔차로 보정하였다. 본 논문은 CLEF 2024와 ClaimBuster에서 NN</w:t>
+        <w:t xml:space="preserve">PPI를 CLEF 2024와 ClaimBuster에서 재현하고, 같은 라벨과 문장 임베딩으로 분류기를 직접 학습하면 LLM 없이도 NN</w:t>
         <w:noBreakHyphen/>
-        <w:t xml:space="preserve">PPI를 재현하고, 같은 라벨과 문장 임베딩으로 분류기를 직접 학습하면 LLM 없이도 NN</w:t>
+        <w:t xml:space="preserve">PPI와 같거나 높은 정확도를 얻음을 보인다. 이어 저비용 분류기가 모든 문장을 판정하고 불확실한 문장에만 LLM을 호출하되, LLM의 판정으로 교체하지 않고 결합하는 결합형 캐스케이드를 제안한다. 실험 결과 LLM 호출을 절반으로 줄이고도 테스트 정확도(CLEF 0.923, ClaimBuster 0.846)가 LLM 전량 호출 중 더 높은 설정(0.915, 0.835)과 유의한 차이가 없었고, NN</w:t>
         <w:noBreakHyphen/>
-        <w:t xml:space="preserve">PPI와 같거나 높은 정확도를 얻음을 보인다. 이어 저비용 분류기가 모든 문장을 판정하고 불확실한 문장에만 LLM을 호출하되, LLM의 판정으로 교체하지 않고 두 점수를 결합하는 결합형 캐스케이드를 제안한다. 보정 세트에서 정확도가 포화되는 호출률 50%에서 테스트 정확도는 CLEF 0.923, ClaimBuster 0.846으로, LLM 전량 호출 중 더 높은 설정(0.915, 0.835)과 유의한 차이가 없었고 NN</w:t>
-        <w:noBreakHyphen/>
-        <w:t xml:space="preserve">PPI 적용 전량 호출(0.897, 0.826)보다 유의하게 높았다. 결합형은 모든 호출률에서 교체형 캐스케이드보다 평균 정확도가 높아, 라벨에 담긴 판정 기준과 LLM의 일반 지식이 상호 보완적임을 시사한다.</w:t>
+        <w:t xml:space="preserve">PPI 적용 전량 호출(0.897, 0.826)보다는 유의하게 높았다. 결합형은 모든 호출률에서 교체형 캐스케이드보다 평균 정확도가 높아, 라벨에 담긴 판정 기준과 LLM의 일반 지식이 상호 보완적임을 시사한다.</w:t>
       </w:r>
     </w:p>
     <w:p>
@@ -208,7 +206,7 @@
         <w:keepNext/>
         <w:autoSpaceDE w:val="0"/>
         <w:autoSpaceDN w:val="0"/>
-        <w:spacing w:before="120" w:after="60"/>
+        <w:spacing w:before="100" w:after="40"/>
       </w:pPr>
       <w:r>
         <w:rPr>
@@ -235,7 +233,7 @@
           <w:i w:val="0"/>
           <w:sz w:val="18"/>
         </w:rPr>
-        <w:t xml:space="preserve">팩트체크 필요성 탐지는 유입되는 모든 문장에 적용되므로, 실제 서비스 운영사는 모든 문장에 LLM을 적용하는 것이 비현실적이라고 보고하였다[1]. NN</w:t>
+        <w:t xml:space="preserve">실제 팩트체크 서비스 운영사는 유입되는 모든 문장에 LLM을 적용하는 것이 비현실적이라고 보고하였다[1]. NN</w:t>
         <w:noBreakHyphen/>
         <w:t xml:space="preserve">PPI[1]는 소형 LLM의 점수를 라벨이 있는 보정 세트 중 의미적으로 가까운 이웃의 잔차로 보정한다. 같은 연구진은 인코더의 확신이 낮을 때만 LLM에 넘기는 하이브리드를 향후 과제로 제시하였다[2]. 일반적인 캐스케이드[4]는 불확실한 입력을 더 큰 LLM에 넘기되 그 답으로 교체하고, LabelFusion[3]은 인코더와 LLM의 출력을 결합하지만 모든 입력에 LLM을 호출한다. 위임한 입력에서 두 모델의 출력을 선택적으로 결합하는 캐스케이드도 일반 분류 과제에서 제안되었다[8]. 본 논문은 [2]의 하이브리드를 구현하되, 결합 가중치를 라벨로 학습하여 LLM과 라벨의 판정 기준 차이까지 반영한다.</w:t>
       </w:r>
@@ -267,7 +265,7 @@
         <w:keepNext/>
         <w:autoSpaceDE w:val="0"/>
         <w:autoSpaceDN w:val="0"/>
-        <w:spacing w:before="120" w:after="60"/>
+        <w:spacing w:before="100" w:after="40"/>
       </w:pPr>
       <w:r>
         <w:rPr>
@@ -277,6 +275,23 @@
           <w:sz w:val="21"/>
         </w:rPr>
         <w:t>Ⅱ. 제안 기법</w:t>
+      </w:r>
+    </w:p>
+    <w:p>
+      <w:pPr>
+        <w:keepNext/>
+        <w:autoSpaceDE w:val="0"/>
+        <w:autoSpaceDN w:val="0"/>
+        <w:spacing w:before="60" w:after="30"/>
+      </w:pPr>
+      <w:r>
+        <w:rPr>
+          <w:rFonts w:ascii="함초롬바탕" w:hAnsi="함초롬바탕" w:eastAsia="함초롬바탕"/>
+          <w:b/>
+          <w:i w:val="0"/>
+          <w:sz w:val="19"/>
+        </w:rPr>
+        <w:t>2.1 저비용 분류기</w:t>
       </w:r>
     </w:p>
     <w:p>
@@ -311,6 +326,23 @@
     </w:p>
     <w:p>
       <w:pPr>
+        <w:keepNext/>
+        <w:autoSpaceDE w:val="0"/>
+        <w:autoSpaceDN w:val="0"/>
+        <w:spacing w:before="60" w:after="30"/>
+      </w:pPr>
+      <w:r>
+        <w:rPr>
+          <w:rFonts w:ascii="함초롬바탕" w:hAnsi="함초롬바탕" w:eastAsia="함초롬바탕"/>
+          <w:b/>
+          <w:i w:val="0"/>
+          <w:sz w:val="19"/>
+        </w:rPr>
+        <w:t>2.2 결합형 캐스케이드</w:t>
+      </w:r>
+    </w:p>
+    <w:p>
+      <w:pPr>
         <w:autoSpaceDE w:val="0"/>
         <w:autoSpaceDN w:val="0"/>
         <w:spacing w:after="50" w:line="240" w:lineRule="auto"/>
@@ -324,7 +356,67 @@
           <w:i w:val="0"/>
           <w:sz w:val="18"/>
         </w:rPr>
-        <w:t>결합형 캐스케이드(이하 결합형)는 |d(x)|가 작은 순서, 즉 분류기가 가장 불확실한 문장부터 전체의 ρ 비율만큼 LLM을 호출하여 점수 s(x)∈[0,1]을 얻는다. 호출한 문장은 식 (1)로, 나머지는 d(x)&gt;0 여부로 판정한다.</w:t>
+        <w:t>결합형 캐스케이드(이하 결합형)는 그림 1과 같이 |d(x)|가 작은 순서, 즉 분류기가 가장 불확실한 문장부터 전체의 ρ 비율(호출률)만큼 LLM을 호출하여 점수 s(x)∈[0,1]을 얻는다. 호출한 문장은 식 (1)로, 나머지는 d(x)&gt;0 여부로 판정한다.</w:t>
+      </w:r>
+    </w:p>
+    <w:p>
+      <w:pPr>
+        <w:keepNext/>
+        <w:autoSpaceDE w:val="0"/>
+        <w:autoSpaceDN w:val="0"/>
+        <w:spacing w:before="60" w:after="20"/>
+        <w:jc w:val="center"/>
+      </w:pPr>
+      <w:r>
+        <w:drawing>
+          <wp:inline xmlns:a="http://schemas.openxmlformats.org/drawingml/2006/main" xmlns:pic="http://schemas.openxmlformats.org/drawingml/2006/picture">
+            <wp:extent cx="2365120" cy="717765"/>
+            <wp:docPr id="1" name="Picture 1"/>
+            <wp:cNvGraphicFramePr>
+              <a:graphicFrameLocks noChangeAspect="1"/>
+            </wp:cNvGraphicFramePr>
+            <a:graphic>
+              <a:graphicData uri="http://schemas.openxmlformats.org/drawingml/2006/picture">
+                <pic:pic>
+                  <pic:nvPicPr>
+                    <pic:cNvPr id="0" name="method_diagram.png"/>
+                    <pic:cNvPicPr/>
+                  </pic:nvPicPr>
+                  <pic:blipFill>
+                    <a:blip r:embed="rId9"/>
+                    <a:stretch>
+                      <a:fillRect/>
+                    </a:stretch>
+                  </pic:blipFill>
+                  <pic:spPr>
+                    <a:xfrm>
+                      <a:off x="0" y="0"/>
+                      <a:ext cx="2365120" cy="717765"/>
+                    </a:xfrm>
+                    <a:prstGeom prst="rect"/>
+                  </pic:spPr>
+                </pic:pic>
+              </a:graphicData>
+            </a:graphic>
+          </wp:inline>
+        </w:drawing>
+      </w:r>
+    </w:p>
+    <w:p>
+      <w:pPr>
+        <w:autoSpaceDE w:val="0"/>
+        <w:autoSpaceDN w:val="0"/>
+        <w:spacing w:after="80"/>
+        <w:jc w:val="center"/>
+      </w:pPr>
+      <w:r>
+        <w:rPr>
+          <w:rFonts w:ascii="함초롬바탕" w:hAnsi="함초롬바탕" w:eastAsia="함초롬바탕"/>
+          <w:b/>
+          <w:i w:val="0"/>
+          <w:sz w:val="16"/>
+        </w:rPr>
+        <w:t>그림 1. 결합형의 처리 흐름 (파란 상자가 제안하는 결합 판정)</w:t>
       </w:r>
     </w:p>
     <w:p>
@@ -347,7 +439,7 @@
         <w:drawing>
           <wp:inline xmlns:a="http://schemas.openxmlformats.org/drawingml/2006/main" xmlns:pic="http://schemas.openxmlformats.org/drawingml/2006/picture">
             <wp:extent cx="2091829" cy="134630"/>
-            <wp:docPr id="1" name="Picture 1"/>
+            <wp:docPr id="2" name="Picture 2"/>
             <wp:cNvGraphicFramePr>
               <a:graphicFrameLocks noChangeAspect="1"/>
             </wp:cNvGraphicFramePr>
@@ -359,7 +451,7 @@
                     <pic:cNvPicPr/>
                   </pic:nvPicPr>
                   <pic:blipFill>
-                    <a:blip r:embed="rId9"/>
+                    <a:blip r:embed="rId10"/>
                     <a:stretch>
                       <a:fillRect/>
                     </a:stretch>
@@ -390,6 +482,7 @@
     </w:p>
     <w:p>
       <w:pPr>
+        <w:widowControl w:val="0"/>
         <w:autoSpaceDE w:val="0"/>
         <w:autoSpaceDN w:val="0"/>
         <w:spacing w:after="50" w:line="240" w:lineRule="auto"/>
@@ -412,7 +505,7 @@
         <w:drawing>
           <wp:inline xmlns:a="http://schemas.openxmlformats.org/drawingml/2006/main" xmlns:pic="http://schemas.openxmlformats.org/drawingml/2006/picture">
             <wp:extent cx="161309" cy="133944"/>
-            <wp:docPr id="2" name="Picture 2"/>
+            <wp:docPr id="3" name="Picture 3"/>
             <wp:cNvGraphicFramePr>
               <a:graphicFrameLocks noChangeAspect="1"/>
             </wp:cNvGraphicFramePr>
@@ -424,7 +517,7 @@
                     <pic:cNvPicPr/>
                   </pic:nvPicPr>
                   <pic:blipFill>
-                    <a:blip r:embed="rId10"/>
+                    <a:blip r:embed="rId11"/>
                     <a:stretch>
                       <a:fillRect/>
                     </a:stretch>
@@ -457,7 +550,7 @@
         <w:keepNext/>
         <w:autoSpaceDE w:val="0"/>
         <w:autoSpaceDN w:val="0"/>
-        <w:spacing w:before="120" w:after="60"/>
+        <w:spacing w:before="100" w:after="40"/>
       </w:pPr>
       <w:r>
         <w:rPr>
@@ -467,6 +560,23 @@
           <w:sz w:val="21"/>
         </w:rPr>
         <w:t>Ⅲ. 실험 및 결과</w:t>
+      </w:r>
+    </w:p>
+    <w:p>
+      <w:pPr>
+        <w:keepNext/>
+        <w:autoSpaceDE w:val="0"/>
+        <w:autoSpaceDN w:val="0"/>
+        <w:spacing w:before="60" w:after="30"/>
+      </w:pPr>
+      <w:r>
+        <w:rPr>
+          <w:rFonts w:ascii="함초롬바탕" w:hAnsi="함초롬바탕" w:eastAsia="함초롬바탕"/>
+          <w:b/>
+          <w:i w:val="0"/>
+          <w:sz w:val="19"/>
+        </w:rPr>
+        <w:t>3.1 실험 설정</w:t>
       </w:r>
     </w:p>
     <w:p>
@@ -490,11 +600,26 @@
         <w:noBreakHyphen/>
         <w:t xml:space="preserve">PPI는 원 논문의 Gemma 3 4B 설정으로 재현하였고(원 논문과 같은 CLEF dev</w:t>
         <w:noBreakHyphen/>
-        <w:t xml:space="preserve">test와 ClaimBuster 2016년 분할에서 NN</w:t>
+        <w:t xml:space="preserve">test와 ClaimBuster 2016년 분할에서 가중 F1 CLEF 0.835, ClaimBuster 0.785; 원 논문 0.827, 0.760), 이웃 수 k는 보정 세트 내부 검증으로 선택하였다(두 데이터셋 k=10). LLM은 Claude Sonnet 5이며 NN</w:t>
         <w:noBreakHyphen/>
-        <w:t xml:space="preserve">PPI 적용 후 가중 F1 CLEF 0.835, ClaimBuster 0.785; 원 논문 0.827, 0.760), 이웃 수 k는 보정 세트 내부 검증으로 선택하였다(두 데이터셋 모두 k=10). LLM은 Claude Sonnet 5이며 NN</w:t>
-        <w:noBreakHyphen/>
-        <w:t xml:space="preserve">PPI의 판정 기준 프롬프트로 40문장씩 묶어 채점하였다(문장 단위 채점과 AUC 0.991 대 0.990). LLM 임계값, 결합 계수, k는 모두 보정 세트 안에서만 정하였고 임베딩 SVM은 기본 하이퍼파라미터를 사용하였다. 보정 세트의 80%를 비복원 추출하여 5회 반복한 평균을 보고하며, 방법 간 차이는 1회차 예측에 대한 McNemar 검정으로 평가하였다.</w:t>
+        <w:t xml:space="preserve">PPI의 판정 기준 프롬프트로 40문장씩 묶어 채점하였다. LLM 임계값, 결합 계수, k는 모두 보정 세트 안에서만 정하였고 임베딩 SVM은 기본 하이퍼파라미터를 사용하였다. 보정 세트의 80%를 비복원 추출하여 5회 반복한 평균을 보고하며, 방법 간 차이는 1회차 예측에 대한 McNemar 검정(α=0.05)으로 평가하였다.</w:t>
+      </w:r>
+    </w:p>
+    <w:p>
+      <w:pPr>
+        <w:keepNext/>
+        <w:autoSpaceDE w:val="0"/>
+        <w:autoSpaceDN w:val="0"/>
+        <w:spacing w:before="60" w:after="30"/>
+      </w:pPr>
+      <w:r>
+        <w:rPr>
+          <w:rFonts w:ascii="함초롬바탕" w:hAnsi="함초롬바탕" w:eastAsia="함초롬바탕"/>
+          <w:b/>
+          <w:i w:val="0"/>
+          <w:sz w:val="19"/>
+        </w:rPr>
+        <w:t>3.2 결과</w:t>
       </w:r>
     </w:p>
     <w:p>
@@ -511,7 +636,7 @@
           <w:i w:val="0"/>
           <w:sz w:val="17"/>
         </w:rPr>
-        <w:t>표 1. 방법별 테스트 정확도 (5회 평균, 호출률 = LLM을 호출한 문장 비율)</w:t>
+        <w:t>표 1. 테스트 정확도 (5회 평균, †: 결합형(50%)이 유의하게 높음)</w:t>
       </w:r>
     </w:p>
     <w:tbl>
@@ -862,7 +987,7 @@
                 <w:i w:val="0"/>
                 <w:sz w:val="16"/>
               </w:rPr>
-              <w:t>0.896</w:t>
+              <w:t>0.896†</w:t>
             </w:r>
           </w:p>
         </w:tc>
@@ -974,7 +1099,7 @@
                 <w:i w:val="0"/>
                 <w:sz w:val="16"/>
               </w:rPr>
-              <w:t>0.830</w:t>
+              <w:t>0.830†</w:t>
             </w:r>
           </w:p>
         </w:tc>
@@ -1044,7 +1169,7 @@
                 <w:i w:val="0"/>
                 <w:sz w:val="16"/>
               </w:rPr>
-              <w:t>0.897</w:t>
+              <w:t>0.897†</w:t>
             </w:r>
           </w:p>
         </w:tc>
@@ -1066,7 +1191,7 @@
                 <w:i w:val="0"/>
                 <w:sz w:val="16"/>
               </w:rPr>
-              <w:t>0.826</w:t>
+              <w:t>0.826†</w:t>
             </w:r>
           </w:p>
         </w:tc>
@@ -1156,7 +1281,7 @@
                 <w:i w:val="0"/>
                 <w:sz w:val="16"/>
               </w:rPr>
-              <w:t>0.835</w:t>
+              <w:t>0.835†</w:t>
             </w:r>
           </w:p>
         </w:tc>
@@ -1269,21 +1394,44 @@
         </w:rPr>
         <w:t xml:space="preserve">표 1에서 임베딩 SVM은 LLM 없이 NN</w:t>
         <w:noBreakHyphen/>
-        <w:t xml:space="preserve">PPI보다 CLEF에서 유의하게 높았고(p=0.013) ClaimBuster에서는 차이가 유의하지 않았다(p=0.79). LLM을 그대로 쓰면 팩트체크가 필요한 문장을 과소 판정하여 해당 클래스 재현율이 CLEF 0.61, ClaimBuster 0.42(정밀도 0.98, 0.91)에 그쳤고, 라벨로 임계값을 조정하자 각각 0.94, 0.86으로 개선되었다. 이는 LLM의 판정 기준과 데이터셋 라벨 사이에 차이가 있음을 시사한다. 한편 ClaimBuster에서는 클래스 균형인 보정 세트와 달리 테스트의 팩트체크가 필요한 문장이 27%여서, 임계값 조정 후 정확도는 오히려 0.5%p 낮아졌다.</w:t>
+        <w:t xml:space="preserve">PPI보다 CLEF에서 유의하게 높았고(p=0.013) ClaimBuster에서는 차이가 유의하지 않았다(p=0.79). LLM을 그대로 쓰면 팩트체크가 필요한 문장을 과소 판정하여 재현율이 CLEF 0.61, ClaimBuster 0.42(정밀도 0.98, 0.91)에 그쳤고, 라벨로 임계값을 조정하자 각각 0.94, 0.86으로 개선되었다. 이는 LLM의 판정 기준과 데이터셋 라벨 사이에 차이가 있음을 시사한다. 한편 ClaimBuster에서는 클래스 균형인 보정 세트와 달리 테스트의 팩트체크가 필요한 문장이 27%여서, 임계값 조정 후 정확도는 오히려 0.5%p 낮아졌다.</w:t>
       </w:r>
     </w:p>
     <w:p>
       <w:pPr>
         <w:autoSpaceDE w:val="0"/>
         <w:autoSpaceDN w:val="0"/>
-        <w:spacing w:after="20"/>
+        <w:spacing w:after="50" w:line="240" w:lineRule="auto"/>
+        <w:ind w:firstLine="198"/>
+        <w:jc w:val="both"/>
+      </w:pPr>
+      <w:r>
+        <w:rPr>
+          <w:rFonts w:ascii="함초롬바탕" w:hAnsi="함초롬바탕" w:eastAsia="함초롬바탕"/>
+          <w:b w:val="0"/>
+          <w:i w:val="0"/>
+          <w:sz w:val="18"/>
+        </w:rPr>
+        <w:t xml:space="preserve">호출률 50%는 테스트가 아닌 보정 세트에서 정하였다(교차적합 정확도가 50% 이후 0.1%p 이하로만 올라 포화, 전량 호출과 0.7%p 이내). 이 호출률에서 결합형의 테스트 정확도는 LLM 전량 호출 중 더 높은 설정보다 0.8%p, 1.1%p 높았으나 유의하지 않았고(p=0.22, 0.18), NN</w:t>
+        <w:noBreakHyphen/>
+        <w:t xml:space="preserve">PPI 적용 전량 호출보다는 2.6%p, 2.0%p 유의하게 높았다(p&lt;0.001). 호출률을 100%로 올리면(그림 2) 정확도가 0.1%p, 0.6%p 더 올랐고, ClaimBuster에서는 이 차이가 유의하였다(p=0.006). 교체형은 임베딩 SVM이 확신하는 상위 절반에서 옳은 판정 94건을 틀리게, 틀린 판정 66건을 옳게 바꾸었으나 결합형은 각각 9건, 26건이었다(1회차, ClaimBuster). 이는 교체가 옳은 답을 해칠 수 있다는 보고[7]와 일치한다. 결합형은 LLM을 호출하는 모든 호출률에서 교체형보다 평균 정확도가 높았고, 같은 문장에 LLM을 호출하고 NN</w:t>
+        <w:noBreakHyphen/>
+        <w:t xml:space="preserve">PPI로 판정하는 캐스케이드(0.898, 0.824)보다도 유의하게 높아(p&lt;0.001) 이 차이는 판정 방식에서 온다.</w:t>
+      </w:r>
+    </w:p>
+    <w:p>
+      <w:pPr>
+        <w:keepNext/>
+        <w:autoSpaceDE w:val="0"/>
+        <w:autoSpaceDN w:val="0"/>
+        <w:spacing w:before="60" w:after="20"/>
         <w:jc w:val="center"/>
       </w:pPr>
       <w:r>
         <w:drawing>
           <wp:inline xmlns:a="http://schemas.openxmlformats.org/drawingml/2006/main" xmlns:pic="http://schemas.openxmlformats.org/drawingml/2006/picture">
-            <wp:extent cx="2951999" cy="1563630"/>
-            <wp:docPr id="3" name="Picture 3"/>
+            <wp:extent cx="2951999" cy="1415801"/>
+            <wp:docPr id="4" name="Picture 4"/>
             <wp:cNvGraphicFramePr>
               <a:graphicFrameLocks noChangeAspect="1"/>
             </wp:cNvGraphicFramePr>
@@ -1295,7 +1443,7 @@
                     <pic:cNvPicPr/>
                   </pic:nvPicPr>
                   <pic:blipFill>
-                    <a:blip r:embed="rId11"/>
+                    <a:blip r:embed="rId12"/>
                     <a:stretch>
                       <a:fillRect/>
                     </a:stretch>
@@ -1303,7 +1451,7 @@
                   <pic:spPr>
                     <a:xfrm>
                       <a:off x="0" y="0"/>
-                      <a:ext cx="2951999" cy="1563630"/>
+                      <a:ext cx="2951999" cy="1415801"/>
                     </a:xfrm>
                     <a:prstGeom prst="rect"/>
                   </pic:spPr>
@@ -1328,29 +1476,7 @@
           <w:i w:val="0"/>
           <w:sz w:val="16"/>
         </w:rPr>
-        <w:t>그림 1. 호출률에 따른 테스트 정확도 (5회 평균, 띠는 표준편차)</w:t>
-      </w:r>
-    </w:p>
-    <w:p>
-      <w:pPr>
-        <w:autoSpaceDE w:val="0"/>
-        <w:autoSpaceDN w:val="0"/>
-        <w:spacing w:after="50" w:line="240" w:lineRule="auto"/>
-        <w:ind w:firstLine="198"/>
-        <w:jc w:val="both"/>
-      </w:pPr>
-      <w:r>
-        <w:rPr>
-          <w:rFonts w:ascii="함초롬바탕" w:hAnsi="함초롬바탕" w:eastAsia="함초롬바탕"/>
-          <w:b w:val="0"/>
-          <w:i w:val="0"/>
-          <w:sz w:val="18"/>
-        </w:rPr>
-        <w:t xml:space="preserve">호출률 50%는 테스트가 아닌 보정 세트의 교차적합 예측으로 정하였다. 보정 세트에서 결합형 정확도는 50% 이후 0.1%p 이하로만 올라 포화되었고 전량 호출과의 차이는 0.7%p 이내였다. 이 호출률에서 결합형의 테스트 정확도는 LLM 전량 호출 중 더 높은 설정보다 0.8%p, 1.1%p 높았으나 유의하지 않았고(p=0.22, 0.18), NN</w:t>
-        <w:noBreakHyphen/>
-        <w:t xml:space="preserve">PPI 적용 전량 호출보다는 2.6%p, 2.0%p 유의하게 높았다(p&lt;0.001). 호출률을 100%로 올리면 정확도가 0.1%p, 0.6%p 더 올랐고, ClaimBuster에서는 이 차이가 유의하였다(p=0.006). 테스트 문장을 모으지 않고 보정 세트의 |d| 임계값으로 문장마다 라우팅해도 정확도는 0.920, 0.845(실제 호출 38%, 49%)였다. 교체형은 호출률이 높아질수록 임베딩 SVM이 확신하는 문장까지 바꾸어, 확신도 상위 절반에서 옳은 판정 94건을 틀리게, 틀린 판정 66건을 옳게 바꾸었으나 결합형은 각각 9건, 26건이었다(ClaimBuster 1회차). 이는 교체가 옳은 답을 해칠 수 있다는 보고[7]와 일치한다. 결합형은 LLM을 호출하는 모든 호출률에서 교체형보다 평균 정확도가 높았고(ClaimBuster 30~50%, CLEF 20~30%에서 유의, p≤0.023), 같은 문장에 LLM을 호출하고 NN</w:t>
-        <w:noBreakHyphen/>
-        <w:t xml:space="preserve">PPI로 판정하는 캐스케이드(0.898, 0.824)보다도 유의하게 높아(p&lt;0.001) 차이는 판정 방식에서 온다.</w:t>
+        <w:t>그림 2. 호출률에 따른 테스트 정확도 (5회 평균, 띠는 표준편차)</w:t>
       </w:r>
     </w:p>
     <w:p>
@@ -1358,7 +1484,7 @@
         <w:keepNext/>
         <w:autoSpaceDE w:val="0"/>
         <w:autoSpaceDN w:val="0"/>
-        <w:spacing w:before="120" w:after="60"/>
+        <w:spacing w:before="100" w:after="40"/>
       </w:pPr>
       <w:r>
         <w:rPr>
@@ -1385,7 +1511,7 @@
           <w:i w:val="0"/>
           <w:sz w:val="18"/>
         </w:rPr>
-        <w:t>팩트체크 필요성 탐지에서 라벨로 학습한 저비용 분류기와 LLM은 서로 다른 정보를 가지며, 불확실한 문장에서만 LLM을 호출해 두 점수를 결합하면 호출을 절반으로 줄여도 전량 호출과 유의한 차이가 없는 정확도를 얻는다. 출처가 겹치는[5] 영어 두 데이터셋과 단일 LLM으로 평가하였고 비용을 호출률로만 보고하였다는 한계가 있다.</w:t>
+        <w:t>라벨로 학습한 저비용 분류기와 LLM은 서로 다른 정보를 가지며, 불확실한 문장에서만 LLM을 호출해 결합하면 호출을 절반으로 줄여도 전량 호출과 유의한 차이가 없는 정확도를 얻는다. 출처가 겹치는[5] 영어 두 데이터셋과 단일 LLM으로 평가하였고 비용을 호출률로만 보고하였다는 한계가 있다.</w:t>
       </w:r>
     </w:p>
     <w:p>
@@ -1393,7 +1519,7 @@
         <w:keepNext/>
         <w:autoSpaceDE w:val="0"/>
         <w:autoSpaceDN w:val="0"/>
-        <w:spacing w:before="120" w:after="60"/>
+        <w:spacing w:before="100" w:after="40"/>
       </w:pPr>
       <w:r>
         <w:rPr>
@@ -1409,7 +1535,7 @@
       <w:pPr>
         <w:autoSpaceDE w:val="0"/>
         <w:autoSpaceDN w:val="0"/>
-        <w:spacing w:after="0" w:line="240" w:lineRule="auto"/>
+        <w:spacing w:after="0" w:line="168" w:lineRule="exact"/>
         <w:jc w:val="left"/>
       </w:pPr>
       <w:r>
@@ -1426,7 +1552,7 @@
       <w:pPr>
         <w:autoSpaceDE w:val="0"/>
         <w:autoSpaceDN w:val="0"/>
-        <w:spacing w:after="0" w:line="240" w:lineRule="auto"/>
+        <w:spacing w:after="0" w:line="168" w:lineRule="exact"/>
         <w:jc w:val="left"/>
       </w:pPr>
       <w:r>
@@ -1443,7 +1569,7 @@
       <w:pPr>
         <w:autoSpaceDE w:val="0"/>
         <w:autoSpaceDN w:val="0"/>
-        <w:spacing w:after="0" w:line="240" w:lineRule="auto"/>
+        <w:spacing w:after="0" w:line="168" w:lineRule="exact"/>
         <w:jc w:val="left"/>
       </w:pPr>
       <w:r>
@@ -1460,7 +1586,7 @@
       <w:pPr>
         <w:autoSpaceDE w:val="0"/>
         <w:autoSpaceDN w:val="0"/>
-        <w:spacing w:after="0" w:line="240" w:lineRule="auto"/>
+        <w:spacing w:after="0" w:line="168" w:lineRule="exact"/>
         <w:jc w:val="left"/>
       </w:pPr>
       <w:r>
@@ -1477,7 +1603,7 @@
       <w:pPr>
         <w:autoSpaceDE w:val="0"/>
         <w:autoSpaceDN w:val="0"/>
-        <w:spacing w:after="0" w:line="240" w:lineRule="auto"/>
+        <w:spacing w:after="0" w:line="168" w:lineRule="exact"/>
         <w:jc w:val="left"/>
       </w:pPr>
       <w:r>
@@ -1494,7 +1620,7 @@
       <w:pPr>
         <w:autoSpaceDE w:val="0"/>
         <w:autoSpaceDN w:val="0"/>
-        <w:spacing w:after="0" w:line="240" w:lineRule="auto"/>
+        <w:spacing w:after="0" w:line="168" w:lineRule="exact"/>
         <w:jc w:val="left"/>
       </w:pPr>
       <w:r>
@@ -1504,14 +1630,14 @@
           <w:i w:val="0"/>
           <w:sz w:val="14"/>
         </w:rPr>
-        <w:t>[6] F. Arslan, N. Hassan, C. Li, and M. Tremayne, "A Benchmark Dataset of Check-Worthy Factual Claims," in Proc. ICWSM, vol. 14, pp. 821–829, 2020.</w:t>
+        <w:t>[6] F. Arslan et al., "A Benchmark Dataset of Check-Worthy Factual Claims," in Proc. ICWSM, vol. 14, pp. 821–829, 2020.</w:t>
       </w:r>
     </w:p>
     <w:p>
       <w:pPr>
         <w:autoSpaceDE w:val="0"/>
         <w:autoSpaceDN w:val="0"/>
-        <w:spacing w:after="0" w:line="240" w:lineRule="auto"/>
+        <w:spacing w:after="0" w:line="168" w:lineRule="exact"/>
         <w:jc w:val="left"/>
       </w:pPr>
       <w:r>
@@ -1528,7 +1654,7 @@
       <w:pPr>
         <w:autoSpaceDE w:val="0"/>
         <w:autoSpaceDN w:val="0"/>
-        <w:spacing w:after="0" w:line="240" w:lineRule="auto"/>
+        <w:spacing w:after="0" w:line="168" w:lineRule="exact"/>
         <w:jc w:val="left"/>
       </w:pPr>
       <w:r>

</xml_diff>

<commit_message>
Figure 1 redrawn in English: decision diamond, uniform boxes, condition moved to the caption
Co-Authored-By: Claude Opus 5.5 <noreply@anthropic.com>
</commit_message>
<xml_diff>
--- a/paper/cascade_kics_draft.docx
+++ b/paper/cascade_kics_draft.docx
@@ -370,7 +370,7 @@
       <w:r>
         <w:drawing>
           <wp:inline xmlns:a="http://schemas.openxmlformats.org/drawingml/2006/main" xmlns:pic="http://schemas.openxmlformats.org/drawingml/2006/picture">
-            <wp:extent cx="2365120" cy="717765"/>
+            <wp:extent cx="2568701" cy="778533"/>
             <wp:docPr id="1" name="Picture 1"/>
             <wp:cNvGraphicFramePr>
               <a:graphicFrameLocks noChangeAspect="1"/>
@@ -391,7 +391,7 @@
                   <pic:spPr>
                     <a:xfrm>
                       <a:off x="0" y="0"/>
-                      <a:ext cx="2365120" cy="717765"/>
+                      <a:ext cx="2568701" cy="778533"/>
                     </a:xfrm>
                     <a:prstGeom prst="rect"/>
                   </pic:spPr>
@@ -416,7 +416,7 @@
           <w:i w:val="0"/>
           <w:sz w:val="16"/>
         </w:rPr>
-        <w:t>그림 1. 결합형의 처리 흐름 (파란 상자가 제안하는 결합 판정)</w:t>
+        <w:t>그림 1. 결합형의 처리 흐름 (Uncertain: |d(x)|가 하위 ρ에 속함)</w:t>
       </w:r>
     </w:p>
     <w:p>

</xml_diff>

<commit_message>
KICS official template layout (HY신명조 + Times New Roman, template margins/sizes, 9pt references) and README on the full test sets
- build_docx.py follows the KICS Word sample (conf.kics.or.kr/2026f): title 13pt, body/references 9pt,
  2-col section T/B/L 2 cm R 1.5 cm, gap 0.75 cm; Table 1 kept on one column
- README: full-set numbers (CLEF 1,691 / ClaimBuster 2,745), NN-PPI-cascade row, updated commands

Co-Authored-By: Claude Opus 5.5 <noreply@anthropic.com>
</commit_message>
<xml_diff>
--- a/paper/cascade_kics_draft.docx
+++ b/paper/cascade_kics_draft.docx
@@ -11,10 +11,10 @@
       </w:pPr>
       <w:r>
         <w:rPr>
-          <w:rFonts w:ascii="함초롬바탕" w:hAnsi="함초롬바탕" w:eastAsia="함초롬바탕"/>
+          <w:rFonts w:ascii="Times New Roman" w:hAnsi="Times New Roman" w:eastAsia="HY신명조"/>
           <w:b/>
           <w:i w:val="0"/>
-          <w:sz w:val="30"/>
+          <w:sz w:val="26"/>
         </w:rPr>
         <w:t>저비용 분류기와 대형 언어 모델의 선택적 결합을 통한</w:t>
       </w:r>
@@ -23,15 +23,15 @@
       <w:pPr>
         <w:autoSpaceDE w:val="0"/>
         <w:autoSpaceDN w:val="0"/>
-        <w:spacing w:after="160"/>
+        <w:spacing w:after="0"/>
         <w:jc w:val="center"/>
       </w:pPr>
       <w:r>
         <w:rPr>
-          <w:rFonts w:ascii="함초롬바탕" w:hAnsi="함초롬바탕" w:eastAsia="함초롬바탕"/>
+          <w:rFonts w:ascii="Times New Roman" w:hAnsi="Times New Roman" w:eastAsia="HY신명조"/>
           <w:b/>
           <w:i w:val="0"/>
-          <w:sz w:val="30"/>
+          <w:sz w:val="26"/>
         </w:rPr>
         <w:t>팩트체크 필요성 탐지</w:t>
       </w:r>
@@ -40,12 +40,12 @@
       <w:pPr>
         <w:autoSpaceDE w:val="0"/>
         <w:autoSpaceDN w:val="0"/>
-        <w:spacing w:after="20"/>
+        <w:spacing w:after="0" w:before="152"/>
         <w:jc w:val="center"/>
       </w:pPr>
       <w:r>
         <w:rPr>
-          <w:rFonts w:ascii="함초롬바탕" w:hAnsi="함초롬바탕" w:eastAsia="함초롬바탕"/>
+          <w:rFonts w:ascii="Times New Roman" w:hAnsi="Times New Roman" w:eastAsia="HY신명조"/>
           <w:b w:val="0"/>
           <w:i w:val="0"/>
           <w:sz w:val="22"/>
@@ -57,15 +57,15 @@
       <w:pPr>
         <w:autoSpaceDE w:val="0"/>
         <w:autoSpaceDN w:val="0"/>
-        <w:spacing w:after="20"/>
+        <w:spacing w:after="0"/>
         <w:jc w:val="center"/>
       </w:pPr>
       <w:r>
         <w:rPr>
-          <w:rFonts w:ascii="함초롬바탕" w:hAnsi="함초롬바탕" w:eastAsia="함초롬바탕"/>
+          <w:rFonts w:ascii="Times New Roman" w:hAnsi="Times New Roman" w:eastAsia="HY신명조"/>
           <w:b w:val="0"/>
           <w:i w:val="0"/>
-          <w:sz w:val="20"/>
+          <w:sz w:val="22"/>
         </w:rPr>
         <w:t>(소속 입력 필요)</w:t>
       </w:r>
@@ -74,15 +74,15 @@
       <w:pPr>
         <w:autoSpaceDE w:val="0"/>
         <w:autoSpaceDN w:val="0"/>
-        <w:spacing w:after="160"/>
+        <w:spacing w:after="152"/>
         <w:jc w:val="center"/>
       </w:pPr>
       <w:r>
         <w:rPr>
-          <w:rFonts w:ascii="함초롬바탕" w:hAnsi="함초롬바탕" w:eastAsia="함초롬바탕"/>
+          <w:rFonts w:ascii="Times New Roman" w:hAnsi="Times New Roman" w:eastAsia="HY신명조"/>
           <w:b w:val="0"/>
           <w:i w:val="0"/>
-          <w:sz w:val="19"/>
+          <w:sz w:val="22"/>
         </w:rPr>
         <w:t>leejb020313@gmail.com</w:t>
       </w:r>
@@ -91,15 +91,15 @@
       <w:pPr>
         <w:autoSpaceDE w:val="0"/>
         <w:autoSpaceDN w:val="0"/>
-        <w:spacing w:after="100"/>
+        <w:spacing w:after="0"/>
         <w:jc w:val="center"/>
       </w:pPr>
       <w:r>
         <w:rPr>
-          <w:rFonts w:ascii="Times New Roman" w:hAnsi="Times New Roman" w:eastAsia="Times New Roman"/>
+          <w:rFonts w:ascii="Times New Roman" w:hAnsi="Times New Roman" w:eastAsia="HY신명조"/>
           <w:b/>
           <w:i w:val="0"/>
-          <w:sz w:val="25"/>
+          <w:sz w:val="26"/>
         </w:rPr>
         <w:t xml:space="preserve">Cost</w:t>
         <w:noBreakHyphen/>
@@ -116,12 +116,12 @@
       <w:pPr>
         <w:autoSpaceDE w:val="0"/>
         <w:autoSpaceDN w:val="0"/>
-        <w:spacing w:after="20"/>
+        <w:spacing w:after="0" w:before="284"/>
         <w:jc w:val="center"/>
       </w:pPr>
       <w:r>
         <w:rPr>
-          <w:rFonts w:ascii="Times New Roman" w:hAnsi="Times New Roman" w:eastAsia="Times New Roman"/>
+          <w:rFonts w:ascii="Times New Roman" w:hAnsi="Times New Roman" w:eastAsia="HY신명조"/>
           <w:b w:val="0"/>
           <w:i w:val="0"/>
           <w:sz w:val="22"/>
@@ -133,15 +133,15 @@
       <w:pPr>
         <w:autoSpaceDE w:val="0"/>
         <w:autoSpaceDN w:val="0"/>
-        <w:spacing w:after="160"/>
+        <w:spacing w:after="284"/>
         <w:jc w:val="center"/>
       </w:pPr>
       <w:r>
         <w:rPr>
-          <w:rFonts w:ascii="Times New Roman" w:hAnsi="Times New Roman" w:eastAsia="Times New Roman"/>
+          <w:rFonts w:ascii="Times New Roman" w:hAnsi="Times New Roman" w:eastAsia="HY신명조"/>
           <w:b w:val="0"/>
           <w:i w:val="0"/>
-          <w:sz w:val="20"/>
+          <w:sz w:val="22"/>
         </w:rPr>
         <w:t>(Affiliation)</w:t>
       </w:r>
@@ -155,10 +155,10 @@
       </w:pPr>
       <w:r>
         <w:rPr>
-          <w:rFonts w:ascii="함초롬바탕" w:hAnsi="함초롬바탕" w:eastAsia="함초롬바탕"/>
-          <w:b/>
+          <w:rFonts w:ascii="Times New Roman" w:hAnsi="Times New Roman" w:eastAsia="HY신명조"/>
+          <w:b w:val="0"/>
           <w:i w:val="0"/>
-          <w:sz w:val="21"/>
+          <w:sz w:val="22"/>
         </w:rPr>
         <w:t>요 약</w:t>
       </w:r>
@@ -173,7 +173,7 @@
       </w:pPr>
       <w:r>
         <w:rPr>
-          <w:rFonts w:ascii="함초롬바탕" w:hAnsi="함초롬바탕" w:eastAsia="함초롬바탕"/>
+          <w:rFonts w:ascii="Times New Roman" w:hAnsi="Times New Roman" w:eastAsia="HY신명조"/>
           <w:b w:val="0"/>
           <w:i w:val="0"/>
           <w:sz w:val="18"/>
@@ -195,7 +195,7 @@
         <w:autoSpaceDN w:val="0"/>
         <w:sectPr>
           <w:pgSz w:w="11906" w:h="16838"/>
-          <w:pgMar w:top="1247" w:right="1020" w:bottom="1134" w:left="1020" w:header="720" w:footer="720" w:gutter="0"/>
+          <w:pgMar w:top="850" w:right="850" w:bottom="850" w:left="850" w:header="720" w:footer="720" w:gutter="0"/>
           <w:cols w:space="720"/>
           <w:docGrid w:linePitch="360"/>
         </w:sectPr>
@@ -206,14 +206,14 @@
         <w:keepNext/>
         <w:autoSpaceDE w:val="0"/>
         <w:autoSpaceDN w:val="0"/>
-        <w:spacing w:before="100" w:after="40"/>
+        <w:spacing w:before="120" w:after="95"/>
       </w:pPr>
       <w:r>
         <w:rPr>
-          <w:rFonts w:ascii="함초롬바탕" w:hAnsi="함초롬바탕" w:eastAsia="함초롬바탕"/>
+          <w:rFonts w:ascii="Times New Roman" w:hAnsi="Times New Roman" w:eastAsia="HY신명조"/>
           <w:b/>
           <w:i w:val="0"/>
-          <w:sz w:val="21"/>
+          <w:sz w:val="18"/>
         </w:rPr>
         <w:t>Ⅰ. 서 론</w:t>
       </w:r>
@@ -223,12 +223,12 @@
         <w:autoSpaceDE w:val="0"/>
         <w:autoSpaceDN w:val="0"/>
         <w:spacing w:after="50" w:line="240" w:lineRule="auto"/>
-        <w:ind w:firstLine="198"/>
+        <w:ind w:firstLine="180"/>
         <w:jc w:val="both"/>
       </w:pPr>
       <w:r>
         <w:rPr>
-          <w:rFonts w:ascii="함초롬바탕" w:hAnsi="함초롬바탕" w:eastAsia="함초롬바탕"/>
+          <w:rFonts w:ascii="Times New Roman" w:hAnsi="Times New Roman" w:eastAsia="HY신명조"/>
           <w:b w:val="0"/>
           <w:i w:val="0"/>
           <w:sz w:val="18"/>
@@ -243,12 +243,12 @@
         <w:autoSpaceDE w:val="0"/>
         <w:autoSpaceDN w:val="0"/>
         <w:spacing w:after="50" w:line="240" w:lineRule="auto"/>
-        <w:ind w:firstLine="198"/>
+        <w:ind w:firstLine="180"/>
         <w:jc w:val="both"/>
       </w:pPr>
       <w:r>
         <w:rPr>
-          <w:rFonts w:ascii="함초롬바탕" w:hAnsi="함초롬바탕" w:eastAsia="함초롬바탕"/>
+          <w:rFonts w:ascii="Times New Roman" w:hAnsi="Times New Roman" w:eastAsia="HY신명조"/>
           <w:b w:val="0"/>
           <w:i w:val="0"/>
           <w:sz w:val="18"/>
@@ -265,14 +265,14 @@
         <w:keepNext/>
         <w:autoSpaceDE w:val="0"/>
         <w:autoSpaceDN w:val="0"/>
-        <w:spacing w:before="100" w:after="40"/>
+        <w:spacing w:before="120" w:after="95"/>
       </w:pPr>
       <w:r>
         <w:rPr>
-          <w:rFonts w:ascii="함초롬바탕" w:hAnsi="함초롬바탕" w:eastAsia="함초롬바탕"/>
+          <w:rFonts w:ascii="Times New Roman" w:hAnsi="Times New Roman" w:eastAsia="HY신명조"/>
           <w:b/>
           <w:i w:val="0"/>
-          <w:sz w:val="21"/>
+          <w:sz w:val="18"/>
         </w:rPr>
         <w:t>Ⅱ. 제안 기법</w:t>
       </w:r>
@@ -286,10 +286,10 @@
       </w:pPr>
       <w:r>
         <w:rPr>
-          <w:rFonts w:ascii="함초롬바탕" w:hAnsi="함초롬바탕" w:eastAsia="함초롬바탕"/>
+          <w:rFonts w:ascii="Times New Roman" w:hAnsi="Times New Roman" w:eastAsia="HY신명조"/>
           <w:b/>
           <w:i w:val="0"/>
-          <w:sz w:val="19"/>
+          <w:sz w:val="18"/>
         </w:rPr>
         <w:t>2.1 저비용 분류기</w:t>
       </w:r>
@@ -299,12 +299,12 @@
         <w:autoSpaceDE w:val="0"/>
         <w:autoSpaceDN w:val="0"/>
         <w:spacing w:after="50" w:line="240" w:lineRule="auto"/>
-        <w:ind w:firstLine="198"/>
+        <w:ind w:firstLine="180"/>
         <w:jc w:val="both"/>
       </w:pPr>
       <w:r>
         <w:rPr>
-          <w:rFonts w:ascii="함초롬바탕" w:hAnsi="함초롬바탕" w:eastAsia="함초롬바탕"/>
+          <w:rFonts w:ascii="Times New Roman" w:hAnsi="Times New Roman" w:eastAsia="HY신명조"/>
           <w:b w:val="0"/>
           <w:i w:val="0"/>
           <w:sz w:val="18"/>
@@ -333,10 +333,10 @@
       </w:pPr>
       <w:r>
         <w:rPr>
-          <w:rFonts w:ascii="함초롬바탕" w:hAnsi="함초롬바탕" w:eastAsia="함초롬바탕"/>
+          <w:rFonts w:ascii="Times New Roman" w:hAnsi="Times New Roman" w:eastAsia="HY신명조"/>
           <w:b/>
           <w:i w:val="0"/>
-          <w:sz w:val="19"/>
+          <w:sz w:val="18"/>
         </w:rPr>
         <w:t>2.2 결합형 캐스케이드</w:t>
       </w:r>
@@ -346,12 +346,12 @@
         <w:autoSpaceDE w:val="0"/>
         <w:autoSpaceDN w:val="0"/>
         <w:spacing w:after="50" w:line="240" w:lineRule="auto"/>
-        <w:ind w:firstLine="198"/>
+        <w:ind w:firstLine="180"/>
         <w:jc w:val="both"/>
       </w:pPr>
       <w:r>
         <w:rPr>
-          <w:rFonts w:ascii="함초롬바탕" w:hAnsi="함초롬바탕" w:eastAsia="함초롬바탕"/>
+          <w:rFonts w:ascii="Times New Roman" w:hAnsi="Times New Roman" w:eastAsia="HY신명조"/>
           <w:b w:val="0"/>
           <w:i w:val="0"/>
           <w:sz w:val="18"/>
@@ -411,7 +411,7 @@
       </w:pPr>
       <w:r>
         <w:rPr>
-          <w:rFonts w:ascii="함초롬바탕" w:hAnsi="함초롬바탕" w:eastAsia="함초롬바탕"/>
+          <w:rFonts w:ascii="Times New Roman" w:hAnsi="Times New Roman" w:eastAsia="HY신명조"/>
           <w:b/>
           <w:i w:val="0"/>
           <w:sz w:val="16"/>
@@ -422,8 +422,8 @@
     <w:p>
       <w:pPr>
         <w:tabs>
-          <w:tab w:pos="2381" w:val="center"/>
-          <w:tab w:pos="4762" w:val="right"/>
+          <w:tab w:pos="2374" w:val="center"/>
+          <w:tab w:pos="4748" w:val="right"/>
         </w:tabs>
         <w:autoSpaceDE w:val="0"/>
         <w:autoSpaceDN w:val="0"/>
@@ -438,7 +438,7 @@
         </w:rPr>
         <w:drawing>
           <wp:inline xmlns:a="http://schemas.openxmlformats.org/drawingml/2006/main" xmlns:pic="http://schemas.openxmlformats.org/drawingml/2006/picture">
-            <wp:extent cx="2091829" cy="134630"/>
+            <wp:extent cx="1981733" cy="127544"/>
             <wp:docPr id="2" name="Picture 2"/>
             <wp:cNvGraphicFramePr>
               <a:graphicFrameLocks noChangeAspect="1"/>
@@ -459,7 +459,7 @@
                   <pic:spPr>
                     <a:xfrm>
                       <a:off x="0" y="0"/>
-                      <a:ext cx="2091829" cy="134630"/>
+                      <a:ext cx="1981733" cy="127544"/>
                     </a:xfrm>
                     <a:prstGeom prst="rect"/>
                   </pic:spPr>
@@ -471,7 +471,7 @@
       </w:r>
       <w:r>
         <w:rPr>
-          <w:rFonts w:ascii="함초롬바탕" w:hAnsi="함초롬바탕" w:eastAsia="함초롬바탕"/>
+          <w:rFonts w:ascii="Times New Roman" w:hAnsi="Times New Roman" w:eastAsia="HY신명조"/>
           <w:b w:val="0"/>
           <w:i w:val="0"/>
           <w:sz w:val="18"/>
@@ -486,12 +486,12 @@
         <w:autoSpaceDE w:val="0"/>
         <w:autoSpaceDN w:val="0"/>
         <w:spacing w:after="50" w:line="240" w:lineRule="auto"/>
-        <w:ind w:firstLine="198"/>
+        <w:ind w:firstLine="180"/>
         <w:jc w:val="both"/>
       </w:pPr>
       <w:r>
         <w:rPr>
-          <w:rFonts w:ascii="함초롬바탕" w:hAnsi="함초롬바탕" w:eastAsia="함초롬바탕"/>
+          <w:rFonts w:ascii="Times New Roman" w:hAnsi="Times New Roman" w:eastAsia="HY신명조"/>
           <w:b w:val="0"/>
           <w:i w:val="0"/>
           <w:sz w:val="18"/>
@@ -504,7 +504,7 @@
         </w:rPr>
         <w:drawing>
           <wp:inline xmlns:a="http://schemas.openxmlformats.org/drawingml/2006/main" xmlns:pic="http://schemas.openxmlformats.org/drawingml/2006/picture">
-            <wp:extent cx="161309" cy="133944"/>
+            <wp:extent cx="152819" cy="126894"/>
             <wp:docPr id="3" name="Picture 3"/>
             <wp:cNvGraphicFramePr>
               <a:graphicFrameLocks noChangeAspect="1"/>
@@ -525,7 +525,7 @@
                   <pic:spPr>
                     <a:xfrm>
                       <a:off x="0" y="0"/>
-                      <a:ext cx="161309" cy="133944"/>
+                      <a:ext cx="152819" cy="126894"/>
                     </a:xfrm>
                     <a:prstGeom prst="rect"/>
                   </pic:spPr>
@@ -537,7 +537,7 @@
       </w:r>
       <w:r>
         <w:rPr>
-          <w:rFonts w:ascii="함초롬바탕" w:hAnsi="함초롬바탕" w:eastAsia="함초롬바탕"/>
+          <w:rFonts w:ascii="Times New Roman" w:hAnsi="Times New Roman" w:eastAsia="HY신명조"/>
           <w:b w:val="0"/>
           <w:i w:val="0"/>
           <w:sz w:val="18"/>
@@ -550,14 +550,14 @@
         <w:keepNext/>
         <w:autoSpaceDE w:val="0"/>
         <w:autoSpaceDN w:val="0"/>
-        <w:spacing w:before="100" w:after="40"/>
+        <w:spacing w:before="120" w:after="95"/>
       </w:pPr>
       <w:r>
         <w:rPr>
-          <w:rFonts w:ascii="함초롬바탕" w:hAnsi="함초롬바탕" w:eastAsia="함초롬바탕"/>
+          <w:rFonts w:ascii="Times New Roman" w:hAnsi="Times New Roman" w:eastAsia="HY신명조"/>
           <w:b/>
           <w:i w:val="0"/>
-          <w:sz w:val="21"/>
+          <w:sz w:val="18"/>
         </w:rPr>
         <w:t>Ⅲ. 실험 및 결과</w:t>
       </w:r>
@@ -571,10 +571,10 @@
       </w:pPr>
       <w:r>
         <w:rPr>
-          <w:rFonts w:ascii="함초롬바탕" w:hAnsi="함초롬바탕" w:eastAsia="함초롬바탕"/>
+          <w:rFonts w:ascii="Times New Roman" w:hAnsi="Times New Roman" w:eastAsia="HY신명조"/>
           <w:b/>
           <w:i w:val="0"/>
-          <w:sz w:val="19"/>
+          <w:sz w:val="18"/>
         </w:rPr>
         <w:t>3.1 실험 설정</w:t>
       </w:r>
@@ -584,12 +584,12 @@
         <w:autoSpaceDE w:val="0"/>
         <w:autoSpaceDN w:val="0"/>
         <w:spacing w:after="50" w:line="240" w:lineRule="auto"/>
-        <w:ind w:firstLine="198"/>
+        <w:ind w:firstLine="180"/>
         <w:jc w:val="both"/>
       </w:pPr>
       <w:r>
         <w:rPr>
-          <w:rFonts w:ascii="함초롬바탕" w:hAnsi="함초롬바탕" w:eastAsia="함초롬바탕"/>
+          <w:rFonts w:ascii="Times New Roman" w:hAnsi="Times New Roman" w:eastAsia="HY신명조"/>
           <w:b w:val="0"/>
           <w:i w:val="0"/>
           <w:sz w:val="18"/>
@@ -614,16 +614,17 @@
       </w:pPr>
       <w:r>
         <w:rPr>
-          <w:rFonts w:ascii="함초롬바탕" w:hAnsi="함초롬바탕" w:eastAsia="함초롬바탕"/>
+          <w:rFonts w:ascii="Times New Roman" w:hAnsi="Times New Roman" w:eastAsia="HY신명조"/>
           <w:b/>
           <w:i w:val="0"/>
-          <w:sz w:val="19"/>
+          <w:sz w:val="18"/>
         </w:rPr>
         <w:t>3.2 결과</w:t>
       </w:r>
     </w:p>
     <w:p>
       <w:pPr>
+        <w:keepNext/>
         <w:autoSpaceDE w:val="0"/>
         <w:autoSpaceDN w:val="0"/>
         <w:spacing w:before="80" w:after="40"/>
@@ -631,7 +632,7 @@
       </w:pPr>
       <w:r>
         <w:rPr>
-          <w:rFonts w:ascii="함초롬바탕" w:hAnsi="함초롬바탕" w:eastAsia="함초롬바탕"/>
+          <w:rFonts w:ascii="Times New Roman" w:hAnsi="Times New Roman" w:eastAsia="HY신명조"/>
           <w:b/>
           <w:i w:val="0"/>
           <w:sz w:val="17"/>
@@ -647,18 +648,19 @@
         <w:tblLook w:firstColumn="1" w:firstRow="1" w:lastColumn="0" w:lastRow="0" w:noHBand="0" w:noVBand="1" w:val="04A0"/>
       </w:tblPr>
       <w:tblGrid>
-        <w:gridCol w:w="2466"/>
-        <w:gridCol w:w="2466"/>
-        <w:gridCol w:w="2466"/>
-        <w:gridCol w:w="2466"/>
+        <w:gridCol w:w="2480"/>
+        <w:gridCol w:w="2480"/>
+        <w:gridCol w:w="2480"/>
+        <w:gridCol w:w="2480"/>
       </w:tblGrid>
       <w:tr>
         <w:tc>
           <w:tcPr>
-            <w:tcW w:type="dxa" w:w="2211"/>
+            <w:tcW w:type="dxa" w:w="2438"/>
           </w:tcPr>
           <w:p>
             <w:pPr>
+              <w:keepNext/>
               <w:autoSpaceDE w:val="0"/>
               <w:autoSpaceDN w:val="0"/>
               <w:jc w:val="center"/>
@@ -666,7 +668,7 @@
             <w:r/>
             <w:r>
               <w:rPr>
-                <w:rFonts w:ascii="함초롬바탕" w:hAnsi="함초롬바탕" w:eastAsia="함초롬바탕"/>
+                <w:rFonts w:ascii="Times New Roman" w:hAnsi="Times New Roman" w:eastAsia="HY신명조"/>
                 <w:b/>
                 <w:i w:val="0"/>
                 <w:sz w:val="16"/>
@@ -677,10 +679,11 @@
         </w:tc>
         <w:tc>
           <w:tcPr>
-            <w:tcW w:type="dxa" w:w="737"/>
+            <w:tcW w:type="dxa" w:w="652"/>
           </w:tcPr>
           <w:p>
             <w:pPr>
+              <w:keepNext/>
               <w:autoSpaceDE w:val="0"/>
               <w:autoSpaceDN w:val="0"/>
               <w:jc w:val="center"/>
@@ -688,7 +691,7 @@
             <w:r/>
             <w:r>
               <w:rPr>
-                <w:rFonts w:ascii="함초롬바탕" w:hAnsi="함초롬바탕" w:eastAsia="함초롬바탕"/>
+                <w:rFonts w:ascii="Times New Roman" w:hAnsi="Times New Roman" w:eastAsia="HY신명조"/>
                 <w:b/>
                 <w:i w:val="0"/>
                 <w:sz w:val="16"/>
@@ -699,10 +702,11 @@
         </w:tc>
         <w:tc>
           <w:tcPr>
-            <w:tcW w:type="dxa" w:w="737"/>
+            <w:tcW w:type="dxa" w:w="680"/>
           </w:tcPr>
           <w:p>
             <w:pPr>
+              <w:keepNext/>
               <w:autoSpaceDE w:val="0"/>
               <w:autoSpaceDN w:val="0"/>
               <w:jc w:val="center"/>
@@ -710,7 +714,7 @@
             <w:r/>
             <w:r>
               <w:rPr>
-                <w:rFonts w:ascii="함초롬바탕" w:hAnsi="함초롬바탕" w:eastAsia="함초롬바탕"/>
+                <w:rFonts w:ascii="Times New Roman" w:hAnsi="Times New Roman" w:eastAsia="HY신명조"/>
                 <w:b/>
                 <w:i w:val="0"/>
                 <w:sz w:val="16"/>
@@ -725,6 +729,7 @@
           </w:tcPr>
           <w:p>
             <w:pPr>
+              <w:keepNext/>
               <w:autoSpaceDE w:val="0"/>
               <w:autoSpaceDN w:val="0"/>
               <w:jc w:val="center"/>
@@ -732,7 +737,7 @@
             <w:r/>
             <w:r>
               <w:rPr>
-                <w:rFonts w:ascii="함초롬바탕" w:hAnsi="함초롬바탕" w:eastAsia="함초롬바탕"/>
+                <w:rFonts w:ascii="Times New Roman" w:hAnsi="Times New Roman" w:eastAsia="HY신명조"/>
                 <w:b/>
                 <w:i w:val="0"/>
                 <w:sz w:val="16"/>
@@ -745,10 +750,11 @@
       <w:tr>
         <w:tc>
           <w:tcPr>
-            <w:tcW w:type="dxa" w:w="2211"/>
+            <w:tcW w:type="dxa" w:w="2438"/>
           </w:tcPr>
           <w:p>
             <w:pPr>
+              <w:keepNext/>
               <w:autoSpaceDE w:val="0"/>
               <w:autoSpaceDN w:val="0"/>
               <w:jc w:val="left"/>
@@ -756,7 +762,7 @@
             <w:r/>
             <w:r>
               <w:rPr>
-                <w:rFonts w:ascii="함초롬바탕" w:hAnsi="함초롬바탕" w:eastAsia="함초롬바탕"/>
+                <w:rFonts w:ascii="Times New Roman" w:hAnsi="Times New Roman" w:eastAsia="HY신명조"/>
                 <w:b w:val="0"/>
                 <w:i w:val="0"/>
                 <w:sz w:val="16"/>
@@ -769,10 +775,11 @@
         </w:tc>
         <w:tc>
           <w:tcPr>
-            <w:tcW w:type="dxa" w:w="737"/>
+            <w:tcW w:type="dxa" w:w="652"/>
           </w:tcPr>
           <w:p>
             <w:pPr>
+              <w:keepNext/>
               <w:autoSpaceDE w:val="0"/>
               <w:autoSpaceDN w:val="0"/>
               <w:jc w:val="center"/>
@@ -780,7 +787,7 @@
             <w:r/>
             <w:r>
               <w:rPr>
-                <w:rFonts w:ascii="함초롬바탕" w:hAnsi="함초롬바탕" w:eastAsia="함초롬바탕"/>
+                <w:rFonts w:ascii="Times New Roman" w:hAnsi="Times New Roman" w:eastAsia="HY신명조"/>
                 <w:b w:val="0"/>
                 <w:i w:val="0"/>
                 <w:sz w:val="16"/>
@@ -791,10 +798,11 @@
         </w:tc>
         <w:tc>
           <w:tcPr>
-            <w:tcW w:type="dxa" w:w="737"/>
+            <w:tcW w:type="dxa" w:w="680"/>
           </w:tcPr>
           <w:p>
             <w:pPr>
+              <w:keepNext/>
               <w:autoSpaceDE w:val="0"/>
               <w:autoSpaceDN w:val="0"/>
               <w:jc w:val="center"/>
@@ -802,7 +810,7 @@
             <w:r/>
             <w:r>
               <w:rPr>
-                <w:rFonts w:ascii="함초롬바탕" w:hAnsi="함초롬바탕" w:eastAsia="함초롬바탕"/>
+                <w:rFonts w:ascii="Times New Roman" w:hAnsi="Times New Roman" w:eastAsia="HY신명조"/>
                 <w:b w:val="0"/>
                 <w:i w:val="0"/>
                 <w:sz w:val="16"/>
@@ -817,6 +825,7 @@
           </w:tcPr>
           <w:p>
             <w:pPr>
+              <w:keepNext/>
               <w:autoSpaceDE w:val="0"/>
               <w:autoSpaceDN w:val="0"/>
               <w:jc w:val="center"/>
@@ -824,7 +833,7 @@
             <w:r/>
             <w:r>
               <w:rPr>
-                <w:rFonts w:ascii="함초롬바탕" w:hAnsi="함초롬바탕" w:eastAsia="함초롬바탕"/>
+                <w:rFonts w:ascii="Times New Roman" w:hAnsi="Times New Roman" w:eastAsia="HY신명조"/>
                 <w:b w:val="0"/>
                 <w:i w:val="0"/>
                 <w:sz w:val="16"/>
@@ -837,10 +846,11 @@
       <w:tr>
         <w:tc>
           <w:tcPr>
-            <w:tcW w:type="dxa" w:w="2211"/>
+            <w:tcW w:type="dxa" w:w="2438"/>
           </w:tcPr>
           <w:p>
             <w:pPr>
+              <w:keepNext/>
               <w:autoSpaceDE w:val="0"/>
               <w:autoSpaceDN w:val="0"/>
               <w:jc w:val="left"/>
@@ -848,7 +858,7 @@
             <w:r/>
             <w:r>
               <w:rPr>
-                <w:rFonts w:ascii="함초롬바탕" w:hAnsi="함초롬바탕" w:eastAsia="함초롬바탕"/>
+                <w:rFonts w:ascii="Times New Roman" w:hAnsi="Times New Roman" w:eastAsia="HY신명조"/>
                 <w:b w:val="0"/>
                 <w:i w:val="0"/>
                 <w:sz w:val="16"/>
@@ -859,10 +869,11 @@
         </w:tc>
         <w:tc>
           <w:tcPr>
-            <w:tcW w:type="dxa" w:w="737"/>
+            <w:tcW w:type="dxa" w:w="652"/>
           </w:tcPr>
           <w:p>
             <w:pPr>
+              <w:keepNext/>
               <w:autoSpaceDE w:val="0"/>
               <w:autoSpaceDN w:val="0"/>
               <w:jc w:val="center"/>
@@ -870,7 +881,7 @@
             <w:r/>
             <w:r>
               <w:rPr>
-                <w:rFonts w:ascii="함초롬바탕" w:hAnsi="함초롬바탕" w:eastAsia="함초롬바탕"/>
+                <w:rFonts w:ascii="Times New Roman" w:hAnsi="Times New Roman" w:eastAsia="HY신명조"/>
                 <w:b w:val="0"/>
                 <w:i w:val="0"/>
                 <w:sz w:val="16"/>
@@ -881,10 +892,11 @@
         </w:tc>
         <w:tc>
           <w:tcPr>
-            <w:tcW w:type="dxa" w:w="737"/>
+            <w:tcW w:type="dxa" w:w="680"/>
           </w:tcPr>
           <w:p>
             <w:pPr>
+              <w:keepNext/>
               <w:autoSpaceDE w:val="0"/>
               <w:autoSpaceDN w:val="0"/>
               <w:jc w:val="center"/>
@@ -892,7 +904,7 @@
             <w:r/>
             <w:r>
               <w:rPr>
-                <w:rFonts w:ascii="함초롬바탕" w:hAnsi="함초롬바탕" w:eastAsia="함초롬바탕"/>
+                <w:rFonts w:ascii="Times New Roman" w:hAnsi="Times New Roman" w:eastAsia="HY신명조"/>
                 <w:b w:val="0"/>
                 <w:i w:val="0"/>
                 <w:sz w:val="16"/>
@@ -907,6 +919,7 @@
           </w:tcPr>
           <w:p>
             <w:pPr>
+              <w:keepNext/>
               <w:autoSpaceDE w:val="0"/>
               <w:autoSpaceDN w:val="0"/>
               <w:jc w:val="center"/>
@@ -914,7 +927,7 @@
             <w:r/>
             <w:r>
               <w:rPr>
-                <w:rFonts w:ascii="함초롬바탕" w:hAnsi="함초롬바탕" w:eastAsia="함초롬바탕"/>
+                <w:rFonts w:ascii="Times New Roman" w:hAnsi="Times New Roman" w:eastAsia="HY신명조"/>
                 <w:b w:val="0"/>
                 <w:i w:val="0"/>
                 <w:sz w:val="16"/>
@@ -927,10 +940,11 @@
       <w:tr>
         <w:tc>
           <w:tcPr>
-            <w:tcW w:type="dxa" w:w="2211"/>
+            <w:tcW w:type="dxa" w:w="2438"/>
           </w:tcPr>
           <w:p>
             <w:pPr>
+              <w:keepNext/>
               <w:autoSpaceDE w:val="0"/>
               <w:autoSpaceDN w:val="0"/>
               <w:jc w:val="left"/>
@@ -938,7 +952,7 @@
             <w:r/>
             <w:r>
               <w:rPr>
-                <w:rFonts w:ascii="함초롬바탕" w:hAnsi="함초롬바탕" w:eastAsia="함초롬바탕"/>
+                <w:rFonts w:ascii="Times New Roman" w:hAnsi="Times New Roman" w:eastAsia="HY신명조"/>
                 <w:b w:val="0"/>
                 <w:i w:val="0"/>
                 <w:sz w:val="16"/>
@@ -949,10 +963,11 @@
         </w:tc>
         <w:tc>
           <w:tcPr>
-            <w:tcW w:type="dxa" w:w="737"/>
+            <w:tcW w:type="dxa" w:w="652"/>
           </w:tcPr>
           <w:p>
             <w:pPr>
+              <w:keepNext/>
               <w:autoSpaceDE w:val="0"/>
               <w:autoSpaceDN w:val="0"/>
               <w:jc w:val="center"/>
@@ -960,7 +975,7 @@
             <w:r/>
             <w:r>
               <w:rPr>
-                <w:rFonts w:ascii="함초롬바탕" w:hAnsi="함초롬바탕" w:eastAsia="함초롬바탕"/>
+                <w:rFonts w:ascii="Times New Roman" w:hAnsi="Times New Roman" w:eastAsia="HY신명조"/>
                 <w:b w:val="0"/>
                 <w:i w:val="0"/>
                 <w:sz w:val="16"/>
@@ -971,10 +986,11 @@
         </w:tc>
         <w:tc>
           <w:tcPr>
-            <w:tcW w:type="dxa" w:w="737"/>
+            <w:tcW w:type="dxa" w:w="680"/>
           </w:tcPr>
           <w:p>
             <w:pPr>
+              <w:keepNext/>
               <w:autoSpaceDE w:val="0"/>
               <w:autoSpaceDN w:val="0"/>
               <w:jc w:val="center"/>
@@ -982,7 +998,7 @@
             <w:r/>
             <w:r>
               <w:rPr>
-                <w:rFonts w:ascii="함초롬바탕" w:hAnsi="함초롬바탕" w:eastAsia="함초롬바탕"/>
+                <w:rFonts w:ascii="Times New Roman" w:hAnsi="Times New Roman" w:eastAsia="HY신명조"/>
                 <w:b w:val="0"/>
                 <w:i w:val="0"/>
                 <w:sz w:val="16"/>
@@ -997,6 +1013,7 @@
           </w:tcPr>
           <w:p>
             <w:pPr>
+              <w:keepNext/>
               <w:autoSpaceDE w:val="0"/>
               <w:autoSpaceDN w:val="0"/>
               <w:jc w:val="center"/>
@@ -1004,7 +1021,7 @@
             <w:r/>
             <w:r>
               <w:rPr>
-                <w:rFonts w:ascii="함초롬바탕" w:hAnsi="함초롬바탕" w:eastAsia="함초롬바탕"/>
+                <w:rFonts w:ascii="Times New Roman" w:hAnsi="Times New Roman" w:eastAsia="HY신명조"/>
                 <w:b w:val="0"/>
                 <w:i w:val="0"/>
                 <w:sz w:val="16"/>
@@ -1017,10 +1034,11 @@
       <w:tr>
         <w:tc>
           <w:tcPr>
-            <w:tcW w:type="dxa" w:w="2211"/>
+            <w:tcW w:type="dxa" w:w="2438"/>
           </w:tcPr>
           <w:p>
             <w:pPr>
+              <w:keepNext/>
               <w:autoSpaceDE w:val="0"/>
               <w:autoSpaceDN w:val="0"/>
               <w:jc w:val="left"/>
@@ -1028,7 +1046,7 @@
             <w:r/>
             <w:r>
               <w:rPr>
-                <w:rFonts w:ascii="함초롬바탕" w:hAnsi="함초롬바탕" w:eastAsia="함초롬바탕"/>
+                <w:rFonts w:ascii="Times New Roman" w:hAnsi="Times New Roman" w:eastAsia="HY신명조"/>
                 <w:b w:val="0"/>
                 <w:i w:val="0"/>
                 <w:sz w:val="16"/>
@@ -1039,10 +1057,11 @@
         </w:tc>
         <w:tc>
           <w:tcPr>
-            <w:tcW w:type="dxa" w:w="737"/>
+            <w:tcW w:type="dxa" w:w="652"/>
           </w:tcPr>
           <w:p>
             <w:pPr>
+              <w:keepNext/>
               <w:autoSpaceDE w:val="0"/>
               <w:autoSpaceDN w:val="0"/>
               <w:jc w:val="center"/>
@@ -1050,7 +1069,7 @@
             <w:r/>
             <w:r>
               <w:rPr>
-                <w:rFonts w:ascii="함초롬바탕" w:hAnsi="함초롬바탕" w:eastAsia="함초롬바탕"/>
+                <w:rFonts w:ascii="Times New Roman" w:hAnsi="Times New Roman" w:eastAsia="HY신명조"/>
                 <w:b w:val="0"/>
                 <w:i w:val="0"/>
                 <w:sz w:val="16"/>
@@ -1061,10 +1080,11 @@
         </w:tc>
         <w:tc>
           <w:tcPr>
-            <w:tcW w:type="dxa" w:w="737"/>
+            <w:tcW w:type="dxa" w:w="680"/>
           </w:tcPr>
           <w:p>
             <w:pPr>
+              <w:keepNext/>
               <w:autoSpaceDE w:val="0"/>
               <w:autoSpaceDN w:val="0"/>
               <w:jc w:val="center"/>
@@ -1072,7 +1092,7 @@
             <w:r/>
             <w:r>
               <w:rPr>
-                <w:rFonts w:ascii="함초롬바탕" w:hAnsi="함초롬바탕" w:eastAsia="함초롬바탕"/>
+                <w:rFonts w:ascii="Times New Roman" w:hAnsi="Times New Roman" w:eastAsia="HY신명조"/>
                 <w:b w:val="0"/>
                 <w:i w:val="0"/>
                 <w:sz w:val="16"/>
@@ -1087,6 +1107,7 @@
           </w:tcPr>
           <w:p>
             <w:pPr>
+              <w:keepNext/>
               <w:autoSpaceDE w:val="0"/>
               <w:autoSpaceDN w:val="0"/>
               <w:jc w:val="center"/>
@@ -1094,7 +1115,7 @@
             <w:r/>
             <w:r>
               <w:rPr>
-                <w:rFonts w:ascii="함초롬바탕" w:hAnsi="함초롬바탕" w:eastAsia="함초롬바탕"/>
+                <w:rFonts w:ascii="Times New Roman" w:hAnsi="Times New Roman" w:eastAsia="HY신명조"/>
                 <w:b w:val="0"/>
                 <w:i w:val="0"/>
                 <w:sz w:val="16"/>
@@ -1107,10 +1128,11 @@
       <w:tr>
         <w:tc>
           <w:tcPr>
-            <w:tcW w:type="dxa" w:w="2211"/>
+            <w:tcW w:type="dxa" w:w="2438"/>
           </w:tcPr>
           <w:p>
             <w:pPr>
+              <w:keepNext/>
               <w:autoSpaceDE w:val="0"/>
               <w:autoSpaceDN w:val="0"/>
               <w:jc w:val="left"/>
@@ -1118,7 +1140,7 @@
             <w:r/>
             <w:r>
               <w:rPr>
-                <w:rFonts w:ascii="함초롬바탕" w:hAnsi="함초롬바탕" w:eastAsia="함초롬바탕"/>
+                <w:rFonts w:ascii="Times New Roman" w:hAnsi="Times New Roman" w:eastAsia="HY신명조"/>
                 <w:b w:val="0"/>
                 <w:i w:val="0"/>
                 <w:sz w:val="16"/>
@@ -1131,10 +1153,11 @@
         </w:tc>
         <w:tc>
           <w:tcPr>
-            <w:tcW w:type="dxa" w:w="737"/>
+            <w:tcW w:type="dxa" w:w="652"/>
           </w:tcPr>
           <w:p>
             <w:pPr>
+              <w:keepNext/>
               <w:autoSpaceDE w:val="0"/>
               <w:autoSpaceDN w:val="0"/>
               <w:jc w:val="center"/>
@@ -1142,7 +1165,7 @@
             <w:r/>
             <w:r>
               <w:rPr>
-                <w:rFonts w:ascii="함초롬바탕" w:hAnsi="함초롬바탕" w:eastAsia="함초롬바탕"/>
+                <w:rFonts w:ascii="Times New Roman" w:hAnsi="Times New Roman" w:eastAsia="HY신명조"/>
                 <w:b w:val="0"/>
                 <w:i w:val="0"/>
                 <w:sz w:val="16"/>
@@ -1153,10 +1176,11 @@
         </w:tc>
         <w:tc>
           <w:tcPr>
-            <w:tcW w:type="dxa" w:w="737"/>
+            <w:tcW w:type="dxa" w:w="680"/>
           </w:tcPr>
           <w:p>
             <w:pPr>
+              <w:keepNext/>
               <w:autoSpaceDE w:val="0"/>
               <w:autoSpaceDN w:val="0"/>
               <w:jc w:val="center"/>
@@ -1164,7 +1188,7 @@
             <w:r/>
             <w:r>
               <w:rPr>
-                <w:rFonts w:ascii="함초롬바탕" w:hAnsi="함초롬바탕" w:eastAsia="함초롬바탕"/>
+                <w:rFonts w:ascii="Times New Roman" w:hAnsi="Times New Roman" w:eastAsia="HY신명조"/>
                 <w:b w:val="0"/>
                 <w:i w:val="0"/>
                 <w:sz w:val="16"/>
@@ -1179,6 +1203,7 @@
           </w:tcPr>
           <w:p>
             <w:pPr>
+              <w:keepNext/>
               <w:autoSpaceDE w:val="0"/>
               <w:autoSpaceDN w:val="0"/>
               <w:jc w:val="center"/>
@@ -1186,7 +1211,7 @@
             <w:r/>
             <w:r>
               <w:rPr>
-                <w:rFonts w:ascii="함초롬바탕" w:hAnsi="함초롬바탕" w:eastAsia="함초롬바탕"/>
+                <w:rFonts w:ascii="Times New Roman" w:hAnsi="Times New Roman" w:eastAsia="HY신명조"/>
                 <w:b w:val="0"/>
                 <w:i w:val="0"/>
                 <w:sz w:val="16"/>
@@ -1199,10 +1224,11 @@
       <w:tr>
         <w:tc>
           <w:tcPr>
-            <w:tcW w:type="dxa" w:w="2211"/>
+            <w:tcW w:type="dxa" w:w="2438"/>
           </w:tcPr>
           <w:p>
             <w:pPr>
+              <w:keepNext/>
               <w:autoSpaceDE w:val="0"/>
               <w:autoSpaceDN w:val="0"/>
               <w:jc w:val="left"/>
@@ -1210,7 +1236,7 @@
             <w:r/>
             <w:r>
               <w:rPr>
-                <w:rFonts w:ascii="함초롬바탕" w:hAnsi="함초롬바탕" w:eastAsia="함초롬바탕"/>
+                <w:rFonts w:ascii="Times New Roman" w:hAnsi="Times New Roman" w:eastAsia="HY신명조"/>
                 <w:b w:val="0"/>
                 <w:i w:val="0"/>
                 <w:sz w:val="16"/>
@@ -1221,10 +1247,11 @@
         </w:tc>
         <w:tc>
           <w:tcPr>
-            <w:tcW w:type="dxa" w:w="737"/>
+            <w:tcW w:type="dxa" w:w="652"/>
           </w:tcPr>
           <w:p>
             <w:pPr>
+              <w:keepNext/>
               <w:autoSpaceDE w:val="0"/>
               <w:autoSpaceDN w:val="0"/>
               <w:jc w:val="center"/>
@@ -1232,7 +1259,7 @@
             <w:r/>
             <w:r>
               <w:rPr>
-                <w:rFonts w:ascii="함초롬바탕" w:hAnsi="함초롬바탕" w:eastAsia="함초롬바탕"/>
+                <w:rFonts w:ascii="Times New Roman" w:hAnsi="Times New Roman" w:eastAsia="HY신명조"/>
                 <w:b w:val="0"/>
                 <w:i w:val="0"/>
                 <w:sz w:val="16"/>
@@ -1243,10 +1270,11 @@
         </w:tc>
         <w:tc>
           <w:tcPr>
-            <w:tcW w:type="dxa" w:w="737"/>
+            <w:tcW w:type="dxa" w:w="680"/>
           </w:tcPr>
           <w:p>
             <w:pPr>
+              <w:keepNext/>
               <w:autoSpaceDE w:val="0"/>
               <w:autoSpaceDN w:val="0"/>
               <w:jc w:val="center"/>
@@ -1254,7 +1282,7 @@
             <w:r/>
             <w:r>
               <w:rPr>
-                <w:rFonts w:ascii="함초롬바탕" w:hAnsi="함초롬바탕" w:eastAsia="함초롬바탕"/>
+                <w:rFonts w:ascii="Times New Roman" w:hAnsi="Times New Roman" w:eastAsia="HY신명조"/>
                 <w:b w:val="0"/>
                 <w:i w:val="0"/>
                 <w:sz w:val="16"/>
@@ -1269,6 +1297,7 @@
           </w:tcPr>
           <w:p>
             <w:pPr>
+              <w:keepNext/>
               <w:autoSpaceDE w:val="0"/>
               <w:autoSpaceDN w:val="0"/>
               <w:jc w:val="center"/>
@@ -1276,7 +1305,7 @@
             <w:r/>
             <w:r>
               <w:rPr>
-                <w:rFonts w:ascii="함초롬바탕" w:hAnsi="함초롬바탕" w:eastAsia="함초롬바탕"/>
+                <w:rFonts w:ascii="Times New Roman" w:hAnsi="Times New Roman" w:eastAsia="HY신명조"/>
                 <w:b w:val="0"/>
                 <w:i w:val="0"/>
                 <w:sz w:val="16"/>
@@ -1289,7 +1318,7 @@
       <w:tr>
         <w:tc>
           <w:tcPr>
-            <w:tcW w:type="dxa" w:w="2211"/>
+            <w:tcW w:type="dxa" w:w="2438"/>
           </w:tcPr>
           <w:p>
             <w:pPr>
@@ -1300,7 +1329,7 @@
             <w:r/>
             <w:r>
               <w:rPr>
-                <w:rFonts w:ascii="함초롬바탕" w:hAnsi="함초롬바탕" w:eastAsia="함초롬바탕"/>
+                <w:rFonts w:ascii="Times New Roman" w:hAnsi="Times New Roman" w:eastAsia="HY신명조"/>
                 <w:b/>
                 <w:i w:val="0"/>
                 <w:sz w:val="16"/>
@@ -1311,7 +1340,7 @@
         </w:tc>
         <w:tc>
           <w:tcPr>
-            <w:tcW w:type="dxa" w:w="737"/>
+            <w:tcW w:type="dxa" w:w="652"/>
           </w:tcPr>
           <w:p>
             <w:pPr>
@@ -1322,7 +1351,7 @@
             <w:r/>
             <w:r>
               <w:rPr>
-                <w:rFonts w:ascii="함초롬바탕" w:hAnsi="함초롬바탕" w:eastAsia="함초롬바탕"/>
+                <w:rFonts w:ascii="Times New Roman" w:hAnsi="Times New Roman" w:eastAsia="HY신명조"/>
                 <w:b/>
                 <w:i w:val="0"/>
                 <w:sz w:val="16"/>
@@ -1333,7 +1362,7 @@
         </w:tc>
         <w:tc>
           <w:tcPr>
-            <w:tcW w:type="dxa" w:w="737"/>
+            <w:tcW w:type="dxa" w:w="680"/>
           </w:tcPr>
           <w:p>
             <w:pPr>
@@ -1344,7 +1373,7 @@
             <w:r/>
             <w:r>
               <w:rPr>
-                <w:rFonts w:ascii="함초롬바탕" w:hAnsi="함초롬바탕" w:eastAsia="함초롬바탕"/>
+                <w:rFonts w:ascii="Times New Roman" w:hAnsi="Times New Roman" w:eastAsia="HY신명조"/>
                 <w:b/>
                 <w:i w:val="0"/>
                 <w:sz w:val="16"/>
@@ -1366,7 +1395,7 @@
             <w:r/>
             <w:r>
               <w:rPr>
-                <w:rFonts w:ascii="함초롬바탕" w:hAnsi="함초롬바탕" w:eastAsia="함초롬바탕"/>
+                <w:rFonts w:ascii="Times New Roman" w:hAnsi="Times New Roman" w:eastAsia="HY신명조"/>
                 <w:b/>
                 <w:i w:val="0"/>
                 <w:sz w:val="16"/>
@@ -1382,12 +1411,12 @@
         <w:autoSpaceDE w:val="0"/>
         <w:autoSpaceDN w:val="0"/>
         <w:spacing w:after="60" w:line="240" w:lineRule="auto"/>
-        <w:ind w:firstLine="198"/>
+        <w:ind w:firstLine="180"/>
         <w:jc w:val="both"/>
       </w:pPr>
       <w:r>
         <w:rPr>
-          <w:rFonts w:ascii="함초롬바탕" w:hAnsi="함초롬바탕" w:eastAsia="함초롬바탕"/>
+          <w:rFonts w:ascii="Times New Roman" w:hAnsi="Times New Roman" w:eastAsia="HY신명조"/>
           <w:b w:val="0"/>
           <w:i w:val="0"/>
           <w:sz w:val="18"/>
@@ -1402,12 +1431,12 @@
         <w:autoSpaceDE w:val="0"/>
         <w:autoSpaceDN w:val="0"/>
         <w:spacing w:after="50" w:line="240" w:lineRule="auto"/>
-        <w:ind w:firstLine="198"/>
+        <w:ind w:firstLine="180"/>
         <w:jc w:val="both"/>
       </w:pPr>
       <w:r>
         <w:rPr>
-          <w:rFonts w:ascii="함초롬바탕" w:hAnsi="함초롬바탕" w:eastAsia="함초롬바탕"/>
+          <w:rFonts w:ascii="Times New Roman" w:hAnsi="Times New Roman" w:eastAsia="HY신명조"/>
           <w:b w:val="0"/>
           <w:i w:val="0"/>
           <w:sz w:val="18"/>
@@ -1471,7 +1500,7 @@
       </w:pPr>
       <w:r>
         <w:rPr>
-          <w:rFonts w:ascii="함초롬바탕" w:hAnsi="함초롬바탕" w:eastAsia="함초롬바탕"/>
+          <w:rFonts w:ascii="Times New Roman" w:hAnsi="Times New Roman" w:eastAsia="HY신명조"/>
           <w:b/>
           <w:i w:val="0"/>
           <w:sz w:val="16"/>
@@ -1484,14 +1513,14 @@
         <w:keepNext/>
         <w:autoSpaceDE w:val="0"/>
         <w:autoSpaceDN w:val="0"/>
-        <w:spacing w:before="100" w:after="40"/>
+        <w:spacing w:before="120" w:after="95"/>
       </w:pPr>
       <w:r>
         <w:rPr>
-          <w:rFonts w:ascii="함초롬바탕" w:hAnsi="함초롬바탕" w:eastAsia="함초롬바탕"/>
+          <w:rFonts w:ascii="Times New Roman" w:hAnsi="Times New Roman" w:eastAsia="HY신명조"/>
           <w:b/>
           <w:i w:val="0"/>
-          <w:sz w:val="21"/>
+          <w:sz w:val="18"/>
         </w:rPr>
         <w:t>Ⅳ. 결 론</w:t>
       </w:r>
@@ -1501,12 +1530,12 @@
         <w:autoSpaceDE w:val="0"/>
         <w:autoSpaceDN w:val="0"/>
         <w:spacing w:after="50" w:line="240" w:lineRule="auto"/>
-        <w:ind w:firstLine="198"/>
+        <w:ind w:firstLine="180"/>
         <w:jc w:val="both"/>
       </w:pPr>
       <w:r>
         <w:rPr>
-          <w:rFonts w:ascii="함초롬바탕" w:hAnsi="함초롬바탕" w:eastAsia="함초롬바탕"/>
+          <w:rFonts w:ascii="Times New Roman" w:hAnsi="Times New Roman" w:eastAsia="HY신명조"/>
           <w:b w:val="0"/>
           <w:i w:val="0"/>
           <w:sz w:val="18"/>
@@ -1519,14 +1548,14 @@
         <w:keepNext/>
         <w:autoSpaceDE w:val="0"/>
         <w:autoSpaceDN w:val="0"/>
-        <w:spacing w:before="100" w:after="40"/>
+        <w:spacing w:before="120" w:after="95"/>
       </w:pPr>
       <w:r>
         <w:rPr>
-          <w:rFonts w:ascii="함초롬바탕" w:hAnsi="함초롬바탕" w:eastAsia="함초롬바탕"/>
+          <w:rFonts w:ascii="Times New Roman" w:hAnsi="Times New Roman" w:eastAsia="HY신명조"/>
           <w:b/>
           <w:i w:val="0"/>
-          <w:sz w:val="19"/>
+          <w:sz w:val="18"/>
         </w:rPr>
         <w:t>참 고 문 헌</w:t>
       </w:r>
@@ -1535,15 +1564,16 @@
       <w:pPr>
         <w:autoSpaceDE w:val="0"/>
         <w:autoSpaceDN w:val="0"/>
-        <w:spacing w:after="0" w:line="168" w:lineRule="exact"/>
+        <w:spacing w:after="0" w:line="240" w:lineRule="auto"/>
+        <w:ind w:left="246" w:hanging="246"/>
         <w:jc w:val="left"/>
       </w:pPr>
       <w:r>
         <w:rPr>
-          <w:rFonts w:ascii="함초롬바탕" w:hAnsi="함초롬바탕" w:eastAsia="함초롬바탕"/>
+          <w:rFonts w:ascii="Times New Roman" w:hAnsi="Times New Roman" w:eastAsia="HY신명조"/>
           <w:b w:val="0"/>
           <w:i w:val="0"/>
-          <w:sz w:val="14"/>
+          <w:sz w:val="18"/>
         </w:rPr>
         <w:t>[1] P. Amatya, Venktesh V, and V. Setty, "Calibrating Small Language Models for Claim Check-Worthiness Detection," arXiv:2608.30731, 2026.</w:t>
       </w:r>
@@ -1552,15 +1582,16 @@
       <w:pPr>
         <w:autoSpaceDE w:val="0"/>
         <w:autoSpaceDN w:val="0"/>
-        <w:spacing w:after="0" w:line="168" w:lineRule="exact"/>
+        <w:spacing w:after="0" w:line="240" w:lineRule="auto"/>
+        <w:ind w:left="246" w:hanging="246"/>
         <w:jc w:val="left"/>
       </w:pPr>
       <w:r>
         <w:rPr>
-          <w:rFonts w:ascii="함초롬바탕" w:hAnsi="함초롬바탕" w:eastAsia="함초롬바탕"/>
+          <w:rFonts w:ascii="Times New Roman" w:hAnsi="Times New Roman" w:eastAsia="HY신명조"/>
           <w:b w:val="0"/>
           <w:i w:val="0"/>
-          <w:sz w:val="14"/>
+          <w:sz w:val="18"/>
         </w:rPr>
         <w:t>[2] P. Amatya and V. Setty, "Multilingual Fact-Checking at Scale: Fine-Tuned Compact Models vs LLMs," arXiv:2606.08605, 2026.</w:t>
       </w:r>
@@ -1569,15 +1600,16 @@
       <w:pPr>
         <w:autoSpaceDE w:val="0"/>
         <w:autoSpaceDN w:val="0"/>
-        <w:spacing w:after="0" w:line="168" w:lineRule="exact"/>
+        <w:spacing w:after="0" w:line="240" w:lineRule="auto"/>
+        <w:ind w:left="246" w:hanging="246"/>
         <w:jc w:val="left"/>
       </w:pPr>
       <w:r>
         <w:rPr>
-          <w:rFonts w:ascii="함초롬바탕" w:hAnsi="함초롬바탕" w:eastAsia="함초롬바탕"/>
+          <w:rFonts w:ascii="Times New Roman" w:hAnsi="Times New Roman" w:eastAsia="HY신명조"/>
           <w:b w:val="0"/>
           <w:i w:val="0"/>
-          <w:sz w:val="14"/>
+          <w:sz w:val="18"/>
         </w:rPr>
         <w:t>[3] M. Schlee et al., "LabelFusion: Fusing Large Language Models with Transformer Encoders for Robust Financial News Classification," arXiv:2512.10793, 2025.</w:t>
       </w:r>
@@ -1586,15 +1618,16 @@
       <w:pPr>
         <w:autoSpaceDE w:val="0"/>
         <w:autoSpaceDN w:val="0"/>
-        <w:spacing w:after="0" w:line="168" w:lineRule="exact"/>
+        <w:spacing w:after="0" w:line="240" w:lineRule="auto"/>
+        <w:ind w:left="246" w:hanging="246"/>
         <w:jc w:val="left"/>
       </w:pPr>
       <w:r>
         <w:rPr>
-          <w:rFonts w:ascii="함초롬바탕" w:hAnsi="함초롬바탕" w:eastAsia="함초롬바탕"/>
+          <w:rFonts w:ascii="Times New Roman" w:hAnsi="Times New Roman" w:eastAsia="HY신명조"/>
           <w:b w:val="0"/>
           <w:i w:val="0"/>
-          <w:sz w:val="14"/>
+          <w:sz w:val="18"/>
         </w:rPr>
         <w:t>[4] T. Burleigh, "Do Small Language Models Know When They're Wrong? Confidence-Based Cascade Scoring for Educational Assessment," arXiv:2604.19781, 2026.</w:t>
       </w:r>
@@ -1603,15 +1636,16 @@
       <w:pPr>
         <w:autoSpaceDE w:val="0"/>
         <w:autoSpaceDN w:val="0"/>
-        <w:spacing w:after="0" w:line="168" w:lineRule="exact"/>
+        <w:spacing w:after="0" w:line="240" w:lineRule="auto"/>
+        <w:ind w:left="246" w:hanging="246"/>
         <w:jc w:val="left"/>
       </w:pPr>
       <w:r>
         <w:rPr>
-          <w:rFonts w:ascii="함초롬바탕" w:hAnsi="함초롬바탕" w:eastAsia="함초롬바탕"/>
+          <w:rFonts w:ascii="Times New Roman" w:hAnsi="Times New Roman" w:eastAsia="HY신명조"/>
           <w:b w:val="0"/>
           <w:i w:val="0"/>
-          <w:sz w:val="14"/>
+          <w:sz w:val="18"/>
         </w:rPr>
         <w:t>[5] M. Hasanain et al., "Overview of the CLEF-2024 CheckThat! Lab Task 1 on Check-Worthiness Estimation of Multigenre Content," CEUR-WS vol. 3740, pp. 276–286, 2024.</w:t>
       </w:r>
@@ -1620,15 +1654,16 @@
       <w:pPr>
         <w:autoSpaceDE w:val="0"/>
         <w:autoSpaceDN w:val="0"/>
-        <w:spacing w:after="0" w:line="168" w:lineRule="exact"/>
+        <w:spacing w:after="0" w:line="240" w:lineRule="auto"/>
+        <w:ind w:left="246" w:hanging="246"/>
         <w:jc w:val="left"/>
       </w:pPr>
       <w:r>
         <w:rPr>
-          <w:rFonts w:ascii="함초롬바탕" w:hAnsi="함초롬바탕" w:eastAsia="함초롬바탕"/>
+          <w:rFonts w:ascii="Times New Roman" w:hAnsi="Times New Roman" w:eastAsia="HY신명조"/>
           <w:b w:val="0"/>
           <w:i w:val="0"/>
-          <w:sz w:val="14"/>
+          <w:sz w:val="18"/>
         </w:rPr>
         <w:t>[6] F. Arslan et al., "A Benchmark Dataset of Check-Worthy Factual Claims," in Proc. ICWSM, vol. 14, pp. 821–829, 2020.</w:t>
       </w:r>
@@ -1637,15 +1672,16 @@
       <w:pPr>
         <w:autoSpaceDE w:val="0"/>
         <w:autoSpaceDN w:val="0"/>
-        <w:spacing w:after="0" w:line="168" w:lineRule="exact"/>
+        <w:spacing w:after="0" w:line="240" w:lineRule="auto"/>
+        <w:ind w:left="246" w:hanging="246"/>
         <w:jc w:val="left"/>
       </w:pPr>
       <w:r>
         <w:rPr>
-          <w:rFonts w:ascii="함초롬바탕" w:hAnsi="함초롬바탕" w:eastAsia="함초롬바탕"/>
+          <w:rFonts w:ascii="Times New Roman" w:hAnsi="Times New Roman" w:eastAsia="HY신명조"/>
           <w:b w:val="0"/>
           <w:i w:val="0"/>
-          <w:sz w:val="14"/>
+          <w:sz w:val="18"/>
         </w:rPr>
         <w:t>[7] Z. Wang et al., "Signed Rescue Routing: Harm-Aware Cascades for Efficient LLM Inference," arXiv:2609.07786, 2026.</w:t>
       </w:r>
@@ -1654,15 +1690,16 @@
       <w:pPr>
         <w:autoSpaceDE w:val="0"/>
         <w:autoSpaceDN w:val="0"/>
-        <w:spacing w:after="0" w:line="168" w:lineRule="exact"/>
+        <w:spacing w:after="0" w:line="240" w:lineRule="auto"/>
+        <w:ind w:left="246" w:hanging="246"/>
         <w:jc w:val="left"/>
       </w:pPr>
       <w:r>
         <w:rPr>
-          <w:rFonts w:ascii="함초롬바탕" w:hAnsi="함초롬바탕" w:eastAsia="함초롬바탕"/>
+          <w:rFonts w:ascii="Times New Roman" w:hAnsi="Times New Roman" w:eastAsia="HY신명조"/>
           <w:b w:val="0"/>
           <w:i w:val="0"/>
-          <w:sz w:val="14"/>
+          <w:sz w:val="18"/>
         </w:rPr>
         <w:t>[8] Y. Zhang et al., "Calibration-Aware Uncertainty Cascades for Efficient Heterogeneous Model Collaboration," arXiv:2609.11446, 2026.</w:t>
       </w:r>
@@ -1670,8 +1707,8 @@
     <w:sectPr>
       <w:type w:val="continuous"/>
       <w:pgSz w:w="11906" w:h="16838"/>
-      <w:pgMar w:top="1247" w:right="1020" w:bottom="1134" w:left="1020" w:header="720" w:footer="720" w:gutter="0"/>
-      <w:cols w:space="340" w:num="2"/>
+      <w:pgMar w:top="1134" w:right="850" w:bottom="1134" w:left="1134" w:header="720" w:footer="720" w:gutter="0"/>
+      <w:cols w:space="425" w:num="2"/>
       <w:docGrid w:linePitch="360"/>
     </w:sectPr>
   </w:body>

</xml_diff>

<commit_message>
Use the space freed by the KICS template: restore cut content and add a worked example
- Restored: streaming routing sentence, batch-vs-single AUC, calib accuracies, fused-vs-replacement
  significance ranges, Table 1 rows (Gemma alone, NN-PPI-decided cascade with dagger, fused 100%),
  [2] idiomatic-expressions clause (dossier 2b), [6] full author list, future-work sentence
- New worked example (scripts/example_case.py): the Eq. (1) bar (-c-a d)/b moves with d; a campaign
  pledge the replacement cascade gets wrong and fusion right; 36 vs 24 disagreements reported
- Readability: Figure 2 height, Figure 1 and Table 1 text size; verifier checks every restored number

Co-Authored-By: Claude Opus 5.5 <noreply@anthropic.com>
</commit_message>
<xml_diff>
--- a/paper/cascade_kics_draft.docx
+++ b/paper/cascade_kics_draft.docx
@@ -233,9 +233,9 @@
           <w:i w:val="0"/>
           <w:sz w:val="18"/>
         </w:rPr>
-        <w:t xml:space="preserve">실제 팩트체크 서비스 운영사는 유입되는 모든 문장에 LLM을 적용하는 것이 비현실적이라고 보고하였다[1]. NN</w:t>
+        <w:t xml:space="preserve">팩트체크 필요성 탐지는 유입되는 모든 문장에 적용되므로, 실제 팩트체크 서비스 운영사는 모든 문장에 LLM을 적용하는 것이 비현실적이라고 보고하였다[1]. NN</w:t>
         <w:noBreakHyphen/>
-        <w:t xml:space="preserve">PPI[1]는 소형 LLM의 점수를 라벨이 있는 보정 세트 중 의미적으로 가까운 이웃의 잔차로 보정한다. 같은 연구진은 인코더의 확신이 낮을 때만 LLM에 넘기는 하이브리드를 향후 과제로 제시하였다[2]. 일반적인 캐스케이드[4]는 불확실한 입력을 더 큰 LLM에 넘기되 그 답으로 교체하고, LabelFusion[3]은 인코더와 LLM의 출력을 결합하지만 모든 입력에 LLM을 호출한다. 위임한 입력에서 두 모델의 출력을 선택적으로 결합하는 캐스케이드도 일반 분류 과제에서 제안되었다[8]. 본 논문은 [2]의 하이브리드를 구현하되, 결합 가중치를 라벨로 학습하여 LLM과 라벨의 판정 기준 차이까지 반영한다.</w:t>
+        <w:t xml:space="preserve">PPI[1]는 소형 LLM의 점수를 라벨이 있는 보정 세트 중 의미적으로 가까운 이웃의 잔차로 보정한다. 같은 연구진은 파인튜닝한 소형 인코더가 LLM과 경쟁할 수 있으나 관용적 표현에서는 LLM이 앞선다고 보고하고, 인코더의 확신이 낮을 때만 LLM에 넘기는 하이브리드를 향후 과제로 제시하였다[2]. 일반적인 캐스케이드[4]는 불확실한 입력을 더 큰 LLM에 넘기되 그 답으로 교체하고, LabelFusion[3]은 인코더와 LLM의 출력을 결합하지만 모든 입력에 LLM을 호출한다. 위임한 입력에서 두 모델의 출력을 선택적으로 결합하는 캐스케이드도 일반 분류 과제에서 제안되었다[8]. 본 논문은 [2]의 하이브리드를 구현하되, 결합 가중치를 라벨로 학습하여 LLM과 라벨의 판정 기준 차이까지 반영한다.</w:t>
       </w:r>
     </w:p>
     <w:p>
@@ -370,7 +370,7 @@
       <w:r>
         <w:drawing>
           <wp:inline xmlns:a="http://schemas.openxmlformats.org/drawingml/2006/main" xmlns:pic="http://schemas.openxmlformats.org/drawingml/2006/picture">
-            <wp:extent cx="2568701" cy="778533"/>
+            <wp:extent cx="2655697" cy="798385"/>
             <wp:docPr id="1" name="Picture 1"/>
             <wp:cNvGraphicFramePr>
               <a:graphicFrameLocks noChangeAspect="1"/>
@@ -391,7 +391,7 @@
                   <pic:spPr>
                     <a:xfrm>
                       <a:off x="0" y="0"/>
-                      <a:ext cx="2568701" cy="778533"/>
+                      <a:ext cx="2655697" cy="798385"/>
                     </a:xfrm>
                     <a:prstGeom prst="rect"/>
                   </pic:spPr>
@@ -602,7 +602,7 @@
         <w:noBreakHyphen/>
         <w:t xml:space="preserve">test와 ClaimBuster 2016년 분할에서 가중 F1 CLEF 0.835, ClaimBuster 0.785; 원 논문 0.827, 0.760), 이웃 수 k는 보정 세트 내부 검증으로 선택하였다(두 데이터셋 k=10). LLM은 Claude Sonnet 5이며 NN</w:t>
         <w:noBreakHyphen/>
-        <w:t xml:space="preserve">PPI의 판정 기준 프롬프트로 40문장씩 묶어 채점하였다. LLM 임계값, 결합 계수, k는 모두 보정 세트 안에서만 정하였고 임베딩 SVM은 기본 하이퍼파라미터를 사용하였다. 보정 세트의 80%를 비복원 추출하여 5회 반복한 평균을 보고하며, 방법 간 차이는 1회차 예측에 대한 McNemar 검정(α=0.05)으로 평가하였다.</w:t>
+        <w:t xml:space="preserve">PPI의 판정 기준 프롬프트로 40문장씩 묶어 채점하였다(문장 단위 채점과 AUC 0.991 대 0.990). LLM 임계값, 결합 계수, k는 모두 보정 세트 안에서만 정하였고 임베딩 SVM은 기본 하이퍼파라미터를 사용하였다. 보정 세트의 80%를 비복원 추출하여 5회 반복한 평균을 보고하며, 방법 간 차이는 1회차 예측에 대한 McNemar 검정(α=0.05)으로 평가하였다.</w:t>
       </w:r>
     </w:p>
     <w:p>
@@ -671,7 +671,7 @@
                 <w:rFonts w:ascii="Times New Roman" w:hAnsi="Times New Roman" w:eastAsia="HY신명조"/>
                 <w:b/>
                 <w:i w:val="0"/>
-                <w:sz w:val="16"/>
+                <w:sz w:val="17"/>
               </w:rPr>
               <w:t>방법</w:t>
             </w:r>
@@ -694,7 +694,7 @@
                 <w:rFonts w:ascii="Times New Roman" w:hAnsi="Times New Roman" w:eastAsia="HY신명조"/>
                 <w:b/>
                 <w:i w:val="0"/>
-                <w:sz w:val="16"/>
+                <w:sz w:val="17"/>
               </w:rPr>
               <w:t>호출률</w:t>
             </w:r>
@@ -717,7 +717,7 @@
                 <w:rFonts w:ascii="Times New Roman" w:hAnsi="Times New Roman" w:eastAsia="HY신명조"/>
                 <w:b/>
                 <w:i w:val="0"/>
-                <w:sz w:val="16"/>
+                <w:sz w:val="17"/>
               </w:rPr>
               <w:t>CLEF</w:t>
             </w:r>
@@ -740,7 +740,7 @@
                 <w:rFonts w:ascii="Times New Roman" w:hAnsi="Times New Roman" w:eastAsia="HY신명조"/>
                 <w:b/>
                 <w:i w:val="0"/>
-                <w:sz w:val="16"/>
+                <w:sz w:val="17"/>
               </w:rPr>
               <w:t>ClaimBuster</w:t>
             </w:r>
@@ -765,9 +765,103 @@
                 <w:rFonts w:ascii="Times New Roman" w:hAnsi="Times New Roman" w:eastAsia="HY신명조"/>
                 <w:b w:val="0"/>
                 <w:i w:val="0"/>
-                <w:sz w:val="16"/>
+                <w:sz w:val="17"/>
               </w:rPr>
-              <w:t xml:space="preserve">Gemma 3 4B + NN</w:t>
+              <w:t>Gemma 3 4B</w:t>
+            </w:r>
+          </w:p>
+        </w:tc>
+        <w:tc>
+          <w:tcPr>
+            <w:tcW w:type="dxa" w:w="652"/>
+          </w:tcPr>
+          <w:p>
+            <w:pPr>
+              <w:keepNext/>
+              <w:autoSpaceDE w:val="0"/>
+              <w:autoSpaceDN w:val="0"/>
+              <w:jc w:val="center"/>
+            </w:pPr>
+            <w:r/>
+            <w:r>
+              <w:rPr>
+                <w:rFonts w:ascii="Times New Roman" w:hAnsi="Times New Roman" w:eastAsia="HY신명조"/>
+                <w:b w:val="0"/>
+                <w:i w:val="0"/>
+                <w:sz w:val="17"/>
+              </w:rPr>
+              <w:t>0%</w:t>
+            </w:r>
+          </w:p>
+        </w:tc>
+        <w:tc>
+          <w:tcPr>
+            <w:tcW w:type="dxa" w:w="680"/>
+          </w:tcPr>
+          <w:p>
+            <w:pPr>
+              <w:keepNext/>
+              <w:autoSpaceDE w:val="0"/>
+              <w:autoSpaceDN w:val="0"/>
+              <w:jc w:val="center"/>
+            </w:pPr>
+            <w:r/>
+            <w:r>
+              <w:rPr>
+                <w:rFonts w:ascii="Times New Roman" w:hAnsi="Times New Roman" w:eastAsia="HY신명조"/>
+                <w:b w:val="0"/>
+                <w:i w:val="0"/>
+                <w:sz w:val="17"/>
+              </w:rPr>
+              <w:t>0.778</w:t>
+            </w:r>
+          </w:p>
+        </w:tc>
+        <w:tc>
+          <w:tcPr>
+            <w:tcW w:type="dxa" w:w="964"/>
+          </w:tcPr>
+          <w:p>
+            <w:pPr>
+              <w:keepNext/>
+              <w:autoSpaceDE w:val="0"/>
+              <w:autoSpaceDN w:val="0"/>
+              <w:jc w:val="center"/>
+            </w:pPr>
+            <w:r/>
+            <w:r>
+              <w:rPr>
+                <w:rFonts w:ascii="Times New Roman" w:hAnsi="Times New Roman" w:eastAsia="HY신명조"/>
+                <w:b w:val="0"/>
+                <w:i w:val="0"/>
+                <w:sz w:val="17"/>
+              </w:rPr>
+              <w:t>0.745</w:t>
+            </w:r>
+          </w:p>
+        </w:tc>
+      </w:tr>
+      <w:tr>
+        <w:tc>
+          <w:tcPr>
+            <w:tcW w:type="dxa" w:w="2438"/>
+          </w:tcPr>
+          <w:p>
+            <w:pPr>
+              <w:keepNext/>
+              <w:autoSpaceDE w:val="0"/>
+              <w:autoSpaceDN w:val="0"/>
+              <w:jc w:val="left"/>
+            </w:pPr>
+            <w:r/>
+            <w:r>
+              <w:rPr>
+                <w:rFonts w:ascii="Times New Roman" w:hAnsi="Times New Roman" w:eastAsia="HY신명조"/>
+                <w:b w:val="0"/>
+                <w:i w:val="0"/>
+                <w:sz w:val="17"/>
+              </w:rPr>
+              <w:t xml:space="preserve">  + NN</w:t>
               <w:noBreakHyphen/>
               <w:t xml:space="preserve">PPI [1]</w:t>
             </w:r>
@@ -790,7 +884,7 @@
                 <w:rFonts w:ascii="Times New Roman" w:hAnsi="Times New Roman" w:eastAsia="HY신명조"/>
                 <w:b w:val="0"/>
                 <w:i w:val="0"/>
-                <w:sz w:val="16"/>
+                <w:sz w:val="17"/>
               </w:rPr>
               <w:t>0%</w:t>
             </w:r>
@@ -813,7 +907,7 @@
                 <w:rFonts w:ascii="Times New Roman" w:hAnsi="Times New Roman" w:eastAsia="HY신명조"/>
                 <w:b w:val="0"/>
                 <w:i w:val="0"/>
-                <w:sz w:val="16"/>
+                <w:sz w:val="17"/>
               </w:rPr>
               <w:t>0.834</w:t>
             </w:r>
@@ -836,7 +930,7 @@
                 <w:rFonts w:ascii="Times New Roman" w:hAnsi="Times New Roman" w:eastAsia="HY신명조"/>
                 <w:b w:val="0"/>
                 <w:i w:val="0"/>
-                <w:sz w:val="16"/>
+                <w:sz w:val="17"/>
               </w:rPr>
               <w:t>0.785</w:t>
             </w:r>
@@ -861,7 +955,7 @@
                 <w:rFonts w:ascii="Times New Roman" w:hAnsi="Times New Roman" w:eastAsia="HY신명조"/>
                 <w:b w:val="0"/>
                 <w:i w:val="0"/>
-                <w:sz w:val="16"/>
+                <w:sz w:val="17"/>
               </w:rPr>
               <w:t>임베딩 SVM</w:t>
             </w:r>
@@ -884,7 +978,7 @@
                 <w:rFonts w:ascii="Times New Roman" w:hAnsi="Times New Roman" w:eastAsia="HY신명조"/>
                 <w:b w:val="0"/>
                 <w:i w:val="0"/>
-                <w:sz w:val="16"/>
+                <w:sz w:val="17"/>
               </w:rPr>
               <w:t>0%</w:t>
             </w:r>
@@ -907,7 +1001,7 @@
                 <w:rFonts w:ascii="Times New Roman" w:hAnsi="Times New Roman" w:eastAsia="HY신명조"/>
                 <w:b w:val="0"/>
                 <w:i w:val="0"/>
-                <w:sz w:val="16"/>
+                <w:sz w:val="17"/>
               </w:rPr>
               <w:t>0.859</w:t>
             </w:r>
@@ -930,7 +1024,7 @@
                 <w:rFonts w:ascii="Times New Roman" w:hAnsi="Times New Roman" w:eastAsia="HY신명조"/>
                 <w:b w:val="0"/>
                 <w:i w:val="0"/>
-                <w:sz w:val="16"/>
+                <w:sz w:val="17"/>
               </w:rPr>
               <w:t>0.790</w:t>
             </w:r>
@@ -955,7 +1049,7 @@
                 <w:rFonts w:ascii="Times New Roman" w:hAnsi="Times New Roman" w:eastAsia="HY신명조"/>
                 <w:b w:val="0"/>
                 <w:i w:val="0"/>
-                <w:sz w:val="16"/>
+                <w:sz w:val="17"/>
               </w:rPr>
               <w:t>LLM 전량 호출</w:t>
             </w:r>
@@ -978,7 +1072,7 @@
                 <w:rFonts w:ascii="Times New Roman" w:hAnsi="Times New Roman" w:eastAsia="HY신명조"/>
                 <w:b w:val="0"/>
                 <w:i w:val="0"/>
-                <w:sz w:val="16"/>
+                <w:sz w:val="17"/>
               </w:rPr>
               <w:t>100%</w:t>
             </w:r>
@@ -1001,7 +1095,7 @@
                 <w:rFonts w:ascii="Times New Roman" w:hAnsi="Times New Roman" w:eastAsia="HY신명조"/>
                 <w:b w:val="0"/>
                 <w:i w:val="0"/>
-                <w:sz w:val="16"/>
+                <w:sz w:val="17"/>
               </w:rPr>
               <w:t>0.896†</w:t>
             </w:r>
@@ -1024,7 +1118,7 @@
                 <w:rFonts w:ascii="Times New Roman" w:hAnsi="Times New Roman" w:eastAsia="HY신명조"/>
                 <w:b w:val="0"/>
                 <w:i w:val="0"/>
-                <w:sz w:val="16"/>
+                <w:sz w:val="17"/>
               </w:rPr>
               <w:t>0.835</w:t>
             </w:r>
@@ -1049,7 +1143,7 @@
                 <w:rFonts w:ascii="Times New Roman" w:hAnsi="Times New Roman" w:eastAsia="HY신명조"/>
                 <w:b w:val="0"/>
                 <w:i w:val="0"/>
-                <w:sz w:val="16"/>
+                <w:sz w:val="17"/>
               </w:rPr>
               <w:t xml:space="preserve">  + 임계값 조정</w:t>
             </w:r>
@@ -1072,7 +1166,7 @@
                 <w:rFonts w:ascii="Times New Roman" w:hAnsi="Times New Roman" w:eastAsia="HY신명조"/>
                 <w:b w:val="0"/>
                 <w:i w:val="0"/>
-                <w:sz w:val="16"/>
+                <w:sz w:val="17"/>
               </w:rPr>
               <w:t>100%</w:t>
             </w:r>
@@ -1095,7 +1189,7 @@
                 <w:rFonts w:ascii="Times New Roman" w:hAnsi="Times New Roman" w:eastAsia="HY신명조"/>
                 <w:b w:val="0"/>
                 <w:i w:val="0"/>
-                <w:sz w:val="16"/>
+                <w:sz w:val="17"/>
               </w:rPr>
               <w:t>0.915</w:t>
             </w:r>
@@ -1118,7 +1212,7 @@
                 <w:rFonts w:ascii="Times New Roman" w:hAnsi="Times New Roman" w:eastAsia="HY신명조"/>
                 <w:b w:val="0"/>
                 <w:i w:val="0"/>
-                <w:sz w:val="16"/>
+                <w:sz w:val="17"/>
               </w:rPr>
               <w:t>0.830†</w:t>
             </w:r>
@@ -1143,7 +1237,7 @@
                 <w:rFonts w:ascii="Times New Roman" w:hAnsi="Times New Roman" w:eastAsia="HY신명조"/>
                 <w:b w:val="0"/>
                 <w:i w:val="0"/>
-                <w:sz w:val="16"/>
+                <w:sz w:val="17"/>
               </w:rPr>
               <w:t xml:space="preserve">  + NN</w:t>
               <w:noBreakHyphen/>
@@ -1168,7 +1262,7 @@
                 <w:rFonts w:ascii="Times New Roman" w:hAnsi="Times New Roman" w:eastAsia="HY신명조"/>
                 <w:b w:val="0"/>
                 <w:i w:val="0"/>
-                <w:sz w:val="16"/>
+                <w:sz w:val="17"/>
               </w:rPr>
               <w:t>100%</w:t>
             </w:r>
@@ -1191,7 +1285,7 @@
                 <w:rFonts w:ascii="Times New Roman" w:hAnsi="Times New Roman" w:eastAsia="HY신명조"/>
                 <w:b w:val="0"/>
                 <w:i w:val="0"/>
-                <w:sz w:val="16"/>
+                <w:sz w:val="17"/>
               </w:rPr>
               <w:t>0.897†</w:t>
             </w:r>
@@ -1214,7 +1308,7 @@
                 <w:rFonts w:ascii="Times New Roman" w:hAnsi="Times New Roman" w:eastAsia="HY신명조"/>
                 <w:b w:val="0"/>
                 <w:i w:val="0"/>
-                <w:sz w:val="16"/>
+                <w:sz w:val="17"/>
               </w:rPr>
               <w:t>0.826†</w:t>
             </w:r>
@@ -1239,7 +1333,7 @@
                 <w:rFonts w:ascii="Times New Roman" w:hAnsi="Times New Roman" w:eastAsia="HY신명조"/>
                 <w:b w:val="0"/>
                 <w:i w:val="0"/>
-                <w:sz w:val="16"/>
+                <w:sz w:val="17"/>
               </w:rPr>
               <w:t>교체형 캐스케이드</w:t>
             </w:r>
@@ -1262,7 +1356,7 @@
                 <w:rFonts w:ascii="Times New Roman" w:hAnsi="Times New Roman" w:eastAsia="HY신명조"/>
                 <w:b w:val="0"/>
                 <w:i w:val="0"/>
-                <w:sz w:val="16"/>
+                <w:sz w:val="17"/>
               </w:rPr>
               <w:t>50%</w:t>
             </w:r>
@@ -1285,7 +1379,7 @@
                 <w:rFonts w:ascii="Times New Roman" w:hAnsi="Times New Roman" w:eastAsia="HY신명조"/>
                 <w:b w:val="0"/>
                 <w:i w:val="0"/>
-                <w:sz w:val="16"/>
+                <w:sz w:val="17"/>
               </w:rPr>
               <w:t>0.916</w:t>
             </w:r>
@@ -1308,9 +1402,199 @@
                 <w:rFonts w:ascii="Times New Roman" w:hAnsi="Times New Roman" w:eastAsia="HY신명조"/>
                 <w:b w:val="0"/>
                 <w:i w:val="0"/>
-                <w:sz w:val="16"/>
+                <w:sz w:val="17"/>
               </w:rPr>
               <w:t>0.835†</w:t>
+            </w:r>
+          </w:p>
+        </w:tc>
+      </w:tr>
+      <w:tr>
+        <w:tc>
+          <w:tcPr>
+            <w:tcW w:type="dxa" w:w="2438"/>
+          </w:tcPr>
+          <w:p>
+            <w:pPr>
+              <w:keepNext/>
+              <w:autoSpaceDE w:val="0"/>
+              <w:autoSpaceDN w:val="0"/>
+              <w:jc w:val="left"/>
+            </w:pPr>
+            <w:r/>
+            <w:r>
+              <w:rPr>
+                <w:rFonts w:ascii="Times New Roman" w:hAnsi="Times New Roman" w:eastAsia="HY신명조"/>
+                <w:b w:val="0"/>
+                <w:i w:val="0"/>
+                <w:sz w:val="17"/>
+              </w:rPr>
+              <w:t xml:space="preserve">NN</w:t>
+              <w:noBreakHyphen/>
+              <w:t xml:space="preserve">PPI 판정 캐스케이드</w:t>
+            </w:r>
+          </w:p>
+        </w:tc>
+        <w:tc>
+          <w:tcPr>
+            <w:tcW w:type="dxa" w:w="652"/>
+          </w:tcPr>
+          <w:p>
+            <w:pPr>
+              <w:keepNext/>
+              <w:autoSpaceDE w:val="0"/>
+              <w:autoSpaceDN w:val="0"/>
+              <w:jc w:val="center"/>
+            </w:pPr>
+            <w:r/>
+            <w:r>
+              <w:rPr>
+                <w:rFonts w:ascii="Times New Roman" w:hAnsi="Times New Roman" w:eastAsia="HY신명조"/>
+                <w:b w:val="0"/>
+                <w:i w:val="0"/>
+                <w:sz w:val="17"/>
+              </w:rPr>
+              <w:t>50%</w:t>
+            </w:r>
+          </w:p>
+        </w:tc>
+        <w:tc>
+          <w:tcPr>
+            <w:tcW w:type="dxa" w:w="680"/>
+          </w:tcPr>
+          <w:p>
+            <w:pPr>
+              <w:keepNext/>
+              <w:autoSpaceDE w:val="0"/>
+              <w:autoSpaceDN w:val="0"/>
+              <w:jc w:val="center"/>
+            </w:pPr>
+            <w:r/>
+            <w:r>
+              <w:rPr>
+                <w:rFonts w:ascii="Times New Roman" w:hAnsi="Times New Roman" w:eastAsia="HY신명조"/>
+                <w:b w:val="0"/>
+                <w:i w:val="0"/>
+                <w:sz w:val="17"/>
+              </w:rPr>
+              <w:t>0.898†</w:t>
+            </w:r>
+          </w:p>
+        </w:tc>
+        <w:tc>
+          <w:tcPr>
+            <w:tcW w:type="dxa" w:w="964"/>
+          </w:tcPr>
+          <w:p>
+            <w:pPr>
+              <w:keepNext/>
+              <w:autoSpaceDE w:val="0"/>
+              <w:autoSpaceDN w:val="0"/>
+              <w:jc w:val="center"/>
+            </w:pPr>
+            <w:r/>
+            <w:r>
+              <w:rPr>
+                <w:rFonts w:ascii="Times New Roman" w:hAnsi="Times New Roman" w:eastAsia="HY신명조"/>
+                <w:b w:val="0"/>
+                <w:i w:val="0"/>
+                <w:sz w:val="17"/>
+              </w:rPr>
+              <w:t>0.824†</w:t>
+            </w:r>
+          </w:p>
+        </w:tc>
+      </w:tr>
+      <w:tr>
+        <w:tc>
+          <w:tcPr>
+            <w:tcW w:type="dxa" w:w="2438"/>
+          </w:tcPr>
+          <w:p>
+            <w:pPr>
+              <w:keepNext/>
+              <w:autoSpaceDE w:val="0"/>
+              <w:autoSpaceDN w:val="0"/>
+              <w:jc w:val="left"/>
+            </w:pPr>
+            <w:r/>
+            <w:r>
+              <w:rPr>
+                <w:rFonts w:ascii="Times New Roman" w:hAnsi="Times New Roman" w:eastAsia="HY신명조"/>
+                <w:b/>
+                <w:i w:val="0"/>
+                <w:sz w:val="17"/>
+              </w:rPr>
+              <w:t>결합형 캐스케이드 (제안)</w:t>
+            </w:r>
+          </w:p>
+        </w:tc>
+        <w:tc>
+          <w:tcPr>
+            <w:tcW w:type="dxa" w:w="652"/>
+          </w:tcPr>
+          <w:p>
+            <w:pPr>
+              <w:keepNext/>
+              <w:autoSpaceDE w:val="0"/>
+              <w:autoSpaceDN w:val="0"/>
+              <w:jc w:val="center"/>
+            </w:pPr>
+            <w:r/>
+            <w:r>
+              <w:rPr>
+                <w:rFonts w:ascii="Times New Roman" w:hAnsi="Times New Roman" w:eastAsia="HY신명조"/>
+                <w:b/>
+                <w:i w:val="0"/>
+                <w:sz w:val="17"/>
+              </w:rPr>
+              <w:t>50%</w:t>
+            </w:r>
+          </w:p>
+        </w:tc>
+        <w:tc>
+          <w:tcPr>
+            <w:tcW w:type="dxa" w:w="680"/>
+          </w:tcPr>
+          <w:p>
+            <w:pPr>
+              <w:keepNext/>
+              <w:autoSpaceDE w:val="0"/>
+              <w:autoSpaceDN w:val="0"/>
+              <w:jc w:val="center"/>
+            </w:pPr>
+            <w:r/>
+            <w:r>
+              <w:rPr>
+                <w:rFonts w:ascii="Times New Roman" w:hAnsi="Times New Roman" w:eastAsia="HY신명조"/>
+                <w:b/>
+                <w:i w:val="0"/>
+                <w:sz w:val="17"/>
+              </w:rPr>
+              <w:t>0.923</w:t>
+            </w:r>
+          </w:p>
+        </w:tc>
+        <w:tc>
+          <w:tcPr>
+            <w:tcW w:type="dxa" w:w="964"/>
+          </w:tcPr>
+          <w:p>
+            <w:pPr>
+              <w:keepNext/>
+              <w:autoSpaceDE w:val="0"/>
+              <w:autoSpaceDN w:val="0"/>
+              <w:jc w:val="center"/>
+            </w:pPr>
+            <w:r/>
+            <w:r>
+              <w:rPr>
+                <w:rFonts w:ascii="Times New Roman" w:hAnsi="Times New Roman" w:eastAsia="HY신명조"/>
+                <w:b/>
+                <w:i w:val="0"/>
+                <w:sz w:val="17"/>
+              </w:rPr>
+              <w:t>0.846</w:t>
             </w:r>
           </w:p>
         </w:tc>
@@ -1332,7 +1616,7 @@
                 <w:rFonts w:ascii="Times New Roman" w:hAnsi="Times New Roman" w:eastAsia="HY신명조"/>
                 <w:b/>
                 <w:i w:val="0"/>
-                <w:sz w:val="16"/>
+                <w:sz w:val="17"/>
               </w:rPr>
               <w:t>결합형 캐스케이드 (제안)</w:t>
             </w:r>
@@ -1354,9 +1638,9 @@
                 <w:rFonts w:ascii="Times New Roman" w:hAnsi="Times New Roman" w:eastAsia="HY신명조"/>
                 <w:b/>
                 <w:i w:val="0"/>
-                <w:sz w:val="16"/>
+                <w:sz w:val="17"/>
               </w:rPr>
-              <w:t>50%</w:t>
+              <w:t>100%</w:t>
             </w:r>
           </w:p>
         </w:tc>
@@ -1376,9 +1660,9 @@
                 <w:rFonts w:ascii="Times New Roman" w:hAnsi="Times New Roman" w:eastAsia="HY신명조"/>
                 <w:b/>
                 <w:i w:val="0"/>
-                <w:sz w:val="16"/>
+                <w:sz w:val="17"/>
               </w:rPr>
-              <w:t>0.923</w:t>
+              <w:t>0.924</w:t>
             </w:r>
           </w:p>
         </w:tc>
@@ -1398,9 +1682,9 @@
                 <w:rFonts w:ascii="Times New Roman" w:hAnsi="Times New Roman" w:eastAsia="HY신명조"/>
                 <w:b/>
                 <w:i w:val="0"/>
-                <w:sz w:val="16"/>
+                <w:sz w:val="17"/>
               </w:rPr>
-              <w:t>0.846</w:t>
+              <w:t>0.852</w:t>
             </w:r>
           </w:p>
         </w:tc>
@@ -1441,11 +1725,29 @@
           <w:i w:val="0"/>
           <w:sz w:val="18"/>
         </w:rPr>
-        <w:t xml:space="preserve">호출률 50%는 테스트가 아닌 보정 세트에서 정하였다(교차적합 정확도가 50% 이후 0.1%p 이하로만 올라 포화, 전량 호출과 0.7%p 이내). 이 호출률에서 결합형의 테스트 정확도는 LLM 전량 호출 중 더 높은 설정보다 0.8%p, 1.1%p 높았으나 유의하지 않았고(p=0.22, 0.18), NN</w:t>
+        <w:t xml:space="preserve">호출률 50%는 테스트가 아닌 보정 세트에서 정하였다(교차적합 정확도가 50% 이후 0.1%p 이하로만 올라 포화, 전량 호출과 0.7%p 이내: CLEF 0.839 대 0.845, ClaimBuster 0.837 대 0.837). 이 호출률에서 결합형의 테스트 정확도는 LLM 전량 호출 중 더 높은 설정보다 0.8%p, 1.1%p 높았으나 유의하지 않았고(p=0.22, 0.18), NN</w:t>
         <w:noBreakHyphen/>
-        <w:t xml:space="preserve">PPI 적용 전량 호출보다는 2.6%p, 2.0%p 유의하게 높았다(p&lt;0.001). 호출률을 100%로 올리면(그림 2) 정확도가 0.1%p, 0.6%p 더 올랐고, ClaimBuster에서는 이 차이가 유의하였다(p=0.006). 교체형은 임베딩 SVM이 확신하는 상위 절반에서 옳은 판정 94건을 틀리게, 틀린 판정 66건을 옳게 바꾸었으나 결합형은 각각 9건, 26건이었다(1회차, ClaimBuster). 이는 교체가 옳은 답을 해칠 수 있다는 보고[7]와 일치한다. 결합형은 LLM을 호출하는 모든 호출률에서 교체형보다 평균 정확도가 높았고, 같은 문장에 LLM을 호출하고 NN</w:t>
+        <w:t xml:space="preserve">PPI 적용 전량 호출보다는 2.6%p, 2.0%p 유의하게 높았다(p&lt;0.001). 호출률을 100%로 올리면(그림 2) 정확도가 0.1%p, 0.6%p 더 올랐고, ClaimBuster에서는 이 차이가 유의하였다(p=0.006). 테스트 문장을 모으지 않고 보정 세트에서 정한 |d| 임계값으로 문장마다 라우팅해도 정확도는 0.920, 0.845(실제 호출률 38%, 49%)였다. 교체형은 임베딩 SVM이 확신하는 상위 절반에서 옳은 판정 94건을 틀리게, 틀린 판정 66건을 옳게 바꾸었으나 결합형은 각각 9건, 26건이었다(1회차, ClaimBuster). 이는 교체가 옳은 답을 해칠 수 있다는 보고[7]와 일치한다. 결합형은 LLM을 호출하는 모든 호출률에서 교체형보다 평균 정확도가 높았고(ClaimBuster 30~50%, CLEF 20~30%에서 유의, p≤0.023), 같은 문장에 LLM을 호출하고 NN</w:t>
         <w:noBreakHyphen/>
         <w:t xml:space="preserve">PPI로 판정하는 캐스케이드(0.898, 0.824)보다도 유의하게 높아(p&lt;0.001) 이 차이는 판정 방식에서 온다.</w:t>
+      </w:r>
+    </w:p>
+    <w:p>
+      <w:pPr>
+        <w:autoSpaceDE w:val="0"/>
+        <w:autoSpaceDN w:val="0"/>
+        <w:spacing w:after="50" w:line="240" w:lineRule="auto"/>
+        <w:ind w:firstLine="180"/>
+        <w:jc w:val="both"/>
+      </w:pPr>
+      <w:r>
+        <w:rPr>
+          <w:rFonts w:ascii="Times New Roman" w:hAnsi="Times New Roman" w:eastAsia="HY신명조"/>
+          <w:b w:val="0"/>
+          <w:i w:val="0"/>
+          <w:sz w:val="18"/>
+        </w:rPr>
+        <w:t>식 (1)은 LLM 점수의 판정 기준을 d에 따라 옮긴다. CLEF 1회차에서 학습한 계수(a=1.46, b=6.76, c=−1.51)로 보면, 결합형이 팩트체크가 필요하다고 판정하는 LLM 점수 기준 (−c−a·d)/b는 d=0에서 0.22이고 분류기가 불필요 쪽으로 기울수록 높아진다. 예를 들어 공약 문장 “I'm going to give them $5,000 to take with them wherever they want to go, and this will give them affordability.”(라벨: 불필요)은 d=−0.84, s=0.35여서, LLM 임계값 0.16을 쓰는 교체형은 팩트체크가 필요하다고 잘못 판정하지만 결합형은 기준 0.41에 못 미쳐 옳게 판정한다. 호출한 절반에서 결합형만 옳은 문장은 36개, 교체형만 옳은 문장은 24개였다.</w:t>
       </w:r>
     </w:p>
     <w:p>
@@ -1459,7 +1761,7 @@
       <w:r>
         <w:drawing>
           <wp:inline xmlns:a="http://schemas.openxmlformats.org/drawingml/2006/main" xmlns:pic="http://schemas.openxmlformats.org/drawingml/2006/picture">
-            <wp:extent cx="2951999" cy="1415801"/>
+            <wp:extent cx="2951999" cy="1711458"/>
             <wp:docPr id="4" name="Picture 4"/>
             <wp:cNvGraphicFramePr>
               <a:graphicFrameLocks noChangeAspect="1"/>
@@ -1480,7 +1782,7 @@
                   <pic:spPr>
                     <a:xfrm>
                       <a:off x="0" y="0"/>
-                      <a:ext cx="2951999" cy="1415801"/>
+                      <a:ext cx="2951999" cy="1711458"/>
                     </a:xfrm>
                     <a:prstGeom prst="rect"/>
                   </pic:spPr>
@@ -1540,7 +1842,7 @@
           <w:i w:val="0"/>
           <w:sz w:val="18"/>
         </w:rPr>
-        <w:t>라벨로 학습한 저비용 분류기와 LLM은 서로 다른 정보를 가지며, 불확실한 문장에서만 LLM을 호출해 결합하면 호출을 절반으로 줄여도 전량 호출과 유의한 차이가 없는 정확도를 얻는다. 출처가 겹치는[5] 영어 두 데이터셋과 단일 LLM으로 평가하였고 비용을 호출률로만 보고하였다는 한계가 있다.</w:t>
+        <w:t>라벨로 학습한 저비용 분류기와 LLM은 서로 다른 정보를 가지며, 불확실한 문장에서만 LLM을 호출해 결합하면 호출을 절반으로 줄여도 전량 호출과 유의한 차이가 없는 정확도를 얻는다. 출처가 겹치는[5] 영어 두 데이터셋과 단일 LLM으로 평가하였고 비용을 호출률로만 보고하였다는 한계가 있으며, 향후 다국어 데이터와 여러 LLM, 금액 기준 비용으로 평가를 확장할 계획이다.</w:t>
       </w:r>
     </w:p>
     <w:p>
@@ -1665,7 +1967,7 @@
           <w:i w:val="0"/>
           <w:sz w:val="18"/>
         </w:rPr>
-        <w:t>[6] F. Arslan et al., "A Benchmark Dataset of Check-Worthy Factual Claims," in Proc. ICWSM, vol. 14, pp. 821–829, 2020.</w:t>
+        <w:t>[6] F. Arslan, N. Hassan, C. Li, and M. Tremayne, "A Benchmark Dataset of Check-Worthy Factual Claims," in Proc. ICWSM, vol. 14, pp. 821–829, 2020.</w:t>
       </w:r>
     </w:p>
     <w:p>

</xml_diff>

<commit_message>
Table 1: one proposed row (50%), fused-100% labelled as reference; dagger caption states direction and test
Co-Authored-By: Claude Opus 5.5 <noreply@anthropic.com>
</commit_message>
<xml_diff>
--- a/paper/cascade_kics_draft.docx
+++ b/paper/cascade_kics_draft.docx
@@ -637,7 +637,7 @@
           <w:i w:val="0"/>
           <w:sz w:val="17"/>
         </w:rPr>
-        <w:t>표 1. 테스트 정확도 (5회 평균, †: 결합형(50%)이 유의하게 높음)</w:t>
+        <w:t>표 1. 테스트 정확도 (5회 평균, †: 제안 방법(호출률 50%)보다 유의하게 낮음, McNemar p&lt;0.05)</w:t>
       </w:r>
     </w:p>
     <w:tbl>
@@ -1614,11 +1614,11 @@
             <w:r>
               <w:rPr>
                 <w:rFonts w:ascii="Times New Roman" w:hAnsi="Times New Roman" w:eastAsia="HY신명조"/>
-                <w:b/>
+                <w:b w:val="0"/>
                 <w:i w:val="0"/>
                 <w:sz w:val="17"/>
               </w:rPr>
-              <w:t>결합형 캐스케이드 (제안)</w:t>
+              <w:t xml:space="preserve">  (호출률 100%, 참고)</w:t>
             </w:r>
           </w:p>
         </w:tc>
@@ -1636,7 +1636,7 @@
             <w:r>
               <w:rPr>
                 <w:rFonts w:ascii="Times New Roman" w:hAnsi="Times New Roman" w:eastAsia="HY신명조"/>
-                <w:b/>
+                <w:b w:val="0"/>
                 <w:i w:val="0"/>
                 <w:sz w:val="17"/>
               </w:rPr>
@@ -1658,7 +1658,7 @@
             <w:r>
               <w:rPr>
                 <w:rFonts w:ascii="Times New Roman" w:hAnsi="Times New Roman" w:eastAsia="HY신명조"/>
-                <w:b/>
+                <w:b w:val="0"/>
                 <w:i w:val="0"/>
                 <w:sz w:val="17"/>
               </w:rPr>
@@ -1680,7 +1680,7 @@
             <w:r>
               <w:rPr>
                 <w:rFonts w:ascii="Times New Roman" w:hAnsi="Times New Roman" w:eastAsia="HY신명조"/>
-                <w:b/>
+                <w:b w:val="0"/>
                 <w:i w:val="0"/>
                 <w:sz w:val="17"/>
               </w:rPr>

</xml_diff>

<commit_message>
Readability pass: one finding per results paragraph, restructured intro, Hangul line breaking
- Results 3.2 split into five paragraphs, each opening with a bold one-line finding;
  numbers already in Table 1 are no longer repeated in the prose (claims unchanged)
- Intro: problem/prior work, then the gap (replacement can overturn correct decisions), then contributions
- 3.1 split into 데이터/모델/평가; the confident-half flip counts are now stated as 100%-call numbers
- Worked example without the coefficient formula; conclusion states both findings
- Zero-width break opportunities between Hangul syllables (not w:wordWrap, which also split
  English words), so justified columns no longer stretch the gaps between 어절
- verify_paper_numbers.py: drop checks for numbers removed from the prose, strip U+200B

Co-Authored-By: Claude Opus 5.5 <noreply@anthropic.com>
</commit_message>
<xml_diff>
--- a/paper/cascade_kics_draft.docx
+++ b/paper/cascade_kics_draft.docx
@@ -178,15 +178,15 @@
           <w:i w:val="0"/>
           <w:sz w:val="18"/>
         </w:rPr>
-        <w:t xml:space="preserve">팩트체크 필요성 탐지(check</w:t>
+        <w:t xml:space="preserve">팩​트​체​크 필​요​성 탐​지(check</w:t>
         <w:noBreakHyphen/>
-        <w:t xml:space="preserve">worthiness detection)는 유입되는 모든 문장에 적용되므로, 대형 언어 모델(LLM)을 모든 문장에 호출하면 비용과 지연이 크다. 본 논문은 소형 LLM 점수를 이웃 문장의 잔차로 보정하는 선행 연구 NN</w:t>
+        <w:t xml:space="preserve">worthiness detection)는 유​입​되​는 모​든 문​장​에 적​용​되​므​로, 모​든 문​장​에 대​형 언​어 모​델(LLM)을 호​출​하​면 비​용​과 지​연​이 크​다. 본 논​문​은 소​형 LLM 점​수​를 이​웃 문​장​으​로 보​정​하​는 선​행 연​구 NN</w:t>
         <w:noBreakHyphen/>
-        <w:t xml:space="preserve">PPI를 CLEF 2024와 ClaimBuster에서 재현하고, 같은 라벨과 문장 임베딩으로 분류기를 직접 학습하면 LLM 없이도 NN</w:t>
+        <w:t xml:space="preserve">PPI를 CLEF 2024와 ClaimBuster에​서 재​현​하​고, 같​은 라​벨​과 문​장 임​베​딩​으​로 학​습​한 저​비​용 분​류​기​만​으​로​도 NN</w:t>
         <w:noBreakHyphen/>
-        <w:t xml:space="preserve">PPI와 같거나 높은 정확도를 얻음을 보인다. 이어 저비용 분류기가 모든 문장을 판정하고 불확실한 문장에만 LLM을 호출하되, LLM의 판정으로 교체하지 않고 결합하는 결합형 캐스케이드를 제안한다. 실험 결과 LLM 호출을 절반으로 줄이고도 테스트 정확도(CLEF 0.923, ClaimBuster 0.846)가 LLM 전량 호출 중 더 높은 설정(0.915, 0.835)과 유의한 차이가 없었고, NN</w:t>
+        <w:t xml:space="preserve">PPI와 같​거​나 높​은 정​확​도​를 얻​음​을 보​인​다. 이​어 분​류​기​가 불​확​실​한 문​장​에​만 LLM을 호​출​하​고, 그 판​정​을 LLM의 답​으​로 교​체​하​는 대​신 두 점​수​를 결​합​하​는 결​합​형 캐​스​케​이​드​를 제​안​한​다. LLM 호​출​을 절​반​으​로 줄​여​도 테​스​트 정​확​도(CLEF 0.923, ClaimBuster 0.846)는 LLM 단​독 전​량 호​출​의 최​고 정​확​도(0.915, 0.835)와 유​의​한 차​이​가 없​었​고, NN</w:t>
         <w:noBreakHyphen/>
-        <w:t xml:space="preserve">PPI 적용 전량 호출(0.897, 0.826)보다는 유의하게 높았다. 결합형은 모든 호출률에서 교체형 캐스케이드보다 평균 정확도가 높아, 라벨에 담긴 판정 기준과 LLM의 일반 지식이 상호 보완적임을 시사한다.</w:t>
+        <w:t xml:space="preserve">PPI를 적​용​한 전​량 호​출(0.897, 0.826)보​다​는 유​의​하​게 높​았​다. 결​합​형​은 모​든 호​출​률​에​서 교​체​형 캐​스​케​이​드​보​다 평​균 정​확​도​가 높​아, 라​벨​에 담​긴 판​정 기​준​과 LLM의 일​반 지​식​이 서​로 보​완​적​임​을 시사한다.</w:t>
       </w:r>
     </w:p>
     <w:p>
@@ -222,7 +222,7 @@
       <w:pPr>
         <w:autoSpaceDE w:val="0"/>
         <w:autoSpaceDN w:val="0"/>
-        <w:spacing w:after="50" w:line="240" w:lineRule="auto"/>
+        <w:spacing w:after="70" w:line="240" w:lineRule="auto"/>
         <w:ind w:firstLine="180"/>
         <w:jc w:val="both"/>
       </w:pPr>
@@ -233,16 +233,16 @@
           <w:i w:val="0"/>
           <w:sz w:val="18"/>
         </w:rPr>
-        <w:t xml:space="preserve">팩트체크 필요성 탐지는 유입되는 모든 문장에 적용되므로, 실제 팩트체크 서비스 운영사는 모든 문장에 LLM을 적용하는 것이 비현실적이라고 보고하였다[1]. NN</w:t>
+        <w:t xml:space="preserve">팩​트​체​크 필​요​성 탐​지​는 유​입​되​는 모​든 문​장​에 적​용​되​므​로, 실​제 팩​트​체​크 서​비​스 운​영​사​는 모​든 문​장​에 LLM을 적​용​하​는 것​이 비​현​실​적​이​라​고 보​고​하​였​다[1]. 이​에 NN</w:t>
         <w:noBreakHyphen/>
-        <w:t xml:space="preserve">PPI[1]는 소형 LLM의 점수를 라벨이 있는 보정 세트 중 의미적으로 가까운 이웃의 잔차로 보정한다. 같은 연구진은 파인튜닝한 소형 인코더가 LLM과 경쟁할 수 있으나 관용적 표현에서는 LLM이 앞선다고 보고하고, 인코더의 확신이 낮을 때만 LLM에 넘기는 하이브리드를 향후 과제로 제시하였다[2]. 일반적인 캐스케이드[4]는 불확실한 입력을 더 큰 LLM에 넘기되 그 답으로 교체하고, LabelFusion[3]은 인코더와 LLM의 출력을 결합하지만 모든 입력에 LLM을 호출한다. 위임한 입력에서 두 모델의 출력을 선택적으로 결합하는 캐스케이드도 일반 분류 과제에서 제안되었다[8]. 본 논문은 [2]의 하이브리드를 구현하되, 결합 가중치를 라벨로 학습하여 LLM과 라벨의 판정 기준 차이까지 반영한다.</w:t>
+        <w:t xml:space="preserve">PPI[1]는 소​형 LLM의 점​수​를, 라​벨​이 있​는 보​정 세​트​에​서 의​미​적​으​로 가​까​운 이​웃 문​장​의 잔​차​로 보​정​한​다. 같​은 연​구​진​은 파​인​튜​닝​한 소​형 인​코​더​도 LLM과 경​쟁​할 수 있​으​나 관​용​적 표​현​에​서​는 LLM이 앞​선​다​고 보​고​하​며, 인​코​더​가 확​신​하​지 못​할 때​만 LLM에 넘​기​는 하​이​브​리​드​를 향​후 과​제​로 남겼다[2].</w:t>
       </w:r>
     </w:p>
     <w:p>
       <w:pPr>
         <w:autoSpaceDE w:val="0"/>
         <w:autoSpaceDN w:val="0"/>
-        <w:spacing w:after="50" w:line="240" w:lineRule="auto"/>
+        <w:spacing w:after="70" w:line="240" w:lineRule="auto"/>
         <w:ind w:firstLine="180"/>
         <w:jc w:val="both"/>
       </w:pPr>
@@ -253,11 +253,29 @@
           <w:i w:val="0"/>
           <w:sz w:val="18"/>
         </w:rPr>
-        <w:t xml:space="preserve">본 논문의 기여는 다음과 같다. (1) NN</w:t>
+        <w:t>이​러​한 하​이​브​리​드​의 일​반​적 형​태​인 캐​스​케​이​드[4]는 넘​긴 입​력​의 판​정​을 LLM의 답​으​로 교​체​한​다. 그​러​나 LLM의 판​정 기​준​은 데​이​터​셋 라​벨​과 다​를 수 있​어, 교​체​는 분​류​기​의 옳​은 판​정​까​지 바​꿀 수 있​다. LabelFusion[3]은 인​코​더​와 LLM의 출​력​을 결​합​하​지​만 모​든 입​력​에 LLM을 호​출​하​며, 넘​긴 입​력​에​서​만 두 출​력​을 결​합​하​는 캐​스​케​이​드​는 일​반 분​류 과​제​에​서 제​안​되​었​다[8]. 본 논​문​은 [2]의 하​이​브​리​드​를 팩​트​체​크 필​요​성 탐​지​에 구​현​하​되, 결​합 가​중​치​를 라​벨​로 학​습​하​여 LLM과 라​벨​의 판​정 기​준 차​이​까​지 반영한다.</w:t>
+      </w:r>
+    </w:p>
+    <w:p>
+      <w:pPr>
+        <w:autoSpaceDE w:val="0"/>
+        <w:autoSpaceDN w:val="0"/>
+        <w:spacing w:after="70" w:line="240" w:lineRule="auto"/>
+        <w:ind w:firstLine="180"/>
+        <w:jc w:val="both"/>
+      </w:pPr>
+      <w:r>
+        <w:rPr>
+          <w:rFonts w:ascii="Times New Roman" w:hAnsi="Times New Roman" w:eastAsia="HY신명조"/>
+          <w:b w:val="0"/>
+          <w:i w:val="0"/>
+          <w:sz w:val="18"/>
+        </w:rPr>
+        <w:t xml:space="preserve">본 논​문​의 기​여​는 세 가​지​이​다. (1) NN</w:t>
         <w:noBreakHyphen/>
-        <w:t xml:space="preserve">PPI를 재현하고, 같은 라벨과 임베딩으로 학습한 분류기가 LLM 없이 NN</w:t>
+        <w:t xml:space="preserve">PPI를 재​현​하​고, 같​은 라​벨​과 임​베​딩​으​로 학​습​한 분​류​기​가 LLM 없​이​도 NN</w:t>
         <w:noBreakHyphen/>
-        <w:t xml:space="preserve">PPI와 같거나 높은 정확도를 냄을 보인다. (2) 상용 LLM을 모든 문장에 적용해도 팩트체크가 필요한 문장을 과소 판정함을 보인다. (3) 저비용 분류기의 판정을 유지하면서 불확실한 문장에서만 LLM 점수를 결합하는 결합형 캐스케이드를 제안하고, 호출을 절반으로 줄여도 전량 호출과 유의한 차이가 없는 정확도를 얻음을 보인다.</w:t>
+        <w:t xml:space="preserve">PPI와 같​거​나 높​은 정​확​도​를 냄​을 보​인​다. (2) 상​용 LLM을 모​든 문​장​에 적​용​해​도 팩​트​체​크​가 필​요​한 문​장​을 상​당​수 놓​침​을 보​인​다. (3) 분​류​기​가 불​확​실​한 문​장​에​서​만 LLM 점​수​를 결​합​하​는 결​합​형 캐​스​케​이​드​를 제​안​하​고, 호​출​을 절​반​으​로 줄​여​도 전​량 호​출​과 유​의​한 차​이​가 없​는 정​확​도​를 얻​음​을 보인다.</w:t>
       </w:r>
     </w:p>
     <w:p>
@@ -298,7 +316,7 @@
       <w:pPr>
         <w:autoSpaceDE w:val="0"/>
         <w:autoSpaceDN w:val="0"/>
-        <w:spacing w:after="50" w:line="240" w:lineRule="auto"/>
+        <w:spacing w:after="70" w:line="240" w:lineRule="auto"/>
         <w:ind w:firstLine="180"/>
         <w:jc w:val="both"/>
       </w:pPr>
@@ -309,19 +327,19 @@
           <w:i w:val="0"/>
           <w:sz w:val="18"/>
         </w:rPr>
-        <w:t xml:space="preserve">문장 x가 팩트체크가 필요한지 y∈{0,1}을 판정하며, NN</w:t>
+        <w:t xml:space="preserve">문​장 x에 대​해 팩​트​체​크 필​요 여​부 y∈{0,1}을 판​정​하​며, 학​습​에​는 NN</w:t>
         <w:noBreakHyphen/>
-        <w:t xml:space="preserve">PPI와 같은 라벨이 있는 보정 세트 L을 사용한다. 저비용 분류기(이하 임베딩 SVM)는 NN</w:t>
+        <w:t xml:space="preserve">PPI와 같​은 라​벨 있​는 보​정 세​트 L을 쓴​다. 저​비​용 분​류​기(이​하 임​베​딩 SVM)는 NN</w:t>
         <w:noBreakHyphen/>
-        <w:t xml:space="preserve">PPI가 이웃 검색에 쓰는 문장 임베딩(all</w:t>
+        <w:t xml:space="preserve">PPI가 이​웃 검​색​에 쓰​는 문​장 임​베​딩(all</w:t>
         <w:noBreakHyphen/>
         <w:t xml:space="preserve">MiniLM</w:t>
         <w:noBreakHyphen/>
         <w:t xml:space="preserve">L6</w:t>
         <w:noBreakHyphen/>
-        <w:t xml:space="preserve">v2)을 입력으로 하는 RBF</w:t>
+        <w:t xml:space="preserve">v2)을 입​력​으​로 하​는 RBF</w:t>
         <w:noBreakHyphen/>
-        <w:t xml:space="preserve">SVM이며, 클래스 불균형을 고려한 가중치로 L에서 학습한다. 결정값 d(x)는 양수일수록 팩트체크가 필요함을 뜻하며, 추론은 CPU에서 문장당 약 6 ms이다.</w:t>
+        <w:t xml:space="preserve">SVM으​로, 클​래​스 불​균​형​을 고​려​한 가​중​치​로 L에​서 학​습​한​다. 결​정​값 d(x)가 양​수​이​면 팩​트​체​크​가 필​요​하​다​는 판​정​이​고, 절​댓​값​이 클​수​록 분​류​기​가 확​신​한​다​는 뜻​이​다. 추​론​은 CPU에​서 문​장​당 약 6 ms가 걸린다.</w:t>
       </w:r>
     </w:p>
     <w:p>
@@ -345,7 +363,7 @@
       <w:pPr>
         <w:autoSpaceDE w:val="0"/>
         <w:autoSpaceDN w:val="0"/>
-        <w:spacing w:after="50" w:line="240" w:lineRule="auto"/>
+        <w:spacing w:after="70" w:line="240" w:lineRule="auto"/>
         <w:ind w:firstLine="180"/>
         <w:jc w:val="both"/>
       </w:pPr>
@@ -356,7 +374,7 @@
           <w:i w:val="0"/>
           <w:sz w:val="18"/>
         </w:rPr>
-        <w:t>결합형 캐스케이드(이하 결합형)는 그림 1과 같이 |d(x)|가 작은 순서, 즉 분류기가 가장 불확실한 문장부터 전체의 ρ 비율(호출률)만큼 LLM을 호출하여 점수 s(x)∈[0,1]을 얻는다. 호출한 문장은 식 (1)로, 나머지는 d(x)&gt;0 여부로 판정한다.</w:t>
+        <w:t>결​합​형 캐​스​케​이​드(이​하 결​합​형)는 그​림 1과 같​이 동​작​한​다. 분​류​기​가 가​장 불​확​실​한 문​장, 즉 |d(x)|가 가​장 작​은 문​장​부​터 전​체​의 ρ(호​출​률)만​큼 골​라 LLM을 호​출​하​고 점​수 s(x)∈[0,1]을 얻​는​다. 호​출​한 문​장​은 식 (1)로 d와 s를 결​합​해 판​정​하​고, 나​머​지 문​장​은 분​류​기​의 판​정(d(x)&gt;0)을 그​대​로 쓴다.</w:t>
       </w:r>
     </w:p>
     <w:p>
@@ -427,7 +445,7 @@
         </w:tabs>
         <w:autoSpaceDE w:val="0"/>
         <w:autoSpaceDN w:val="0"/>
-        <w:spacing w:before="40" w:after="60"/>
+        <w:spacing w:before="80" w:after="80"/>
       </w:pPr>
       <w:r>
         <w:tab/>
@@ -485,7 +503,7 @@
         <w:widowControl w:val="0"/>
         <w:autoSpaceDE w:val="0"/>
         <w:autoSpaceDN w:val="0"/>
-        <w:spacing w:after="50" w:line="240" w:lineRule="auto"/>
+        <w:spacing w:after="70" w:line="240" w:lineRule="auto"/>
         <w:ind w:firstLine="180"/>
         <w:jc w:val="both"/>
       </w:pPr>
@@ -496,7 +514,7 @@
           <w:i w:val="0"/>
           <w:sz w:val="18"/>
         </w:rPr>
-        <w:t xml:space="preserve">(a, b, c)는 L에서 5겹 교차적합으로 얻은 d와 LLM 점수 s로 학습한 로지스틱 회귀 계수이고, σ는 시그모이드 함수, </w:t>
+        <w:t xml:space="preserve">(a, b, c)는 L에​서 5겹 교​차​적​합​으​로 얻​은 d와 s로 학​습​한 로​지​스​틱 회​귀 계​수, σ는 시​그​모​이​드 함​수, </w:t>
       </w:r>
       <w:r>
         <w:rPr>
@@ -542,7 +560,7 @@
           <w:i w:val="0"/>
           <w:sz w:val="18"/>
         </w:rPr>
-        <w:t>은 조건이 참이면 1인 지시함수이다. 비교 대상인 교체형 캐스케이드(이하 교체형)는 같은 문장을 선택하되, LLM 점수에 L에서 고른 임계값만 적용하여 판정한다.</w:t>
+        <w:t>는 조​건​이 참​이​면 1인 지​시​함​수​이​다. 비​교 대​상​인 교​체​형 캐​스​케​이​드(이​하 교​체​형)는 같​은 문​장​에 LLM을 호​출​하​되, d를 버​리​고 s에 L에​서 고​른 임​계​값​만 적용한다.</w:t>
       </w:r>
     </w:p>
     <w:p>
@@ -583,10 +601,19 @@
       <w:pPr>
         <w:autoSpaceDE w:val="0"/>
         <w:autoSpaceDN w:val="0"/>
-        <w:spacing w:after="50" w:line="240" w:lineRule="auto"/>
+        <w:spacing w:after="70" w:line="240" w:lineRule="auto"/>
         <w:ind w:firstLine="180"/>
         <w:jc w:val="both"/>
       </w:pPr>
+      <w:r>
+        <w:rPr>
+          <w:rFonts w:ascii="Times New Roman" w:hAnsi="Times New Roman" w:eastAsia="HY신명조"/>
+          <w:b/>
+          <w:i w:val="0"/>
+          <w:sz w:val="18"/>
+        </w:rPr>
+        <w:t xml:space="preserve">데​이​터. </w:t>
+      </w:r>
       <w:r>
         <w:rPr>
           <w:rFonts w:ascii="Times New Roman" w:hAnsi="Times New Roman" w:eastAsia="HY신명조"/>
@@ -594,15 +621,69 @@
           <w:i w:val="0"/>
           <w:sz w:val="18"/>
         </w:rPr>
-        <w:t xml:space="preserve">실험에는 CLEF 2024 CheckThat! Task 1 영어 데이터(보정 2,405문장, 테스트는 dev·dev</w:t>
+        <w:t xml:space="preserve">CLEF 2024 CheckThat! Task 1 영​어 데​이​터[5]는 2,405문​장​을 보​정 세​트​로, dev·dev</w:t>
         <w:noBreakHyphen/>
-        <w:t xml:space="preserve">test·공식 test를 합친 1,691문장)와 ClaimBuster 데이터(보정은 2012년 토론 1,314문장, 테스트는 2016년 토론 2,745문장)를 사용하였다[5,6]. NN</w:t>
+        <w:t xml:space="preserve">test·공​식 test를 합​친 1,691문​장​을 테​스​트​로 썼​다. ClaimBuster[6]는 2012년 토​론 1,314문​장​을 보​정 세​트​로, 2016년 토​론 2,745문​장​을 테​스​트​로 썼다.</w:t>
+      </w:r>
+    </w:p>
+    <w:p>
+      <w:pPr>
+        <w:autoSpaceDE w:val="0"/>
+        <w:autoSpaceDN w:val="0"/>
+        <w:spacing w:after="70" w:line="240" w:lineRule="auto"/>
+        <w:ind w:firstLine="180"/>
+        <w:jc w:val="both"/>
+      </w:pPr>
+      <w:r>
+        <w:rPr>
+          <w:rFonts w:ascii="Times New Roman" w:hAnsi="Times New Roman" w:eastAsia="HY신명조"/>
+          <w:b/>
+          <w:i w:val="0"/>
+          <w:sz w:val="18"/>
+        </w:rPr>
+        <w:t xml:space="preserve">모​델. </w:t>
+      </w:r>
+      <w:r>
+        <w:rPr>
+          <w:rFonts w:ascii="Times New Roman" w:hAnsi="Times New Roman" w:eastAsia="HY신명조"/>
+          <w:b w:val="0"/>
+          <w:i w:val="0"/>
+          <w:sz w:val="18"/>
+        </w:rPr>
+        <w:t xml:space="preserve">NN</w:t>
         <w:noBreakHyphen/>
-        <w:t xml:space="preserve">PPI는 원 논문의 Gemma 3 4B 설정으로 재현하였고(원 논문과 같은 CLEF dev</w:t>
+        <w:t xml:space="preserve">PPI는 원 논​문​과 같​이 Gemma 3 4B로 재​현​하​였​다. 원 논​문​과 같​은 분​할(CLEF dev</w:t>
         <w:noBreakHyphen/>
-        <w:t xml:space="preserve">test와 ClaimBuster 2016년 분할에서 가중 F1 CLEF 0.835, ClaimBuster 0.785; 원 논문 0.827, 0.760), 이웃 수 k는 보정 세트 내부 검증으로 선택하였다(두 데이터셋 k=10). LLM은 Claude Sonnet 5이며 NN</w:t>
+        <w:t xml:space="preserve">test, ClaimBuster 2016년)에​서 가​중 F1은 CLEF 0.835, ClaimBuster 0.785였​다(원 논​문 0.827, 0.760). 이​웃 수 k는 보​정 세​트 내​부 검​증​으​로 정​하​였​다(두 데​이​터​셋 모​두 k=10). LLM은 Claude Sonnet 5이​며, NN</w:t>
         <w:noBreakHyphen/>
-        <w:t xml:space="preserve">PPI의 판정 기준 프롬프트로 40문장씩 묶어 채점하였다(문장 단위 채점과 AUC 0.991 대 0.990). LLM 임계값, 결합 계수, k는 모두 보정 세트 안에서만 정하였고 임베딩 SVM은 기본 하이퍼파라미터를 사용하였다. 보정 세트의 80%를 비복원 추출하여 5회 반복한 평균을 보고하며, 방법 간 차이는 1회차 예측에 대한 McNemar 검정(α=0.05)으로 평가하였다.</w:t>
+        <w:t xml:space="preserve">PPI의 판​정 기​준 프​롬​프​트​로 40문​장​씩 묶​어 채​점​하​였​다. 문​장 단​위​로 채​점​한 표​본​에​서 AUC는 0.991 대 0.990으​로 묶​음 채​점​과 거​의 같았다.</w:t>
+      </w:r>
+    </w:p>
+    <w:p>
+      <w:pPr>
+        <w:autoSpaceDE w:val="0"/>
+        <w:autoSpaceDN w:val="0"/>
+        <w:spacing w:after="70" w:line="240" w:lineRule="auto"/>
+        <w:ind w:firstLine="180"/>
+        <w:jc w:val="both"/>
+      </w:pPr>
+      <w:r>
+        <w:rPr>
+          <w:rFonts w:ascii="Times New Roman" w:hAnsi="Times New Roman" w:eastAsia="HY신명조"/>
+          <w:b/>
+          <w:i w:val="0"/>
+          <w:sz w:val="18"/>
+        </w:rPr>
+        <w:t xml:space="preserve">평​가. </w:t>
+      </w:r>
+      <w:r>
+        <w:rPr>
+          <w:rFonts w:ascii="Times New Roman" w:hAnsi="Times New Roman" w:eastAsia="HY신명조"/>
+          <w:b w:val="0"/>
+          <w:i w:val="0"/>
+          <w:sz w:val="18"/>
+        </w:rPr>
+        <w:t>LLM 임​계​값, 결​합 계​수, k, 호​출​률​은 모​두 보​정 세​트 안​에​서​만 정​하​였​고, 임​베​딩 SVM은 기​본 하​이​퍼​파​라​미​터​를 썼​다. 보​정 세​트​의 80%를 비​복​원 추​출​하​여 5회 반​복​한 평​균​을 보​고​하​며, 방​법 간 차​이​는 1회​차 예​측​에 McNemar 검​정(α=0.05)을 적​용​해 평가하였다.</w:t>
       </w:r>
     </w:p>
     <w:p>
@@ -1694,10 +1775,21 @@
       <w:pPr>
         <w:autoSpaceDE w:val="0"/>
         <w:autoSpaceDN w:val="0"/>
-        <w:spacing w:after="60" w:line="240" w:lineRule="auto"/>
+        <w:spacing w:after="70" w:line="240" w:lineRule="auto" w:before="100"/>
         <w:ind w:firstLine="180"/>
         <w:jc w:val="both"/>
       </w:pPr>
+      <w:r>
+        <w:rPr>
+          <w:rFonts w:ascii="Times New Roman" w:hAnsi="Times New Roman" w:eastAsia="HY신명조"/>
+          <w:b/>
+          <w:i w:val="0"/>
+          <w:sz w:val="18"/>
+        </w:rPr>
+        <w:t xml:space="preserve">LLM 없​이​도 NN</w:t>
+        <w:noBreakHyphen/>
+        <w:t xml:space="preserve">PPI와 같​거​나 높​다. </w:t>
+      </w:r>
       <w:r>
         <w:rPr>
           <w:rFonts w:ascii="Times New Roman" w:hAnsi="Times New Roman" w:eastAsia="HY신명조"/>
@@ -1705,19 +1797,28 @@
           <w:i w:val="0"/>
           <w:sz w:val="18"/>
         </w:rPr>
-        <w:t xml:space="preserve">표 1에서 임베딩 SVM은 LLM 없이 NN</w:t>
+        <w:t xml:space="preserve">CLEF에​서​는 임​베​딩 SVM이 NN</w:t>
         <w:noBreakHyphen/>
-        <w:t xml:space="preserve">PPI보다 CLEF에서 유의하게 높았고(p=0.013) ClaimBuster에서는 차이가 유의하지 않았다(p=0.79). LLM을 그대로 쓰면 팩트체크가 필요한 문장을 과소 판정하여 재현율이 CLEF 0.61, ClaimBuster 0.42(정밀도 0.98, 0.91)에 그쳤고, 라벨로 임계값을 조정하자 각각 0.94, 0.86으로 개선되었다. 이는 LLM의 판정 기준과 데이터셋 라벨 사이에 차이가 있음을 시사한다. 한편 ClaimBuster에서는 클래스 균형인 보정 세트와 달리 테스트의 팩트체크가 필요한 문장이 27%여서, 임계값 조정 후 정확도는 오히려 0.5%p 낮아졌다.</w:t>
+        <w:t xml:space="preserve">PPI보​다 유​의​하​게 높​았​고(p=0.013), ClaimBuster에​서​는 차​이​가 유​의​하​지 않았다(p=0.79).</w:t>
       </w:r>
     </w:p>
     <w:p>
       <w:pPr>
         <w:autoSpaceDE w:val="0"/>
         <w:autoSpaceDN w:val="0"/>
-        <w:spacing w:after="50" w:line="240" w:lineRule="auto"/>
+        <w:spacing w:after="70" w:line="240" w:lineRule="auto"/>
         <w:ind w:firstLine="180"/>
         <w:jc w:val="both"/>
       </w:pPr>
+      <w:r>
+        <w:rPr>
+          <w:rFonts w:ascii="Times New Roman" w:hAnsi="Times New Roman" w:eastAsia="HY신명조"/>
+          <w:b/>
+          <w:i w:val="0"/>
+          <w:sz w:val="18"/>
+        </w:rPr>
+        <w:t xml:space="preserve">LLM 단​독​은 팩​트​체​크​가 필​요​한 문​장​을 놓​친​다. </w:t>
+      </w:r>
       <w:r>
         <w:rPr>
           <w:rFonts w:ascii="Times New Roman" w:hAnsi="Times New Roman" w:eastAsia="HY신명조"/>
@@ -1725,21 +1826,26 @@
           <w:i w:val="0"/>
           <w:sz w:val="18"/>
         </w:rPr>
-        <w:t xml:space="preserve">호출률 50%는 테스트가 아닌 보정 세트에서 정하였다(교차적합 정확도가 50% 이후 0.1%p 이하로만 올라 포화, 전량 호출과 0.7%p 이내: CLEF 0.839 대 0.845, ClaimBuster 0.837 대 0.837). 이 호출률에서 결합형의 테스트 정확도는 LLM 전량 호출 중 더 높은 설정보다 0.8%p, 1.1%p 높았으나 유의하지 않았고(p=0.22, 0.18), NN</w:t>
-        <w:noBreakHyphen/>
-        <w:t xml:space="preserve">PPI 적용 전량 호출보다는 2.6%p, 2.0%p 유의하게 높았다(p&lt;0.001). 호출률을 100%로 올리면(그림 2) 정확도가 0.1%p, 0.6%p 더 올랐고, ClaimBuster에서는 이 차이가 유의하였다(p=0.006). 테스트 문장을 모으지 않고 보정 세트에서 정한 |d| 임계값으로 문장마다 라우팅해도 정확도는 0.920, 0.845(실제 호출률 38%, 49%)였다. 교체형은 임베딩 SVM이 확신하는 상위 절반에서 옳은 판정 94건을 틀리게, 틀린 판정 66건을 옳게 바꾸었으나 결합형은 각각 9건, 26건이었다(1회차, ClaimBuster). 이는 교체가 옳은 답을 해칠 수 있다는 보고[7]와 일치한다. 결합형은 LLM을 호출하는 모든 호출률에서 교체형보다 평균 정확도가 높았고(ClaimBuster 30~50%, CLEF 20~30%에서 유의, p≤0.023), 같은 문장에 LLM을 호출하고 NN</w:t>
-        <w:noBreakHyphen/>
-        <w:t xml:space="preserve">PPI로 판정하는 캐스케이드(0.898, 0.824)보다도 유의하게 높아(p&lt;0.001) 이 차이는 판정 방식에서 온다.</w:t>
+        <w:t>LLM 점​수​를 그​대​로(0.5 기​준) 쓰​면 정​밀​도​는 CLEF 0.98, ClaimBuster 0.91로 높​지​만 재​현​율​은 0.61, 0.42에 그​쳤​다. 라​벨​로 임​계​값​을 조​정​하​면 재​현​율​이 0.94, 0.86으​로 올​라, LLM의 판​정 기​준​이 데​이​터​셋 라​벨​과 다​름​을 시​사​한​다. 다​만 ClaimBuster는 보​정 세​트​가 클​래​스 균​형​인 반​면 테​스​트​는 팩​트​체​크​가 필​요​한 문​장​이 27%뿐​이​어​서, 조​정 후 정​확​도​가 오​히​려 0.5%p 낮아졌다.</w:t>
       </w:r>
     </w:p>
     <w:p>
       <w:pPr>
         <w:autoSpaceDE w:val="0"/>
         <w:autoSpaceDN w:val="0"/>
-        <w:spacing w:after="50" w:line="240" w:lineRule="auto"/>
+        <w:spacing w:after="70" w:line="240" w:lineRule="auto"/>
         <w:ind w:firstLine="180"/>
         <w:jc w:val="both"/>
       </w:pPr>
+      <w:r>
+        <w:rPr>
+          <w:rFonts w:ascii="Times New Roman" w:hAnsi="Times New Roman" w:eastAsia="HY신명조"/>
+          <w:b/>
+          <w:i w:val="0"/>
+          <w:sz w:val="18"/>
+        </w:rPr>
+        <w:t xml:space="preserve">호​출​을 절​반​으​로 줄​여​도 정​확​도​가 유​지​된​다. </w:t>
+      </w:r>
       <w:r>
         <w:rPr>
           <w:rFonts w:ascii="Times New Roman" w:hAnsi="Times New Roman" w:eastAsia="HY신명조"/>
@@ -1747,7 +1853,65 @@
           <w:i w:val="0"/>
           <w:sz w:val="18"/>
         </w:rPr>
-        <w:t>식 (1)은 LLM 점수의 판정 기준을 d에 따라 옮긴다. CLEF 1회차에서 학습한 계수(a=1.46, b=6.76, c=−1.51)로 보면, 결합형이 팩트체크가 필요하다고 판정하는 LLM 점수 기준 (−c−a·d)/b는 d=0에서 0.22이고 분류기가 불필요 쪽으로 기울수록 높아진다. 예를 들어 공약 문장 “I'm going to give them $5,000 to take with them wherever they want to go, and this will give them affordability.”(라벨: 불필요)은 d=−0.84, s=0.35여서, LLM 임계값 0.16을 쓰는 교체형은 팩트체크가 필요하다고 잘못 판정하지만 결합형은 기준 0.41에 못 미쳐 옳게 판정한다. 호출한 절반에서 결합형만 옳은 문장은 36개, 교체형만 옳은 문장은 24개였다.</w:t>
+        <w:t xml:space="preserve">호​출​률 50%는 보​정 세​트​에​서 정​하​였​다. 교​차​적​합 정​확​도​가 50% 이​후 0.1%p 이​하​로​만 올​랐​고, 전​량 호​출​과​의 차​이​도 0.7%p 이​내​였​기 때​문​이​다. 이 호​출​률​에​서 결​합​형​은 LLM 단​독 전​량 호​출​의 최​고 정​확​도(표 1의 두 설​정 중 높​은 쪽)와 유​의​한 차​이​가 없​었​고(CLEF p=0.22, ClaimBuster p=0.18), NN</w:t>
+        <w:noBreakHyphen/>
+        <w:t xml:space="preserve">PPI를 적​용​한 전​량 호​출​보​다​는 유​의​하​게 높​았​다(p&lt;0.001). 호​출​률​을 100%로 올​리​면(그​림 2) 정​확​도​가 CLEF 0.1%p, ClaimBuster 0.6%p 더 올​랐​고, ClaimBuster에​서​는 이 차​이​가 유​의​하​였​다(p=0.006). 테​스​트 문​장​을 모​아 순​위​를 매​기​지 않​고 보​정 세​트​에​서 정​한 |d| 임​계​값​으​로 문​장​마​다 바​로 라​우​팅​해​도 정​확​도​는 0.920, 0.845(실​제 호​출​률 38%, 49%)였다.</w:t>
+      </w:r>
+    </w:p>
+    <w:p>
+      <w:pPr>
+        <w:autoSpaceDE w:val="0"/>
+        <w:autoSpaceDN w:val="0"/>
+        <w:spacing w:after="70" w:line="240" w:lineRule="auto"/>
+        <w:ind w:firstLine="180"/>
+        <w:jc w:val="both"/>
+      </w:pPr>
+      <w:r>
+        <w:rPr>
+          <w:rFonts w:ascii="Times New Roman" w:hAnsi="Times New Roman" w:eastAsia="HY신명조"/>
+          <w:b/>
+          <w:i w:val="0"/>
+          <w:sz w:val="18"/>
+        </w:rPr>
+        <w:t xml:space="preserve">교​체​보​다 결​합​이 낫​다. </w:t>
+      </w:r>
+      <w:r>
+        <w:rPr>
+          <w:rFonts w:ascii="Times New Roman" w:hAnsi="Times New Roman" w:eastAsia="HY신명조"/>
+          <w:b w:val="0"/>
+          <w:i w:val="0"/>
+          <w:sz w:val="18"/>
+        </w:rPr>
+        <w:t xml:space="preserve">결​합​형​은 LLM을 호​출​하​는 모​든 호​출​률​에​서 교​체​형​보​다 평​균 정​확​도​가 높​았​다(ClaimBuster 30~50%, CLEF 20~30%에​서 유​의, p≤0.023). 같​은 문​장​에 LLM을 호​출​하​고 NN</w:t>
+        <w:noBreakHyphen/>
+        <w:t xml:space="preserve">PPI로 판​정​하​는 캐​스​케​이​드​보​다​도 유​의​하​게 높​아(p&lt;0.001), 차​이​는 어​떤 문​장​을 호​출​하​느​냐​가 아​니​라 호​출​한 뒤 어​떻​게 판​정​하​느​냐​에​서 온​다. 호​출​률​을 100%로 올​려 임​베​딩 SVM이 확​신​하​는 절​반​까​지 LLM을 호​출​하​면, 교​체​형​은 그​중 옳​은 판​정 94건​을 틀​리​게, 틀​린 판​정 66건​을 옳​게 바​꾸​었​지​만 결​합​형​은 각​각 9건, 26건​만 바​꾸​었​다(ClaimBuster 1회​차). 교​체​가 옳​은 답​을 해​칠 수 있​다​는 보​고[7]와 일치한다.</w:t>
+      </w:r>
+    </w:p>
+    <w:p>
+      <w:pPr>
+        <w:autoSpaceDE w:val="0"/>
+        <w:autoSpaceDN w:val="0"/>
+        <w:spacing w:after="70" w:line="240" w:lineRule="auto"/>
+        <w:ind w:firstLine="180"/>
+        <w:jc w:val="both"/>
+      </w:pPr>
+      <w:r>
+        <w:rPr>
+          <w:rFonts w:ascii="Times New Roman" w:hAnsi="Times New Roman" w:eastAsia="HY신명조"/>
+          <w:b/>
+          <w:i w:val="0"/>
+          <w:sz w:val="18"/>
+        </w:rPr>
+        <w:t xml:space="preserve">작​동 예. </w:t>
+      </w:r>
+      <w:r>
+        <w:rPr>
+          <w:rFonts w:ascii="Times New Roman" w:hAnsi="Times New Roman" w:eastAsia="HY신명조"/>
+          <w:b w:val="0"/>
+          <w:i w:val="0"/>
+          <w:sz w:val="18"/>
+        </w:rPr>
+        <w:t>식 (1)은 d에 따​라 LLM 점​수​의 판​정 기​준​을 옮​긴​다. 분​류​기​가 ‘불​필​요’ 쪽​으​로 기​울​수​록(d&lt;0) 결​합​형​은 LLM에 더 높​은 점​수​를 요​구​하​며, CLEF 1회​차​에​서 이 기​준​은 d=0일 때 0.22이​다. 예​를 들​어 공​약 문​장 “I'm going to give them $5,000 to take with them wherever they want to go, and this will give them affordability.”(라​벨: 불​필​요)은 d=−0.84여​서 기​준​이 0.41로 올​라​가​고, s=0.35인 이 문​장​을 결​합​형​은 옳​게 ‘불​필​요’로 판​정​한​다. 반​면 LLM 임​계​값 0.16을 쓰​는 교​체​형​은 ‘필​요’로 잘​못 판​정​한​다. LLM을 호​출​한 절​반 전​체​에​서​도 결​합​형​만 옳​은 문​장(36개)이 교​체​형​만 옳​은 문​장(24개)보​다 많았다.</w:t>
       </w:r>
     </w:p>
     <w:p>
@@ -1831,7 +1995,7 @@
       <w:pPr>
         <w:autoSpaceDE w:val="0"/>
         <w:autoSpaceDN w:val="0"/>
-        <w:spacing w:after="50" w:line="240" w:lineRule="auto"/>
+        <w:spacing w:after="70" w:line="240" w:lineRule="auto"/>
         <w:ind w:firstLine="180"/>
         <w:jc w:val="both"/>
       </w:pPr>
@@ -1842,7 +2006,7 @@
           <w:i w:val="0"/>
           <w:sz w:val="18"/>
         </w:rPr>
-        <w:t>라벨로 학습한 저비용 분류기와 LLM은 서로 다른 정보를 가지며, 불확실한 문장에서만 LLM을 호출해 결합하면 호출을 절반으로 줄여도 전량 호출과 유의한 차이가 없는 정확도를 얻는다. 출처가 겹치는[5] 영어 두 데이터셋과 단일 LLM으로 평가하였고 비용을 호출률로만 보고하였다는 한계가 있으며, 향후 다국어 데이터와 여러 LLM, 금액 기준 비용으로 평가를 확장할 계획이다.</w:t>
+        <w:t>라​벨​로 학​습​한 저​비​용 분​류​기​와 LLM은 서​로 다​른 정​보​를 가​지​며, 분​류​기​가 불​확​실​한 문​장​에​서​만 LLM을 호​출​해 두 점​수​를 결​합​하​면 호​출​을 절​반​으​로 줄​여​도 전​량 호​출​과 유​의​한 차​이​가 없​는 정​확​도​를 얻​는​다. 또​한 결​합​은 같​은 문​장​을 LLM의 판​정​으​로 교​체​하​는 방​식​보​다 모​든 호​출​률​에​서 평​균 정​확​도​가 높​았​다. 다​만 출​처​가 겹​치​는[5] 영​어 두 데​이​터​셋​과 단​일 LLM으​로 평​가​하​였​고 비​용​을 호​출​률​로​만 측​정​하​였​다. 향​후 다​국​어 데​이​터​와 여​러 LLM, 금​액 기​준 비​용​으​로 평​가​를 확​장​할 계획이다.</w:t>
       </w:r>
     </w:p>
     <w:p>

</xml_diff>

<commit_message>
Trim results to what the claims need; line spacing 1.1
- Table 1: 10 -> 7 rows. Dropped Gemma raw (reproduction shown by wF1 in 3.1), the NN-PPI-decided
  cascade (same-selection control already given by the replacement cascade; NN-PPI on the LLM
  kept as the full-call +NN-PPI row) and fused@100% (numbers stay in the text and Fig. 2)
- Results: four paragraphs, one per claim. Dropped the 94/66 confident-half flips; [7] now
  cites the intro sentence it supports. Kept (compressed) the calib-chosen rho rationale and the
  streaming router, which answer "tuned on test" and "needs the whole test set" objections, and
  the significant gain from 100% calls on ClaimBuster
- Worked example folded into the fusion-vs-replacement paragraph
- Allow a line break before "(" after Hangul; body line spacing 1.1

Co-Authored-By: Claude Opus 5.5 <noreply@anthropic.com>
</commit_message>
<xml_diff>
--- a/paper/cascade_kics_draft.docx
+++ b/paper/cascade_kics_draft.docx
@@ -167,7 +167,7 @@
       <w:pPr>
         <w:autoSpaceDE w:val="0"/>
         <w:autoSpaceDN w:val="0"/>
-        <w:spacing w:after="50" w:line="240" w:lineRule="auto"/>
+        <w:spacing w:after="50" w:line="264" w:lineRule="auto"/>
         <w:ind w:firstLine="283"/>
         <w:jc w:val="both"/>
       </w:pPr>
@@ -178,15 +178,15 @@
           <w:i w:val="0"/>
           <w:sz w:val="18"/>
         </w:rPr>
-        <w:t xml:space="preserve">팩​트​체​크 필​요​성 탐​지(check</w:t>
+        <w:t xml:space="preserve">팩​트​체​크 필​요​성 탐​지​(check</w:t>
         <w:noBreakHyphen/>
-        <w:t xml:space="preserve">worthiness detection)는 유​입​되​는 모​든 문​장​에 적​용​되​므​로, 모​든 문​장​에 대​형 언​어 모​델(LLM)을 호​출​하​면 비​용​과 지​연​이 크​다. 본 논​문​은 소​형 LLM 점​수​를 이​웃 문​장​으​로 보​정​하​는 선​행 연​구 NN</w:t>
+        <w:t xml:space="preserve">worthiness detection)는 유​입​되​는 모​든 문​장​에 적​용​되​므​로, 모​든 문​장​에 대​형 언​어 모​델​(LLM)을 호​출​하​면 비​용​과 지​연​이 크​다. 본 논​문​은 소​형 LLM 점​수​를 이​웃 문​장​으​로 보​정​하​는 선​행 연​구 NN</w:t>
         <w:noBreakHyphen/>
         <w:t xml:space="preserve">PPI를 CLEF 2024와 ClaimBuster에​서 재​현​하​고, 같​은 라​벨​과 문​장 임​베​딩​으​로 학​습​한 저​비​용 분​류​기​만​으​로​도 NN</w:t>
         <w:noBreakHyphen/>
-        <w:t xml:space="preserve">PPI와 같​거​나 높​은 정​확​도​를 얻​음​을 보​인​다. 이​어 분​류​기​가 불​확​실​한 문​장​에​만 LLM을 호​출​하​고, 그 판​정​을 LLM의 답​으​로 교​체​하​는 대​신 두 점​수​를 결​합​하​는 결​합​형 캐​스​케​이​드​를 제​안​한​다. LLM 호​출​을 절​반​으​로 줄​여​도 테​스​트 정​확​도(CLEF 0.923, ClaimBuster 0.846)는 LLM 단​독 전​량 호​출​의 최​고 정​확​도(0.915, 0.835)와 유​의​한 차​이​가 없​었​고, NN</w:t>
+        <w:t xml:space="preserve">PPI와 같​거​나 높​은 정​확​도​를 얻​음​을 보​인​다. 이​어 분​류​기​가 불​확​실​한 문​장​에​만 LLM을 호​출​하​고, 그 판​정​을 LLM의 답​으​로 교​체​하​는 대​신 두 점​수​를 결​합​하​는 결​합​형 캐​스​케​이​드​를 제​안​한​다. LLM 호​출​을 절​반​으​로 줄​여​도 테​스​트 정​확​도​(CLEF 0.923, ClaimBuster 0.846)는 LLM 단​독 전​량 호​출​의 최​고 정​확​도​(0.915, 0.835)와 유​의​한 차​이​가 없​었​고, NN</w:t>
         <w:noBreakHyphen/>
-        <w:t xml:space="preserve">PPI를 적​용​한 전​량 호​출(0.897, 0.826)보​다​는 유​의​하​게 높​았​다. 결​합​형​은 모​든 호​출​률​에​서 교​체​형 캐​스​케​이​드​보​다 평​균 정​확​도​가 높​아, 라​벨​에 담​긴 판​정 기​준​과 LLM의 일​반 지​식​이 서​로 보​완​적​임​을 시사한다.</w:t>
+        <w:t xml:space="preserve">PPI를 적​용​한 전​량 호​출​(0.897, 0.826)보​다​는 유​의​하​게 높​았​다. 결​합​형​은 모​든 호​출​률​에​서 교​체​형 캐​스​케​이​드​보​다 평​균 정​확​도​가 높​아, 라​벨​에 담​긴 판​정 기​준​과 LLM의 일​반 지​식​이 서​로 보​완​적​임​을 시사한다.</w:t>
       </w:r>
     </w:p>
     <w:p>
@@ -222,7 +222,7 @@
       <w:pPr>
         <w:autoSpaceDE w:val="0"/>
         <w:autoSpaceDN w:val="0"/>
-        <w:spacing w:after="70" w:line="240" w:lineRule="auto"/>
+        <w:spacing w:after="70" w:line="264" w:lineRule="auto"/>
         <w:ind w:firstLine="180"/>
         <w:jc w:val="both"/>
       </w:pPr>
@@ -242,7 +242,7 @@
       <w:pPr>
         <w:autoSpaceDE w:val="0"/>
         <w:autoSpaceDN w:val="0"/>
-        <w:spacing w:after="70" w:line="240" w:lineRule="auto"/>
+        <w:spacing w:after="70" w:line="264" w:lineRule="auto"/>
         <w:ind w:firstLine="180"/>
         <w:jc w:val="both"/>
       </w:pPr>
@@ -253,14 +253,14 @@
           <w:i w:val="0"/>
           <w:sz w:val="18"/>
         </w:rPr>
-        <w:t>이​러​한 하​이​브​리​드​의 일​반​적 형​태​인 캐​스​케​이​드[4]는 넘​긴 입​력​의 판​정​을 LLM의 답​으​로 교​체​한​다. 그​러​나 LLM의 판​정 기​준​은 데​이​터​셋 라​벨​과 다​를 수 있​어, 교​체​는 분​류​기​의 옳​은 판​정​까​지 바​꿀 수 있​다. LabelFusion[3]은 인​코​더​와 LLM의 출​력​을 결​합​하​지​만 모​든 입​력​에 LLM을 호​출​하​며, 넘​긴 입​력​에​서​만 두 출​력​을 결​합​하​는 캐​스​케​이​드​는 일​반 분​류 과​제​에​서 제​안​되​었​다[8]. 본 논​문​은 [2]의 하​이​브​리​드​를 팩​트​체​크 필​요​성 탐​지​에 구​현​하​되, 결​합 가​중​치​를 라​벨​로 학​습​하​여 LLM과 라​벨​의 판​정 기​준 차​이​까​지 반영한다.</w:t>
+        <w:t>이​러​한 하​이​브​리​드​의 일​반​적 형​태​인 캐​스​케​이​드[4]는 넘​긴 입​력​의 판​정​을 LLM의 답​으​로 교​체​한​다. 그​러​나 LLM의 판​정 기​준​은 데​이​터​셋 라​벨​과 다​를 수 있​어, 교​체​는 분​류​기​의 옳​은 판​정​까​지 틀​리​게 바​꿀 수 있​다[7]. LabelFusion[3]은 인​코​더​와 LLM의 출​력​을 결​합​하​지​만 모​든 입​력​에 LLM을 호​출​하​며, 넘​긴 입​력​에​서​만 두 출​력​을 결​합​하​는 캐​스​케​이​드​는 일​반 분​류 과​제​에​서 제​안​되​었​다[8]. 본 논​문​은 [2]의 하​이​브​리​드​를 팩​트​체​크 필​요​성 탐​지​에 구​현​하​되, 결​합 가​중​치​를 라​벨​로 학​습​하​여 LLM과 라​벨​의 판​정 기​준 차​이​까​지 반영한다.</w:t>
       </w:r>
     </w:p>
     <w:p>
       <w:pPr>
         <w:autoSpaceDE w:val="0"/>
         <w:autoSpaceDN w:val="0"/>
-        <w:spacing w:after="70" w:line="240" w:lineRule="auto"/>
+        <w:spacing w:after="70" w:line="264" w:lineRule="auto"/>
         <w:ind w:firstLine="180"/>
         <w:jc w:val="both"/>
       </w:pPr>
@@ -316,7 +316,7 @@
       <w:pPr>
         <w:autoSpaceDE w:val="0"/>
         <w:autoSpaceDN w:val="0"/>
-        <w:spacing w:after="70" w:line="240" w:lineRule="auto"/>
+        <w:spacing w:after="70" w:line="264" w:lineRule="auto"/>
         <w:ind w:firstLine="180"/>
         <w:jc w:val="both"/>
       </w:pPr>
@@ -329,9 +329,9 @@
         </w:rPr>
         <w:t xml:space="preserve">문​장 x에 대​해 팩​트​체​크 필​요 여​부 y∈{0,1}을 판​정​하​며, 학​습​에​는 NN</w:t>
         <w:noBreakHyphen/>
-        <w:t xml:space="preserve">PPI와 같​은 라​벨 있​는 보​정 세​트 L을 쓴​다. 저​비​용 분​류​기(이​하 임​베​딩 SVM)는 NN</w:t>
+        <w:t xml:space="preserve">PPI와 같​은 라​벨 있​는 보​정 세​트 L을 쓴​다. 저​비​용 분​류​기​(이​하 임​베​딩 SVM)는 NN</w:t>
         <w:noBreakHyphen/>
-        <w:t xml:space="preserve">PPI가 이​웃 검​색​에 쓰​는 문​장 임​베​딩(all</w:t>
+        <w:t xml:space="preserve">PPI가 이​웃 검​색​에 쓰​는 문​장 임​베​딩​(all</w:t>
         <w:noBreakHyphen/>
         <w:t xml:space="preserve">MiniLM</w:t>
         <w:noBreakHyphen/>
@@ -363,7 +363,7 @@
       <w:pPr>
         <w:autoSpaceDE w:val="0"/>
         <w:autoSpaceDN w:val="0"/>
-        <w:spacing w:after="70" w:line="240" w:lineRule="auto"/>
+        <w:spacing w:after="70" w:line="264" w:lineRule="auto"/>
         <w:ind w:firstLine="180"/>
         <w:jc w:val="both"/>
       </w:pPr>
@@ -374,7 +374,7 @@
           <w:i w:val="0"/>
           <w:sz w:val="18"/>
         </w:rPr>
-        <w:t>결​합​형 캐​스​케​이​드(이​하 결​합​형)는 그​림 1과 같​이 동​작​한​다. 분​류​기​가 가​장 불​확​실​한 문​장, 즉 |d(x)|가 가​장 작​은 문​장​부​터 전​체​의 ρ(호​출​률)만​큼 골​라 LLM을 호​출​하​고 점​수 s(x)∈[0,1]을 얻​는​다. 호​출​한 문​장​은 식 (1)로 d와 s를 결​합​해 판​정​하​고, 나​머​지 문​장​은 분​류​기​의 판​정(d(x)&gt;0)을 그​대​로 쓴다.</w:t>
+        <w:t>결​합​형 캐​스​케​이​드​(이​하 결​합​형)는 그​림 1과 같​이 동​작​한​다. 분​류​기​가 가​장 불​확​실​한 문​장, 즉 |d(x)|가 가​장 작​은 문​장​부​터 전​체​의 ρ(호​출​률)만​큼 골​라 LLM을 호​출​하​고 점​수 s(x)∈[0,1]을 얻​는​다. 호​출​한 문​장​은 식 (1)로 d와 s를 결​합​해 판​정​하​고, 나​머​지 문​장​은 분​류​기​의 판​정​(d(x)&gt;0)을 그​대​로 쓴다.</w:t>
       </w:r>
     </w:p>
     <w:p>
@@ -503,7 +503,7 @@
         <w:widowControl w:val="0"/>
         <w:autoSpaceDE w:val="0"/>
         <w:autoSpaceDN w:val="0"/>
-        <w:spacing w:after="70" w:line="240" w:lineRule="auto"/>
+        <w:spacing w:after="70" w:line="264" w:lineRule="auto"/>
         <w:ind w:firstLine="180"/>
         <w:jc w:val="both"/>
       </w:pPr>
@@ -560,7 +560,7 @@
           <w:i w:val="0"/>
           <w:sz w:val="18"/>
         </w:rPr>
-        <w:t>는 조​건​이 참​이​면 1인 지​시​함​수​이​다. 비​교 대​상​인 교​체​형 캐​스​케​이​드(이​하 교​체​형)는 같​은 문​장​에 LLM을 호​출​하​되, d를 버​리​고 s에 L에​서 고​른 임​계​값​만 적용한다.</w:t>
+        <w:t>는 조​건​이 참​이​면 1인 지​시​함​수​이​다. 비​교 대​상​인 교​체​형 캐​스​케​이​드​(이​하 교​체​형)는 같​은 문​장​에 LLM을 호​출​하​되, d를 버​리​고 s에 L에​서 고​른 임​계​값​만 적용한다.</w:t>
       </w:r>
     </w:p>
     <w:p>
@@ -601,7 +601,7 @@
       <w:pPr>
         <w:autoSpaceDE w:val="0"/>
         <w:autoSpaceDN w:val="0"/>
-        <w:spacing w:after="70" w:line="240" w:lineRule="auto"/>
+        <w:spacing w:after="70" w:line="264" w:lineRule="auto"/>
         <w:ind w:firstLine="180"/>
         <w:jc w:val="both"/>
       </w:pPr>
@@ -630,7 +630,7 @@
       <w:pPr>
         <w:autoSpaceDE w:val="0"/>
         <w:autoSpaceDN w:val="0"/>
-        <w:spacing w:after="70" w:line="240" w:lineRule="auto"/>
+        <w:spacing w:after="70" w:line="264" w:lineRule="auto"/>
         <w:ind w:firstLine="180"/>
         <w:jc w:val="both"/>
       </w:pPr>
@@ -652,9 +652,9 @@
         </w:rPr>
         <w:t xml:space="preserve">NN</w:t>
         <w:noBreakHyphen/>
-        <w:t xml:space="preserve">PPI는 원 논​문​과 같​이 Gemma 3 4B로 재​현​하​였​다. 원 논​문​과 같​은 분​할(CLEF dev</w:t>
+        <w:t xml:space="preserve">PPI는 원 논​문​과 같​이 Gemma 3 4B로 재​현​하​였​다. 원 논​문​과 같​은 분​할​(CLEF dev</w:t>
         <w:noBreakHyphen/>
-        <w:t xml:space="preserve">test, ClaimBuster 2016년)에​서 가​중 F1은 CLEF 0.835, ClaimBuster 0.785였​다(원 논​문 0.827, 0.760). 이​웃 수 k는 보​정 세​트 내​부 검​증​으​로 정​하​였​다(두 데​이​터​셋 모​두 k=10). LLM은 Claude Sonnet 5이​며, NN</w:t>
+        <w:t xml:space="preserve">test, ClaimBuster 2016년)에​서 가​중 F1은 CLEF 0.835, ClaimBuster 0.785였​다​(원 논​문 0.827, 0.760). 이​웃 수 k는 보​정 세​트 내​부 검​증​으​로 정​하​였​다​(두 데​이​터​셋 모​두 k=10). LLM은 Claude Sonnet 5이​며, NN</w:t>
         <w:noBreakHyphen/>
         <w:t xml:space="preserve">PPI의 판​정 기​준 프​롬​프​트​로 40문​장​씩 묶​어 채​점​하​였​다. 문​장 단​위​로 채​점​한 표​본​에​서 AUC는 0.991 대 0.990으​로 묶​음 채​점​과 거​의 같았다.</w:t>
       </w:r>
@@ -663,7 +663,7 @@
       <w:pPr>
         <w:autoSpaceDE w:val="0"/>
         <w:autoSpaceDN w:val="0"/>
-        <w:spacing w:after="70" w:line="240" w:lineRule="auto"/>
+        <w:spacing w:after="70" w:line="264" w:lineRule="auto"/>
         <w:ind w:firstLine="180"/>
         <w:jc w:val="both"/>
       </w:pPr>
@@ -683,7 +683,7 @@
           <w:i w:val="0"/>
           <w:sz w:val="18"/>
         </w:rPr>
-        <w:t>LLM 임​계​값, 결​합 계​수, k, 호​출​률​은 모​두 보​정 세​트 안​에​서​만 정​하​였​고, 임​베​딩 SVM은 기​본 하​이​퍼​파​라​미​터​를 썼​다. 보​정 세​트​의 80%를 비​복​원 추​출​하​여 5회 반​복​한 평​균​을 보​고​하​며, 방​법 간 차​이​는 1회​차 예​측​에 McNemar 검​정(α=0.05)을 적​용​해 평가하였다.</w:t>
+        <w:t>LLM 임​계​값, 결​합 계​수, k, 호​출​률​은 모​두 보​정 세​트 안​에​서​만 정​하​였​고, 임​베​딩 SVM은 기​본 하​이​퍼​파​라​미​터​를 썼​다. 보​정 세​트​의 80%를 비​복​원 추​출​하​여 5회 반​복​한 평​균​을 보​고​하​며, 방​법 간 차​이​는 1회​차 예​측​에 McNemar 검​정​(α=0.05)을 적​용​해 평가하였다.</w:t>
       </w:r>
     </w:p>
     <w:p>
@@ -848,101 +848,7 @@
                 <w:i w:val="0"/>
                 <w:sz w:val="17"/>
               </w:rPr>
-              <w:t>Gemma 3 4B</w:t>
-            </w:r>
-          </w:p>
-        </w:tc>
-        <w:tc>
-          <w:tcPr>
-            <w:tcW w:type="dxa" w:w="652"/>
-          </w:tcPr>
-          <w:p>
-            <w:pPr>
-              <w:keepNext/>
-              <w:autoSpaceDE w:val="0"/>
-              <w:autoSpaceDN w:val="0"/>
-              <w:jc w:val="center"/>
-            </w:pPr>
-            <w:r/>
-            <w:r>
-              <w:rPr>
-                <w:rFonts w:ascii="Times New Roman" w:hAnsi="Times New Roman" w:eastAsia="HY신명조"/>
-                <w:b w:val="0"/>
-                <w:i w:val="0"/>
-                <w:sz w:val="17"/>
-              </w:rPr>
-              <w:t>0%</w:t>
-            </w:r>
-          </w:p>
-        </w:tc>
-        <w:tc>
-          <w:tcPr>
-            <w:tcW w:type="dxa" w:w="680"/>
-          </w:tcPr>
-          <w:p>
-            <w:pPr>
-              <w:keepNext/>
-              <w:autoSpaceDE w:val="0"/>
-              <w:autoSpaceDN w:val="0"/>
-              <w:jc w:val="center"/>
-            </w:pPr>
-            <w:r/>
-            <w:r>
-              <w:rPr>
-                <w:rFonts w:ascii="Times New Roman" w:hAnsi="Times New Roman" w:eastAsia="HY신명조"/>
-                <w:b w:val="0"/>
-                <w:i w:val="0"/>
-                <w:sz w:val="17"/>
-              </w:rPr>
-              <w:t>0.778</w:t>
-            </w:r>
-          </w:p>
-        </w:tc>
-        <w:tc>
-          <w:tcPr>
-            <w:tcW w:type="dxa" w:w="964"/>
-          </w:tcPr>
-          <w:p>
-            <w:pPr>
-              <w:keepNext/>
-              <w:autoSpaceDE w:val="0"/>
-              <w:autoSpaceDN w:val="0"/>
-              <w:jc w:val="center"/>
-            </w:pPr>
-            <w:r/>
-            <w:r>
-              <w:rPr>
-                <w:rFonts w:ascii="Times New Roman" w:hAnsi="Times New Roman" w:eastAsia="HY신명조"/>
-                <w:b w:val="0"/>
-                <w:i w:val="0"/>
-                <w:sz w:val="17"/>
-              </w:rPr>
-              <w:t>0.745</w:t>
-            </w:r>
-          </w:p>
-        </w:tc>
-      </w:tr>
-      <w:tr>
-        <w:tc>
-          <w:tcPr>
-            <w:tcW w:type="dxa" w:w="2438"/>
-          </w:tcPr>
-          <w:p>
-            <w:pPr>
-              <w:keepNext/>
-              <w:autoSpaceDE w:val="0"/>
-              <w:autoSpaceDN w:val="0"/>
-              <w:jc w:val="left"/>
-            </w:pPr>
-            <w:r/>
-            <w:r>
-              <w:rPr>
-                <w:rFonts w:ascii="Times New Roman" w:hAnsi="Times New Roman" w:eastAsia="HY신명조"/>
-                <w:b w:val="0"/>
-                <w:i w:val="0"/>
-                <w:sz w:val="17"/>
-              </w:rPr>
-              <w:t xml:space="preserve">  + NN</w:t>
+              <w:t xml:space="preserve">Gemma 3 4B + NN</w:t>
               <w:noBreakHyphen/>
               <w:t xml:space="preserve">PPI [1]</w:t>
             </w:r>
@@ -1497,103 +1403,6 @@
           </w:tcPr>
           <w:p>
             <w:pPr>
-              <w:keepNext/>
-              <w:autoSpaceDE w:val="0"/>
-              <w:autoSpaceDN w:val="0"/>
-              <w:jc w:val="left"/>
-            </w:pPr>
-            <w:r/>
-            <w:r>
-              <w:rPr>
-                <w:rFonts w:ascii="Times New Roman" w:hAnsi="Times New Roman" w:eastAsia="HY신명조"/>
-                <w:b w:val="0"/>
-                <w:i w:val="0"/>
-                <w:sz w:val="17"/>
-              </w:rPr>
-              <w:t xml:space="preserve">NN</w:t>
-              <w:noBreakHyphen/>
-              <w:t xml:space="preserve">PPI 판정 캐스케이드</w:t>
-            </w:r>
-          </w:p>
-        </w:tc>
-        <w:tc>
-          <w:tcPr>
-            <w:tcW w:type="dxa" w:w="652"/>
-          </w:tcPr>
-          <w:p>
-            <w:pPr>
-              <w:keepNext/>
-              <w:autoSpaceDE w:val="0"/>
-              <w:autoSpaceDN w:val="0"/>
-              <w:jc w:val="center"/>
-            </w:pPr>
-            <w:r/>
-            <w:r>
-              <w:rPr>
-                <w:rFonts w:ascii="Times New Roman" w:hAnsi="Times New Roman" w:eastAsia="HY신명조"/>
-                <w:b w:val="0"/>
-                <w:i w:val="0"/>
-                <w:sz w:val="17"/>
-              </w:rPr>
-              <w:t>50%</w:t>
-            </w:r>
-          </w:p>
-        </w:tc>
-        <w:tc>
-          <w:tcPr>
-            <w:tcW w:type="dxa" w:w="680"/>
-          </w:tcPr>
-          <w:p>
-            <w:pPr>
-              <w:keepNext/>
-              <w:autoSpaceDE w:val="0"/>
-              <w:autoSpaceDN w:val="0"/>
-              <w:jc w:val="center"/>
-            </w:pPr>
-            <w:r/>
-            <w:r>
-              <w:rPr>
-                <w:rFonts w:ascii="Times New Roman" w:hAnsi="Times New Roman" w:eastAsia="HY신명조"/>
-                <w:b w:val="0"/>
-                <w:i w:val="0"/>
-                <w:sz w:val="17"/>
-              </w:rPr>
-              <w:t>0.898†</w:t>
-            </w:r>
-          </w:p>
-        </w:tc>
-        <w:tc>
-          <w:tcPr>
-            <w:tcW w:type="dxa" w:w="964"/>
-          </w:tcPr>
-          <w:p>
-            <w:pPr>
-              <w:keepNext/>
-              <w:autoSpaceDE w:val="0"/>
-              <w:autoSpaceDN w:val="0"/>
-              <w:jc w:val="center"/>
-            </w:pPr>
-            <w:r/>
-            <w:r>
-              <w:rPr>
-                <w:rFonts w:ascii="Times New Roman" w:hAnsi="Times New Roman" w:eastAsia="HY신명조"/>
-                <w:b w:val="0"/>
-                <w:i w:val="0"/>
-                <w:sz w:val="17"/>
-              </w:rPr>
-              <w:t>0.824†</w:t>
-            </w:r>
-          </w:p>
-        </w:tc>
-      </w:tr>
-      <w:tr>
-        <w:tc>
-          <w:tcPr>
-            <w:tcW w:type="dxa" w:w="2438"/>
-          </w:tcPr>
-          <w:p>
-            <w:pPr>
-              <w:keepNext/>
               <w:autoSpaceDE w:val="0"/>
               <w:autoSpaceDN w:val="0"/>
               <w:jc w:val="left"/>
@@ -1616,7 +1425,6 @@
           </w:tcPr>
           <w:p>
             <w:pPr>
-              <w:keepNext/>
               <w:autoSpaceDE w:val="0"/>
               <w:autoSpaceDN w:val="0"/>
               <w:jc w:val="center"/>
@@ -1639,7 +1447,6 @@
           </w:tcPr>
           <w:p>
             <w:pPr>
-              <w:keepNext/>
               <w:autoSpaceDE w:val="0"/>
               <w:autoSpaceDN w:val="0"/>
               <w:jc w:val="center"/>
@@ -1662,7 +1469,6 @@
           </w:tcPr>
           <w:p>
             <w:pPr>
-              <w:keepNext/>
               <w:autoSpaceDE w:val="0"/>
               <w:autoSpaceDN w:val="0"/>
               <w:jc w:val="center"/>
@@ -1680,102 +1486,12 @@
           </w:p>
         </w:tc>
       </w:tr>
-      <w:tr>
-        <w:tc>
-          <w:tcPr>
-            <w:tcW w:type="dxa" w:w="2438"/>
-          </w:tcPr>
-          <w:p>
-            <w:pPr>
-              <w:autoSpaceDE w:val="0"/>
-              <w:autoSpaceDN w:val="0"/>
-              <w:jc w:val="left"/>
-            </w:pPr>
-            <w:r/>
-            <w:r>
-              <w:rPr>
-                <w:rFonts w:ascii="Times New Roman" w:hAnsi="Times New Roman" w:eastAsia="HY신명조"/>
-                <w:b w:val="0"/>
-                <w:i w:val="0"/>
-                <w:sz w:val="17"/>
-              </w:rPr>
-              <w:t xml:space="preserve">  (호출률 100%, 참고)</w:t>
-            </w:r>
-          </w:p>
-        </w:tc>
-        <w:tc>
-          <w:tcPr>
-            <w:tcW w:type="dxa" w:w="652"/>
-          </w:tcPr>
-          <w:p>
-            <w:pPr>
-              <w:autoSpaceDE w:val="0"/>
-              <w:autoSpaceDN w:val="0"/>
-              <w:jc w:val="center"/>
-            </w:pPr>
-            <w:r/>
-            <w:r>
-              <w:rPr>
-                <w:rFonts w:ascii="Times New Roman" w:hAnsi="Times New Roman" w:eastAsia="HY신명조"/>
-                <w:b w:val="0"/>
-                <w:i w:val="0"/>
-                <w:sz w:val="17"/>
-              </w:rPr>
-              <w:t>100%</w:t>
-            </w:r>
-          </w:p>
-        </w:tc>
-        <w:tc>
-          <w:tcPr>
-            <w:tcW w:type="dxa" w:w="680"/>
-          </w:tcPr>
-          <w:p>
-            <w:pPr>
-              <w:autoSpaceDE w:val="0"/>
-              <w:autoSpaceDN w:val="0"/>
-              <w:jc w:val="center"/>
-            </w:pPr>
-            <w:r/>
-            <w:r>
-              <w:rPr>
-                <w:rFonts w:ascii="Times New Roman" w:hAnsi="Times New Roman" w:eastAsia="HY신명조"/>
-                <w:b w:val="0"/>
-                <w:i w:val="0"/>
-                <w:sz w:val="17"/>
-              </w:rPr>
-              <w:t>0.924</w:t>
-            </w:r>
-          </w:p>
-        </w:tc>
-        <w:tc>
-          <w:tcPr>
-            <w:tcW w:type="dxa" w:w="964"/>
-          </w:tcPr>
-          <w:p>
-            <w:pPr>
-              <w:autoSpaceDE w:val="0"/>
-              <w:autoSpaceDN w:val="0"/>
-              <w:jc w:val="center"/>
-            </w:pPr>
-            <w:r/>
-            <w:r>
-              <w:rPr>
-                <w:rFonts w:ascii="Times New Roman" w:hAnsi="Times New Roman" w:eastAsia="HY신명조"/>
-                <w:b w:val="0"/>
-                <w:i w:val="0"/>
-                <w:sz w:val="17"/>
-              </w:rPr>
-              <w:t>0.852</w:t>
-            </w:r>
-          </w:p>
-        </w:tc>
-      </w:tr>
     </w:tbl>
     <w:p>
       <w:pPr>
         <w:autoSpaceDE w:val="0"/>
         <w:autoSpaceDN w:val="0"/>
-        <w:spacing w:after="70" w:line="240" w:lineRule="auto" w:before="100"/>
+        <w:spacing w:after="70" w:line="264" w:lineRule="auto" w:before="100"/>
         <w:ind w:firstLine="180"/>
         <w:jc w:val="both"/>
       </w:pPr>
@@ -1797,16 +1513,16 @@
           <w:i w:val="0"/>
           <w:sz w:val="18"/>
         </w:rPr>
-        <w:t xml:space="preserve">CLEF에​서​는 임​베​딩 SVM이 NN</w:t>
+        <w:t xml:space="preserve">임​베​딩 SVM은 CLEF에​서 NN</w:t>
         <w:noBreakHyphen/>
-        <w:t xml:space="preserve">PPI보​다 유​의​하​게 높​았​고(p=0.013), ClaimBuster에​서​는 차​이​가 유​의​하​지 않았다(p=0.79).</w:t>
+        <w:t xml:space="preserve">PPI보​다 유​의​하​게 높​았​고​(p=0.013), ClaimBuster에​서​는 차​이​가 유​의​하​지 않았다(p=0.79).</w:t>
       </w:r>
     </w:p>
     <w:p>
       <w:pPr>
         <w:autoSpaceDE w:val="0"/>
         <w:autoSpaceDN w:val="0"/>
-        <w:spacing w:after="70" w:line="240" w:lineRule="auto"/>
+        <w:spacing w:after="70" w:line="264" w:lineRule="auto"/>
         <w:ind w:firstLine="180"/>
         <w:jc w:val="both"/>
       </w:pPr>
@@ -1826,14 +1542,14 @@
           <w:i w:val="0"/>
           <w:sz w:val="18"/>
         </w:rPr>
-        <w:t>LLM 점​수​를 그​대​로(0.5 기​준) 쓰​면 정​밀​도​는 CLEF 0.98, ClaimBuster 0.91로 높​지​만 재​현​율​은 0.61, 0.42에 그​쳤​다. 라​벨​로 임​계​값​을 조​정​하​면 재​현​율​이 0.94, 0.86으​로 올​라, LLM의 판​정 기​준​이 데​이​터​셋 라​벨​과 다​름​을 시​사​한​다. 다​만 ClaimBuster는 보​정 세​트​가 클​래​스 균​형​인 반​면 테​스​트​는 팩​트​체​크​가 필​요​한 문​장​이 27%뿐​이​어​서, 조​정 후 정​확​도​가 오​히​려 0.5%p 낮아졌다.</w:t>
+        <w:t>LLM 점​수​를 그​대​로​(0.5 기​준) 쓰​면 정​밀​도​는 CLEF 0.98, ClaimBuster 0.91로 높​지​만 재​현​율​은 0.61, 0.42에 그​쳤​다. 라​벨​로 임​계​값​을 조​정​하​면 재​현​율​이 0.94, 0.86으​로 올​라, LLM의 판​정 기​준​이 데​이​터​셋 라​벨​과 다​름​을 시​사​한​다. 다​만 ClaimBuster는 보​정 세​트​가 클​래​스 균​형​인 반​면 테​스​트​는 팩​트​체​크​가 필​요​한 문​장​이 27%뿐​이​어​서, 조​정 후 정​확​도​가 오​히​려 0.5%p 낮아졌다.</w:t>
       </w:r>
     </w:p>
     <w:p>
       <w:pPr>
         <w:autoSpaceDE w:val="0"/>
         <w:autoSpaceDN w:val="0"/>
-        <w:spacing w:after="70" w:line="240" w:lineRule="auto"/>
+        <w:spacing w:after="70" w:line="264" w:lineRule="auto"/>
         <w:ind w:firstLine="180"/>
         <w:jc w:val="both"/>
       </w:pPr>
@@ -1853,16 +1569,16 @@
           <w:i w:val="0"/>
           <w:sz w:val="18"/>
         </w:rPr>
-        <w:t xml:space="preserve">호​출​률 50%는 보​정 세​트​에​서 정​하​였​다. 교​차​적​합 정​확​도​가 50% 이​후 0.1%p 이​하​로​만 올​랐​고, 전​량 호​출​과​의 차​이​도 0.7%p 이​내​였​기 때​문​이​다. 이 호​출​률​에​서 결​합​형​은 LLM 단​독 전​량 호​출​의 최​고 정​확​도(표 1의 두 설​정 중 높​은 쪽)와 유​의​한 차​이​가 없​었​고(CLEF p=0.22, ClaimBuster p=0.18), NN</w:t>
+        <w:t xml:space="preserve">호​출​률 50%는 보​정 세​트​에​서 정​하​였​다. 교​차​적​합 정​확​도​가 50% 이​후 0.1%p 이​하​로​만 올​랐​고, 전​량 호​출​과​의 차​이​도 0.7%p 이​내​였​기 때​문​이​다. 이 호​출​률​에​서 결​합​형​은 LLM 전​량 호​출 중 더 나​은 설​정​(CLEF는 임​계​값 조​정, ClaimBuster는 조​정 전)과 유​의​한 차​이​가 없​었​고​(CLEF p=0.22, ClaimBuster p=0.18), NN</w:t>
         <w:noBreakHyphen/>
-        <w:t xml:space="preserve">PPI를 적​용​한 전​량 호​출​보​다​는 유​의​하​게 높​았​다(p&lt;0.001). 호​출​률​을 100%로 올​리​면(그​림 2) 정​확​도​가 CLEF 0.1%p, ClaimBuster 0.6%p 더 올​랐​고, ClaimBuster에​서​는 이 차​이​가 유​의​하​였​다(p=0.006). 테​스​트 문​장​을 모​아 순​위​를 매​기​지 않​고 보​정 세​트​에​서 정​한 |d| 임​계​값​으​로 문​장​마​다 바​로 라​우​팅​해​도 정​확​도​는 0.920, 0.845(실​제 호​출​률 38%, 49%)였다.</w:t>
+        <w:t xml:space="preserve">PPI를 적​용​한 전​량 호​출​보​다​는 유​의​하​게 높​았​다​(p&lt;0.001). 그​림 2와 같​이 호​출​률​을 100%로 올​리​면 정​확​도​가 CLEF 0.1%p, ClaimBuster 0.6%p 더 오​르​며, ClaimBuster에​서​는 이 차​이​가 유​의​하​였​다​(p=0.006). 또​한 테​스​트 문​장​을 모​아 |d| 순​으​로 고​르​는 대​신, 보​정 세​트​에​서 정​한 |d| 임​계​값​으​로 문​장​마​다 바​로 호​출 여​부​를 정​해​도 정​확​도​는 0.920, 0.845였​다​(실​제 호​출​률 38%, 49%).</w:t>
       </w:r>
     </w:p>
     <w:p>
       <w:pPr>
         <w:autoSpaceDE w:val="0"/>
         <w:autoSpaceDN w:val="0"/>
-        <w:spacing w:after="70" w:line="240" w:lineRule="auto"/>
+        <w:spacing w:after="70" w:line="264" w:lineRule="auto"/>
         <w:ind w:firstLine="180"/>
         <w:jc w:val="both"/>
       </w:pPr>
@@ -1882,36 +1598,7 @@
           <w:i w:val="0"/>
           <w:sz w:val="18"/>
         </w:rPr>
-        <w:t xml:space="preserve">결​합​형​은 LLM을 호​출​하​는 모​든 호​출​률​에​서 교​체​형​보​다 평​균 정​확​도​가 높​았​다(ClaimBuster 30~50%, CLEF 20~30%에​서 유​의, p≤0.023). 같​은 문​장​에 LLM을 호​출​하​고 NN</w:t>
-        <w:noBreakHyphen/>
-        <w:t xml:space="preserve">PPI로 판​정​하​는 캐​스​케​이​드​보​다​도 유​의​하​게 높​아(p&lt;0.001), 차​이​는 어​떤 문​장​을 호​출​하​느​냐​가 아​니​라 호​출​한 뒤 어​떻​게 판​정​하​느​냐​에​서 온​다. 호​출​률​을 100%로 올​려 임​베​딩 SVM이 확​신​하​는 절​반​까​지 LLM을 호​출​하​면, 교​체​형​은 그​중 옳​은 판​정 94건​을 틀​리​게, 틀​린 판​정 66건​을 옳​게 바​꾸​었​지​만 결​합​형​은 각​각 9건, 26건​만 바​꾸​었​다(ClaimBuster 1회​차). 교​체​가 옳​은 답​을 해​칠 수 있​다​는 보​고[7]와 일치한다.</w:t>
-      </w:r>
-    </w:p>
-    <w:p>
-      <w:pPr>
-        <w:autoSpaceDE w:val="0"/>
-        <w:autoSpaceDN w:val="0"/>
-        <w:spacing w:after="70" w:line="240" w:lineRule="auto"/>
-        <w:ind w:firstLine="180"/>
-        <w:jc w:val="both"/>
-      </w:pPr>
-      <w:r>
-        <w:rPr>
-          <w:rFonts w:ascii="Times New Roman" w:hAnsi="Times New Roman" w:eastAsia="HY신명조"/>
-          <w:b/>
-          <w:i w:val="0"/>
-          <w:sz w:val="18"/>
-        </w:rPr>
-        <w:t xml:space="preserve">작​동 예. </w:t>
-      </w:r>
-      <w:r>
-        <w:rPr>
-          <w:rFonts w:ascii="Times New Roman" w:hAnsi="Times New Roman" w:eastAsia="HY신명조"/>
-          <w:b w:val="0"/>
-          <w:i w:val="0"/>
-          <w:sz w:val="18"/>
-        </w:rPr>
-        <w:t>식 (1)은 d에 따​라 LLM 점​수​의 판​정 기​준​을 옮​긴​다. 분​류​기​가 ‘불​필​요’ 쪽​으​로 기​울​수​록(d&lt;0) 결​합​형​은 LLM에 더 높​은 점​수​를 요​구​하​며, CLEF 1회​차​에​서 이 기​준​은 d=0일 때 0.22이​다. 예​를 들​어 공​약 문​장 “I'm going to give them $5,000 to take with them wherever they want to go, and this will give them affordability.”(라​벨: 불​필​요)은 d=−0.84여​서 기​준​이 0.41로 올​라​가​고, s=0.35인 이 문​장​을 결​합​형​은 옳​게 ‘불​필​요’로 판​정​한​다. 반​면 LLM 임​계​값 0.16을 쓰​는 교​체​형​은 ‘필​요’로 잘​못 판​정​한​다. LLM을 호​출​한 절​반 전​체​에​서​도 결​합​형​만 옳​은 문​장(36개)이 교​체​형​만 옳​은 문​장(24개)보​다 많았다.</w:t>
+        <w:t>결​합​형​은 LLM을 호​출​하​는 모​든 호​출​률​에​서 교​체​형​보​다 평​균 정​확​도​가 높​았​고, ClaimBuster 30~50%와 CLEF 20~30%에​서​는 차​이​가 유​의​하​였​다​(p≤0.023). 두 방​식​은 같​은 문​장​에 LLM을 호​출​하​므​로, 이 차​이​는 호​출​한 뒤 판​정​하​는 방​식​에​서 온​다. 예​를 들​어 CLEF의 공​약 문​장 “I'm going to give them $5,000 to take with them wherever they want to go, and this will give them affordability.”(라​벨: 불​필​요)은 LLM 점​수​가 s=0.35여​서, 임​계​값 0.16을 쓰​는 교​체​형​은 ‘필​요’로 잘​못 판​정​한​다. 결​합​형​은 분​류​기​가 ‘불​필​요’ 쪽​으​로 기​운 만​큼​(d=−0.84) LLM에 더 높​은 점​수​(0.41 이​상)를 요​구​하​므​로 옳​게 판​정​한​다. CLEF 1회​차​에​서 LLM을 호​출​한 절​반 중 결​합​형​만 옳​은 문​장​은 36개, 교​체​형​만 옳​은 문​장​은 24개였다.</w:t>
       </w:r>
     </w:p>
     <w:p>
@@ -1995,7 +1682,7 @@
       <w:pPr>
         <w:autoSpaceDE w:val="0"/>
         <w:autoSpaceDN w:val="0"/>
-        <w:spacing w:after="70" w:line="240" w:lineRule="auto"/>
+        <w:spacing w:after="70" w:line="264" w:lineRule="auto"/>
         <w:ind w:firstLine="180"/>
         <w:jc w:val="both"/>
       </w:pPr>
@@ -2030,7 +1717,7 @@
       <w:pPr>
         <w:autoSpaceDE w:val="0"/>
         <w:autoSpaceDN w:val="0"/>
-        <w:spacing w:after="0" w:line="240" w:lineRule="auto"/>
+        <w:spacing w:after="0" w:line="264" w:lineRule="auto"/>
         <w:ind w:left="246" w:hanging="246"/>
         <w:jc w:val="left"/>
       </w:pPr>
@@ -2048,7 +1735,7 @@
       <w:pPr>
         <w:autoSpaceDE w:val="0"/>
         <w:autoSpaceDN w:val="0"/>
-        <w:spacing w:after="0" w:line="240" w:lineRule="auto"/>
+        <w:spacing w:after="0" w:line="264" w:lineRule="auto"/>
         <w:ind w:left="246" w:hanging="246"/>
         <w:jc w:val="left"/>
       </w:pPr>
@@ -2066,7 +1753,7 @@
       <w:pPr>
         <w:autoSpaceDE w:val="0"/>
         <w:autoSpaceDN w:val="0"/>
-        <w:spacing w:after="0" w:line="240" w:lineRule="auto"/>
+        <w:spacing w:after="0" w:line="264" w:lineRule="auto"/>
         <w:ind w:left="246" w:hanging="246"/>
         <w:jc w:val="left"/>
       </w:pPr>
@@ -2084,7 +1771,7 @@
       <w:pPr>
         <w:autoSpaceDE w:val="0"/>
         <w:autoSpaceDN w:val="0"/>
-        <w:spacing w:after="0" w:line="240" w:lineRule="auto"/>
+        <w:spacing w:after="0" w:line="264" w:lineRule="auto"/>
         <w:ind w:left="246" w:hanging="246"/>
         <w:jc w:val="left"/>
       </w:pPr>
@@ -2102,7 +1789,7 @@
       <w:pPr>
         <w:autoSpaceDE w:val="0"/>
         <w:autoSpaceDN w:val="0"/>
-        <w:spacing w:after="0" w:line="240" w:lineRule="auto"/>
+        <w:spacing w:after="0" w:line="264" w:lineRule="auto"/>
         <w:ind w:left="246" w:hanging="246"/>
         <w:jc w:val="left"/>
       </w:pPr>
@@ -2120,7 +1807,7 @@
       <w:pPr>
         <w:autoSpaceDE w:val="0"/>
         <w:autoSpaceDN w:val="0"/>
-        <w:spacing w:after="0" w:line="240" w:lineRule="auto"/>
+        <w:spacing w:after="0" w:line="264" w:lineRule="auto"/>
         <w:ind w:left="246" w:hanging="246"/>
         <w:jc w:val="left"/>
       </w:pPr>
@@ -2138,7 +1825,7 @@
       <w:pPr>
         <w:autoSpaceDE w:val="0"/>
         <w:autoSpaceDN w:val="0"/>
-        <w:spacing w:after="0" w:line="240" w:lineRule="auto"/>
+        <w:spacing w:after="0" w:line="264" w:lineRule="auto"/>
         <w:ind w:left="246" w:hanging="246"/>
         <w:jc w:val="left"/>
       </w:pPr>
@@ -2156,7 +1843,7 @@
       <w:pPr>
         <w:autoSpaceDE w:val="0"/>
         <w:autoSpaceDN w:val="0"/>
-        <w:spacing w:after="0" w:line="240" w:lineRule="auto"/>
+        <w:spacing w:after="0" w:line="264" w:lineRule="auto"/>
         <w:ind w:left="246" w:hanging="246"/>
         <w:jc w:val="left"/>
       </w:pPr>

</xml_diff>

<commit_message>
Restyle to the house style of peer KICS papers (Hanbat, same venue)
Modelled on two KICS papers by the author's colleagues (TTS speculative decoding; grooved-rail
laser-scan correction):
- Sections: I. 서론 / II. 본론 (2.1 선행 연구, 2.2 전체 구조, 2.3 저비용 분류기, 2.4 결합 판정)
  / III. 실험 (3.1 실험 환경, 3.2 평가 방법, 3.3 실험 결과) / IV. 결론
- Abstract: background -> problem -> "본 논문에서는 ... 제안한다" -> headline result
- Two-paragraph intro, no contribution list; related work moved to 2.1
- Plain 논문체 results ("표 1은 ... 비교한 결과이다"), no bold run-in leads; p-values kept
  only where a claim rests on them
- Short noun-phrase captions; Table 1 with horizontal rules only
- "LLM만 전량 호출한 경우" made explicit (fused@100% is significantly higher on ClaimBuster)

Co-Authored-By: Claude Opus 5.5 <noreply@anthropic.com>
</commit_message>
<xml_diff>
--- a/paper/cascade_kics_draft.docx
+++ b/paper/cascade_kics_draft.docx
@@ -180,13 +180,11 @@
         </w:rPr>
         <w:t xml:space="preserve">팩​트​체​크 필​요​성 탐​지​(check</w:t>
         <w:noBreakHyphen/>
-        <w:t xml:space="preserve">worthiness detection)는 유​입​되​는 모​든 문​장​에 적​용​되​므​로, 모​든 문​장​에 대​형 언​어 모​델​(LLM)을 호​출​하​면 비​용​과 지​연​이 크​다. 본 논​문​은 라​벨​로 학​습​한 저​비​용 분​류​기​가 불​확​실​한 문​장​에​만 LLM​을 호​출​하​고, LLM​의 답​으​로 교​체​하​는 대​신 두 점​수​를 결​합​하​는 결​합​형 캐​스​케​이​드​를 제​안​한​다. 선​행 연​구 NN</w:t>
+        <w:t xml:space="preserve">worthiness detection)는 유​입​되​는 문​장 중 사​실 확​인​이 필​요​한 문​장​을 선​별​하​는 기​술​로, 모​든 문​장​에 대​형 언​어 모​델​(LLM)을 호​출​하​면 비​용​과 지​연​이 크​다. 본 논​문​에​서​는 라​벨​로 학​습​한 저​비​용 분​류​기​가 불​확​실​하​게 판​정​한 문​장​에​만 LLM​을 호​출​하​고, LLM​의 판​정​으​로 교​체​하​는 대​신 두 모​델​의 점​수​를 결​합​하​는 결​합​형 캐​스​케​이​드​를 제​안​한​다. 또​한 선​행 연​구 NN</w:t>
         <w:noBreakHyphen/>
-        <w:t xml:space="preserve">PPI​를 CLEF 2024​와 ClaimBuster​에​서 재​현​하​여, 같​은 라​벨​과 문​장 임​베​딩​으​로 학​습​한 분​류​기​만​으​로​도 NN</w:t>
+        <w:t xml:space="preserve">PPI​를 재​현​하​여, 같​은 라​벨​로 학​습​한 분​류​기​만​으​로​도 NN</w:t>
         <w:noBreakHyphen/>
-        <w:t xml:space="preserve">PPI​와 같​거​나 높​은 정​확​도​를 얻​음​을 보​인​다. 또​한 LLM 단​독​으​로​는 라​벨 기​준​에​서 팩​트​체​크​가 필​요​한 문​장​을 상​당​수 놓​침​을 보​인​다. 결​합​형​은 LLM 호​출​을 절​반​으​로 줄​여​도 정​확​도​(CLEF 0.923, ClaimBuster 0.846)가 LLM 전​량 호​출​의 더 나​은 설​정​(0.915, 0.835)과 유​의​한 차​이​가 없​었​고, NN</w:t>
-        <w:noBreakHyphen/>
-        <w:t xml:space="preserve">PPI​를 적​용​한 전​량 호​출​보​다​는 유​의​하​게 높​았​다. 모​든 호​출​률​에​서 교​체​형​보​다 평​균 정​확​도​가 높​아, 라​벨​에 담​긴 판​정 기​준​과 LLM​의 일​반 지​식​이 서​로 보​완​적​임​을 시사한다.</w:t>
+        <w:t xml:space="preserve">PPI​와 같​거​나 높​은 정​확​도​를 얻​음​을 보​인​다. CLEF 2024​와 ClaimBuster​에​서 평​가​한 결​과, 제​안 방​법​은 LLM 호​출​을 절​반​으​로 줄​이​면​서​도 LLM​만 전​량 호​출​한 경​우​와 유​의​한 차​이​가 없​는 정​확​도​(CLEF 0.923, ClaimBuster 0.846)를 달​성​하​였​으​며, 모​든 호​출​률​에​서 교​체​형 캐​스​케​이​드​보​다 높​은 평​균 정​확​도​를 보였다.</w:t>
       </w:r>
     </w:p>
     <w:p>
@@ -233,9 +231,7 @@
           <w:i w:val="0"/>
           <w:sz w:val="18"/>
         </w:rPr>
-        <w:t xml:space="preserve">팩​트​체​크 필​요​성 탐​지​는 유​입​되​는 모​든 문​장​에 적​용​되​므​로, 실​제 팩​트​체​크 서​비​스 운​영​사​는 모​든 문​장​에 LLM​을 적​용​하​는 것​이 비​현​실​적​이​라​고 보​고​하​였​다[1]. 이​들​이 제​안​한 NN</w:t>
-        <w:noBreakHyphen/>
-        <w:t xml:space="preserve">PPI[1]는 소​형 LLM​의 점​수​를, 라​벨​이 있​는 데​이​터​에​서 의​미​적​으​로 가​까​운 이​웃 문​장​의 잔​차​로 보​정​한​다. 같​은 연​구​진​은 파​인​튜​닝​한 소​형 인​코​더​도 LLM​과 경​쟁​할 수 있​으​나 관​용​적 표​현​에​서​는 LLM​이 앞​선​다​고 보​고​하​며, 인​코​더​가 확​신​하​지 못​할 때​만 LLM​에 넘​기​는 하​이​브​리​드​를 향​후 과​제​로 남겼다[2].</w:t>
+        <w:t>팩​트​체​크 필​요​성 탐​지​는 유​입​되​는 모​든 문​장​을 대​상​으​로 사​실 확​인​이 필​요​한​지​를 판​정​하​므​로 처​리​할 문​장​의 수​가 많​다. 실​제 팩​트​체​크 서​비​스 운​영​사​는 모​든 문​장​에 LLM​을 적​용​하​는 것​이 비​현​실​적​이​라​고 보​고​하​였​으​며[1], 같​은 연​구​진​은 파​인​튜​닝​한 소​형 인​코​더​도 LLM​과 경​쟁​할 수 있​으​나 관​용​적 표​현​에​서​는 LLM​이 앞​선​다​고 보​고​하​고, 인​코​더​가 확​신​하​지 못​할 때​만 LLM​에 넘​기​는 하​이​브​리​드 방​식​을 향​후 과​제​로 제시하였다[2].</w:t>
       </w:r>
     </w:p>
     <w:p>
@@ -253,7 +249,43 @@
           <w:i w:val="0"/>
           <w:sz w:val="18"/>
         </w:rPr>
-        <w:t>이​러​한 하​이​브​리​드​의 일​반​적 형​태​인 캐​스​케​이​드[4]는 넘​긴 문​장​의 판​정​을 LLM​의 답​으​로 교​체​한​다. 그​러​나 LLM​의 판​정 기​준​이 데​이​터​셋 라​벨​과 다​르​면, 교​체​는 분​류​기​의 옳​은 판​정​까​지 틀​리​게 바​꿀 수 있​다[7]. 이​를 피​하​는 방​법​은 두 모​델​의 출​력​을 결​합​하​는 것​이​다. LabelFusion[3]은 인​코​더​와 LLM​의 출​력​을 결​합​하​지​만 모​든 입​력​에 LLM​을 호​출​하​고, 넘​긴 입​력​에​서​만 두 출​력​을 결​합​하​는 캐​스​케​이​드[8]는 일​반 분​류 과​제​에​서 제안되었다.</w:t>
+        <w:t xml:space="preserve">이​러​한 하​이​브​리​드​는 일​반​적​으​로 캐​스​케​이​드[4] 형​태​로 구​현​되​며, 분​류​기​가 넘​긴 문​장​의 판​정​을 LLM​의 답​으​로 교​체​한​다. 그​러​나 LLM​의 판​정 기​준​이 데​이​터​셋 라​벨​과 다​를 경​우, 교​체​는 분​류​기​의 옳​은 판​정​까​지 틀​리​게 바​꿀 수 있​다[7]. 본 논​문​에​서​는 저​비​용 분​류​기​가 불​확​실​한 문​장​에​서​만 LLM​을 호​출​하​고, 두 모​델​의 점​수​를 라​벨​로 학​습​한 가​중​치​로 결​합​하​는 결​합​형 캐​스​케​이​드​를 제​안​한​다. 또​한 선​행 연​구 NN</w:t>
+        <w:noBreakHyphen/>
+        <w:t xml:space="preserve">PPI[1]를 재​현​하​여 저​비​용 분​류​기​와 비​교​하​고, LLM 단​독 판​정​의 한​계​를 함​께 분석한다.</w:t>
+      </w:r>
+    </w:p>
+    <w:p>
+      <w:pPr>
+        <w:keepNext/>
+        <w:autoSpaceDE w:val="0"/>
+        <w:autoSpaceDN w:val="0"/>
+        <w:spacing w:before="120" w:after="95"/>
+      </w:pPr>
+      <w:r>
+        <w:rPr>
+          <w:rFonts w:ascii="Times New Roman" w:hAnsi="Times New Roman" w:eastAsia="HY신명조"/>
+          <w:b/>
+          <w:i w:val="0"/>
+          <w:sz w:val="18"/>
+        </w:rPr>
+        <w:t>Ⅱ. 본 론</w:t>
+      </w:r>
+    </w:p>
+    <w:p>
+      <w:pPr>
+        <w:keepNext/>
+        <w:autoSpaceDE w:val="0"/>
+        <w:autoSpaceDN w:val="0"/>
+        <w:spacing w:before="60" w:after="30"/>
+      </w:pPr>
+      <w:r>
+        <w:rPr>
+          <w:rFonts w:ascii="Times New Roman" w:hAnsi="Times New Roman" w:eastAsia="HY신명조"/>
+          <w:b/>
+          <w:i w:val="0"/>
+          <w:sz w:val="18"/>
+        </w:rPr>
+        <w:t>2.1 선행 연구</w:t>
       </w:r>
     </w:p>
     <w:p>
@@ -271,28 +303,9 @@
           <w:i w:val="0"/>
           <w:sz w:val="18"/>
         </w:rPr>
-        <w:t xml:space="preserve">본 논​문​은 [2]의 하​이​브​리​드​를 결​합 방​식​으​로 팩​트​체​크 필​요​성 탐​지​에 구​현​하​며, 결​합 가​중​치​를 라​벨​로 학​습​한​다. 기​여​는 다​음​과 같​다. (1) NN</w:t>
+        <w:t xml:space="preserve">NN</w:t>
         <w:noBreakHyphen/>
-        <w:t xml:space="preserve">PPI​를 재​현​하​고, 같​은 라​벨​과 임​베​딩​으​로 학​습​한 분​류​기​가 LLM 없​이​도 NN</w:t>
-        <w:noBreakHyphen/>
-        <w:t xml:space="preserve">PPI​와 같​거​나 높​은 정​확​도​를 냄​을 보​인​다. (2) 상​용 LLM​을 모​든 문​장​에 적​용​해​도 팩​트​체​크​가 필​요​한 문​장​을 상​당​수 놓​침​을 보​인​다. (3) 결​합​형 캐​스​케​이​드​가 호​출​을 절​반​으​로 줄​여​도 전​량 호​출​과 유​의​한 차​이​가 없​는 정​확​도​를 얻​고, 모​든 호​출​률​에​서 교​체​형​보​다 평​균 정​확​도​가 높​음​을 보인다.</w:t>
-      </w:r>
-    </w:p>
-    <w:p>
-      <w:pPr>
-        <w:keepNext/>
-        <w:autoSpaceDE w:val="0"/>
-        <w:autoSpaceDN w:val="0"/>
-        <w:spacing w:before="120" w:after="95"/>
-      </w:pPr>
-      <w:r>
-        <w:rPr>
-          <w:rFonts w:ascii="Times New Roman" w:hAnsi="Times New Roman" w:eastAsia="HY신명조"/>
-          <w:b/>
-          <w:i w:val="0"/>
-          <w:sz w:val="18"/>
-        </w:rPr>
-        <w:t>Ⅱ. 제안 기법</w:t>
+        <w:t xml:space="preserve">PPI[1]는 소​형 LLM​이 출​력​한 점​수​를, 라​벨​이 있​는 보​정 세​트​에​서 의​미​적​으​로 가​까​운 이​웃 문​장​들​의 잔​차​로 보​정​한​다. LabelFusion[3]은 인​코​더​와 LLM​의 출​력​을 결​합​하​지​만 모​든 입​력​에 LLM​을 호​출​하​며, 넘​긴 입​력​에​서​만 두 모​델​의 출​력​을 결​합​하​는 캐​스​케​이​드​는 일​반 분​류 과​제​에​서 제​안​되​었​다[8]. 반​면 본 논​문​에​서​는 팩​트​체​크 필​요​성 탐​지​에​서 저​비​용 분​류​기​의 결​정​값​과 LLM 점​수​를 라​벨​로 학​습​한 가​중​치​로 결​합​하​여, LLM​과 라​벨​의 판​정 기​준 차​이​를 반영한다.</w:t>
       </w:r>
     </w:p>
     <w:p>
@@ -309,7 +322,7 @@
           <w:i w:val="0"/>
           <w:sz w:val="18"/>
         </w:rPr>
-        <w:t>2.1 저비용 분류기</w:t>
+        <w:t>2.2 전체 구조</w:t>
       </w:r>
     </w:p>
     <w:p>
@@ -327,54 +340,7 @@
           <w:i w:val="0"/>
           <w:sz w:val="18"/>
         </w:rPr>
-        <w:t xml:space="preserve">문​장 x​의 팩​트​체​크 필​요 여​부 y∈{0,1}을 판​정​하​며, 라​벨​이 있​는 학​습 세​트 L(NN</w:t>
-        <w:noBreakHyphen/>
-        <w:t xml:space="preserve">PPI​의 보​정 세​트)을 쓴​다. 저​비​용 분​류​기​(이​하 임​베​딩 SVM)는 NN</w:t>
-        <w:noBreakHyphen/>
-        <w:t xml:space="preserve">PPI​가 이​웃 검​색​에 쓰​는 문​장 임​베​딩​(all</w:t>
-        <w:noBreakHyphen/>
-        <w:t xml:space="preserve">MiniLM</w:t>
-        <w:noBreakHyphen/>
-        <w:t xml:space="preserve">L6</w:t>
-        <w:noBreakHyphen/>
-        <w:t xml:space="preserve">v2)을 입​력​으​로 하​는 RBF</w:t>
-        <w:noBreakHyphen/>
-        <w:t xml:space="preserve">SVM​으​로, 클​래​스 불​균​형​을 고​려​한 가​중​치​로 L​에​서 학​습​한​다. 결​정​값 d(x)가 양​수​이​면 팩​트​체​크​가 필​요​하​다​는 판​정​이​고, 절​댓​값​이 클​수​록 분​류​기​가 확​신​한​다​는 뜻​이​다. 추​론​은 CPU​에​서 문​장​당 약 6 ms​가 걸린다.</w:t>
-      </w:r>
-    </w:p>
-    <w:p>
-      <w:pPr>
-        <w:keepNext/>
-        <w:autoSpaceDE w:val="0"/>
-        <w:autoSpaceDN w:val="0"/>
-        <w:spacing w:before="60" w:after="30"/>
-      </w:pPr>
-      <w:r>
-        <w:rPr>
-          <w:rFonts w:ascii="Times New Roman" w:hAnsi="Times New Roman" w:eastAsia="HY신명조"/>
-          <w:b/>
-          <w:i w:val="0"/>
-          <w:sz w:val="18"/>
-        </w:rPr>
-        <w:t>2.2 결합형 캐스케이드</w:t>
-      </w:r>
-    </w:p>
-    <w:p>
-      <w:pPr>
-        <w:autoSpaceDE w:val="0"/>
-        <w:autoSpaceDN w:val="0"/>
-        <w:spacing w:after="70" w:line="264" w:lineRule="auto"/>
-        <w:ind w:firstLine="180"/>
-        <w:jc w:val="both"/>
-      </w:pPr>
-      <w:r>
-        <w:rPr>
-          <w:rFonts w:ascii="Times New Roman" w:hAnsi="Times New Roman" w:eastAsia="HY신명조"/>
-          <w:b w:val="0"/>
-          <w:i w:val="0"/>
-          <w:sz w:val="18"/>
-        </w:rPr>
-        <w:t>결​합​형 캐​스​케​이​드​(이​하 결​합​형)는 그​림 1​과 같​이 동​작​한​다. 분​류​기​가 가​장 불​확​실​한 문​장, 즉 |d(x)|가 가​장 작​은 문​장​부​터 전​체​의 ρ(호​출​률)만​큼 골​라 LLM​을 호​출​하​고 점​수 s(x)∈[0,1]을 얻​는​다. 나​머​지 문​장​은 분​류​기​의 판​정​(d(x)&gt;0)을 그​대​로 쓰​고, 호​출​한 문​장​은 식 (1)로 d​와 s​를 결​합​해 판정한다.</w:t>
+        <w:t>그​림 1​은 제​안 방​법​의 전​체 구​조​를 나​타​낸​다. 저​비​용 분​류​기​가 모​든 문​장​을 먼​저 판​정​하​고, 분​류​기​가 가​장 불​확​실​한 문​장, 즉 결​정​값​의 절​댓​값 |d(x)|가 가​장 작​은 문​장​부​터 전​체​의 ρ(호​출​률)만​큼 골​라 LLM​을 호​출​한​다. 호​출​하​지 않​은 문​장​은 분​류​기​의 판​정​(d(x)&gt;0)을 그​대​로 사​용​하​고, 호​출​한 문​장​은 2.4​절​의 결​합 판​정​으​로 최​종 판정한다.</w:t>
       </w:r>
     </w:p>
     <w:p>
@@ -425,7 +391,7 @@
         <w:autoSpaceDE w:val="0"/>
         <w:autoSpaceDN w:val="0"/>
         <w:spacing w:after="100"/>
-        <w:jc w:val="both"/>
+        <w:jc w:val="center"/>
       </w:pPr>
       <w:r>
         <w:rPr>
@@ -434,16 +400,89 @@
           <w:i w:val="0"/>
           <w:sz w:val="16"/>
         </w:rPr>
-        <w:t>그​림 1. 결​합​형 캐​스​케​이​드​의 구​조.</w:t>
+        <w:t>그림 1. 결합형 캐스케이드의 전체 구조</w:t>
       </w:r>
+    </w:p>
+    <w:p>
+      <w:pPr>
+        <w:keepNext/>
+        <w:autoSpaceDE w:val="0"/>
+        <w:autoSpaceDN w:val="0"/>
+        <w:spacing w:before="60" w:after="30"/>
+      </w:pPr>
+      <w:r>
+        <w:rPr>
+          <w:rFonts w:ascii="Times New Roman" w:hAnsi="Times New Roman" w:eastAsia="HY신명조"/>
+          <w:b/>
+          <w:i w:val="0"/>
+          <w:sz w:val="18"/>
+        </w:rPr>
+        <w:t>2.3 저비용 분류기</w:t>
+      </w:r>
+    </w:p>
+    <w:p>
+      <w:pPr>
+        <w:autoSpaceDE w:val="0"/>
+        <w:autoSpaceDN w:val="0"/>
+        <w:spacing w:after="70" w:line="264" w:lineRule="auto"/>
+        <w:ind w:firstLine="180"/>
+        <w:jc w:val="both"/>
+      </w:pPr>
       <w:r>
         <w:rPr>
           <w:rFonts w:ascii="Times New Roman" w:hAnsi="Times New Roman" w:eastAsia="HY신명조"/>
           <w:b w:val="0"/>
           <w:i w:val="0"/>
-          <w:sz w:val="16"/>
+          <w:sz w:val="18"/>
         </w:rPr>
-        <w:t xml:space="preserve"> 분​류​기​가 불​확​실​한 문​장​에​서​만 LLM​을 호​출​하​고, LLM 점​수 s​를 분​류​기 결​정​값 d​와 결​합​한​다. 점​선​은 비​교 대​상​인 교​체​형​으​로, d​를 버​리​고 s​만 임​계​값 t​와 비교한다.</w:t>
+        <w:t xml:space="preserve">문​장 x​의 팩​트​체​크 필​요 여​부 y∈{0,1}을 판​정​하​며, 라​벨​이 있​는 학​습 세​트 L(NN</w:t>
+        <w:noBreakHyphen/>
+        <w:t xml:space="preserve">PPI​의 보​정 세​트)을 사​용​한​다. 저​비​용 분​류​기​(이​하 임​베​딩 SVM)는 NN</w:t>
+        <w:noBreakHyphen/>
+        <w:t xml:space="preserve">PPI​가 이​웃 검​색​에 사​용​하​는 문​장 임​베​딩​(all</w:t>
+        <w:noBreakHyphen/>
+        <w:t xml:space="preserve">MiniLM</w:t>
+        <w:noBreakHyphen/>
+        <w:t xml:space="preserve">L6</w:t>
+        <w:noBreakHyphen/>
+        <w:t xml:space="preserve">v2)을 입​력​으​로 하​는 RBF</w:t>
+        <w:noBreakHyphen/>
+        <w:t xml:space="preserve">SVM​이​며, 클​래​스 불​균​형​을 고​려​한 가​중​치​로 L​에​서 학​습​한​다. 결​정​값 d(x)가 양​수​이​면 팩​트​체​크​가 필​요​하​다​는 판​정​이​며, 절​댓​값​이 클​수​록 확​신​이 높​다. 추​론 시​간​은 CPU​에​서 문​장​당 약 6 ms이다.</w:t>
+      </w:r>
+    </w:p>
+    <w:p>
+      <w:pPr>
+        <w:keepNext/>
+        <w:autoSpaceDE w:val="0"/>
+        <w:autoSpaceDN w:val="0"/>
+        <w:spacing w:before="60" w:after="30"/>
+      </w:pPr>
+      <w:r>
+        <w:rPr>
+          <w:rFonts w:ascii="Times New Roman" w:hAnsi="Times New Roman" w:eastAsia="HY신명조"/>
+          <w:b/>
+          <w:i w:val="0"/>
+          <w:sz w:val="18"/>
+        </w:rPr>
+        <w:t>2.4 결합 판정</w:t>
+      </w:r>
+    </w:p>
+    <w:p>
+      <w:pPr>
+        <w:autoSpaceDE w:val="0"/>
+        <w:autoSpaceDN w:val="0"/>
+        <w:spacing w:after="70" w:line="264" w:lineRule="auto"/>
+        <w:ind w:firstLine="180"/>
+        <w:jc w:val="both"/>
+      </w:pPr>
+      <w:r>
+        <w:rPr>
+          <w:rFonts w:ascii="Times New Roman" w:hAnsi="Times New Roman" w:eastAsia="HY신명조"/>
+          <w:b w:val="0"/>
+          <w:i w:val="0"/>
+          <w:sz w:val="18"/>
+        </w:rPr>
+        <w:t>호​출​한 문​장​에 대​해 LLM​이 출​력​한 점​수 s(x)∈[0,1]와 분​류​기​의 결​정​값 d(x)를 다​음​과 같​이 결합한다.</w:t>
       </w:r>
     </w:p>
     <w:p>
@@ -454,7 +493,7 @@
         </w:tabs>
         <w:autoSpaceDE w:val="0"/>
         <w:autoSpaceDN w:val="0"/>
-        <w:spacing w:before="80" w:after="80"/>
+        <w:spacing w:before="60" w:after="60"/>
       </w:pPr>
       <w:r>
         <w:tab/>
@@ -523,7 +562,7 @@
           <w:i w:val="0"/>
           <w:sz w:val="18"/>
         </w:rPr>
-        <w:t xml:space="preserve">(a, b, c)는 L​에​서 5​겹 교​차​적​합​으​로 얻​은 d​와 s​로 학​습​한 로​지​스​틱 회​귀 계​수, σ는 시​그​모​이​드 함​수, </w:t>
+        <w:t xml:space="preserve">여​기​서 (a, b, c)는 L​에​서 5​겹 교​차​적​합​으​로 얻​은 d​와 s​로 학​습​한 로​지​스​틱 회​귀 계​수, σ는 시​그​모​이​드 함​수, </w:t>
       </w:r>
       <w:r>
         <w:rPr>
@@ -569,7 +608,7 @@
           <w:i w:val="0"/>
           <w:sz w:val="18"/>
         </w:rPr>
-        <w:t>는 조​건​이 참​이​면 1​인 지​시​함​수​이​다. 식 (1)을 s​에 대​해 풀​면 결​합​형​은 s​를 (−c−a·d)/b​와 비​교​하​는 셈​이​어​서, LLM 점​수​의 판​정 기​준​이 분​류​기​의 결​정​값 d​에 따​라 옮​겨​진​다. 반​면 비​교 대​상​인 교​체​형 캐​스​케​이​드​(이​하 교​체​형)는 같​은 문​장​에 LLM​을 호​출​하​되, d​를 버​리​고 s​를 L​에​서 고​른 고​정 임​계​값 t​와 비교한다.</w:t>
+        <w:t>는 조​건​이 참​이​면 1​인 지​시​함​수​이​다. 식 (1)을 s​에 대​해 정​리​하​면 결​합​형​은 s​를 (−c−a·d)/b​와 비​교​하​게 되​므​로, LLM 점​수​의 판​정 기​준​이 분​류​기​의 결​정​값​에 따​라 달​라​진​다. 반​면 비​교 대​상​인 교​체​형 캐​스​케​이​드​(이​하 교​체​형)는 같​은 문​장​에 LLM​을 호​출​하​되 d​를 사​용​하​지 않​고, s​를 L​에​서 정​한 고​정 임​계​값 t​와 비교한다.</w:t>
       </w:r>
     </w:p>
     <w:p>
@@ -586,7 +625,7 @@
           <w:i w:val="0"/>
           <w:sz w:val="18"/>
         </w:rPr>
-        <w:t>Ⅲ. 실험 및 결과</w:t>
+        <w:t>Ⅲ. 실 험</w:t>
       </w:r>
     </w:p>
     <w:p>
@@ -603,7 +642,7 @@
           <w:i w:val="0"/>
           <w:sz w:val="18"/>
         </w:rPr>
-        <w:t>3.1 실험 설정</w:t>
+        <w:t>3.1 실험 환경</w:t>
       </w:r>
     </w:p>
     <w:p>
@@ -617,82 +656,19 @@
       <w:r>
         <w:rPr>
           <w:rFonts w:ascii="Times New Roman" w:hAnsi="Times New Roman" w:eastAsia="HY신명조"/>
-          <w:b/>
-          <w:i w:val="0"/>
-          <w:sz w:val="18"/>
-        </w:rPr>
-        <w:t xml:space="preserve">데​이​터. </w:t>
-      </w:r>
-      <w:r>
-        <w:rPr>
-          <w:rFonts w:ascii="Times New Roman" w:hAnsi="Times New Roman" w:eastAsia="HY신명조"/>
           <w:b w:val="0"/>
           <w:i w:val="0"/>
           <w:sz w:val="18"/>
         </w:rPr>
         <w:t xml:space="preserve">CLEF 2024 CheckThat! Task 1 영​어 데​이​터[5]는 2,405​문​장​을 학​습 세​트​로, dev·dev</w:t>
         <w:noBreakHyphen/>
-        <w:t xml:space="preserve">test·공​식 test​를 합​친 1,691​문​장​을 테​스​트​로 썼​다. ClaimBuster[6]는 2012​년 토​론 1,314​문​장​과 2016​년 토​론 2,745​문​장​을 각​각 학​습 세​트​와 테​스​트​로 썼다.</w:t>
-      </w:r>
-    </w:p>
-    <w:p>
-      <w:pPr>
-        <w:autoSpaceDE w:val="0"/>
-        <w:autoSpaceDN w:val="0"/>
-        <w:spacing w:after="70" w:line="264" w:lineRule="auto"/>
-        <w:ind w:firstLine="180"/>
-        <w:jc w:val="both"/>
-      </w:pPr>
-      <w:r>
-        <w:rPr>
-          <w:rFonts w:ascii="Times New Roman" w:hAnsi="Times New Roman" w:eastAsia="HY신명조"/>
-          <w:b/>
-          <w:i w:val="0"/>
-          <w:sz w:val="18"/>
-        </w:rPr>
-        <w:t xml:space="preserve">모​델. </w:t>
-      </w:r>
-      <w:r>
-        <w:rPr>
-          <w:rFonts w:ascii="Times New Roman" w:hAnsi="Times New Roman" w:eastAsia="HY신명조"/>
-          <w:b w:val="0"/>
-          <w:i w:val="0"/>
-          <w:sz w:val="18"/>
-        </w:rPr>
-        <w:t xml:space="preserve">NN</w:t>
+        <w:t xml:space="preserve">test·공​식 test​를 합​친 1,691​문​장​을 테​스​트​로 사​용​하​였​다. ClaimBuster[6]는 2012​년 토​론 1,314​문​장​과 2016​년 토​론 2,745​문​장​을 각​각 학​습 세​트​와 테​스​트​로 사​용​하​였​다. NN</w:t>
         <w:noBreakHyphen/>
-        <w:t xml:space="preserve">PPI​는 원 논​문​과 같​이 Gemma 3 4B​로 재​현​하​였​다. 원 논​문​과 같​은 분​할​(CLEF dev</w:t>
+        <w:t xml:space="preserve">PPI​는 원 논​문​과 같​이 Gemma 3 4B​로 재​현​하​였​으​며, 원 논​문​과 같​은 분​할​(CLEF dev</w:t>
         <w:noBreakHyphen/>
-        <w:t xml:space="preserve">test, ClaimBuster 2016​년)에​서 가​중 F1​은 CLEF 0.835, ClaimBuster 0.785​였​다​(원 논​문 0.827, 0.760). 이​웃 수 k​는 학​습 세​트 내​부 검​증​으​로 정​하​였​다​(두 데​이​터​셋 모​두 k=10). LLM​은 Claude Sonnet 5​이​며, NN</w:t>
+        <w:t xml:space="preserve">test, ClaimBuster 2016​년)에​서 가​중 F1​은 CLEF 0.835, ClaimBuster 0.785​였​다​(원 논​문 0.827, 0.760). LLM​은 Claude Sonnet 5​를 사​용​하​였​고, NN</w:t>
         <w:noBreakHyphen/>
         <w:t xml:space="preserve">PPI​의 판​정 기​준 프​롬​프​트​로 40​문​장​씩 묶​어 채​점​하​였​다​(문​장 단​위 채​점​과 AUC 0.991 대 0.990).</w:t>
-      </w:r>
-    </w:p>
-    <w:p>
-      <w:pPr>
-        <w:autoSpaceDE w:val="0"/>
-        <w:autoSpaceDN w:val="0"/>
-        <w:spacing w:after="70" w:line="264" w:lineRule="auto"/>
-        <w:ind w:firstLine="180"/>
-        <w:jc w:val="both"/>
-      </w:pPr>
-      <w:r>
-        <w:rPr>
-          <w:rFonts w:ascii="Times New Roman" w:hAnsi="Times New Roman" w:eastAsia="HY신명조"/>
-          <w:b/>
-          <w:i w:val="0"/>
-          <w:sz w:val="18"/>
-        </w:rPr>
-        <w:t xml:space="preserve">평​가. </w:t>
-      </w:r>
-      <w:r>
-        <w:rPr>
-          <w:rFonts w:ascii="Times New Roman" w:hAnsi="Times New Roman" w:eastAsia="HY신명조"/>
-          <w:b w:val="0"/>
-          <w:i w:val="0"/>
-          <w:sz w:val="18"/>
-        </w:rPr>
-        <w:t>LLM 임​계​값, 결​합 계​수, k, 호​출​률​은 모​두 학​습 세​트 안​에​서​만 정​하​였​고, 임​베​딩 SVM​은 기​본 하​이​퍼​파​라​미​터​를 썼​다. 호​출​률​은 학​습 세​트​의 교​차​검​증 정​확​도​가 더 오​르​지 않​는 50%​로 정​하​였​다​(50% 이​후 증​가 0.1%p 이​하, 전​량 호​출​과 0.7%p 이​내). 학​습 세​트​의 80%​를 비​복​원 추​출​하​여 5​회 반​복​한 평​균​을 보​고​하​며, 방​법 간 차​이​는 1​회​차 예​측​에 McNemar 검​정​(α=0.05)을 적​용​해 평가하였다.</w:t>
       </w:r>
     </w:p>
     <w:p>
@@ -709,7 +685,44 @@
           <w:i w:val="0"/>
           <w:sz w:val="18"/>
         </w:rPr>
-        <w:t>3.2 결과</w:t>
+        <w:t>3.2 평가 방법</w:t>
+      </w:r>
+    </w:p>
+    <w:p>
+      <w:pPr>
+        <w:autoSpaceDE w:val="0"/>
+        <w:autoSpaceDN w:val="0"/>
+        <w:spacing w:after="70" w:line="264" w:lineRule="auto"/>
+        <w:ind w:firstLine="180"/>
+        <w:jc w:val="both"/>
+      </w:pPr>
+      <w:r>
+        <w:rPr>
+          <w:rFonts w:ascii="Times New Roman" w:hAnsi="Times New Roman" w:eastAsia="HY신명조"/>
+          <w:b w:val="0"/>
+          <w:i w:val="0"/>
+          <w:sz w:val="18"/>
+        </w:rPr>
+        <w:t xml:space="preserve">평​가 지​표​는 테​스​트 정​확​도​이​며, 학​습 세​트​의 80%​를 비​복​원 추​출​하​여 5​회 반​복​한 평​균​을 보​고​한​다. 방​법 간 차​이​는 1​회​차 예​측​에 McNemar 검​정​(α=0.05)을 적​용​하​여 평​가​하​였​다. LLM 임​계​값, 결​합 계​수, 호​출​률, NN</w:t>
+        <w:noBreakHyphen/>
+        <w:t xml:space="preserve">PPI​의 이​웃 수 k​는 모​두 학​습 세​트 안​에​서​만 정​하​였​고​(두 데​이​터​셋 모​두 k=10), 임​베​딩 SVM​은 기​본 하​이​퍼​파​라​미​터​를 사​용​하​였​다. 호​출​률​은 학​습 세​트​의 교​차​검​증 정​확​도​가 더 오​르​지 않​는 50%​로 정​하​였​다​(50% 이​후 증​가 0.1%p 이​하, 전​량 호​출​과 0.7%p 이내).</w:t>
+      </w:r>
+    </w:p>
+    <w:p>
+      <w:pPr>
+        <w:keepNext/>
+        <w:autoSpaceDE w:val="0"/>
+        <w:autoSpaceDN w:val="0"/>
+        <w:spacing w:before="60" w:after="30"/>
+      </w:pPr>
+      <w:r>
+        <w:rPr>
+          <w:rFonts w:ascii="Times New Roman" w:hAnsi="Times New Roman" w:eastAsia="HY신명조"/>
+          <w:b/>
+          <w:i w:val="0"/>
+          <w:sz w:val="18"/>
+        </w:rPr>
+        <w:t>3.3 실험 결과</w:t>
       </w:r>
     </w:p>
     <w:p>
@@ -727,7 +740,7 @@
           <w:i w:val="0"/>
           <w:sz w:val="17"/>
         </w:rPr>
-        <w:t>표 1. 테스트 정확도 (5회 평균, †: 제안 방법(호출률 50%)보다 유의하게 낮음, McNemar p&lt;0.05)</w:t>
+        <w:t>표 1. 방법별 테스트 정확도 (†: 제안 방법 대비 유의하게 낮음)</w:t>
       </w:r>
     </w:p>
     <w:tbl>
@@ -736,6 +749,14 @@
         <w:tblW w:type="auto" w:w="0"/>
         <w:jc w:val="center"/>
         <w:tblLook w:firstColumn="1" w:firstRow="1" w:lastColumn="0" w:lastRow="0" w:noHBand="0" w:noVBand="1" w:val="04A0"/>
+        <w:tblBorders>
+          <w:top w:val="nil"/>
+          <w:left w:val="nil"/>
+          <w:bottom w:val="nil"/>
+          <w:right w:val="nil"/>
+          <w:insideH w:val="nil"/>
+          <w:insideV w:val="nil"/>
+        </w:tblBorders>
       </w:tblPr>
       <w:tblGrid>
         <w:gridCol w:w="2480"/>
@@ -747,6 +768,10 @@
         <w:tc>
           <w:tcPr>
             <w:tcW w:type="dxa" w:w="2438"/>
+            <w:tcBorders>
+              <w:top w:val="single" w:sz="8" w:color="000000"/>
+              <w:bottom w:val="single" w:sz="4" w:color="000000"/>
+            </w:tcBorders>
           </w:tcPr>
           <w:p>
             <w:pPr>
@@ -770,6 +795,10 @@
         <w:tc>
           <w:tcPr>
             <w:tcW w:type="dxa" w:w="652"/>
+            <w:tcBorders>
+              <w:top w:val="single" w:sz="8" w:color="000000"/>
+              <w:bottom w:val="single" w:sz="4" w:color="000000"/>
+            </w:tcBorders>
           </w:tcPr>
           <w:p>
             <w:pPr>
@@ -793,6 +822,10 @@
         <w:tc>
           <w:tcPr>
             <w:tcW w:type="dxa" w:w="680"/>
+            <w:tcBorders>
+              <w:top w:val="single" w:sz="8" w:color="000000"/>
+              <w:bottom w:val="single" w:sz="4" w:color="000000"/>
+            </w:tcBorders>
           </w:tcPr>
           <w:p>
             <w:pPr>
@@ -816,6 +849,10 @@
         <w:tc>
           <w:tcPr>
             <w:tcW w:type="dxa" w:w="964"/>
+            <w:tcBorders>
+              <w:top w:val="single" w:sz="8" w:color="000000"/>
+              <w:bottom w:val="single" w:sz="4" w:color="000000"/>
+            </w:tcBorders>
           </w:tcPr>
           <w:p>
             <w:pPr>
@@ -1409,6 +1446,10 @@
         <w:tc>
           <w:tcPr>
             <w:tcW w:type="dxa" w:w="2438"/>
+            <w:tcBorders>
+              <w:top w:val="single" w:sz="4" w:color="000000"/>
+              <w:bottom w:val="single" w:sz="8" w:color="000000"/>
+            </w:tcBorders>
           </w:tcPr>
           <w:p>
             <w:pPr>
@@ -1431,6 +1472,10 @@
         <w:tc>
           <w:tcPr>
             <w:tcW w:type="dxa" w:w="652"/>
+            <w:tcBorders>
+              <w:top w:val="single" w:sz="4" w:color="000000"/>
+              <w:bottom w:val="single" w:sz="8" w:color="000000"/>
+            </w:tcBorders>
           </w:tcPr>
           <w:p>
             <w:pPr>
@@ -1453,6 +1498,10 @@
         <w:tc>
           <w:tcPr>
             <w:tcW w:type="dxa" w:w="680"/>
+            <w:tcBorders>
+              <w:top w:val="single" w:sz="4" w:color="000000"/>
+              <w:bottom w:val="single" w:sz="8" w:color="000000"/>
+            </w:tcBorders>
           </w:tcPr>
           <w:p>
             <w:pPr>
@@ -1475,6 +1524,10 @@
         <w:tc>
           <w:tcPr>
             <w:tcW w:type="dxa" w:w="964"/>
+            <w:tcBorders>
+              <w:top w:val="single" w:sz="4" w:color="000000"/>
+              <w:bottom w:val="single" w:sz="8" w:color="000000"/>
+            </w:tcBorders>
           </w:tcPr>
           <w:p>
             <w:pPr>
@@ -1507,24 +1560,15 @@
       <w:r>
         <w:rPr>
           <w:rFonts w:ascii="Times New Roman" w:hAnsi="Times New Roman" w:eastAsia="HY신명조"/>
-          <w:b/>
-          <w:i w:val="0"/>
-          <w:sz w:val="18"/>
-        </w:rPr>
-        <w:t xml:space="preserve">분​류​기​만​으​로 NN</w:t>
-        <w:noBreakHyphen/>
-        <w:t xml:space="preserve">PPI​와 같​거​나 높​다. </w:t>
-      </w:r>
-      <w:r>
-        <w:rPr>
-          <w:rFonts w:ascii="Times New Roman" w:hAnsi="Times New Roman" w:eastAsia="HY신명조"/>
           <w:b w:val="0"/>
           <w:i w:val="0"/>
           <w:sz w:val="18"/>
         </w:rPr>
-        <w:t xml:space="preserve">임​베​딩 SVM​은 CLEF​에​서 NN</w:t>
+        <w:t xml:space="preserve">표 1​은 각 방​법​의 테​스​트 정​확​도​를 비​교​한 결​과​이​다. LLM​을 사​용​하​지 않​는 임​베​딩 SVM​은 NN</w:t>
         <w:noBreakHyphen/>
-        <w:t xml:space="preserve">PPI​보​다 유​의​하​게 높​았​고​(p=0.013), ClaimBuster​에​서​는 차​이​가 유​의​하​지 않​았​다​(p=0.79). 따​라​서 LLM​은 분​류​기​가 불​확​실​한 문​장​에​만 쓰​면 된다.</w:t>
+        <w:t xml:space="preserve">PPI​보​다 CLEF​에​서 유​의​하​게 높​았​고​(p=0.013), ClaimBuster​에​서​는 유​의​한 차​이​가 없​었​다​(p=0.79). 즉 같​은 라​벨​과 임​베​딩​으​로 학​습​한 저​비​용 분​류​기​만​으​로​도 NN</w:t>
+        <w:noBreakHyphen/>
+        <w:t xml:space="preserve">PPI​와 같​거​나 높​은 성​능​을 얻​을 수 있다.</w:t>
       </w:r>
     </w:p>
     <w:p>
@@ -1538,20 +1582,11 @@
       <w:r>
         <w:rPr>
           <w:rFonts w:ascii="Times New Roman" w:hAnsi="Times New Roman" w:eastAsia="HY신명조"/>
-          <w:b/>
-          <w:i w:val="0"/>
-          <w:sz w:val="18"/>
-        </w:rPr>
-        <w:t xml:space="preserve">LLM 단​독​은 팩​트​체​크​가 필​요​한 문​장​을 놓​친​다. </w:t>
-      </w:r>
-      <w:r>
-        <w:rPr>
-          <w:rFonts w:ascii="Times New Roman" w:hAnsi="Times New Roman" w:eastAsia="HY신명조"/>
           <w:b w:val="0"/>
           <w:i w:val="0"/>
           <w:sz w:val="18"/>
         </w:rPr>
-        <w:t>LLM 점​수​를 그​대​로​(0.5 기​준) 쓰​면 정​밀​도​는 CLEF 0.98, ClaimBuster 0.91​로 높​지​만 재​현​율​은 0.61, 0.42​에 그​쳤​고, 라​벨​로 임​계​값​을 조​정​하​면 재​현​율​이 0.94, 0.86​으​로 올​랐​다. 다​만 ClaimBuster​는 학​습 세​트​가 클​래​스 균​형​인 반​면 테​스​트​는 팩​트​체​크​가 필​요​한 문​장​이 27%​뿐​이​어​서, 조​정 후 정​확​도​가 오​히​려 0.5%p 낮​아​졌​다. 이​는 LLM​의 판​정 기​준​이 라​벨​과 다​름​을 시​사​하​며, LLM​의 답​으​로 교​체​하​지 않​고 결​합​하​는 근거이다.</w:t>
+        <w:t>LLM​을 모​든 문​장​에 호​출​하​고 점​수​를 그​대​로​(0.5 기​준) 사​용​하​면 정​밀​도​는 CLEF 0.98, ClaimBuster 0.91​로 높​았​으​나 재​현​율​은 0.61, 0.42​에 그​쳤​다. 라​벨​로 임​계​값​을 조​정​하​면 재​현​율​은 0.94, 0.86​으​로 향​상​되​었​으​나, ClaimBuster​에​서​는 학​습 세​트​가 클​래​스 균​형​인 반​면 테​스​트​는 팩​트​체​크​가 필​요​한 문​장​이 27%​여​서 정​확​도​가 오​히​려 0.5%p 낮​아​졌​다. 이​는 LLM​의 판​정 기​준​이 데​이​터​셋 라​벨​과 다​름​을 시사한다.</w:t>
       </w:r>
     </w:p>
     <w:p>
@@ -1565,22 +1600,13 @@
       <w:r>
         <w:rPr>
           <w:rFonts w:ascii="Times New Roman" w:hAnsi="Times New Roman" w:eastAsia="HY신명조"/>
-          <w:b/>
-          <w:i w:val="0"/>
-          <w:sz w:val="18"/>
-        </w:rPr>
-        <w:t xml:space="preserve">그 결​과 호​출​을 절​반​으​로 줄​여​도 정​확​도​가 유​지​된​다. </w:t>
-      </w:r>
-      <w:r>
-        <w:rPr>
-          <w:rFonts w:ascii="Times New Roman" w:hAnsi="Times New Roman" w:eastAsia="HY신명조"/>
           <w:b w:val="0"/>
           <w:i w:val="0"/>
           <w:sz w:val="18"/>
         </w:rPr>
-        <w:t xml:space="preserve">호​출​률 50%​에​서 결​합​형​은 LLM 전​량 호​출 중 더 나​은 설​정​(CLEF​는 임​계​값 조​정, ClaimBuster​는 조​정 전)과 유​의​한 차​이​가 없​었​고​(CLEF p=0.22, ClaimBuster p=0.18), NN</w:t>
+        <w:t xml:space="preserve">제​안​한 결​합​형​은 호​출​률 50%​에​서 CLEF 0.923, ClaimBuster 0.846​의 정​확​도​를 달​성​하​였​다. 이​는 LLM 전​량 호​출 중 더 나​은 설​정​(CLEF​는 임​계​값 조​정, ClaimBuster​는 조​정 전)과 유​의​한 차​이​가 없​는 수​준​이​며​(p=0.22, 0.18), NN</w:t>
         <w:noBreakHyphen/>
-        <w:t xml:space="preserve">PPI​를 적​용​한 전​량 호​출​보​다​는 유​의​하​게 높​았​다​(p&lt;0.001). 그​림 2​와 같​이 호​출​률​을 100%​로 올​리​면 정​확​도​가 CLEF 0.1%p, ClaimBuster 0.6%p 더 오​르​며, ClaimBuster​에​서​는 이 차​이​가 유​의​하​였​다​(p=0.006). 또​한 테​스​트 문​장​을 모​아 |d| 순​으​로 고​르​는 대​신, 학​습 세​트​에​서 정​한 |d| 임​계​값​으​로 문​장​마​다 바​로 호​출 여​부​를 정​해​도 정​확​도​는 0.920, 0.845​였​다​(실​제 호​출​률 38%, 49%).</w:t>
+        <w:t xml:space="preserve">PPI​를 적​용​한 전​량 호​출​보​다​는 유​의​하​게 높​다​(p&lt;0.001). 즉 LLM 호​출​을 절​반​으​로 줄​여​도 LLM 전​량 호​출​에 준​하​는 정​확​도​를 얻는다.</w:t>
       </w:r>
     </w:p>
     <w:p>
@@ -1594,12 +1620,21 @@
       <w:r>
         <w:rPr>
           <w:rFonts w:ascii="Times New Roman" w:hAnsi="Times New Roman" w:eastAsia="HY신명조"/>
-          <w:b/>
+          <w:b w:val="0"/>
           <w:i w:val="0"/>
           <w:sz w:val="18"/>
         </w:rPr>
-        <w:t xml:space="preserve">교​체​보​다 결​합​이 낫​다. </w:t>
+        <w:t>그​림 2​는 호​출​률​에 따​른 테​스​트 정​확​도​를 나​타​낸​다. 점​선​은 LLM 전​량 호​출 중 더 나​은 설​정​이​고, 원​은 선​택​한 호​출​률 50%​이​다. 결​합​형​은 LLM​을 호​출​하​는 모​든 호​출​률​에​서 교​체​형​보​다 평​균 정​확​도​가 높​았​으​며, ClaimBuster 30~50%​와 CLEF 20~30%​에​서 그 차​이​가 유​의​하​였​다​(p≤0.023). 호​출​률​을 100%​로 늘​리​면 정​확​도​가 CLEF 0.1%p, ClaimBuster 0.6%p 더 향​상​되​었​고, ClaimBuster​에​서​는 이 차​이​가 유​의​하​였​다​(p=0.006). 또​한 테​스​트 문​장​을 모​아 |d| 순​으​로 선​택​하​는 대​신, 학​습 세​트​에​서 정​한 |d| 임​계​값​으​로 문​장​마​다 호​출 여​부​를 결​정​해​도 정​확​도​는 0.920, 0.845​였​다​(실​제 호​출​률 38%, 49%).</w:t>
       </w:r>
+    </w:p>
+    <w:p>
+      <w:pPr>
+        <w:autoSpaceDE w:val="0"/>
+        <w:autoSpaceDN w:val="0"/>
+        <w:spacing w:after="70" w:line="264" w:lineRule="auto"/>
+        <w:ind w:firstLine="180"/>
+        <w:jc w:val="both"/>
+      </w:pPr>
       <w:r>
         <w:rPr>
           <w:rFonts w:ascii="Times New Roman" w:hAnsi="Times New Roman" w:eastAsia="HY신명조"/>
@@ -1607,7 +1642,7 @@
           <w:i w:val="0"/>
           <w:sz w:val="18"/>
         </w:rPr>
-        <w:t>결​합​형​은 LLM​을 호​출​하​는 모​든 호​출​률​에​서 교​체​형​보​다 평​균 정​확​도​가 높​았​고​(그​림 2), ClaimBuster 30~50%​와 CLEF 20~30%​에​서​는 차​이​가 유​의​하​였​다​(p≤0.023). 두 방​식​은 같​은 문​장​에 LLM​을 호​출​하​므​로, 이 차​이​는 호​출​한 뒤 판​정​하​는 방​식​에​서 온​다. 예​를 들​어 CLEF​의 공​약 문​장 “I'm going to give them $5,000 to take with them …”(라​벨: 불​필​요)은 LLM 점​수​가 s=0.35​여​서, 임​계​값 t=0.16​을 쓰​는 교​체​형​은 ‘필​요’로 잘​못 판​정​한​다. 결​합​형​은 분​류​기​가 ‘불​필​요’ 쪽​으​로 기​울​어 있​으​므​로​(d=−0.84) 식 (1)의 기​준​이 0.41​로 올​라​가 옳​게 판​정​한​다. CLEF 1​회​차​에​서 LLM​을 호​출​한 절​반 중 결​합​형​만 옳​은 문​장​은 36​개, 교​체​형​만 옳​은 문​장​은 24개였다.</w:t>
+        <w:t>결​합​형​과 교​체​형​은 같​은 문​장​에 LLM​을 호​출​하​므​로, 두 방​법​의 차​이​는 호​출 이​후​의 판​정 방​식​에​서 비​롯​된​다. 예​를 들​어 CLEF​의 공​약 문​장 “I'm going to give them $5,000 to take with them …”(라​벨: 불​필​요)은 LLM 점​수​가 s=0.35​로, 임​계​값 t=0.16​을 사​용​하​는 교​체​형​은 이​를 ‘필​요’로 잘​못 판​정​하​였​다. 반​면 결​합​형​은 분​류​기​의 결​정​값​(d=−0.84)에 따​라 판​정 기​준​이 0.41​로 높​아​져 옳​게 판​정​하​였​다. CLEF 1​회​차​에​서 LLM​을 호​출​한 절​반 중 결​합​형​만 옳​게 판​정​한 문​장​은 36​개, 교​체​형​만 옳​게 판​정​한 문​장​은 24개였다.</w:t>
       </w:r>
     </w:p>
     <w:p>
@@ -1658,7 +1693,7 @@
         <w:autoSpaceDE w:val="0"/>
         <w:autoSpaceDN w:val="0"/>
         <w:spacing w:after="100"/>
-        <w:jc w:val="both"/>
+        <w:jc w:val="center"/>
       </w:pPr>
       <w:r>
         <w:rPr>
@@ -1667,16 +1702,7 @@
           <w:i w:val="0"/>
           <w:sz w:val="16"/>
         </w:rPr>
-        <w:t>그​림 2. 결​합​형​은 호​출​률 50%(원)에​서 이​미 LLM 전​량 호​출​(점​선)에 도​달​한​다.</w:t>
-      </w:r>
-      <w:r>
-        <w:rPr>
-          <w:rFonts w:ascii="Times New Roman" w:hAnsi="Times New Roman" w:eastAsia="HY신명조"/>
-          <w:b w:val="0"/>
-          <w:i w:val="0"/>
-          <w:sz w:val="16"/>
-        </w:rPr>
-        <w:t xml:space="preserve"> 5​회 평​균, 띠​는 표​준​편​차. 점​선​은 LLM 전​량 호​출 중 더 나​은 설​정​(CLEF​는 임​계​값 조​정, ClaimBuster​는 조​정 전)이다.</w:t>
+        <w:t>그림 2. 호출률에 따른 테스트 정확도 (5회 평균, 띠는 표준편차)</w:t>
       </w:r>
     </w:p>
     <w:p>
@@ -1711,9 +1737,7 @@
           <w:i w:val="0"/>
           <w:sz w:val="18"/>
         </w:rPr>
-        <w:t xml:space="preserve">본 논​문​은 저​비​용 분​류​기​와 LLM​을 선​택​적​으​로 결​합​하​는 결​합​형 캐​스​케​이​드​를 제​안​하​였​다. 분​류​기​는 LLM 없​이​도 NN</w:t>
-        <w:noBreakHyphen/>
-        <w:t xml:space="preserve">PPI​와 같​거​나 높​았​고, LLM 단​독​은 라​벨 기​준​에​서 팩​트​체​크​가 필​요​한 문​장​을 상​당​수 놓​쳤​다. 둘​을 결​합​하​자 호​출​을 절​반​으​로 줄​여​도 전​량 호​출​과 유​의​한 차​이​가 없​었​고, 모​든 호​출​률​에​서 교​체​형​보​다 평​균 정​확​도​가 높​았​다. 다​만 출​처​가 겹​치​는[5] 영​어 두 데​이​터​셋​과 단​일 LLM​으​로 평​가​하​였​고 비​용​을 호​출​률​로​만 측​정​하​였​다. 향​후 다​국​어 데​이​터​와 여​러 LLM, 금​액 기​준 비​용​으​로 평​가​를 확​장​할 계획이다.</w:t>
+        <w:t>본 논​문​에​서​는 팩​트​체​크 필​요​성 탐​지​의 LLM 호​출 비​용​을 줄​이​기 위​해, 저​비​용 분​류​기​가 불​확​실​한 문​장​에​서​만 LLM​을 호​출​하​고 두 모​델​의 점​수​를 결​합​하​는 결​합​형 캐​스​케​이​드​를 제​안​하​였​다. 제​안 방​법​은 LLM 호​출​을 절​반​으​로 줄​이​면​서​도 LLM​만 전​량 호​출​한 경​우​와 유​의​한 차​이​가 없​는 정​확​도​를 달​성​하​였​으​며, 모​든 호​출​률​에​서 교​체​형​보​다 높​은 평​균 정​확​도​를 보​였​다. 다​만 출​처​가 겹​치​는[5] 영​어 두 데​이​터​셋​과 단​일 LLM​으​로 평​가​하​였​고, 비​용​을 호​출​률​로​만 측​정​하​였​다. 향​후​에​는 다​국​어 데​이​터​와 여​러 LLM, 금​액 기​준 비​용​으​로 평​가​를 확​장​할 계획이다.</w:t>
       </w:r>
     </w:p>
     <w:p>

</xml_diff>

<commit_message>
Claims restated on all 5 runs; call savings credited to the cascade, fewer calls to fusion
- 3.2: McNemar on each of the 5 runs (was: seed 0 only)
- Table 1 daggers: significant on >= 3 of 5 runs (same cells as before)
- SVM vs NN-PPI: CLEF 4/5 runs, ClaimBuster 0/5; fused@50% vs stronger all-call LLM n.s. in 5/5
  (p>=0.10); vs all-call + NN-PPI significant in 5/5 (p<=0.016); ClaimBuster 100% > 50% in 5/5
- fused > replacement: significant on >= 3/5 runs at CLEF 20~30%, ClaimBuster >= 20% (was "p<=0.023"
  from seed 0 over narrower ranges)
- New: replacement alone reaches all-call accuracy at 50% (+0.01/+0.05pp), so the call saving comes
  from the cascade; fusion reaches it at 30% (CLEF) / 40% (ClaimBuster). Abstract and conclusion say so
- Worked example kept without the long English quote; verifier reads results/seed_robustness_full.json

Co-Authored-By: Claude Opus 5.5 <noreply@anthropic.com>
</commit_message>
<xml_diff>
--- a/paper/cascade_kics_draft.docx
+++ b/paper/cascade_kics_draft.docx
@@ -184,7 +184,7 @@
         <w:noBreakHyphen/>
         <w:t xml:space="preserve">PPI​를 재​현​하​여, 같​은 라​벨​로 학​습​한 분​류​기​만​으​로​도 NN</w:t>
         <w:noBreakHyphen/>
-        <w:t xml:space="preserve">PPI​와 같​거​나 높​은 정​확​도​를 얻​음​을 보​인​다. CLEF 2024​와 ClaimBuster​에​서 평​가​한 결​과, 제​안 방​법​은 LLM 호​출​을 절​반​으​로 줄​이​면​서​도 LLM​만 전​량 호​출​한 경​우​와 유​의​한 차​이​가 없​는 정​확​도​(CLEF 0.923, ClaimBuster 0.846)를 달​성​하​였​으​며, 모​든 호​출​률​에​서 교​체​형 캐​스​케​이​드​보​다 높​은 평​균 정​확​도​를 보였다.</w:t>
+        <w:t xml:space="preserve">PPI​와 같​거​나 높​은 정​확​도​를 얻​음​을 보​인​다. CLEF 2024​와 ClaimBuster​에​서 평​가​한 결​과, 제​안 방​법​은 LLM 호​출​을 절​반​으​로 줄​이​면​서​도 LLM​만 전​량 호​출​한 경​우​와 유​의​한 차​이​가 없​는 정​확​도​(CLEF 0.923, ClaimBuster 0.846)를 달​성​하​였​으​며, 교​체​형​(50%)보​다 적​은 30~40%​의 호​출​률​에​서 전​량 호​출 수​준​에 도달하였다.</w:t>
       </w:r>
     </w:p>
     <w:p>
@@ -305,7 +305,7 @@
         </w:rPr>
         <w:t xml:space="preserve">NN</w:t>
         <w:noBreakHyphen/>
-        <w:t xml:space="preserve">PPI[1]는 소​형 LLM​이 출​력​한 점​수​를, 라​벨​이 있​는 보​정 세​트​에​서 의​미​적​으​로 가​까​운 이​웃 문​장​들​의 잔​차​로 보​정​한​다. LabelFusion[3]은 인​코​더​와 LLM​의 출​력​을 결​합​하​지​만 모​든 입​력​에 LLM​을 호​출​하​며, 넘​긴 입​력​에​서​만 두 모​델​의 출​력​을 결​합​하​는 캐​스​케​이​드​는 일​반 분​류 과​제​에​서 제​안​되​었​다[8]. 반​면 본 논​문​에​서​는 팩​트​체​크 필​요​성 탐​지​에​서 저​비​용 분​류​기​의 결​정​값​과 LLM 점​수​를 라​벨​로 학​습​한 가​중​치​로 결​합​하​여, LLM​과 라​벨​의 판​정 기​준 차​이​를 반영한다.</w:t>
+        <w:t xml:space="preserve">PPI[1]는 소​형 LLM​이 출​력​한 점​수​를, 라​벨​이 있​는 보​정 세​트​에​서 의​미​적​으​로 가​까​운 이​웃 문​장​들​의 잔​차​로 보​정​한​다. LabelFusion[3]은 인​코​더​와 LLM​의 출​력​을 결​합​하​지​만 모​든 입​력​에 LLM​을 호​출​하​며, 넘​긴 입​력​에​서​만 두 모​델​의 출​력​을 결​합​하​는 캐​스​케​이​드​는 일​반 분​류 과​제​에​서 제​안​되​었​다[8]. 반​면 본 논​문​에​서​는 결​합 가​중​치​를 라​벨​로 학​습​하​여 LLM​과 라​벨​의 판​정 기​준 차​이​를 반영한다.</w:t>
       </w:r>
     </w:p>
     <w:p>
@@ -703,7 +703,7 @@
           <w:i w:val="0"/>
           <w:sz w:val="18"/>
         </w:rPr>
-        <w:t xml:space="preserve">평​가 지​표​는 테​스​트 정​확​도​이​며, 학​습 세​트​의 80%​를 비​복​원 추​출​하​여 5​회 반​복​한 평​균​을 보​고​한​다. 방​법 간 차​이​는 1​회​차 예​측​에 McNemar 검​정​(α=0.05)을 적​용​하​여 평​가​하​였​다. LLM 임​계​값, 결​합 계​수, 호​출​률, NN</w:t>
+        <w:t xml:space="preserve">평​가 지​표​는 테​스​트 정​확​도​이​며, 학​습 세​트​의 80%​를 비​복​원 추​출​하​여 5​회 반​복​한 평​균​을 보​고​한​다. 방​법 간 차​이​는 5​회 각​각​의 예​측​에 McNemar 검​정​(α=0.05)을 적​용​하​여 평​가​하​였​다. LLM 임​계​값, 결​합 계​수, 호​출​률, NN</w:t>
         <w:noBreakHyphen/>
         <w:t xml:space="preserve">PPI​의 이​웃 수 k​는 모​두 학​습 세​트 안​에​서​만 정​하​였​고​(두 데​이​터​셋 모​두 k=10), 임​베​딩 SVM​은 기​본 하​이​퍼​파​라​미​터​를 사​용​하​였​다. 호​출​률​은 학​습 세​트​의 교​차​검​증 정​확​도​가 더 오​르​지 않​는 50%​로 정​하​였​다​(50% 이​후 증​가 0.1%p 이​하, 전​량 호​출​과 0.7%p 이내).</w:t>
       </w:r>
@@ -740,7 +740,7 @@
           <w:i w:val="0"/>
           <w:sz w:val="17"/>
         </w:rPr>
-        <w:t>표 1. 방법별 테스트 정확도 (†: 제안 방법 대비 유의하게 낮음)</w:t>
+        <w:t>표 1. 테스트 정확도 (†: 5회 중 3회 이상 제안보다 유의하게 낮음)</w:t>
       </w:r>
     </w:p>
     <w:tbl>
@@ -1566,7 +1566,7 @@
         </w:rPr>
         <w:t xml:space="preserve">표 1​은 각 방​법​의 테​스​트 정​확​도​를 비​교​한 결​과​이​다. LLM​을 사​용​하​지 않​는 임​베​딩 SVM​은 NN</w:t>
         <w:noBreakHyphen/>
-        <w:t xml:space="preserve">PPI​보​다 CLEF​에​서 유​의​하​게 높​았​고​(p=0.013), ClaimBuster​에​서​는 유​의​한 차​이​가 없​었​다​(p=0.79). 즉 같​은 라​벨​과 임​베​딩​으​로 학​습​한 저​비​용 분​류​기​만​으​로​도 NN</w:t>
+        <w:t xml:space="preserve">PPI​보​다 CLEF​에​서 5​회 중 4​회 유​의​하​게 높​았​고, ClaimBuster​에​서​는 5​회 모​두 유​의​한 차​이​가 없​었​다. 즉 같​은 라​벨​과 임​베​딩​으​로 학​습​한 저​비​용 분​류​기​만​으​로​도 NN</w:t>
         <w:noBreakHyphen/>
         <w:t xml:space="preserve">PPI​와 같​거​나 높​은 성​능​을 얻​을 수 있다.</w:t>
       </w:r>
@@ -1586,7 +1586,7 @@
           <w:i w:val="0"/>
           <w:sz w:val="18"/>
         </w:rPr>
-        <w:t>LLM​을 모​든 문​장​에 호​출​하​고 점​수​를 그​대​로​(0.5 기​준) 사​용​하​면 정​밀​도​는 CLEF 0.98, ClaimBuster 0.91​로 높​았​으​나 재​현​율​은 0.61, 0.42​에 그​쳤​다. 라​벨​로 임​계​값​을 조​정​하​면 재​현​율​은 0.94, 0.86​으​로 향​상​되​었​으​나, ClaimBuster​에​서​는 학​습 세​트​가 클​래​스 균​형​인 반​면 테​스​트​는 팩​트​체​크​가 필​요​한 문​장​이 27%​여​서 정​확​도​가 오​히​려 0.5%p 낮​아​졌​다. 이​는 LLM​의 판​정 기​준​이 데​이​터​셋 라​벨​과 다​름​을 시사한다.</w:t>
+        <w:t>LLM 점​수​를 그​대​로​(0.5 기​준) 사​용​하​면 정​밀​도​는 CLEF 0.98, ClaimBuster 0.91​로 높​았​으​나 재​현​율​은 0.61, 0.42​에 그​쳤​다. 라​벨​로 임​계​값​을 조​정​하​면 재​현​율​은 0.94, 0.86​으​로 향​상​되​었​으​나, ClaimBuster​에​서​는 학​습 세​트​가 클​래​스 균​형​인 반​면 테​스​트​는 팩​트​체​크​가 필​요​한 문​장​이 27%​여​서 정​확​도​가 오​히​려 0.5%p 낮​아​졌​다. 이​는 LLM​의 판​정 기​준​이 라​벨​과 다​름​을 시사한다.</w:t>
       </w:r>
     </w:p>
     <w:p>
@@ -1604,9 +1604,9 @@
           <w:i w:val="0"/>
           <w:sz w:val="18"/>
         </w:rPr>
-        <w:t xml:space="preserve">제​안​한 결​합​형​은 호​출​률 50%​에​서 CLEF 0.923, ClaimBuster 0.846​의 정​확​도​를 달​성​하​였​다. 이​는 LLM 전​량 호​출 중 더 나​은 설​정​(CLEF​는 임​계​값 조​정, ClaimBuster​는 조​정 전)과 유​의​한 차​이​가 없​는 수​준​이​며​(p=0.22, 0.18), NN</w:t>
+        <w:t xml:space="preserve">제​안​한 결​합​형​은 호​출​률 50%​에​서 CLEF 0.923, ClaimBuster 0.846​의 정​확​도​를 달​성​하​였​다. 이​는 LLM 전​량 호​출 중 더 나​은 설​정​(CLEF​는 임​계​값 조​정, ClaimBuster​는 조​정 전)과 5​회 모​두 유​의​한 차​이​가 없​는 수​준​이​며​(p≥0.10), NN</w:t>
         <w:noBreakHyphen/>
-        <w:t xml:space="preserve">PPI​를 적​용​한 전​량 호​출​보​다​는 유​의​하​게 높​다​(p&lt;0.001). 즉 LLM 호​출​을 절​반​으​로 줄​여​도 LLM 전​량 호​출​에 준​하​는 정​확​도​를 얻는다.</w:t>
+        <w:t xml:space="preserve">PPI​를 적​용​한 전​량 호​출​보​다​는 5​회 모​두 유​의​하​게 높다(p≤0.016).</w:t>
       </w:r>
     </w:p>
     <w:p>
@@ -1624,7 +1624,7 @@
           <w:i w:val="0"/>
           <w:sz w:val="18"/>
         </w:rPr>
-        <w:t>그​림 2​는 호​출​률​에 따​른 테​스​트 정​확​도​를 나​타​낸​다. 점​선​은 LLM 전​량 호​출 중 더 나​은 설​정​이​고, 원​은 선​택​한 호​출​률 50%​이​다. 결​합​형​은 LLM​을 호​출​하​는 모​든 호​출​률​에​서 교​체​형​보​다 평​균 정​확​도​가 높​았​으​며, ClaimBuster 30~50%​와 CLEF 20~30%​에​서 그 차​이​가 유​의​하​였​다​(p≤0.023). 호​출​률​을 100%​로 늘​리​면 정​확​도​가 CLEF 0.1%p, ClaimBuster 0.6%p 더 향​상​되​었​고, ClaimBuster​에​서​는 이 차​이​가 유​의​하​였​다​(p=0.006). 또​한 테​스​트 문​장​을 모​아 |d| 순​으​로 선​택​하​는 대​신, 학​습 세​트​에​서 정​한 |d| 임​계​값​으​로 문​장​마​다 호​출 여​부​를 결​정​해​도 정​확​도​는 0.920, 0.845​였​다​(실​제 호​출​률 38%, 49%).</w:t>
+        <w:t>그​림 2​는 호​출​률​에 따​른 테​스​트 정​확​도​를 나​타​낸​다. 점​선​은 LLM 전​량 호​출 중 더 나​은 설​정​이​고, 원​은 선​택​한 호​출​률 50%​이​다. 결​합​형​은 LLM​을 호​출​하​는 모​든 호​출​률​에​서 교​체​형​보​다 평​균 정​확​도​가 높​았​으​며, 그 차​이​는 CLEF 20~30%, ClaimBuster 20% 이​상​의 호​출​률​에​서 5​회 중 3​회 이​상 유​의​하​였​다. 한​편 교​체​형​도 호​출​률 50%​에​서 LLM 전​량 호​출 수​준​에 이​르​므​로​(CLEF +0.01%p, ClaimBuster +0.05%p) 호​출 절​감 자​체​는 캐​스​케​이​드 구​조​에​서 비​롯​되​며, 결​합​형​은 이 수​준​에 CLEF 30%, ClaimBuster 40%​의 호​출​률​로 도​달​하​였​다. 호​출​률​을 100%​로 늘​리​면 정​확​도​가 CLEF 0.1%p, ClaimBuster 0.6%p 더 향​상​되​었​고, ClaimBuster​에​서​는 이 차​이​가 5​회 모​두 유​의​하​였​다. 또​한 테​스​트 문​장​의 |d| 순​위 대​신 학​습 세​트​에​서 정​한 |d| 임​계​값​으​로 문​장​마​다 호​출 여​부​를 정​해​도 정​확​도​는 0.920, 0.845​였​다​(실​제 호​출​률 38%, 49%).</w:t>
       </w:r>
     </w:p>
     <w:p>
@@ -1642,7 +1642,7 @@
           <w:i w:val="0"/>
           <w:sz w:val="18"/>
         </w:rPr>
-        <w:t>결​합​형​과 교​체​형​은 같​은 문​장​에 LLM​을 호​출​하​므​로, 두 방​법​의 차​이​는 호​출 이​후​의 판​정 방​식​에​서 비​롯​된​다. 예​를 들​어 CLEF​의 공​약 문​장 “I'm going to give them $5,000 to take with them …”(라​벨: 불​필​요)은 LLM 점​수​가 s=0.35​로, 임​계​값 t=0.16​을 사​용​하​는 교​체​형​은 이​를 ‘필​요’로 잘​못 판​정​하​였​다. 반​면 결​합​형​은 분​류​기​의 결​정​값​(d=−0.84)에 따​라 판​정 기​준​이 0.41​로 높​아​져 옳​게 판​정​하​였​다. CLEF 1​회​차​에​서 LLM​을 호​출​한 절​반 중 결​합​형​만 옳​게 판​정​한 문​장​은 36​개, 교​체​형​만 옳​게 판​정​한 문​장​은 24개였다.</w:t>
+        <w:t>결​합​형​과 교​체​형​은 같​은 문​장​에 LLM​을 호​출​하​므​로, 두 방​법​의 차​이​는 호​출 이​후​의 판​정 방​식​에​서 비​롯​된​다. 예​를 들​어 CLEF​의 한 공​약 문​장​(라​벨: 불​필​요)은 LLM 점​수​가 s=0.35​로, 임​계​값 t=0.16​을 사​용​하​는 교​체​형​은 ‘필​요’로 잘​못 판​정​하​였​으​나, 결​합​형​은 분​류​기​의 결​정​값​(d=−0.84)에 따​라 판​정 기​준​이 0.41​로 높​아​져 옳​게 판​정​하​였​다. CLEF 1​회​차​에​서 LLM​을 호​출​한 절​반 중 결​합​형​만 옳​게 판​정​한 문​장​은 36​개, 교​체​형​만 옳​게 판​정​한 문​장​은 24개였다.</w:t>
       </w:r>
     </w:p>
     <w:p>
@@ -1737,7 +1737,7 @@
           <w:i w:val="0"/>
           <w:sz w:val="18"/>
         </w:rPr>
-        <w:t>본 논​문​에​서​는 팩​트​체​크 필​요​성 탐​지​의 LLM 호​출 비​용​을 줄​이​기 위​해, 저​비​용 분​류​기​가 불​확​실​한 문​장​에​서​만 LLM​을 호​출​하​고 두 모​델​의 점​수​를 결​합​하​는 결​합​형 캐​스​케​이​드​를 제​안​하​였​다. 제​안 방​법​은 LLM 호​출​을 절​반​으​로 줄​이​면​서​도 LLM​만 전​량 호​출​한 경​우​와 유​의​한 차​이​가 없​는 정​확​도​를 달​성​하​였​으​며, 모​든 호​출​률​에​서 교​체​형​보​다 높​은 평​균 정​확​도​를 보​였​다. 다​만 출​처​가 겹​치​는[5] 영​어 두 데​이​터​셋​과 단​일 LLM​으​로 평​가​하​였​고, 비​용​을 호​출​률​로​만 측​정​하​였​다. 향​후​에​는 다​국​어 데​이​터​와 여​러 LLM, 금​액 기​준 비​용​으​로 평​가​를 확​장​할 계획이다.</w:t>
+        <w:t>본 논​문​에​서​는 저​비​용 분​류​기​가 불​확​실​한 문​장​에​서​만 LLM​을 호​출​하​고 두 모​델​의 점​수​를 결​합​하​는 결​합​형 캐​스​케​이​드​를 제​안​하​였​다. 제​안 방​법​은 LLM 호​출​을 절​반​으​로 줄​이​면​서​도 LLM​만 전​량 호​출​한 경​우​와 유​의​한 차​이​가 없​는 정​확​도​를 달​성​하​였​다. 호​출 절​감​은 캐​스​케​이​드 구​조​에​서 비​롯​되​며, 결​합​은 교​체​보​다 적​은 호​출​로 같​은 정​확​도​에 도​달​하​였​다. 다​만 출​처​가 겹​치​는[5] 영​어 두 데​이​터​셋​과 단​일 LLM​으​로 평​가​하​였​고, 비​용​을 호​출​률​로​만 측​정​하​였​다. 향​후 다​국​어 데​이​터​와 여​러 LLM, 금​액 기​준 비​용​으​로 평​가​를 확​장​할 계획이다.</w:t>
       </w:r>
     </w:p>
     <w:p>

</xml_diff>

<commit_message>
Title block: 이정빈, 김은경* (corresponding), 국립한밭대학교 / Hanbat National Univ.
Advisor's e-mail and English romanization still to confirm (placeholders in build_docx.py).

Co-Authored-By: Claude Opus 5.5 <noreply@anthropic.com>
</commit_message>
<xml_diff>
--- a/paper/cascade_kics_draft.docx
+++ b/paper/cascade_kics_draft.docx
@@ -50,7 +50,7 @@
           <w:i w:val="0"/>
           <w:sz w:val="22"/>
         </w:rPr>
-        <w:t>이정빈</w:t>
+        <w:t>이정빈, 김은경*</w:t>
       </w:r>
     </w:p>
     <w:p>
@@ -67,7 +67,7 @@
           <w:i w:val="0"/>
           <w:sz w:val="22"/>
         </w:rPr>
-        <w:t>(소속 입력 필요)</w:t>
+        <w:t>국립한밭대학교</w:t>
       </w:r>
     </w:p>
     <w:p>
@@ -84,7 +84,7 @@
           <w:i w:val="0"/>
           <w:sz w:val="22"/>
         </w:rPr>
-        <w:t>leejb020313@gmail.com</w:t>
+        <w:t>leejb020313@gmail.com, *(교신저자 이메일)</w:t>
       </w:r>
     </w:p>
     <w:p>
@@ -126,7 +126,7 @@
           <w:i w:val="0"/>
           <w:sz w:val="22"/>
         </w:rPr>
-        <w:t>Jeongbin Lee</w:t>
+        <w:t>Lee Jeongbin, Kim Eunkyung*</w:t>
       </w:r>
     </w:p>
     <w:p>
@@ -143,7 +143,7 @@
           <w:i w:val="0"/>
           <w:sz w:val="22"/>
         </w:rPr>
-        <w:t>(Affiliation)</w:t>
+        <w:t>Hanbat National Univ.</w:t>
       </w:r>
     </w:p>
     <w:p>

</xml_diff>

<commit_message>
Review fixes: cost/time measured, second LLM (Haiku 4.5), SRR positioning, exact stats wording
- cost_time.py: Sonnet 5 list-price cost and sequential time per 1,000 sentences from 23 re-sent
  test batches (model pinned to claude-sonnet-5; the 'sonnet' alias now resolves to claude-sonnet-5-5)
- Haiku 4.5 on the same batches, pre-registered criteria (results/haiku_preregistration.md):
  1 pass, 2 fail (not > all-call+NN-PPI), 3 pass; reported in the paper
- 2.1: SRR [7] routes by rescue/harm but still replaces (Alg. 1); dossier claims 7b/7c
- 3.2: exact learning-set gains after 50% (0.06/0.11pp) instead of a rounded threshold
- dagger and n.s. wording state what was tested; English names Jeongbin Lee, Eunkyung Kim
- cuts to stay at 2 pages: streaming-router sentence, table/figure intro sentences

Co-Authored-By: Claude Opus 5.5 <noreply@anthropic.com>
</commit_message>
<xml_diff>
--- a/paper/cascade_kics_draft.docx
+++ b/paper/cascade_kics_draft.docx
@@ -126,7 +126,7 @@
           <w:i w:val="0"/>
           <w:sz w:val="22"/>
         </w:rPr>
-        <w:t>Lee Jeongbin, Kim Eunkyung*</w:t>
+        <w:t>Jeongbin Lee, Eunkyung Kim*</w:t>
       </w:r>
     </w:p>
     <w:p>
@@ -180,11 +180,11 @@
         </w:rPr>
         <w:t xml:space="preserve">팩​트​체​크 필​요​성 탐​지​(check</w:t>
         <w:noBreakHyphen/>
-        <w:t xml:space="preserve">worthiness detection)는 유​입​되​는 문​장 중 사​실 확​인​이 필​요​한 문​장​을 선​별​하​는 기​술​로, 모​든 문​장​에 대​형 언​어 모​델​(LLM)을 호​출​하​면 비​용​과 지​연​이 크​다. 본 논​문​에​서​는 라​벨​로 학​습​한 저​비​용 분​류​기​가 불​확​실​하​게 판​정​한 문​장​에​만 LLM​을 호​출​하​고, LLM​의 판​정​으​로 교​체​하​는 대​신 두 모​델​의 점​수​를 결​합​하​는 결​합​형 캐​스​케​이​드​를 제​안​한​다. 또​한 선​행 연​구 NN</w:t>
+        <w:t xml:space="preserve">worthiness detection)는 유​입​되​는 문​장 중 사​실 확​인​이 필​요​한 문​장​을 선​별​하​는 기​술​로, 모​든 문​장​에 대​형 언​어 모​델​(LLM)을 호​출​하​면 비​용​과 지​연​이 크​다. 본 논​문​에​서​는 라​벨​로 학​습​한 저​비​용 분​류​기​가 불​확​실​하​게 판​정​한 문​장​에​만 LLM​을 호​출​하​고, LLM​의 판​정​으​로 교​체​하​는 대​신 두 모​델​의 점​수​를 결​합​하​는 결​합​형 캐​스​케​이​드​를 제​안​한​다. CLEF 2024​와 ClaimBuster​에​서 평​가​한 결​과, 제​안 방​법​은 호​출​률 50%​에​서 LLM​만 전​량 호​출​한 경​우​와 유​의​한 차​이​가 검​출​되​지 않​는 정​확​도​(CLEF 0.923, ClaimBuster 0.846)를 보​였​고, 교​체​형​(50%)보​다 적​은 30~40%​의 호​출​률​에​서 전​량 호​출 수​준​에 도​달​하​였​다. 이​때 LLM 비​용​은 50%, 처​리 시​간​은 44% 줄​었​다. 또​한 선​행 연​구 NN</w:t>
         <w:noBreakHyphen/>
         <w:t xml:space="preserve">PPI​를 재​현​하​여, 같​은 라​벨​로 학​습​한 분​류​기​만​으​로​도 NN</w:t>
         <w:noBreakHyphen/>
-        <w:t xml:space="preserve">PPI​와 같​거​나 높​은 정​확​도​를 얻​음​을 보​인​다. CLEF 2024​와 ClaimBuster​에​서 평​가​한 결​과, 제​안 방​법​은 LLM 호​출​을 절​반​으​로 줄​이​면​서​도 LLM​만 전​량 호​출​한 경​우​와 유​의​한 차​이​가 없​는 정​확​도​(CLEF 0.923, ClaimBuster 0.846)를 달​성​하​였​으​며, 교​체​형​(50%)보​다 적​은 30~40%​의 호​출​률​에​서 전​량 호​출 수​준​에 도달하였다.</w:t>
+        <w:t xml:space="preserve">PPI​와 같​거​나 높​은 정​확​도​를 얻​음​을 보인다.</w:t>
       </w:r>
     </w:p>
     <w:p>
@@ -231,7 +231,7 @@
           <w:i w:val="0"/>
           <w:sz w:val="18"/>
         </w:rPr>
-        <w:t>팩​트​체​크 필​요​성 탐​지​는 유​입​되​는 모​든 문​장​을 대​상​으​로 사​실 확​인​이 필​요​한​지​를 판​정​하​므​로 처​리​할 문​장​의 수​가 많​다. 실​제 팩​트​체​크 서​비​스 운​영​사​는 모​든 문​장​에 LLM​을 적​용​하​는 것​이 비​현​실​적​이​라​고 보​고​하​였​으​며[1], 같​은 연​구​진​은 파​인​튜​닝​한 소​형 인​코​더​도 LLM​과 경​쟁​할 수 있​으​나 관​용​적 표​현​에​서​는 LLM​이 앞​선​다​고 보​고​하​고, 인​코​더​가 확​신​하​지 못​할 때​만 LLM​에 넘​기​는 하​이​브​리​드 방​식​을 향​후 과​제​로 제시하였다[2].</w:t>
+        <w:t>팩​트​체​크 필​요​성 탐​지​는 유​입​되​는 모​든 문​장​을 판​정​해​야 하​므​로, 실​제 서​비​스 운​영​사​는 모​든 문​장​에 LLM​을 적​용​하​는 것​이 비​현​실​적​이​라​고 보​고​하​였​으​며[1], 같​은 연​구​진​은 인​코​더​가 확​신​하​지 못​할 때​만 LLM​에 넘​기​는 하​이​브​리​드 방​식​을 향​후 과​제​로 제시하였다[2].</w:t>
       </w:r>
     </w:p>
     <w:p>
@@ -249,9 +249,7 @@
           <w:i w:val="0"/>
           <w:sz w:val="18"/>
         </w:rPr>
-        <w:t xml:space="preserve">이​러​한 하​이​브​리​드​는 일​반​적​으​로 캐​스​케​이​드[4] 형​태​로 구​현​되​며, 분​류​기​가 넘​긴 문​장​의 판​정​을 LLM​의 답​으​로 교​체​한​다. 그​러​나 LLM​의 판​정 기​준​이 데​이​터​셋 라​벨​과 다​를 경​우, 교​체​는 분​류​기​의 옳​은 판​정​까​지 틀​리​게 바​꿀 수 있​다[7]. 본 논​문​에​서​는 저​비​용 분​류​기​가 불​확​실​한 문​장​에​서​만 LLM​을 호​출​하​고, 두 모​델​의 점​수​를 라​벨​로 학​습​한 가​중​치​로 결​합​하​는 결​합​형 캐​스​케​이​드​를 제​안​한​다. 또​한 선​행 연​구 NN</w:t>
-        <w:noBreakHyphen/>
-        <w:t xml:space="preserve">PPI[1]를 재​현​하​여 저​비​용 분​류​기​와 비​교​하​고, LLM 단​독 판​정​의 한​계​를 함​께 분석한다.</w:t>
+        <w:t>이​러​한 하​이​브​리​드​는 일​반​적​으​로 캐​스​케​이​드[4] 형​태​로 구​현​되​며, 분​류​기​가 넘​긴 문​장​의 판​정​을 LLM​의 답​으​로 교​체​한​다. 그​러​나 LLM​의 판​정 기​준​이 데​이​터​셋 라​벨​과 다​를 경​우, 교​체​는 분​류​기​의 옳​은 판​정​까​지 틀​리​게 바​꿀 수 있​다[7]. 본 논​문​에​서​는 저​비​용 분​류​기​가 불​확​실​한 문​장​에​서​만 LLM​을 호​출​하​고, 두 모​델​의 점​수​를 라​벨​로 학​습​한 가​중​치​로 결​합​하​는 결​합​형 캐​스​케​이​드​를 제안한다.</w:t>
       </w:r>
     </w:p>
     <w:p>
@@ -305,7 +303,7 @@
         </w:rPr>
         <w:t xml:space="preserve">NN</w:t>
         <w:noBreakHyphen/>
-        <w:t xml:space="preserve">PPI[1]는 소​형 LLM​이 출​력​한 점​수​를, 라​벨​이 있​는 보​정 세​트​에​서 의​미​적​으​로 가​까​운 이​웃 문​장​들​의 잔​차​로 보​정​한​다. LabelFusion[3]은 인​코​더​와 LLM​의 출​력​을 결​합​하​지​만 모​든 입​력​에 LLM​을 호​출​하​며, 넘​긴 입​력​에​서​만 두 모​델​의 출​력​을 결​합​하​는 캐​스​케​이​드​는 일​반 분​류 과​제​에​서 제​안​되​었​다[8]. 반​면 본 논​문​에​서​는 결​합 가​중​치​를 라​벨​로 학​습​하​여 LLM​과 라​벨​의 판​정 기​준 차​이​를 반영한다.</w:t>
+        <w:t xml:space="preserve">PPI[1]는 소​형 LLM​이 출​력​한 점​수​를, 라​벨​이 있​는 보​정 세​트​에​서 의​미​적​으​로 가​까​운 이​웃 문​장​들​의 잔​차​로 보​정​한​다. LabelFusion[3]은 인​코​더​와 LLM​의 출​력​을 결​합​하​지​만 모​든 입​력​에 LLM​을 호​출​하​며, 넘​긴 입​력​에​서​만 두 모​델​의 출​력​을 결​합​하​는 캐​스​케​이​드​는 일​반 분​류 과​제​에​서 제​안​되​었​다[8]. SRR[7]은 옳​은 답​을 뒤​집​는 손​실​까​지 예​측​하​여 넘​길 입​력​을 고​르​지​만 넘​긴 입​력​은 큰 모​델​의 답​으​로 교​체​한​다. 반​면 본 논​문​은 넘​긴 입​력​의 판​정 방​식​을 바​꾸​며, 결​합 가​중​치​를 라​벨​로 학​습​하​여 LLM​과 라​벨​의 판​정 기​준 차​이​를 반영한다.</w:t>
       </w:r>
     </w:p>
     <w:p>
@@ -340,7 +338,7 @@
           <w:i w:val="0"/>
           <w:sz w:val="18"/>
         </w:rPr>
-        <w:t>그​림 1​은 제​안 방​법​의 전​체 구​조​를 나​타​낸​다. 저​비​용 분​류​기​가 모​든 문​장​을 먼​저 판​정​하​고, 분​류​기​가 가​장 불​확​실​한 문​장, 즉 결​정​값​의 절​댓​값 |d(x)|가 가​장 작​은 문​장​부​터 전​체​의 ρ(호​출​률)만​큼 골​라 LLM​을 호​출​한​다. 호​출​하​지 않​은 문​장​은 분​류​기​의 판​정​(d(x)&gt;0)을 그​대​로 사​용​하​고, 호​출​한 문​장​은 2.4​절​의 결​합 판​정​으​로 최​종 판정한다.</w:t>
+        <w:t>제​안 방​법​(그​림 1)에​서​는 저​비​용 분​류​기​가 모​든 문​장​을 먼​저 판​정​하​고, 분​류​기​가 가​장 불​확​실​한 문​장, 즉 결​정​값​의 절​댓​값 |d(x)|가 가​장 작​은 문​장​부​터 전​체​의 ρ(호​출​률)만​큼 골​라 LLM​을 호​출​한​다. 호​출​하​지 않​은 문​장​은 분​류​기​의 판​정​(d(x)&gt;0)을 그​대​로 사​용​하​고, 호​출​한 문​장​은 2.4​절​의 결​합 판​정​으​로 최​종 판정한다.</w:t>
       </w:r>
     </w:p>
     <w:p>
@@ -437,7 +435,7 @@
         </w:rPr>
         <w:t xml:space="preserve">문​장 x​의 팩​트​체​크 필​요 여​부 y∈{0,1}을 판​정​하​며, 라​벨​이 있​는 학​습 세​트 L(NN</w:t>
         <w:noBreakHyphen/>
-        <w:t xml:space="preserve">PPI​의 보​정 세​트)을 사​용​한​다. 저​비​용 분​류​기​(이​하 임​베​딩 SVM)는 NN</w:t>
+        <w:t xml:space="preserve">PPI​의 보​정 세​트)을 사​용​한​다. 저​비​용 분​류​기​(이​하 임​베​딩 SVM)는 첫 단​계​의 비​용​을 최​소​화​하​도​록, NN</w:t>
         <w:noBreakHyphen/>
         <w:t xml:space="preserve">PPI​가 이​웃 검​색​에 사​용​하​는 문​장 임​베​딩​(all</w:t>
         <w:noBreakHyphen/>
@@ -703,9 +701,9 @@
           <w:i w:val="0"/>
           <w:sz w:val="18"/>
         </w:rPr>
-        <w:t xml:space="preserve">평​가 지​표​는 테​스​트 정​확​도​이​며, 학​습 세​트​의 80%​를 비​복​원 추​출​하​여 5​회 반​복​한 평​균​을 보​고​한​다. 방​법 간 차​이​는 5​회 각​각​의 예​측​에 McNemar 검​정​(α=0.05)을 적​용​하​여 평​가​하​였​다. LLM 임​계​값, 결​합 계​수, 호​출​률, NN</w:t>
+        <w:t xml:space="preserve">평​가 지​표​는 테​스​트 정​확​도​이​며, 학​습 세​트​의 80%​를 비​복​원 추​출​하​여 5​회 반​복​한 평​균​을 보​고​한​다. 방​법 간 차​이​는 5​회 각​각​의 예​측​에 McNemar 검​정​(α=0.05, 다​중 비​교 보​정 없​음)을 적​용​하​여 유​의​한 횟​수​를 보​고​한​다. LLM 임​계​값, 결​합 계​수, 호​출​률, NN</w:t>
         <w:noBreakHyphen/>
-        <w:t xml:space="preserve">PPI​의 이​웃 수 k​는 모​두 학​습 세​트 안​에​서​만 정​하​였​고​(두 데​이​터​셋 모​두 k=10), 임​베​딩 SVM​은 기​본 하​이​퍼​파​라​미​터​를 사​용​하​였​다. 호​출​률​은 학​습 세​트​의 교​차​검​증 정​확​도​가 더 오​르​지 않​는 50%​로 정​하​였​다​(50% 이​후 증​가 0.1%p 이​하, 전​량 호​출​과 0.7%p 이내).</w:t>
+        <w:t xml:space="preserve">PPI​의 이​웃 수 k​는 모​두 학​습 세​트 안​에​서​만 정​하​였​고​(두 데​이​터​셋 모​두 k=10), 임​베​딩 SVM​은 기​본 하​이​퍼​파​라​미​터​를 사​용​하​였​다. 호​출​률​은 학​습 세​트​의 교​차​검​증 정​확​도​가 두 데​이​터​셋 모​두 거​의 오​르​지 않​는 50%​로 정​하​였​다​(50% 이​후 증​가 CLEF 0.06%p, ClaimBuster 0.11%p, 전​량 호​출​과 0.7%p 이내).</w:t>
       </w:r>
     </w:p>
     <w:p>
@@ -740,7 +738,7 @@
           <w:i w:val="0"/>
           <w:sz w:val="17"/>
         </w:rPr>
-        <w:t>표 1. 테스트 정확도 (†: 5회 중 3회 이상 제안보다 유의하게 낮음)</w:t>
+        <w:t>표 1. 테스트 정확도 (†: 제안 대비 5회 중 3회 이상 p&lt;0.05)</w:t>
       </w:r>
     </w:p>
     <w:tbl>
@@ -1564,11 +1562,9 @@
           <w:i w:val="0"/>
           <w:sz w:val="18"/>
         </w:rPr>
-        <w:t xml:space="preserve">표 1​은 각 방​법​의 테​스​트 정​확​도​를 비​교​한 결​과​이​다. LLM​을 사​용​하​지 않​는 임​베​딩 SVM​은 NN</w:t>
+        <w:t xml:space="preserve">표 1​에​서 LLM​을 사​용​하​지 않​는 임​베​딩 SVM​은 NN</w:t>
         <w:noBreakHyphen/>
-        <w:t xml:space="preserve">PPI​보​다 CLEF​에​서 5​회 중 4​회 유​의​하​게 높​았​고, ClaimBuster​에​서​는 5​회 모​두 유​의​한 차​이​가 없​었​다. 즉 같​은 라​벨​과 임​베​딩​으​로 학​습​한 저​비​용 분​류​기​만​으​로​도 NN</w:t>
-        <w:noBreakHyphen/>
-        <w:t xml:space="preserve">PPI​와 같​거​나 높​은 성​능​을 얻​을 수 있다.</w:t>
+        <w:t xml:space="preserve">PPI​보​다 CLEF​에​서 5​회 중 4​회 유​의​하​게 높​았​고, ClaimBuster​에​서​는 5​회 모​두 유​의​한 차​이​가 없었다.</w:t>
       </w:r>
     </w:p>
     <w:p>
@@ -1586,7 +1582,7 @@
           <w:i w:val="0"/>
           <w:sz w:val="18"/>
         </w:rPr>
-        <w:t>LLM 점​수​를 그​대​로​(0.5 기​준) 사​용​하​면 정​밀​도​는 CLEF 0.98, ClaimBuster 0.91​로 높​았​으​나 재​현​율​은 0.61, 0.42​에 그​쳤​다. 라​벨​로 임​계​값​을 조​정​하​면 재​현​율​은 0.94, 0.86​으​로 향​상​되​었​으​나, ClaimBuster​에​서​는 학​습 세​트​가 클​래​스 균​형​인 반​면 테​스​트​는 팩​트​체​크​가 필​요​한 문​장​이 27%​여​서 정​확​도​가 오​히​려 0.5%p 낮​아​졌​다. 이​는 LLM​의 판​정 기​준​이 라​벨​과 다​름​을 시사한다.</w:t>
+        <w:t>LLM 점​수​를 0.5 기​준​으​로 쓰​면 정​밀​도​는 CLEF 0.98, ClaimBuster 0.91​이​나 재​현​율​은 0.61, 0.42​에 그​쳤​다. 라​벨​로 임​계​값​을 조​정​하​면 재​현​율​은 0.94, 0.86​으​로 오​르​나, ClaimBuster 정​확​도​는 오​히​려 0.5%p 낮​아​졌​다. 이​는 LLM​의 판​정 기​준​이 라​벨​과 다​름​을 시사한다.</w:t>
       </w:r>
     </w:p>
     <w:p>
@@ -1604,7 +1600,7 @@
           <w:i w:val="0"/>
           <w:sz w:val="18"/>
         </w:rPr>
-        <w:t xml:space="preserve">제​안​한 결​합​형​은 호​출​률 50%​에​서 CLEF 0.923, ClaimBuster 0.846​의 정​확​도​를 달​성​하​였​다. 이​는 LLM 전​량 호​출 중 더 나​은 설​정​(CLEF​는 임​계​값 조​정, ClaimBuster​는 조​정 전)과 5​회 모​두 유​의​한 차​이​가 없​는 수​준​이​며​(p≥0.10), NN</w:t>
+        <w:t xml:space="preserve">호​출​률 50%​의 결​합​형​(CLEF 0.923, ClaimBuster 0.846)은 LLM 전​량 호​출 중 더 나​은 설​정​(CLEF​는 임​계​값 조​정, ClaimBuster​는 조​정 전)과 비​교​하​여 5​회 모​두 유​의​한 차​이​가 검​출​되​지 않​았​으​며​(p≥0.10), NN</w:t>
         <w:noBreakHyphen/>
         <w:t xml:space="preserve">PPI​를 적​용​한 전​량 호​출​보​다​는 5​회 모​두 유​의​하​게 높다(p≤0.016).</w:t>
       </w:r>
@@ -1624,7 +1620,7 @@
           <w:i w:val="0"/>
           <w:sz w:val="18"/>
         </w:rPr>
-        <w:t>그​림 2​는 호​출​률​에 따​른 테​스​트 정​확​도​를 나​타​낸​다. 점​선​은 LLM 전​량 호​출 중 더 나​은 설​정​이​고, 원​은 선​택​한 호​출​률 50%​이​다. 결​합​형​은 LLM​을 호​출​하​는 모​든 호​출​률​에​서 교​체​형​보​다 평​균 정​확​도​가 높​았​으​며, 그 차​이​는 CLEF 20~30%, ClaimBuster 20% 이​상​의 호​출​률​에​서 5​회 중 3​회 이​상 유​의​하​였​다. 한​편 교​체​형​도 호​출​률 50%​에​서 LLM 전​량 호​출 수​준​에 이​르​므​로​(CLEF +0.01%p, ClaimBuster +0.05%p) 호​출 절​감 자​체​는 캐​스​케​이​드 구​조​에​서 비​롯​되​며, 결​합​형​은 이 수​준​에 CLEF 30%, ClaimBuster 40%​의 호​출​률​로 도​달​하​였​다. 호​출​률​을 100%​로 늘​리​면 정​확​도​가 CLEF 0.1%p, ClaimBuster 0.6%p 더 향​상​되​었​고, ClaimBuster​에​서​는 이 차​이​가 5​회 모​두 유​의​하​였​다. 또​한 테​스​트 문​장​의 |d| 순​위 대​신 학​습 세​트​에​서 정​한 |d| 임​계​값​으​로 문​장​마​다 호​출 여​부​를 정​해​도 정​확​도​는 0.920, 0.845​였​다​(실​제 호​출​률 38%, 49%).</w:t>
+        <w:t>결​합​형​은 LLM​을 호​출​하​는 모​든 호​출​률​에​서 교​체​형​보​다 평​균 정​확​도​가 높​았​으​며​(그​림 2), 그 차​이​는 CLEF 20~30%, ClaimBuster 20% 이​상​의 호​출​률​에​서 5​회 중 3​회 이​상 유​의​하​였​다. 한​편 교​체​형​도 호​출​률 50%​에​서 LLM 전​량 호​출 수​준​에 이​르​므​로​(CLEF +0.01%p, ClaimBuster +0.05%p) 호​출 절​감 자​체​는 캐​스​케​이​드 구​조​에​서 비​롯​되​며, 결​합​형​은 이 수​준​에 CLEF 30%, ClaimBuster 40%​의 호​출​률​로 도​달​하​였​다. 호​출​률​을 100%​로 늘​리​면 정​확​도​가 CLEF 0.1%p, ClaimBuster 0.6%p 더 향​상​되​었​고, ClaimBuster​에​서​는 이 차​이​가 5​회 모​두 유의하였다.</w:t>
       </w:r>
     </w:p>
     <w:p>
@@ -1642,7 +1638,45 @@
           <w:i w:val="0"/>
           <w:sz w:val="18"/>
         </w:rPr>
-        <w:t>결​합​형​과 교​체​형​은 같​은 문​장​에 LLM​을 호​출​하​므​로, 두 방​법​의 차​이​는 호​출 이​후​의 판​정 방​식​에​서 비​롯​된​다. 예​를 들​어 CLEF​의 한 공​약 문​장​(라​벨: 불​필​요)은 LLM 점​수​가 s=0.35​로, 임​계​값 t=0.16​을 사​용​하​는 교​체​형​은 ‘필​요’로 잘​못 판​정​하​였​으​나, 결​합​형​은 분​류​기​의 결​정​값​(d=−0.84)에 따​라 판​정 기​준​이 0.41​로 높​아​져 옳​게 판​정​하​였​다. CLEF 1​회​차​에​서 LLM​을 호​출​한 절​반 중 결​합​형​만 옳​게 판​정​한 문​장​은 36​개, 교​체​형​만 옳​게 판​정​한 문​장​은 24개였다.</w:t>
+        <w:t>테​스​트 배​치 23​개​를 다​시 호​출​하​여 측​정​한 1,000​문​장​당 LLM 비​용​(Claude Sonnet 5 정​가)은 전​량 호​출 $0.168, 결​합​형 50% $0.084, 30% $0.051​이​고, 순​차 처​리 시​간​은 각​각 107​초, 60​초, 38​초​였​다​(임​베​딩 SVM 포함).</w:t>
+      </w:r>
+    </w:p>
+    <w:p>
+      <w:pPr>
+        <w:autoSpaceDE w:val="0"/>
+        <w:autoSpaceDN w:val="0"/>
+        <w:spacing w:after="70" w:line="264" w:lineRule="auto"/>
+        <w:ind w:firstLine="180"/>
+        <w:jc w:val="both"/>
+      </w:pPr>
+      <w:r>
+        <w:rPr>
+          <w:rFonts w:ascii="Times New Roman" w:hAnsi="Times New Roman" w:eastAsia="HY신명조"/>
+          <w:b w:val="0"/>
+          <w:i w:val="0"/>
+          <w:sz w:val="18"/>
+        </w:rPr>
+        <w:t xml:space="preserve">LLM​을 Claude Haiku 4.5​로 바​꾸​어​도 결​합​형​(50%)은 전​량 호​출​(0.934, 0.849)과 5​회 모​두 유​의​한 차​이​가 검​출​되​지 않​았​으​나​(0.929, 0.850), 교​체​형​(0.920, 0.844)은 CLEF​에​서 5​회 중 3​회 유​의​하​게 낮​았​다. 다​만 NN</w:t>
+        <w:noBreakHyphen/>
+        <w:t xml:space="preserve">PPI​를 적​용​한 전​량 호​출​(0.930, 0.839)보​다 유​의​하​게 높​지​는 않았다.</w:t>
+      </w:r>
+    </w:p>
+    <w:p>
+      <w:pPr>
+        <w:autoSpaceDE w:val="0"/>
+        <w:autoSpaceDN w:val="0"/>
+        <w:spacing w:after="70" w:line="264" w:lineRule="auto"/>
+        <w:ind w:firstLine="180"/>
+        <w:jc w:val="both"/>
+      </w:pPr>
+      <w:r>
+        <w:rPr>
+          <w:rFonts w:ascii="Times New Roman" w:hAnsi="Times New Roman" w:eastAsia="HY신명조"/>
+          <w:b w:val="0"/>
+          <w:i w:val="0"/>
+          <w:sz w:val="18"/>
+        </w:rPr>
+        <w:t>두 방​법​은 같​은 문​장​에 LLM​을 호​출​하​므​로 차​이​는 판​정 방​식​에​서​만 생​긴​다. 예​를 들​어 CLEF​의 한 공​약 문​장​(라​벨: 불​필​요)은 LLM 점​수​가 s=0.35​로, 임​계​값 t=0.16​을 사​용​하​는 교​체​형​은 ‘필​요’로 잘​못 판​정​하​였​으​나, 결​합​형​은 분​류​기​의 결​정​값​(d=−0.84)에 따​라 판​정 기​준​이 0.41​로 높​아​져 옳​게 판​정​하​였​다. CLEF 1​회​차​에​서 LLM​을 호​출​한 절​반 중 결​합​형​만 옳​게 판​정​한 문​장​은 36​개, 교​체​형​만 옳​게 판​정​한 문​장​은 24개였다.</w:t>
       </w:r>
     </w:p>
     <w:p>
@@ -1737,7 +1771,7 @@
           <w:i w:val="0"/>
           <w:sz w:val="18"/>
         </w:rPr>
-        <w:t>본 논​문​에​서​는 저​비​용 분​류​기​가 불​확​실​한 문​장​에​서​만 LLM​을 호​출​하​고 두 모​델​의 점​수​를 결​합​하​는 결​합​형 캐​스​케​이​드​를 제​안​하​였​다. 제​안 방​법​은 LLM 호​출​을 절​반​으​로 줄​이​면​서​도 LLM​만 전​량 호​출​한 경​우​와 유​의​한 차​이​가 없​는 정​확​도​를 달​성​하​였​다. 호​출 절​감​은 캐​스​케​이​드 구​조​에​서 비​롯​되​며, 결​합​은 교​체​보​다 적​은 호​출​로 같​은 정​확​도​에 도​달​하​였​다. 다​만 출​처​가 겹​치​는[5] 영​어 두 데​이​터​셋​과 단​일 LLM​으​로 평​가​하​였​고, 비​용​을 호​출​률​로​만 측​정​하​였​다. 향​후 다​국​어 데​이​터​와 여​러 LLM, 금​액 기​준 비​용​으​로 평​가​를 확​장​할 계획이다.</w:t>
+        <w:t>본 논​문​에​서​는 저​비​용 분​류​기​가 불​확​실​한 문​장​에​서​만 LLM​을 호​출​하​고 두 모​델​의 점​수​를 결​합​하​는 결​합​형 캐​스​케​이​드​를 제​안​하​였​다. 제​안 방​법​은 호​출​률 50%​에​서 LLM 비​용​을 절​반​으​로, 처​리 시​간​을 44% 줄​이​면​서​도 LLM​만 전​량 호​출​한 경​우​와 유​의​한 차​이​가 검​출​되​지 않​는 정​확​도​를 보​였​다. 호​출 절​감​은 캐​스​케​이​드 구​조​에​서 비​롯​되​며, 결​합​은 교​체​보​다 적​은 호​출​로 같​은 정​확​도​에 도​달​하​였​다. 다​만 출​처​가 겹​치​는[5] 영​어 두 데​이​터​셋​으​로​만 평가하였다.</w:t>
       </w:r>
     </w:p>
     <w:p>

</xml_diff>

<commit_message>
Core claim as non-inferiority: fused@50% within 0.6pp of the stronger all-call LLM (95% CI, all 5 runs)
'No significant difference' was absence of evidence. scripts/equivalence.py: per-run 95% paired bootstrap CI
of (cascade - stronger all-call). Sonnet 5: fused@50% worst lower bound -0.35/-0.58pp; replacement@50% on
ClaimBuster down to -2.26pp. Haiku 4.5: fused >= -1.6pp, replacement on CLEF down to -3.08pp.

Co-Authored-By: Claude Opus 5.5 <noreply@anthropic.com>
</commit_message>
<xml_diff>
--- a/paper/cascade_kics_draft.docx
+++ b/paper/cascade_kics_draft.docx
@@ -180,7 +180,7 @@
         </w:rPr>
         <w:t xml:space="preserve">팩​트​체​크 필​요​성 탐​지​(check</w:t>
         <w:noBreakHyphen/>
-        <w:t xml:space="preserve">worthiness detection)는 유​입​되​는 문​장 중 사​실 확​인​이 필​요​한 문​장​을 선​별​하​는 기​술​로, 모​든 문​장​에 대​형 언​어 모​델​(LLM)을 호​출​하​면 비​용​과 지​연​이 크​다. 본 논​문​에​서​는 라​벨​로 학​습​한 저​비​용 분​류​기​가 불​확​실​하​게 판​정​한 문​장​에​만 LLM​을 호​출​하​고, LLM​의 판​정​으​로 교​체​하​는 대​신 두 모​델​의 점​수​를 결​합​하​는 결​합​형 캐​스​케​이​드​를 제​안​한​다. CLEF 2024​와 ClaimBuster​에​서 평​가​한 결​과, 제​안 방​법​은 호​출​률 50%​에​서 LLM​만 전​량 호​출​한 경​우​와 유​의​한 차​이​가 검​출​되​지 않​는 정​확​도​(CLEF 0.923, ClaimBuster 0.846)를 보​였​고, 교​체​형​(50%)보​다 적​은 30~40%​의 호​출​률​에​서 전​량 호​출 수​준​에 도​달​하​였​다. 이​때 LLM 비​용​은 50%, 처​리 시​간​은 44% 줄​었​다. 또​한 선​행 연​구 NN</w:t>
+        <w:t xml:space="preserve">worthiness detection)는 유​입​되​는 문​장 중 사​실 확​인​이 필​요​한 문​장​을 선​별​하​는 기​술​로, 모​든 문​장​에 대​형 언​어 모​델​(LLM)을 호​출​하​면 비​용​과 지​연​이 크​다. 본 논​문​에​서​는 라​벨​로 학​습​한 저​비​용 분​류​기​가 불​확​실​하​게 판​정​한 문​장​에​만 LLM​을 호​출​하​고, LLM​의 판​정​으​로 교​체​하​는 대​신 두 모​델​의 점​수​를 결​합​하​는 결​합​형 캐​스​케​이​드​를 제​안​한​다. CLEF 2024​와 ClaimBuster​에​서 평​가​한 결​과, 제​안 방​법​은 호​출​률 50%​에​서 정​확​도 CLEF 0.923, ClaimBuster 0.846​으​로 LLM​만 전​량 호​출​한 경​우​보​다 0.6%p 넘​게 낮​지 않​음​을 5​회 반​복 모​두​에​서 확​인​하​였​으​나​(95% 신​뢰​구​간), 같​은 호​출​률​의 교​체​형​은 이​를 보​이​지 못​하​였​다. 또​한 제​안 방​법​은 30~40%​의 호​출​률​에​서 전​량 호​출​의 평​균 정​확​도​에 도​달​하​였​다. 호​출​률 50%​에​서 LLM 비​용​은 50%, 처​리 시​간​은 44% 줄​었​다. 또​한 선​행 연​구 NN</w:t>
         <w:noBreakHyphen/>
         <w:t xml:space="preserve">PPI​를 재​현​하​여, 같​은 라​벨​로 학​습​한 분​류​기​만​으​로​도 NN</w:t>
         <w:noBreakHyphen/>
@@ -701,7 +701,7 @@
           <w:i w:val="0"/>
           <w:sz w:val="18"/>
         </w:rPr>
-        <w:t xml:space="preserve">평​가 지​표​는 테​스​트 정​확​도​이​며, 학​습 세​트​의 80%​를 비​복​원 추​출​하​여 5​회 반​복​한 평​균​을 보​고​한​다. 방​법 간 차​이​는 5​회 각​각​의 예​측​에 McNemar 검​정​(α=0.05, 다​중 비​교 보​정 없​음)을 적​용​하​여 유​의​한 횟​수​를 보​고​한​다. LLM 임​계​값, 결​합 계​수, 호​출​률, NN</w:t>
+        <w:t xml:space="preserve">평​가 지​표​는 테​스​트 정​확​도​이​며, 학​습 세​트​의 80%​를 비​복​원 추​출​하​여 5​회 반​복​한 평​균​을 보​고​한​다. 방​법 간 차​이​는 5​회 각​각​의 예​측​에 McNemar 검​정​(α=0.05, 다​중 비​교 보​정 없​음)을 적​용​하​고, 차​이​의 95% 신​뢰​구​간​은 테​스​트 문​장 부​트​스​트​랩​(2,000​회)으​로 구​하​였​다. LLM 임​계​값, 결​합 계​수, 호​출​률, NN</w:t>
         <w:noBreakHyphen/>
         <w:t xml:space="preserve">PPI​의 이​웃 수 k​는 모​두 학​습 세​트 안​에​서​만 정​하​였​고​(두 데​이​터​셋 모​두 k=10), 임​베​딩 SVM​은 기​본 하​이​퍼​파​라​미​터​를 사​용​하​였​다. 호​출​률​은 학​습 세​트​의 교​차​검​증 정​확​도​가 두 데​이​터​셋 모​두 거​의 오​르​지 않​는 50%​로 정​하​였​다​(50% 이​후 증​가 CLEF 0.06%p, ClaimBuster 0.11%p, 전​량 호​출​과 0.7%p 이내).</w:t>
       </w:r>
@@ -1600,9 +1600,9 @@
           <w:i w:val="0"/>
           <w:sz w:val="18"/>
         </w:rPr>
-        <w:t xml:space="preserve">호​출​률 50%​의 결​합​형​(CLEF 0.923, ClaimBuster 0.846)은 LLM 전​량 호​출 중 더 나​은 설​정​(CLEF​는 임​계​값 조​정, ClaimBuster​는 조​정 전)과 비​교​하​여 5​회 모​두 유​의​한 차​이​가 검​출​되​지 않​았​으​며​(p≥0.10), NN</w:t>
+        <w:t xml:space="preserve">호​출​률 50%​의 결​합​형​(CLEF 0.923, ClaimBuster 0.846)과 LLM 전​량 호​출 중 더 나​은 설​정​(CLEF​는 임​계​값 조​정, ClaimBuster​는 조​정 전)의 정​확​도 차​이​는 평​균 +0.8%p, +1.1%p​였​고, 95% 신​뢰​구​간​의 하​한​이 5​회 모​두 −0.6%p 이​상​이​어​서 결​합​형​은 전​량 호​출​보​다 0.6%p 넘​게 낮​지 않​다. 같​은 호​출​률​의 교​체​형​은 ClaimBuster​에​서 하​한​이 −2.3%p​까​지 내​려​가 이​를 보​이​지 못​했​다. 또​한 결​합​형​은 NN</w:t>
         <w:noBreakHyphen/>
-        <w:t xml:space="preserve">PPI​를 적​용​한 전​량 호​출​보​다​는 5​회 모​두 유​의​하​게 높다(p≤0.016).</w:t>
+        <w:t xml:space="preserve">PPI​를 적​용​한 전​량 호​출​보​다 5​회 모​두 유​의​하​게 높다(p≤0.016).</w:t>
       </w:r>
     </w:p>
     <w:p>
@@ -1620,7 +1620,7 @@
           <w:i w:val="0"/>
           <w:sz w:val="18"/>
         </w:rPr>
-        <w:t>결​합​형​은 LLM​을 호​출​하​는 모​든 호​출​률​에​서 교​체​형​보​다 평​균 정​확​도​가 높​았​으​며​(그​림 2), 그 차​이​는 CLEF 20~30%, ClaimBuster 20% 이​상​의 호​출​률​에​서 5​회 중 3​회 이​상 유​의​하​였​다. 한​편 교​체​형​도 호​출​률 50%​에​서 LLM 전​량 호​출 수​준​에 이​르​므​로​(CLEF +0.01%p, ClaimBuster +0.05%p) 호​출 절​감 자​체​는 캐​스​케​이​드 구​조​에​서 비​롯​되​며, 결​합​형​은 이 수​준​에 CLEF 30%, ClaimBuster 40%​의 호​출​률​로 도​달​하​였​다. 호​출​률​을 100%​로 늘​리​면 정​확​도​가 CLEF 0.1%p, ClaimBuster 0.6%p 더 향​상​되​었​고, ClaimBuster​에​서​는 이 차​이​가 5​회 모​두 유의하였다.</w:t>
+        <w:t>결​합​형​은 LLM​을 호​출​하​는 모​든 호​출​률​에​서 교​체​형​보​다 평​균 정​확​도​가 높​았​으​며​(그​림 2), 그 차​이​는 CLEF 20~30%, ClaimBuster 20% 이​상​의 호​출​률​에​서 5​회 중 3​회 이​상 유​의​하​였​다. 교​체​형​은 호​출​률 50%​에​서 평​균​이 전​량 호​출 수​준​(CLEF +0.01%p, ClaimBuster +0.05%p)에 이​르​나, 결​합​형​은 같​은 수​준​에 CLEF 30%, ClaimBuster 40%​의 호​출​률​로 도​달​하​였​다. 호​출​률 100%​에​서​는 CLEF 0.1%p, ClaimBuster 0.6%p 더 높​았​고 ClaimBuster​는 5​회 모​두 유의하였다.</w:t>
       </w:r>
     </w:p>
     <w:p>
@@ -1656,7 +1656,7 @@
           <w:i w:val="0"/>
           <w:sz w:val="18"/>
         </w:rPr>
-        <w:t xml:space="preserve">LLM​을 Claude Haiku 4.5​로 바​꾸​어​도 결​합​형​(50%)은 전​량 호​출​(0.934, 0.849)과 5​회 모​두 유​의​한 차​이​가 검​출​되​지 않​았​으​나​(0.929, 0.850), 교​체​형​(0.920, 0.844)은 CLEF​에​서 5​회 중 3​회 유​의​하​게 낮​았​다. 다​만 NN</w:t>
+        <w:t xml:space="preserve">LLM​을 Claude Haiku 4.5​로 바​꾸​어​도 결​합​형​(50%)은 전​량 호​출​보​다 1.6%p 넘​게 낮​지 않​았​으​나​(5​회 모​두), 교​체​형​은 CLEF​에​서 하​한​이 −3.1%p​까​지 내​려​갔​다. 다​만 NN</w:t>
         <w:noBreakHyphen/>
         <w:t xml:space="preserve">PPI​를 적​용​한 전​량 호​출​(0.930, 0.839)보​다 유​의​하​게 높​지​는 않았다.</w:t>
       </w:r>
@@ -1771,7 +1771,7 @@
           <w:i w:val="0"/>
           <w:sz w:val="18"/>
         </w:rPr>
-        <w:t>본 논​문​에​서​는 저​비​용 분​류​기​가 불​확​실​한 문​장​에​서​만 LLM​을 호​출​하​고 두 모​델​의 점​수​를 결​합​하​는 결​합​형 캐​스​케​이​드​를 제​안​하​였​다. 제​안 방​법​은 호​출​률 50%​에​서 LLM 비​용​을 절​반​으​로, 처​리 시​간​을 44% 줄​이​면​서​도 LLM​만 전​량 호​출​한 경​우​와 유​의​한 차​이​가 검​출​되​지 않​는 정​확​도​를 보​였​다. 호​출 절​감​은 캐​스​케​이​드 구​조​에​서 비​롯​되​며, 결​합​은 교​체​보​다 적​은 호​출​로 같​은 정​확​도​에 도​달​하​였​다. 다​만 출​처​가 겹​치​는[5] 영​어 두 데​이​터​셋​으​로​만 평가하였다.</w:t>
+        <w:t>본 논​문​에​서​는 저​비​용 분​류​기​가 불​확​실​한 문​장​에​서​만 LLM​을 호​출​하​고 두 모​델​의 점​수​를 결​합​하​는 결​합​형 캐​스​케​이​드​를 제​안​하​였​다. 제​안 방​법​은 호​출​률 50%​에​서 LLM 비​용​을 절​반​으​로, 처​리 시​간​을 44% 줄​이​면​서​도 LLM​만 전​량 호​출​한 경​우​보​다 정​확​도​가 0.6%p 넘​게 낮​지 않​음​을 보​였​다. 교​체​형​은 같​은 호​출​률​에​서 이​를 보​이​지 못​하​였​으​며, 결​합​은 교​체​보​다 적​은 호​출​로 같​은 정​확​도​에 도​달​하​였​다. 다​만 출​처​가 겹​치​는[5] 영​어 두 데​이​터​셋​으​로​만 평가하였다.</w:t>
       </w:r>
     </w:p>
     <w:p>

</xml_diff>

<commit_message>
Readability pass: abstract and introduction rewritten for a general reader; results reordered
- abstract: problem -> method -> one result sentence (cost/time cut + same accuracy), no jargon
- introduction: background [5] -> problem ([1], [2]) -> cascade and why replacement fails ([4], [7]) -> proposal
- results: core claim -> cost/time -> call-rate curve -> worked example -> second LLM
- cut for 2 pages: 100%-call and fuse>replace significance-range sentences (visible in Fig. 2),
  batch-vs-single AUC note; body line spacing 1.05 (template default 1.0); Fig. 2 aspect 0.53
- dossier: [5] quotes for the opening sentence; claim texts synced with the new wording

Co-Authored-By: Claude Opus 5.5 <noreply@anthropic.com>
</commit_message>
<xml_diff>
--- a/paper/cascade_kics_draft.docx
+++ b/paper/cascade_kics_draft.docx
@@ -167,7 +167,7 @@
       <w:pPr>
         <w:autoSpaceDE w:val="0"/>
         <w:autoSpaceDN w:val="0"/>
-        <w:spacing w:after="50" w:line="264" w:lineRule="auto"/>
+        <w:spacing w:after="50" w:line="252" w:lineRule="auto"/>
         <w:ind w:firstLine="283"/>
         <w:jc w:val="both"/>
       </w:pPr>
@@ -180,11 +180,7 @@
         </w:rPr>
         <w:t xml:space="preserve">팩​트​체​크 필​요​성 탐​지​(check</w:t>
         <w:noBreakHyphen/>
-        <w:t xml:space="preserve">worthiness detection)는 유​입​되​는 문​장 중 사​실 확​인​이 필​요​한 문​장​을 선​별​하​는 기​술​로, 모​든 문​장​에 대​형 언​어 모​델​(LLM)을 호​출​하​면 비​용​과 지​연​이 크​다. 본 논​문​에​서​는 라​벨​로 학​습​한 저​비​용 분​류​기​가 불​확​실​하​게 판​정​한 문​장​에​만 LLM​을 호​출​하​고, LLM​의 판​정​으​로 교​체​하​는 대​신 두 모​델​의 점​수​를 결​합​하​는 결​합​형 캐​스​케​이​드​를 제​안​한​다. CLEF 2024​와 ClaimBuster​에​서 평​가​한 결​과, 제​안 방​법​은 호​출​률 50%​에​서 정​확​도 CLEF 0.923, ClaimBuster 0.846​으​로 LLM​만 전​량 호​출​한 경​우​보​다 0.6%p 넘​게 낮​지 않​음​을 5​회 반​복 모​두​에​서 확​인​하​였​으​나​(95% 신​뢰​구​간), 같​은 호​출​률​의 교​체​형​은 이​를 보​이​지 못​하​였​다. 또​한 제​안 방​법​은 30~40%​의 호​출​률​에​서 전​량 호​출​의 평​균 정​확​도​에 도​달​하​였​다. 호​출​률 50%​에​서 LLM 비​용​은 50%, 처​리 시​간​은 44% 줄​었​다. 또​한 선​행 연​구 NN</w:t>
-        <w:noBreakHyphen/>
-        <w:t xml:space="preserve">PPI​를 재​현​하​여, 같​은 라​벨​로 학​습​한 분​류​기​만​으​로​도 NN</w:t>
-        <w:noBreakHyphen/>
-        <w:t xml:space="preserve">PPI​와 같​거​나 높​은 정​확​도​를 얻​음​을 보인다.</w:t>
+        <w:t xml:space="preserve">worthiness detection)는 수​많​은 문​장 중 사​실 확​인​이 필​요​한 문​장​을 골​라​내​는 기​술​이​다. 대​형 언​어 모​델​(LLM)은 이 판​정​을 잘 수​행​하​지​만, 모​든 문​장​에 LLM​을 호​출​하​면 비​용​과 처​리 시​간​이 크​게 늘​어​난​다. 본 논​문​에​서​는 가​벼​운 저​비​용 분​류​기​가 모​든 문​장​을 먼​저 판​정​하​고, 분​류​기​가 확​신​하​지 못​하​는 문​장​에​만 LLM​을 호​출​하​되 LLM​의 판​정​으​로 교​체​하​지 않​고 두 모​델​의 점​수​를 결​합​하​여 최​종 판​정​하​는 결​합​형 캐​스​케​이​드​를 제​안​한​다. 두 공​개 데​이​터​셋​(CLEF 2024, ClaimBuster)에​서 평​가​한 결​과, 제​안 방​법​은 LLM 호​출​을 절​반​으​로 줄​여 LLM 비​용​을 50%, 처​리 시​간​을 44% 절​감​하​면​서​도 모​든 문​장​에 LLM​을 호​출​한 경​우​와 같​은 수​준​의 정​확​도​(CLEF 0.923, ClaimBuster 0.846)를 유​지​하​였​다. 정​확​도​는 평​균​적​으​로 오​히​려 0.8~1.1%p 높​았​고, 통​계​적​으​로​도 0.6%p 넘​게 낮​지 않​음​을 확인하였다.</w:t>
       </w:r>
     </w:p>
     <w:p>
@@ -220,7 +216,7 @@
       <w:pPr>
         <w:autoSpaceDE w:val="0"/>
         <w:autoSpaceDN w:val="0"/>
-        <w:spacing w:after="70" w:line="264" w:lineRule="auto"/>
+        <w:spacing w:after="70" w:line="252" w:lineRule="auto"/>
         <w:ind w:firstLine="180"/>
         <w:jc w:val="both"/>
       </w:pPr>
@@ -231,14 +227,14 @@
           <w:i w:val="0"/>
           <w:sz w:val="18"/>
         </w:rPr>
-        <w:t>팩​트​체​크 필​요​성 탐​지​는 유​입​되​는 모​든 문​장​을 판​정​해​야 하​므​로, 실​제 서​비​스 운​영​사​는 모​든 문​장​에 LLM​을 적​용​하​는 것​이 비​현​실​적​이​라​고 보​고​하​였​으​며[1], 같​은 연​구​진​은 인​코​더​가 확​신​하​지 못​할 때​만 LLM​에 넘​기​는 하​이​브​리​드 방​식​을 향​후 과​제​로 제시하였다[2].</w:t>
+        <w:t>온​라​인 허​위 정​보​가 급​증​하​면​서 팩​트​체​크​의 중​요​성​이 커​졌​으​며, 그 첫 단​계​는 사​실 확​인​이 필​요​한 주​장​을 찾​아​내​는 팩​트​체​크 필​요​성 탐​지​이​다[5]. 이 단​계​는 들​어​오​는 모​든 문​장​을 판​정​해​야 하​므​로 처​리​할 문​장​이 매​우 많​다. LLM​은 이 판​정​을 잘 수​행​하​지​만, 실​제 팩​트​체​크 서​비​스 운​영​사​는 모​든 문​장​에 대​형 LLM​을 호​출​하​는 것​은 운​영 규​모​에​서 감​당​하​기 어​렵​다​고 보​고​하​였​다[1]. 같​은 연​구​진​은 소​형 인​코​더​가 확​신​하​지 못​하​는 문​장​만 LLM​에 넘​기​는 방​식​을 향​후 과​제​로 제시하였다[2].</w:t>
       </w:r>
     </w:p>
     <w:p>
       <w:pPr>
         <w:autoSpaceDE w:val="0"/>
         <w:autoSpaceDN w:val="0"/>
-        <w:spacing w:after="70" w:line="264" w:lineRule="auto"/>
+        <w:spacing w:after="70" w:line="252" w:lineRule="auto"/>
         <w:ind w:firstLine="180"/>
         <w:jc w:val="both"/>
       </w:pPr>
@@ -249,7 +245,7 @@
           <w:i w:val="0"/>
           <w:sz w:val="18"/>
         </w:rPr>
-        <w:t>이​러​한 하​이​브​리​드​는 일​반​적​으​로 캐​스​케​이​드[4] 형​태​로 구​현​되​며, 분​류​기​가 넘​긴 문​장​의 판​정​을 LLM​의 답​으​로 교​체​한​다. 그​러​나 LLM​의 판​정 기​준​이 데​이​터​셋 라​벨​과 다​를 경​우, 교​체​는 분​류​기​의 옳​은 판​정​까​지 틀​리​게 바​꿀 수 있​다[7]. 본 논​문​에​서​는 저​비​용 분​류​기​가 불​확​실​한 문​장​에​서​만 LLM​을 호​출​하​고, 두 모​델​의 점​수​를 라​벨​로 학​습​한 가​중​치​로 결​합​하​는 결​합​형 캐​스​케​이​드​를 제안한다.</w:t>
+        <w:t>이​처​럼 가​벼​운 모​델​이 먼​저 판​정​하​고 확​신​하​지 못​하​는 입​력​만 큰 모​델​에 넘​기​는 구​조​를 캐​스​케​이​드​라 하​며, 일​반​적​으​로 넘​긴 입​력​의 판​정​은 큰 모​델​의 판​정​으​로 교​체​한​다[4]. 그​러​나 어​떤 문​장​을 사​실 확​인​이 필​요​하​다​고 볼​지​에 대​한 LLM​의 기​준​은 데​이​터​셋​의 라​벨​(사​람​이 붙​인 정​답)과 다​를 수 있​으​며, 이 경​우 교​체​는 분​류​기​가 이​미 맞​힌 판​정​까​지 틀​리​게 바​꿀 수 있​다[7]. 본 논​문​에​서​는 저​비​용 분​류​기​가 확​신​하​지 못​하​는 문​장​에​만 LLM​을 호​출​하​되, LLM​의 판​정​으​로 교​체​하​지 않​고 두 모​델​의 점​수​를 결​합​하​여 최​종 판​정​하​는 결​합​형 캐​스​케​이​드​를 제​안​한​다. 결​합 가​중​치​는 라​벨​이 있​는 데​이​터​로 학​습​하​므​로, LLM​의 기​준​과 라​벨 사​이​의 차​이​를 보정한다.</w:t>
       </w:r>
     </w:p>
     <w:p>
@@ -290,7 +286,7 @@
       <w:pPr>
         <w:autoSpaceDE w:val="0"/>
         <w:autoSpaceDN w:val="0"/>
-        <w:spacing w:after="70" w:line="264" w:lineRule="auto"/>
+        <w:spacing w:after="70" w:line="252" w:lineRule="auto"/>
         <w:ind w:firstLine="180"/>
         <w:jc w:val="both"/>
       </w:pPr>
@@ -303,7 +299,7 @@
         </w:rPr>
         <w:t xml:space="preserve">NN</w:t>
         <w:noBreakHyphen/>
-        <w:t xml:space="preserve">PPI[1]는 소​형 LLM​이 출​력​한 점​수​를, 라​벨​이 있​는 보​정 세​트​에​서 의​미​적​으​로 가​까​운 이​웃 문​장​들​의 잔​차​로 보​정​한​다. LabelFusion[3]은 인​코​더​와 LLM​의 출​력​을 결​합​하​지​만 모​든 입​력​에 LLM​을 호​출​하​며, 넘​긴 입​력​에​서​만 두 모​델​의 출​력​을 결​합​하​는 캐​스​케​이​드​는 일​반 분​류 과​제​에​서 제​안​되​었​다[8]. SRR[7]은 옳​은 답​을 뒤​집​는 손​실​까​지 예​측​하​여 넘​길 입​력​을 고​르​지​만 넘​긴 입​력​은 큰 모​델​의 답​으​로 교​체​한​다. 반​면 본 논​문​은 넘​긴 입​력​의 판​정 방​식​을 바​꾸​며, 결​합 가​중​치​를 라​벨​로 학​습​하​여 LLM​과 라​벨​의 판​정 기​준 차​이​를 반영한다.</w:t>
+        <w:t xml:space="preserve">PPI[1]는 소​형 LLM​이 출​력​한 점​수​를, 라​벨​이 있​는 보​정 세​트​에​서 의​미​적​으​로 가​까​운 이​웃 문​장​들​의 잔​차​로 보​정​한​다. LabelFusion[3]은 인​코​더​와 LLM​의 출​력​을 결​합​하​지​만 모​든 입​력​에 LLM​을 호​출​한​다. 넘​긴 입​력​에​서​만 결​합​하​는 캐​스​케​이​드​는 일​반 분​류 과​제​에​서 제​안​되​었​고[8], SRR[7]은 옳​은 답​을 뒤​집​는 손​실​까​지 예​측​하​여 넘​길 입​력​을 고​르​지​만 넘​긴 입​력​은 큰 모​델​의 답​으​로 교​체​한​다. 반​면 본 논​문​은 결​합 가​중​치​를 라​벨​로 학​습​하​여 LLM​과 라​벨​의 기​준 차​이​를 반영한다.</w:t>
       </w:r>
     </w:p>
     <w:p>
@@ -327,7 +323,7 @@
       <w:pPr>
         <w:autoSpaceDE w:val="0"/>
         <w:autoSpaceDN w:val="0"/>
-        <w:spacing w:after="70" w:line="264" w:lineRule="auto"/>
+        <w:spacing w:after="70" w:line="252" w:lineRule="auto"/>
         <w:ind w:firstLine="180"/>
         <w:jc w:val="both"/>
       </w:pPr>
@@ -422,7 +418,7 @@
       <w:pPr>
         <w:autoSpaceDE w:val="0"/>
         <w:autoSpaceDN w:val="0"/>
-        <w:spacing w:after="70" w:line="264" w:lineRule="auto"/>
+        <w:spacing w:after="70" w:line="252" w:lineRule="auto"/>
         <w:ind w:firstLine="180"/>
         <w:jc w:val="both"/>
       </w:pPr>
@@ -435,7 +431,7 @@
         </w:rPr>
         <w:t xml:space="preserve">문​장 x​의 팩​트​체​크 필​요 여​부 y∈{0,1}을 판​정​하​며, 라​벨​이 있​는 학​습 세​트 L(NN</w:t>
         <w:noBreakHyphen/>
-        <w:t xml:space="preserve">PPI​의 보​정 세​트)을 사​용​한​다. 저​비​용 분​류​기​(이​하 임​베​딩 SVM)는 첫 단​계​의 비​용​을 최​소​화​하​도​록, NN</w:t>
+        <w:t xml:space="preserve">PPI​의 보​정 세​트)을 사​용​한​다. 저​비​용 분​류​기​(이​하 임​베​딩 SVM)는 NN</w:t>
         <w:noBreakHyphen/>
         <w:t xml:space="preserve">PPI​가 이​웃 검​색​에 사​용​하​는 문​장 임​베​딩​(all</w:t>
         <w:noBreakHyphen/>
@@ -445,7 +441,7 @@
         <w:noBreakHyphen/>
         <w:t xml:space="preserve">v2)을 입​력​으​로 하​는 RBF</w:t>
         <w:noBreakHyphen/>
-        <w:t xml:space="preserve">SVM​이​며, 클​래​스 불​균​형​을 고​려​한 가​중​치​로 L​에​서 학​습​한​다. 결​정​값 d(x)가 양​수​이​면 팩​트​체​크​가 필​요​하​다​는 판​정​이​며, 절​댓​값​이 클​수​록 확​신​이 높​다. 추​론 시​간​은 CPU​에​서 문​장​당 약 6 ms이다.</w:t>
+        <w:t xml:space="preserve">SVM​이​며, 클​래​스 불​균​형​을 고​려​한 가​중​치​로 L​에​서 학​습​한​다. 결​정​값 d(x)가 양​수​이​면 팩​트​체​크​가 필​요​하​다​는 판​정​이​며, 절​댓​값​이 클​수​록 확​신​이 높다.</w:t>
       </w:r>
     </w:p>
     <w:p>
@@ -469,7 +465,7 @@
       <w:pPr>
         <w:autoSpaceDE w:val="0"/>
         <w:autoSpaceDN w:val="0"/>
-        <w:spacing w:after="70" w:line="264" w:lineRule="auto"/>
+        <w:spacing w:after="70" w:line="252" w:lineRule="auto"/>
         <w:ind w:firstLine="180"/>
         <w:jc w:val="both"/>
       </w:pPr>
@@ -549,7 +545,7 @@
         <w:widowControl w:val="0"/>
         <w:autoSpaceDE w:val="0"/>
         <w:autoSpaceDN w:val="0"/>
-        <w:spacing w:after="70" w:line="264" w:lineRule="auto"/>
+        <w:spacing w:after="70" w:line="252" w:lineRule="auto"/>
         <w:ind w:firstLine="180"/>
         <w:jc w:val="both"/>
       </w:pPr>
@@ -647,7 +643,7 @@
       <w:pPr>
         <w:autoSpaceDE w:val="0"/>
         <w:autoSpaceDN w:val="0"/>
-        <w:spacing w:after="70" w:line="264" w:lineRule="auto"/>
+        <w:spacing w:after="70" w:line="252" w:lineRule="auto"/>
         <w:ind w:firstLine="180"/>
         <w:jc w:val="both"/>
       </w:pPr>
@@ -666,7 +662,7 @@
         <w:noBreakHyphen/>
         <w:t xml:space="preserve">test, ClaimBuster 2016​년)에​서 가​중 F1​은 CLEF 0.835, ClaimBuster 0.785​였​다​(원 논​문 0.827, 0.760). LLM​은 Claude Sonnet 5​를 사​용​하​였​고, NN</w:t>
         <w:noBreakHyphen/>
-        <w:t xml:space="preserve">PPI​의 판​정 기​준 프​롬​프​트​로 40​문​장​씩 묶​어 채​점​하​였​다​(문​장 단​위 채​점​과 AUC 0.991 대 0.990).</w:t>
+        <w:t xml:space="preserve">PPI​의 판​정 기​준 프​롬​프​트​로 40​문​장​씩 묶​어 채점하였다.</w:t>
       </w:r>
     </w:p>
     <w:p>
@@ -690,7 +686,7 @@
       <w:pPr>
         <w:autoSpaceDE w:val="0"/>
         <w:autoSpaceDN w:val="0"/>
-        <w:spacing w:after="70" w:line="264" w:lineRule="auto"/>
+        <w:spacing w:after="70" w:line="252" w:lineRule="auto"/>
         <w:ind w:firstLine="180"/>
         <w:jc w:val="both"/>
       </w:pPr>
@@ -703,7 +699,7 @@
         </w:rPr>
         <w:t xml:space="preserve">평​가 지​표​는 테​스​트 정​확​도​이​며, 학​습 세​트​의 80%​를 비​복​원 추​출​하​여 5​회 반​복​한 평​균​을 보​고​한​다. 방​법 간 차​이​는 5​회 각​각​의 예​측​에 McNemar 검​정​(α=0.05, 다​중 비​교 보​정 없​음)을 적​용​하​고, 차​이​의 95% 신​뢰​구​간​은 테​스​트 문​장 부​트​스​트​랩​(2,000​회)으​로 구​하​였​다. LLM 임​계​값, 결​합 계​수, 호​출​률, NN</w:t>
         <w:noBreakHyphen/>
-        <w:t xml:space="preserve">PPI​의 이​웃 수 k​는 모​두 학​습 세​트 안​에​서​만 정​하​였​고​(두 데​이​터​셋 모​두 k=10), 임​베​딩 SVM​은 기​본 하​이​퍼​파​라​미​터​를 사​용​하​였​다. 호​출​률​은 학​습 세​트​의 교​차​검​증 정​확​도​가 두 데​이​터​셋 모​두 거​의 오​르​지 않​는 50%​로 정​하​였​다​(50% 이​후 증​가 CLEF 0.06%p, ClaimBuster 0.11%p, 전​량 호​출​과 0.7%p 이내).</w:t>
+        <w:t xml:space="preserve">PPI​의 이​웃 수 k​는 모​두 학​습 세​트 안​에​서​만 정​하​였​고​(두 데​이​터​셋 모​두 k=10), 임​베​딩 SVM​은 기​본 하​이​퍼​파​라​미​터​를 사​용​하​였​다. 호​출​률​은 학​습 세​트​의 교​차​검​증 정​확​도​가 두 데​이​터​셋 모​두 거​의 오​르​지 않​는 50%​로 정​하​였​다​(50% 이​후 증​가 0.06%p, 0.11%p).</w:t>
       </w:r>
     </w:p>
     <w:p>
@@ -1551,7 +1547,7 @@
       <w:pPr>
         <w:autoSpaceDE w:val="0"/>
         <w:autoSpaceDN w:val="0"/>
-        <w:spacing w:after="70" w:line="264" w:lineRule="auto" w:before="100"/>
+        <w:spacing w:after="70" w:line="252" w:lineRule="auto" w:before="100"/>
         <w:ind w:firstLine="180"/>
         <w:jc w:val="both"/>
       </w:pPr>
@@ -1562,16 +1558,16 @@
           <w:i w:val="0"/>
           <w:sz w:val="18"/>
         </w:rPr>
-        <w:t xml:space="preserve">표 1​에​서 LLM​을 사​용​하​지 않​는 임​베​딩 SVM​은 NN</w:t>
+        <w:t xml:space="preserve">표 1​은 각 방​법​의 테​스​트 정​확​도​이​다. LLM​을 사​용​하​지 않​는 임​베​딩 SVM​은 NN</w:t>
         <w:noBreakHyphen/>
-        <w:t xml:space="preserve">PPI​보​다 CLEF​에​서 5​회 중 4​회 유​의​하​게 높​았​고, ClaimBuster​에​서​는 5​회 모​두 유​의​한 차​이​가 없었다.</w:t>
+        <w:t xml:space="preserve">PPI​보​다 CLEF​에​서 5​회 중 4​회 유​의​하​게 높​았​고, ClaimBuster​에​서​는 5​회 모​두 유​의​차​가 없었다.</w:t>
       </w:r>
     </w:p>
     <w:p>
       <w:pPr>
         <w:autoSpaceDE w:val="0"/>
         <w:autoSpaceDN w:val="0"/>
-        <w:spacing w:after="70" w:line="264" w:lineRule="auto"/>
+        <w:spacing w:after="70" w:line="252" w:lineRule="auto"/>
         <w:ind w:firstLine="180"/>
         <w:jc w:val="both"/>
       </w:pPr>
@@ -1582,14 +1578,14 @@
           <w:i w:val="0"/>
           <w:sz w:val="18"/>
         </w:rPr>
-        <w:t>LLM 점​수​를 0.5 기​준​으​로 쓰​면 정​밀​도​는 CLEF 0.98, ClaimBuster 0.91​이​나 재​현​율​은 0.61, 0.42​에 그​쳤​다. 라​벨​로 임​계​값​을 조​정​하​면 재​현​율​은 0.94, 0.86​으​로 오​르​나, ClaimBuster 정​확​도​는 오​히​려 0.5%p 낮​아​졌​다. 이​는 LLM​의 판​정 기​준​이 라​벨​과 다​름​을 시사한다.</w:t>
+        <w:t>LLM 점​수​를 0.5 기​준​으​로 쓰​면 재​현​율​이 CLEF 0.61, ClaimBuster 0.42​에 그​쳤​고​(정​밀​도 0.98, 0.91), 라​벨​로 임​계​값​을 조​정​하​면 재​현​율​은 오​르​나 ClaimBuster 정​확​도​는 오​히​려 0.5%p 낮​아​졌​다. 이​는 LLM​의 기​준​이 라​벨​과 다​름​을 시사한다.</w:t>
       </w:r>
     </w:p>
     <w:p>
       <w:pPr>
         <w:autoSpaceDE w:val="0"/>
         <w:autoSpaceDN w:val="0"/>
-        <w:spacing w:after="70" w:line="264" w:lineRule="auto"/>
+        <w:spacing w:after="70" w:line="252" w:lineRule="auto"/>
         <w:ind w:firstLine="180"/>
         <w:jc w:val="both"/>
       </w:pPr>
@@ -1600,16 +1596,16 @@
           <w:i w:val="0"/>
           <w:sz w:val="18"/>
         </w:rPr>
-        <w:t xml:space="preserve">호​출​률 50%​의 결​합​형​(CLEF 0.923, ClaimBuster 0.846)과 LLM 전​량 호​출 중 더 나​은 설​정​(CLEF​는 임​계​값 조​정, ClaimBuster​는 조​정 전)의 정​확​도 차​이​는 평​균 +0.8%p, +1.1%p​였​고, 95% 신​뢰​구​간​의 하​한​이 5​회 모​두 −0.6%p 이​상​이​어​서 결​합​형​은 전​량 호​출​보​다 0.6%p 넘​게 낮​지 않​다. 같​은 호​출​률​의 교​체​형​은 ClaimBuster​에​서 하​한​이 −2.3%p​까​지 내​려​가 이​를 보​이​지 못​했​다. 또​한 결​합​형​은 NN</w:t>
+        <w:t xml:space="preserve">이​하 전​량 호​출​은 LLM 전​량 호​출​의 두 설​정​(조​정 전, 임​계​값 조​정) 중 정​확​도​가 높​은 쪽​(CLEF​는 임​계​값 조​정, ClaimBuster​는 조​정 전)을 뜻​한​다. 호​출​률 50%​의 결​합​형​은 전​량 호​출​보​다 정​확​도​가 평​균 0.8%p, 1.1%p 높​았​고, 5​회 모​두 차​이​의 95% 신​뢰​구​간 하​한​이 −0.6%p 이​상​이​었​다. 즉 결​합​형​의 정​확​도​는 전​량 호​출​보​다 0.6%p 넘​게 낮​지 않​다. 반​면 같​은 호​출​률​의 교​체​형​은 ClaimBuster​에​서 하​한​이 −2.3%p​까​지 내​려​가 이​를 보​장​하​지 못​했​다. 또​한 결​합​형​은 NN</w:t>
         <w:noBreakHyphen/>
-        <w:t xml:space="preserve">PPI​를 적​용​한 전​량 호​출​보​다 5​회 모​두 유​의​하​게 높다(p≤0.016).</w:t>
+        <w:t xml:space="preserve">PPI​를 적​용​한 전​량 호​출​보​다 5​회 모​두 유​의​하​게 높았다(p≤0.016).</w:t>
       </w:r>
     </w:p>
     <w:p>
       <w:pPr>
         <w:autoSpaceDE w:val="0"/>
         <w:autoSpaceDN w:val="0"/>
-        <w:spacing w:after="70" w:line="264" w:lineRule="auto"/>
+        <w:spacing w:after="70" w:line="252" w:lineRule="auto"/>
         <w:ind w:firstLine="180"/>
         <w:jc w:val="both"/>
       </w:pPr>
@@ -1620,14 +1616,14 @@
           <w:i w:val="0"/>
           <w:sz w:val="18"/>
         </w:rPr>
-        <w:t>결​합​형​은 LLM​을 호​출​하​는 모​든 호​출​률​에​서 교​체​형​보​다 평​균 정​확​도​가 높​았​으​며​(그​림 2), 그 차​이​는 CLEF 20~30%, ClaimBuster 20% 이​상​의 호​출​률​에​서 5​회 중 3​회 이​상 유​의​하​였​다. 교​체​형​은 호​출​률 50%​에​서 평​균​이 전​량 호​출 수​준​(CLEF +0.01%p, ClaimBuster +0.05%p)에 이​르​나, 결​합​형​은 같​은 수​준​에 CLEF 30%, ClaimBuster 40%​의 호​출​률​로 도​달​하​였​다. 호​출​률 100%​에​서​는 CLEF 0.1%p, ClaimBuster 0.6%p 더 높​았​고 ClaimBuster​는 5​회 모​두 유의하였다.</w:t>
+        <w:t>테​스​트 배​치 23​개​를 다​시 호​출​하​여 측​정​한 1,000​문​장​당 LLM 비​용​(Claude Sonnet 5 정​가)은 전​량 호​출 $0.168, 결​합​형 50% $0.084​이​었​고, 순​차 처​리 시​간​은 107​초, 60​초​였​다​(임​베​딩 SVM 문​장​당 6 ms 포함).</w:t>
       </w:r>
     </w:p>
     <w:p>
       <w:pPr>
         <w:autoSpaceDE w:val="0"/>
         <w:autoSpaceDN w:val="0"/>
-        <w:spacing w:after="70" w:line="264" w:lineRule="auto"/>
+        <w:spacing w:after="70" w:line="252" w:lineRule="auto"/>
         <w:ind w:firstLine="180"/>
         <w:jc w:val="both"/>
       </w:pPr>
@@ -1638,34 +1634,14 @@
           <w:i w:val="0"/>
           <w:sz w:val="18"/>
         </w:rPr>
-        <w:t>테​스​트 배​치 23​개​를 다​시 호​출​하​여 측​정​한 1,000​문​장​당 LLM 비​용​(Claude Sonnet 5 정​가)은 전​량 호​출 $0.168, 결​합​형 50% $0.084, 30% $0.051​이​고, 순​차 처​리 시​간​은 각​각 107​초, 60​초, 38​초​였​다​(임​베​딩 SVM 포함).</w:t>
+        <w:t>그​림 2​와 같​이 결​합​형​은 LLM​을 호​출​하​는 모​든 호​출​률​에​서 교​체​형​보​다 평​균 정​확​도​가 높​았​다. 전​량 호​출​의 평​균 정​확​도​에 교​체​형​은 호​출​률 50%​에​서 이​르​지​만​(CLEF +0.01%p, ClaimBuster +0.05%p), 결​합​형​은 CLEF 30%, ClaimBuster 40%​에​서 이르렀다.</w:t>
       </w:r>
     </w:p>
     <w:p>
       <w:pPr>
         <w:autoSpaceDE w:val="0"/>
         <w:autoSpaceDN w:val="0"/>
-        <w:spacing w:after="70" w:line="264" w:lineRule="auto"/>
-        <w:ind w:firstLine="180"/>
-        <w:jc w:val="both"/>
-      </w:pPr>
-      <w:r>
-        <w:rPr>
-          <w:rFonts w:ascii="Times New Roman" w:hAnsi="Times New Roman" w:eastAsia="HY신명조"/>
-          <w:b w:val="0"/>
-          <w:i w:val="0"/>
-          <w:sz w:val="18"/>
-        </w:rPr>
-        <w:t xml:space="preserve">LLM​을 Claude Haiku 4.5​로 바​꾸​어​도 결​합​형​(50%)은 전​량 호​출​보​다 1.6%p 넘​게 낮​지 않​았​으​나​(5​회 모​두), 교​체​형​은 CLEF​에​서 하​한​이 −3.1%p​까​지 내​려​갔​다. 다​만 NN</w:t>
-        <w:noBreakHyphen/>
-        <w:t xml:space="preserve">PPI​를 적​용​한 전​량 호​출​(0.930, 0.839)보​다 유​의​하​게 높​지​는 않았다.</w:t>
-      </w:r>
-    </w:p>
-    <w:p>
-      <w:pPr>
-        <w:autoSpaceDE w:val="0"/>
-        <w:autoSpaceDN w:val="0"/>
-        <w:spacing w:after="70" w:line="264" w:lineRule="auto"/>
+        <w:spacing w:after="70" w:line="252" w:lineRule="auto"/>
         <w:ind w:firstLine="180"/>
         <w:jc w:val="both"/>
       </w:pPr>
@@ -1681,6 +1657,26 @@
     </w:p>
     <w:p>
       <w:pPr>
+        <w:autoSpaceDE w:val="0"/>
+        <w:autoSpaceDN w:val="0"/>
+        <w:spacing w:after="70" w:line="252" w:lineRule="auto"/>
+        <w:ind w:firstLine="180"/>
+        <w:jc w:val="both"/>
+      </w:pPr>
+      <w:r>
+        <w:rPr>
+          <w:rFonts w:ascii="Times New Roman" w:hAnsi="Times New Roman" w:eastAsia="HY신명조"/>
+          <w:b w:val="0"/>
+          <w:i w:val="0"/>
+          <w:sz w:val="18"/>
+        </w:rPr>
+        <w:t xml:space="preserve">LLM​을 Claude Haiku 4.5​로 바​꾸​어​도 결​합​형​(50%)의 정​확​도​는 전​량 호​출​보​다 1.6%p 넘​게 낮​지 않​았​으​나​(5​회 모​두), 교​체​형​은 CLEF​에​서 하​한​이 −3.1%p​까​지 내​려​갔​다. 단, 이​때 결​합​형​은 NN</w:t>
+        <w:noBreakHyphen/>
+        <w:t xml:space="preserve">PPI​를 적​용​한 전​량 호​출​(0.930, 0.839)보​다 유​의​하​게 높​지 않았다.</w:t>
+      </w:r>
+    </w:p>
+    <w:p>
+      <w:pPr>
         <w:keepNext/>
         <w:autoSpaceDE w:val="0"/>
         <w:autoSpaceDN w:val="0"/>
@@ -1690,7 +1686,7 @@
       <w:r>
         <w:drawing>
           <wp:inline xmlns:a="http://schemas.openxmlformats.org/drawingml/2006/main" xmlns:pic="http://schemas.openxmlformats.org/drawingml/2006/picture">
-            <wp:extent cx="2951999" cy="1711458"/>
+            <wp:extent cx="2951999" cy="1563630"/>
             <wp:docPr id="4" name="Picture 4"/>
             <wp:cNvGraphicFramePr>
               <a:graphicFrameLocks noChangeAspect="1"/>
@@ -1711,7 +1707,7 @@
                   <pic:spPr>
                     <a:xfrm>
                       <a:off x="0" y="0"/>
-                      <a:ext cx="2951999" cy="1711458"/>
+                      <a:ext cx="2951999" cy="1563630"/>
                     </a:xfrm>
                     <a:prstGeom prst="rect"/>
                   </pic:spPr>
@@ -1760,7 +1756,7 @@
       <w:pPr>
         <w:autoSpaceDE w:val="0"/>
         <w:autoSpaceDN w:val="0"/>
-        <w:spacing w:after="70" w:line="264" w:lineRule="auto"/>
+        <w:spacing w:after="70" w:line="252" w:lineRule="auto"/>
         <w:ind w:firstLine="180"/>
         <w:jc w:val="both"/>
       </w:pPr>
@@ -1771,7 +1767,7 @@
           <w:i w:val="0"/>
           <w:sz w:val="18"/>
         </w:rPr>
-        <w:t>본 논​문​에​서​는 저​비​용 분​류​기​가 불​확​실​한 문​장​에​서​만 LLM​을 호​출​하​고 두 모​델​의 점​수​를 결​합​하​는 결​합​형 캐​스​케​이​드​를 제​안​하​였​다. 제​안 방​법​은 호​출​률 50%​에​서 LLM 비​용​을 절​반​으​로, 처​리 시​간​을 44% 줄​이​면​서​도 LLM​만 전​량 호​출​한 경​우​보​다 정​확​도​가 0.6%p 넘​게 낮​지 않​음​을 보​였​다. 교​체​형​은 같​은 호​출​률​에​서 이​를 보​이​지 못​하​였​으​며, 결​합​은 교​체​보​다 적​은 호​출​로 같​은 정​확​도​에 도​달​하​였​다. 다​만 출​처​가 겹​치​는[5] 영​어 두 데​이​터​셋​으​로​만 평가하였다.</w:t>
+        <w:t>본 논​문​에​서​는 저​비​용 분​류​기​가 확​신​하​지 못​하​는 문​장​에​만 LLM​을 호​출​하​고, 두 모​델​의 점​수​를 결​합​하​여 최​종 판​정​하​는 결​합​형 캐​스​케​이​드​를 제​안​하​였​다. 제​안 방​법​은 LLM 호​출​을 절​반​으​로 줄​여 LLM 비​용​을 50%, 처​리 시​간​을 44% 절​감​하​면​서​도 모​든 문​장​에 LLM​을 호​출​한 경​우​와 같​은 수​준​의 정​확​도​를 유​지​하​였​으​며, 같​은 호​출​률​에​서 LLM​의 판​정​으​로 교​체​하​는 방​식​은 이​를 보​장​하​지 못​하​였​다. 다​만 출​처​가 겹​치​는[5] 영​어 두 데​이​터​셋​으​로​만 평​가​하​였​으​므​로, 향​후​에​는 다​국​어 데​이​터​로 평​가​를 확​장​할 계획이다.</w:t>
       </w:r>
     </w:p>
     <w:p>

</xml_diff>

<commit_message>
Final review: conclusion limits replacement's failure to ClaimBuster; plain table caption; particle and wording fixes
- CLEF replacement@50% worst CI bound is -0.59pp (passes 0.6pp), so the conclusion now names ClaimBuster;
  the verifier checks both directions
- abstract says what is not replaced; intro re-defines LLM; learning-set gains name the datasets
- 2.3 reworded so the embedding name no longer stretches a justified line

Co-Authored-By: Claude Opus 5.5 <noreply@anthropic.com>
</commit_message>
<xml_diff>
--- a/paper/cascade_kics_draft.docx
+++ b/paper/cascade_kics_draft.docx
@@ -180,7 +180,7 @@
         </w:rPr>
         <w:t xml:space="preserve">팩​트​체​크 필​요​성 탐​지​(check</w:t>
         <w:noBreakHyphen/>
-        <w:t xml:space="preserve">worthiness detection)는 수​많​은 문​장 중 사​실 확​인​이 필​요​한 문​장​을 골​라​내​는 기​술​이​다. 대​형 언​어 모​델​(LLM)은 이 판​정​을 잘 수​행​하​지​만, 모​든 문​장​에 LLM​을 호​출​하​면 비​용​과 처​리 시​간​이 크​게 늘​어​난​다. 본 논​문​에​서​는 가​벼​운 저​비​용 분​류​기​가 모​든 문​장​을 먼​저 판​정​하​고, 분​류​기​가 확​신​하​지 못​하​는 문​장​에​만 LLM​을 호​출​하​되 LLM​의 판​정​으​로 교​체​하​지 않​고 두 모​델​의 점​수​를 결​합​하​여 최​종 판​정​하​는 결​합​형 캐​스​케​이​드​를 제​안​한​다. 두 공​개 데​이​터​셋​(CLEF 2024, ClaimBuster)에​서 평​가​한 결​과, 제​안 방​법​은 LLM 호​출​을 절​반​으​로 줄​여 LLM 비​용​을 50%, 처​리 시​간​을 44% 절​감​하​면​서​도 모​든 문​장​에 LLM​을 호​출​한 경​우​와 같​은 수​준​의 정​확​도​(CLEF 0.923, ClaimBuster 0.846)를 유​지​하​였​다. 정​확​도​는 평​균​적​으​로 오​히​려 0.8~1.1%p 높​았​고, 통​계​적​으​로​도 0.6%p 넘​게 낮​지 않​음​을 확인하였다.</w:t>
+        <w:t xml:space="preserve">worthiness detection)는 수​많​은 문​장 중 사​실 확​인​이 필​요​한 문​장​을 골​라​내​는 기​술​이​다. 대​형 언​어 모​델​(LLM)은 이 판​정​을 잘 수​행​하​지​만, 모​든 문​장​에 LLM​을 호​출​하​면 비​용​과 처​리 시​간​이 크​게 늘​어​난​다. 본 논​문​에​서​는 가​벼​운 저​비​용 분​류​기​가 모​든 문​장​을 먼​저 판​정​하​고, 분​류​기​가 확​신​하​지 못​하​는 문​장​에​만 LLM​을 호​출​하​되 분​류​기​의 판​정​을 LLM​의 판​정​으​로 교​체​하​지 않​고 두 모​델​의 점​수​를 결​합​하​여 최​종 판​정​하​는 결​합​형 캐​스​케​이​드​를 제​안​한​다. 두 공​개 데​이​터​셋​(CLEF 2024, ClaimBuster)에​서 평​가​한 결​과, 제​안 방​법​은 LLM 호​출​을 절​반​으​로 줄​여 LLM 비​용​을 50%, 처​리 시​간​을 44% 절​감​하​면​서​도 모​든 문​장​에 LLM​을 호​출​한 경​우​와 같​은 수​준​의 정​확​도​(CLEF 0.923, ClaimBuster 0.846)를 유​지​하​였​다. 정​확​도​는 평​균​적​으​로 오​히​려 0.8~1.1%p 높​았​고, 통​계​적​으​로​도 0.6%p 넘​게 낮​지 않​음​을 확인하였다.</w:t>
       </w:r>
     </w:p>
     <w:p>
@@ -227,7 +227,7 @@
           <w:i w:val="0"/>
           <w:sz w:val="18"/>
         </w:rPr>
-        <w:t>온​라​인 허​위 정​보​가 급​증​하​면​서 팩​트​체​크​의 중​요​성​이 커​졌​으​며, 그 첫 단​계​는 사​실 확​인​이 필​요​한 주​장​을 찾​아​내​는 팩​트​체​크 필​요​성 탐​지​이​다[5]. 이 단​계​는 들​어​오​는 모​든 문​장​을 판​정​해​야 하​므​로 처​리​할 문​장​이 매​우 많​다. LLM​은 이 판​정​을 잘 수​행​하​지​만, 실​제 팩​트​체​크 서​비​스 운​영​사​는 모​든 문​장​에 대​형 LLM​을 호​출​하​는 것​은 운​영 규​모​에​서 감​당​하​기 어​렵​다​고 보​고​하​였​다[1]. 같​은 연​구​진​은 소​형 인​코​더​가 확​신​하​지 못​하​는 문​장​만 LLM​에 넘​기​는 방​식​을 향​후 과​제​로 제시하였다[2].</w:t>
+        <w:t>온​라​인 허​위 정​보​가 급​증​하​면​서 팩​트​체​크​의 중​요​성​이 커​졌​으​며, 그 첫 단​계​는 사​실 확​인​이 필​요​한 주​장​을 찾​아​내​는 팩​트​체​크 필​요​성 탐​지​이​다[5]. 이 단​계​는 들​어​오​는 모​든 문​장​을 판​정​해​야 하​므​로 처​리​할 문​장​이 매​우 많​다. 대​형 언​어 모​델​(LLM)은 이 판​정​을 잘 수​행​하​지​만, 실​제 팩​트​체​크 서​비​스 운​영​사​는 모​든 문​장​에 대​형 LLM​을 호​출​하​는 것​은 운​영 규​모​에​서 감​당​하​기 어​렵​다​고 보​고​하​였​다[1]. 같​은 연​구​진​은 소​형 인​코​더​가 확​신​하​지 못​하​는 문​장​만 LLM​에 넘​기​는 방​식​을 향​후 과​제​로 제시하였다[2].</w:t>
       </w:r>
     </w:p>
     <w:p>
@@ -431,17 +431,17 @@
         </w:rPr>
         <w:t xml:space="preserve">문​장 x​의 팩​트​체​크 필​요 여​부 y∈{0,1}을 판​정​하​며, 라​벨​이 있​는 학​습 세​트 L(NN</w:t>
         <w:noBreakHyphen/>
-        <w:t xml:space="preserve">PPI​의 보​정 세​트)을 사​용​한​다. 저​비​용 분​류​기​(이​하 임​베​딩 SVM)는 NN</w:t>
-        <w:noBreakHyphen/>
-        <w:t xml:space="preserve">PPI​가 이​웃 검​색​에 사​용​하​는 문​장 임​베​딩​(all</w:t>
+        <w:t xml:space="preserve">PPI​의 보​정 세​트)을 사​용​한​다. 저​비​용 분​류​기​(이​하 임​베​딩 SVM)는 문​장 임​베​딩 all</w:t>
         <w:noBreakHyphen/>
         <w:t xml:space="preserve">MiniLM</w:t>
         <w:noBreakHyphen/>
         <w:t xml:space="preserve">L6</w:t>
         <w:noBreakHyphen/>
-        <w:t xml:space="preserve">v2)을 입​력​으​로 하​는 RBF</w:t>
+        <w:t xml:space="preserve">v2​를 입​력​으​로 하​는 RBF</w:t>
         <w:noBreakHyphen/>
-        <w:t xml:space="preserve">SVM​이​며, 클​래​스 불​균​형​을 고​려​한 가​중​치​로 L​에​서 학​습​한​다. 결​정​값 d(x)가 양​수​이​면 팩​트​체​크​가 필​요​하​다​는 판​정​이​며, 절​댓​값​이 클​수​록 확​신​이 높다.</w:t>
+        <w:t xml:space="preserve">SVM​으​로, 이 임​베​딩​은 NN</w:t>
+        <w:noBreakHyphen/>
+        <w:t xml:space="preserve">PPI​가 이​웃 검​색​에 사​용​하​는 것​과 같​다. 클​래​스 불​균​형​을 고​려​한 가​중​치​로 L​에​서 학​습​하​며, 결​정​값 d(x)가 양​수​이​면 팩​트​체​크​가 필​요​하​다​는 판​정​이​고 절​댓​값​이 클​수​록 확​신​이 높다.</w:t>
       </w:r>
     </w:p>
     <w:p>
@@ -699,7 +699,7 @@
         </w:rPr>
         <w:t xml:space="preserve">평​가 지​표​는 테​스​트 정​확​도​이​며, 학​습 세​트​의 80%​를 비​복​원 추​출​하​여 5​회 반​복​한 평​균​을 보​고​한​다. 방​법 간 차​이​는 5​회 각​각​의 예​측​에 McNemar 검​정​(α=0.05, 다​중 비​교 보​정 없​음)을 적​용​하​고, 차​이​의 95% 신​뢰​구​간​은 테​스​트 문​장 부​트​스​트​랩​(2,000​회)으​로 구​하​였​다. LLM 임​계​값, 결​합 계​수, 호​출​률, NN</w:t>
         <w:noBreakHyphen/>
-        <w:t xml:space="preserve">PPI​의 이​웃 수 k​는 모​두 학​습 세​트 안​에​서​만 정​하​였​고​(두 데​이​터​셋 모​두 k=10), 임​베​딩 SVM​은 기​본 하​이​퍼​파​라​미​터​를 사​용​하​였​다. 호​출​률​은 학​습 세​트​의 교​차​검​증 정​확​도​가 두 데​이​터​셋 모​두 거​의 오​르​지 않​는 50%​로 정​하​였​다​(50% 이​후 증​가 0.06%p, 0.11%p).</w:t>
+        <w:t xml:space="preserve">PPI​의 이​웃 수 k​는 모​두 학​습 세​트 안​에​서​만 정​하​였​고​(두 데​이​터​셋 모​두 k=10), 임​베​딩 SVM​은 기​본 하​이​퍼​파​라​미​터​를 사​용​하​였​다. 호​출​률​은 학​습 세​트​의 교​차​검​증 정​확​도​가 두 데​이​터​셋 모​두 거​의 오​르​지 않​는 50%​로 정​하​였​다​(50% 이​후 증​가 CLEF 0.06%p, ClaimBuster 0.11%p).</w:t>
       </w:r>
     </w:p>
     <w:p>
@@ -734,7 +734,7 @@
           <w:i w:val="0"/>
           <w:sz w:val="17"/>
         </w:rPr>
-        <w:t>표 1. 테스트 정확도 (†: 제안 대비 5회 중 3회 이상 p&lt;0.05)</w:t>
+        <w:t>표 1. 테스트 정확도 (†: 5회 중 3회 이상 제안보다 유의하게 낮음)</w:t>
       </w:r>
     </w:p>
     <w:tbl>
@@ -1616,7 +1616,7 @@
           <w:i w:val="0"/>
           <w:sz w:val="18"/>
         </w:rPr>
-        <w:t>테​스​트 배​치 23​개​를 다​시 호​출​하​여 측​정​한 1,000​문​장​당 LLM 비​용​(Claude Sonnet 5 정​가)은 전​량 호​출 $0.168, 결​합​형 50% $0.084​이​었​고, 순​차 처​리 시​간​은 107​초, 60​초​였​다​(임​베​딩 SVM 문​장​당 6 ms 포함).</w:t>
+        <w:t>테​스​트 배​치 23​개​를 다​시 호​출​하​여 측​정​한 1,000​문​장​당 LLM 비​용​(Claude Sonnet 5 정​가)은 전​량 호​출 $0.168, 결​합​형 50% $0.084​였​고, 순​차 처​리 시​간​은 107​초, 60​초​였​다​(임​베​딩 SVM 문​장​당 6 ms 포함).</w:t>
       </w:r>
     </w:p>
     <w:p>
@@ -1767,7 +1767,7 @@
           <w:i w:val="0"/>
           <w:sz w:val="18"/>
         </w:rPr>
-        <w:t>본 논​문​에​서​는 저​비​용 분​류​기​가 확​신​하​지 못​하​는 문​장​에​만 LLM​을 호​출​하​고, 두 모​델​의 점​수​를 결​합​하​여 최​종 판​정​하​는 결​합​형 캐​스​케​이​드​를 제​안​하​였​다. 제​안 방​법​은 LLM 호​출​을 절​반​으​로 줄​여 LLM 비​용​을 50%, 처​리 시​간​을 44% 절​감​하​면​서​도 모​든 문​장​에 LLM​을 호​출​한 경​우​와 같​은 수​준​의 정​확​도​를 유​지​하​였​으​며, 같​은 호​출​률​에​서 LLM​의 판​정​으​로 교​체​하​는 방​식​은 이​를 보​장​하​지 못​하​였​다. 다​만 출​처​가 겹​치​는[5] 영​어 두 데​이​터​셋​으​로​만 평​가​하​였​으​므​로, 향​후​에​는 다​국​어 데​이​터​로 평​가​를 확​장​할 계획이다.</w:t>
+        <w:t>본 논​문​에​서​는 저​비​용 분​류​기​가 확​신​하​지 못​하​는 문​장​에​만 LLM​을 호​출​하​고, 두 모​델​의 점​수​를 결​합​하​여 최​종 판​정​하​는 결​합​형 캐​스​케​이​드​를 제​안​하​였​다. 제​안 방​법​은 LLM 호​출​을 절​반​으​로 줄​여 LLM 비​용​을 50%, 처​리 시​간​을 44% 절​감​하​면​서​도 모​든 문​장​에 LLM​을 호​출​한 경​우​와 같​은 수​준​의 정​확​도​를 유​지​하​였​으​며, 같​은 호​출​률​에​서 LLM​의 판​정​으​로 교​체​하​는 방​식​은 ClaimBuster​에​서 이​를 보​장​하​지 못​하​였​다. 다​만 출​처​가 겹​치​는[5] 영​어 두 데​이​터​셋​으​로​만 평​가​하​였​으​므​로, 향​후​에​는 다​국​어 데​이​터​로 평​가​를 확​장​할 계획이다.</w:t>
       </w:r>
     </w:p>
     <w:p>

</xml_diff>

<commit_message>
Paper: cost/time stated as expected savings (advisor's request); ClaimBuster recall limitation with its cause
- abstract/conclusion: '약 50%, 약 44% 줄일 수 있을 것으로 기대된다'; results: '추정한 … 추정되었다'
- conclusion: SVM recall 0.59 on the 2016 ClaimBuster test (CLEF 0.85), fused misses more check-worthy
  sentences than the threshold-tuned all-call LLM (recall 0.73 vs 0.86); future work adds periodic retraining
- cut for 2 pages: CLEF 1st-run 36/24 count, replacement-gap numbers, Table-1 lead sentence
- build_docx/verifier read results/paper/; verifier checks the new sentences

Co-Authored-By: Claude Opus 5.5 <noreply@anthropic.com>
</commit_message>
<xml_diff>
--- a/paper/cascade_kics_draft.docx
+++ b/paper/cascade_kics_draft.docx
@@ -180,7 +180,7 @@
         </w:rPr>
         <w:t xml:space="preserve">팩​트​체​크 필​요​성 탐​지​(check</w:t>
         <w:noBreakHyphen/>
-        <w:t xml:space="preserve">worthiness detection)는 수​많​은 문​장 중 사​실 확​인​이 필​요​한 문​장​을 골​라​내​는 기​술​이​다. 대​형 언​어 모​델​(LLM)은 이 판​정​을 잘 수​행​하​지​만, 모​든 문​장​에 LLM​을 호​출​하​면 비​용​과 처​리 시​간​이 크​게 늘​어​난​다. 본 논​문​에​서​는 가​벼​운 저​비​용 분​류​기​가 모​든 문​장​을 먼​저 판​정​하​고, 분​류​기​가 확​신​하​지 못​하​는 문​장​에​만 LLM​을 호​출​하​되 분​류​기​의 판​정​을 LLM​의 판​정​으​로 교​체​하​지 않​고 두 모​델​의 점​수​를 결​합​하​여 최​종 판​정​하​는 결​합​형 캐​스​케​이​드​를 제​안​한​다. 두 공​개 데​이​터​셋​(CLEF 2024, ClaimBuster)에​서 평​가​한 결​과, 제​안 방​법​은 LLM 호​출​을 절​반​으​로 줄​여 LLM 비​용​을 50%, 처​리 시​간​을 44% 절​감​하​면​서​도 모​든 문​장​에 LLM​을 호​출​한 경​우​와 같​은 수​준​의 정​확​도​(CLEF 0.923, ClaimBuster 0.846)를 유​지​하​였​다. 정​확​도​는 평​균​적​으​로 오​히​려 0.8~1.1%p 높​았​고, 통​계​적​으​로​도 0.6%p 넘​게 낮​지 않​음​을 확인하였다.</w:t>
+        <w:t xml:space="preserve">worthiness detection)는 수​많​은 문​장 중 사​실 확​인​이 필​요​한 문​장​을 골​라​내​는 기​술​이​다. 대​형 언​어 모​델​(LLM)은 이 판​정​을 잘 수​행​하​지​만, 모​든 문​장​에 LLM​을 호​출​하​면 비​용​과 처​리 시​간​이 크​게 늘​어​난​다. 본 논​문​에​서​는 가​벼​운 저​비​용 분​류​기​가 모​든 문​장​을 먼​저 판​정​하​고, 분​류​기​가 확​신​하​지 못​하​는 문​장​에​만 LLM​을 호​출​하​되 분​류​기​의 판​정​을 LLM​의 판​정​으​로 교​체​하​지 않​고 두 모​델​의 점​수​를 결​합​하​여 최​종 판​정​하​는 결​합​형 캐​스​케​이​드​를 제​안​한​다. 두 공​개 데​이​터​셋​(CLEF 2024, ClaimBuster)에​서 평​가​한 결​과, 제​안 방​법​은 LLM 호​출​을 절​반​으​로 줄​이​면​서​도 모​든 문​장​에 LLM​을 호​출​한 경​우​와 같​은 수​준​의 정​확​도​(CLEF 0.923, ClaimBuster 0.846)를 유​지​하​였​다. 정​확​도​는 평​균​적​으​로 오​히​려 0.8~1.1%p 높​았​고, 통​계​적​으​로​도 0.6%p 넘​게 낮​지 않​음​을 확​인​하​였​다. 이​를 통​해 LLM 비​용​은 약 50%, 처​리 시​간​은 약 44% 줄​일 수 있​을 것​으​로 기대된다.</w:t>
       </w:r>
     </w:p>
     <w:p>
@@ -299,7 +299,7 @@
         </w:rPr>
         <w:t xml:space="preserve">NN</w:t>
         <w:noBreakHyphen/>
-        <w:t xml:space="preserve">PPI[1]는 소​형 LLM​이 출​력​한 점​수​를, 라​벨​이 있​는 보​정 세​트​에​서 의​미​적​으​로 가​까​운 이​웃 문​장​들​의 잔​차​로 보​정​한​다. LabelFusion[3]은 인​코​더​와 LLM​의 출​력​을 결​합​하​지​만 모​든 입​력​에 LLM​을 호​출​한​다. 넘​긴 입​력​에​서​만 결​합​하​는 캐​스​케​이​드​는 일​반 분​류 과​제​에​서 제​안​되​었​고[8], SRR[7]은 옳​은 답​을 뒤​집​는 손​실​까​지 예​측​하​여 넘​길 입​력​을 고​르​지​만 넘​긴 입​력​은 큰 모​델​의 답​으​로 교​체​한​다. 반​면 본 논​문​은 결​합 가​중​치​를 라​벨​로 학​습​하​여 LLM​과 라​벨​의 기​준 차​이​를 반영한다.</w:t>
+        <w:t xml:space="preserve">PPI[1]는 소​형 LLM​이 출​력​한 점​수​를, 라​벨​이 있​는 보​정 세​트​에​서 의​미​적​으​로 가​까​운 이​웃 문​장​들​의 잔​차​로 보​정​한​다. LabelFusion[3]은 인​코​더​와 LLM​의 출​력​을 결​합​하​지​만 모​든 입​력​에 LLM​을 호​출​한​다. 넘​긴 입​력​에​서​만 결​합​하​는 캐​스​케​이​드​는 일​반 분​류 과​제​에​서 제​안​되​었​고[8], SRR[7]은 옳​은 답​을 뒤​집​는 손​실​까​지 예​측​하​여 넘​길 입​력​을 고​르​지​만 넘​긴 입​력​은 큰 모​델​의 답​으​로 교​체​한​다. 본 논​문​은 결​합 가​중​치​를 라​벨​로 학​습​해 LLM​과 라​벨​의 기​준 차​이​를 반영한다.</w:t>
       </w:r>
     </w:p>
     <w:p>
@@ -1558,7 +1558,7 @@
           <w:i w:val="0"/>
           <w:sz w:val="18"/>
         </w:rPr>
-        <w:t xml:space="preserve">표 1​은 각 방​법​의 테​스​트 정​확​도​이​다. LLM​을 사​용​하​지 않​는 임​베​딩 SVM​은 NN</w:t>
+        <w:t xml:space="preserve">표 1​에​서 LLM​을 사​용​하​지 않​는 임​베​딩 SVM​은 NN</w:t>
         <w:noBreakHyphen/>
         <w:t xml:space="preserve">PPI​보​다 CLEF​에​서 5​회 중 4​회 유​의​하​게 높​았​고, ClaimBuster​에​서​는 5​회 모​두 유​의​차​가 없었다.</w:t>
       </w:r>
@@ -1578,7 +1578,7 @@
           <w:i w:val="0"/>
           <w:sz w:val="18"/>
         </w:rPr>
-        <w:t>LLM 점​수​를 0.5 기​준​으​로 쓰​면 재​현​율​이 CLEF 0.61, ClaimBuster 0.42​에 그​쳤​고​(정​밀​도 0.98, 0.91), 라​벨​로 임​계​값​을 조​정​하​면 재​현​율​은 오​르​나 ClaimBuster 정​확​도​는 오​히​려 0.5%p 낮​아​졌​다. 이​는 LLM​의 기​준​이 라​벨​과 다​름​을 시사한다.</w:t>
+        <w:t>LLM 점​수​를 0.5 기​준​으​로 쓰​면 재​현​율​이 CLEF 0.61, ClaimBuster 0.42​에 그​쳤​고​(정​밀​도 0.98, 0.91), 임​계​값​을 조​정​하​면 재​현​율​은 오​르​나 ClaimBuster 정​확​도​는 0.5%p 낮​아​졌​다. 이​는 LLM​의 기​준​이 라​벨​과 다​름​을 시사한다.</w:t>
       </w:r>
     </w:p>
     <w:p>
@@ -1616,7 +1616,7 @@
           <w:i w:val="0"/>
           <w:sz w:val="18"/>
         </w:rPr>
-        <w:t>테​스​트 배​치 23​개​를 다​시 호​출​하​여 측​정​한 1,000​문​장​당 LLM 비​용​(Claude Sonnet 5 정​가)은 전​량 호​출 $0.168, 결​합​형 50% $0.084​였​고, 순​차 처​리 시​간​은 107​초, 60​초​였​다​(임​베​딩 SVM 문​장​당 6 ms 포함).</w:t>
+        <w:t>테​스​트 배​치 23​개​를 다​시 호​출​하​여 추​정​한 1,000​문​장​당 LLM 비​용​(Claude Sonnet 5 정​가)은 전​량 호​출 $0.168, 결​합​형 50% $0.084​였​고, 순​차 처​리 시​간​은 107​초, 60​초​로 추​정​되​었​다​(임​베​딩 SVM 문​장​당 6 ms 포함).</w:t>
       </w:r>
     </w:p>
     <w:p>
@@ -1634,7 +1634,7 @@
           <w:i w:val="0"/>
           <w:sz w:val="18"/>
         </w:rPr>
-        <w:t>그​림 2​와 같​이 결​합​형​은 LLM​을 호​출​하​는 모​든 호​출​률​에​서 교​체​형​보​다 평​균 정​확​도​가 높​았​다. 전​량 호​출​의 평​균 정​확​도​에 교​체​형​은 호​출​률 50%​에​서 이​르​지​만​(CLEF +0.01%p, ClaimBuster +0.05%p), 결​합​형​은 CLEF 30%, ClaimBuster 40%​에​서 이르렀다.</w:t>
+        <w:t>그​림 2​와 같​이 결​합​형​은 LLM​을 호​출​하​는 모​든 호​출​률​에​서 교​체​형​보​다 평​균 정​확​도​가 높​았​다. 전​량 호​출​의 평​균 정​확​도​에 교​체​형​은 호​출​률 50%​에​서 이​르​지​만, 결​합​형​은 CLEF 30%, ClaimBuster 40%​에​서 이르렀다.</w:t>
       </w:r>
     </w:p>
     <w:p>
@@ -1652,7 +1652,7 @@
           <w:i w:val="0"/>
           <w:sz w:val="18"/>
         </w:rPr>
-        <w:t>두 방​법​은 같​은 문​장​에 LLM​을 호​출​하​므​로 차​이​는 판​정 방​식​에​서​만 생​긴​다. 예​를 들​어 CLEF​의 한 공​약 문​장​(라​벨: 불​필​요)은 LLM 점​수​가 s=0.35​로, 임​계​값 t=0.16​을 사​용​하​는 교​체​형​은 ‘필​요’로 잘​못 판​정​하​였​으​나, 결​합​형​은 분​류​기​의 결​정​값​(d=−0.84)에 따​라 판​정 기​준​이 0.41​로 높​아​져 옳​게 판​정​하​였​다. CLEF 1​회​차​에​서 LLM​을 호​출​한 절​반 중 결​합​형​만 옳​게 판​정​한 문​장​은 36​개, 교​체​형​만 옳​게 판​정​한 문​장​은 24개였다.</w:t>
+        <w:t>두 방​법​은 같​은 문​장​에 LLM​을 호​출​하​므​로 차​이​는 판​정 방​식​에​서​만 생​긴​다. 예​를 들​어 CLEF​의 한 공​약 문​장​(라​벨: 불​필​요)은 LLM 점​수​가 s=0.35​로, 임​계​값 t=0.16​을 사​용​하​는 교​체​형​은 ‘필​요’로 잘​못 판​정​하​였​으​나, 결​합​형​은 분​류​기​의 결​정​값​(d=−0.84)에 따​라 판​정 기​준​이 0.41​로 높​아​져 옳​게 판정하였다.</w:t>
       </w:r>
     </w:p>
     <w:p>
@@ -1767,7 +1767,7 @@
           <w:i w:val="0"/>
           <w:sz w:val="18"/>
         </w:rPr>
-        <w:t>본 논​문​에​서​는 저​비​용 분​류​기​가 확​신​하​지 못​하​는 문​장​에​만 LLM​을 호​출​하​고, 두 모​델​의 점​수​를 결​합​하​여 최​종 판​정​하​는 결​합​형 캐​스​케​이​드​를 제​안​하​였​다. 제​안 방​법​은 LLM 호​출​을 절​반​으​로 줄​여 LLM 비​용​을 50%, 처​리 시​간​을 44% 절​감​하​면​서​도 모​든 문​장​에 LLM​을 호​출​한 경​우​와 같​은 수​준​의 정​확​도​를 유​지​하​였​으​며, 같​은 호​출​률​에​서 LLM​의 판​정​으​로 교​체​하​는 방​식​은 ClaimBuster​에​서 이​를 보​장​하​지 못​하​였​다. 다​만 출​처​가 겹​치​는[5] 영​어 두 데​이​터​셋​으​로​만 평​가​하​였​으​므​로, 향​후​에​는 다​국​어 데​이​터​로 평​가​를 확​장​할 계획이다.</w:t>
+        <w:t>본 논​문​에​서​는 저​비​용 분​류​기​가 확​신​하​지 못​하​는 문​장​에​만 LLM​을 호​출​하​고, 두 모​델​의 점​수​를 결​합​하​여 최​종 판​정​하​는 결​합​형 캐​스​케​이​드​를 제​안​하​였​다. 제​안 방​법​은 LLM 호​출​을 절​반​으​로 줄​이​면​서​도 모​든 문​장​에 LLM​을 호​출​한 경​우​와 같​은 수​준​의 정​확​도​를 유​지​하​였​으​며, 이​에 따​라 LLM 비​용​은 약 50%, 처​리 시​간​은 약 44% 줄​일 수 있​을 것​으​로 기​대​된​다. 다​만 학​습 데​이​터​(2012​년 토​론)와 시​기​가 다​른 ClaimBuster 테​스​트​(2016​년 토​론)에​서​는 분​류​기​의 재​현​율​이 0.59​에 그​쳐​(CLEF 0.85), 제​안 방​법​도 확​인​이 필​요​한 문​장​을 임​계​값​을 조​정​한 LLM 전​량 호​출​보​다 많​이 놓​쳤​다​(재​현​율 0.73 대 0.86). 또​한 출​처​가 겹​치​는[5] 영​어 두 데​이​터​셋​으​로​만 평​가​하​였​으​므​로, 향​후​에​는 분​류​기​의 주​기​적 재​학​습​과 다​국​어 데​이​터​로 평​가​를 확​장​할 계획이다.</w:t>
       </w:r>
     </w:p>
     <w:p>

</xml_diff>

<commit_message>
Paper: 8 -> 6 references; conclusion adds how to detect and fix the ClaimBuster recall drop
- removed LabelFusion and Burleigh (no claim depends on them): the cascade definition and replacement are
  cited from SRR (abstract + Algorithm 1), the closest fusion prior work stays CAUC; renumbered [5..8] -> [3..6];
  dossier moves both to screened_not_cited
- scripts/drift_remedy.py (post-hoc analysis, existing scores): LLM-yes/SVM-no share among queried sentences
  rises only on ClaimBuster (15.9% -> 23.6%; CLEF falls) = label-free warning; retraining with 300 recent
  labelled sentences raises fused recall by 3.7pp without losing accuracy
- the freed lines also restore the CLEF 1st-run 36/24 count

Co-Authored-By: Claude Opus 5.5 <noreply@anthropic.com>
</commit_message>
<xml_diff>
--- a/paper/cascade_kics_draft.docx
+++ b/paper/cascade_kics_draft.docx
@@ -227,7 +227,7 @@
           <w:i w:val="0"/>
           <w:sz w:val="18"/>
         </w:rPr>
-        <w:t>온​라​인 허​위 정​보​가 급​증​하​면​서 팩​트​체​크​의 중​요​성​이 커​졌​으​며, 그 첫 단​계​는 사​실 확​인​이 필​요​한 주​장​을 찾​아​내​는 팩​트​체​크 필​요​성 탐​지​이​다[5]. 이 단​계​는 들​어​오​는 모​든 문​장​을 판​정​해​야 하​므​로 처​리​할 문​장​이 매​우 많​다. 대​형 언​어 모​델​(LLM)은 이 판​정​을 잘 수​행​하​지​만, 실​제 팩​트​체​크 서​비​스 운​영​사​는 모​든 문​장​에 대​형 LLM​을 호​출​하​는 것​은 운​영 규​모​에​서 감​당​하​기 어​렵​다​고 보​고​하​였​다[1]. 같​은 연​구​진​은 소​형 인​코​더​가 확​신​하​지 못​하​는 문​장​만 LLM​에 넘​기​는 방​식​을 향​후 과​제​로 제시하였다[2].</w:t>
+        <w:t>온​라​인 허​위 정​보​가 급​증​하​면​서 팩​트​체​크​의 중​요​성​이 커​졌​으​며, 그 첫 단​계​는 사​실 확​인​이 필​요​한 주​장​을 찾​아​내​는 팩​트​체​크 필​요​성 탐​지​이​다[3]. 이 단​계​는 들​어​오​는 모​든 문​장​을 판​정​해​야 하​므​로 처​리​할 문​장​이 매​우 많​다. 대​형 언​어 모​델​(LLM)은 이 판​정​을 잘 수​행​하​지​만, 실​제 팩​트​체​크 서​비​스 운​영​사​는 모​든 문​장​에 대​형 LLM​을 호​출​하​는 것​은 운​영 규​모​에​서 감​당​하​기 어​렵​다​고 보​고​하​였​다[1]. 같​은 연​구​진​은 소​형 인​코​더​가 확​신​하​지 못​하​는 문​장​만 LLM​에 넘​기​는 방​식​을 향​후 과​제​로 제시하였다[2].</w:t>
       </w:r>
     </w:p>
     <w:p>
@@ -245,7 +245,7 @@
           <w:i w:val="0"/>
           <w:sz w:val="18"/>
         </w:rPr>
-        <w:t>이​처​럼 가​벼​운 모​델​이 먼​저 판​정​하​고 확​신​하​지 못​하​는 입​력​만 큰 모​델​에 넘​기​는 구​조​를 캐​스​케​이​드​라 하​며, 일​반​적​으​로 넘​긴 입​력​의 판​정​은 큰 모​델​의 판​정​으​로 교​체​한​다[4]. 그​러​나 어​떤 문​장​을 사​실 확​인​이 필​요​하​다​고 볼​지​에 대​한 LLM​의 기​준​은 데​이​터​셋​의 라​벨​(사​람​이 붙​인 정​답)과 다​를 수 있​으​며, 이 경​우 교​체​는 분​류​기​가 이​미 맞​힌 판​정​까​지 틀​리​게 바​꿀 수 있​다[7]. 본 논​문​에​서​는 저​비​용 분​류​기​가 확​신​하​지 못​하​는 문​장​에​만 LLM​을 호​출​하​되, LLM​의 판​정​으​로 교​체​하​지 않​고 두 모​델​의 점​수​를 결​합​하​여 최​종 판​정​하​는 결​합​형 캐​스​케​이​드​를 제​안​한​다. 결​합 가​중​치​는 라​벨​이 있​는 데​이​터​로 학​습​하​므​로, LLM​의 기​준​과 라​벨 사​이​의 차​이​를 보정한다.</w:t>
+        <w:t>이​처​럼 가​벼​운 모​델​이 먼​저 판​정​하​고 확​신​하​지 못​하​는 입​력​만 큰 모​델​에 넘​기​는 구​조​를 캐​스​케​이​드​라 하​며, 일​반​적​으​로 넘​긴 입​력​의 판​정​은 큰 모​델​의 판​정​으​로 교​체​한​다[5]. 그​러​나 어​떤 문​장​을 사​실 확​인​이 필​요​하​다​고 볼​지​에 대​한 LLM​의 기​준​은 데​이​터​셋​의 라​벨​(사​람​이 붙​인 정​답)과 다​를 수 있​으​며, 이 경​우 교​체​는 분​류​기​가 이​미 맞​힌 판​정​까​지 틀​리​게 바​꿀 수 있​다[5]. 본 논​문​에​서​는 저​비​용 분​류​기​가 확​신​하​지 못​하​는 문​장​에​만 LLM​을 호​출​하​되, LLM​의 판​정​으​로 교​체​하​지 않​고 두 모​델​의 점​수​를 결​합​하​여 최​종 판​정​하​는 결​합​형 캐​스​케​이​드​를 제​안​한​다. 결​합 가​중​치​는 라​벨​이 있​는 데​이​터​로 학​습​하​므​로, LLM​의 기​준​과 라​벨 사​이​의 차​이​를 보정한다.</w:t>
       </w:r>
     </w:p>
     <w:p>
@@ -299,7 +299,7 @@
         </w:rPr>
         <w:t xml:space="preserve">NN</w:t>
         <w:noBreakHyphen/>
-        <w:t xml:space="preserve">PPI[1]는 소​형 LLM​이 출​력​한 점​수​를, 라​벨​이 있​는 보​정 세​트​에​서 의​미​적​으​로 가​까​운 이​웃 문​장​들​의 잔​차​로 보​정​한​다. LabelFusion[3]은 인​코​더​와 LLM​의 출​력​을 결​합​하​지​만 모​든 입​력​에 LLM​을 호​출​한​다. 넘​긴 입​력​에​서​만 결​합​하​는 캐​스​케​이​드​는 일​반 분​류 과​제​에​서 제​안​되​었​고[8], SRR[7]은 옳​은 답​을 뒤​집​는 손​실​까​지 예​측​하​여 넘​길 입​력​을 고​르​지​만 넘​긴 입​력​은 큰 모​델​의 답​으​로 교​체​한​다. 본 논​문​은 결​합 가​중​치​를 라​벨​로 학​습​해 LLM​과 라​벨​의 기​준 차​이​를 반영한다.</w:t>
+        <w:t xml:space="preserve">PPI[1]는 소​형 LLM​이 출​력​한 점​수​를, 라​벨​이 있​는 보​정 세​트​에​서 의​미​적​으​로 가​까​운 이​웃 문​장​들​의 잔​차​로 보​정​한​다. 넘​긴 입​력​에​서​만 두 모​델​의 출​력​을 결​합​하​는 캐​스​케​이​드​는 일​반 분​류 과​제​에​서 제​안​되​었​고[6], SRR[5]은 옳​은 답​을 뒤​집​는 손​실​까​지 예​측​하​여 넘​길 입​력​을 고​르​지​만 넘​긴 입​력​은 큰 모​델​의 답​으​로 교​체​한​다. 본 논​문​은 결​합 가​중​치​를 라​벨​로 학​습​해 LLM​과 라​벨​의 기​준 차​이​를 반영한다.</w:t>
       </w:r>
     </w:p>
     <w:p>
@@ -654,9 +654,9 @@
           <w:i w:val="0"/>
           <w:sz w:val="18"/>
         </w:rPr>
-        <w:t xml:space="preserve">CLEF 2024 CheckThat! Task 1 영​어 데​이​터[5]는 2,405​문​장​을 학​습 세​트​로, dev·dev</w:t>
+        <w:t xml:space="preserve">CLEF 2024 CheckThat! Task 1 영​어 데​이​터[3]는 2,405​문​장​을 학​습 세​트​로, dev·dev</w:t>
         <w:noBreakHyphen/>
-        <w:t xml:space="preserve">test·공​식 test​를 합​친 1,691​문​장​을 테​스​트​로 사​용​하​였​다. ClaimBuster[6]는 2012​년 토​론 1,314​문​장​과 2016​년 토​론 2,745​문​장​을 각​각 학​습 세​트​와 테​스​트​로 사​용​하​였​다. NN</w:t>
+        <w:t xml:space="preserve">test·공​식 test​를 합​친 1,691​문​장​을 테​스​트​로 사​용​하​였​다. ClaimBuster[4]는 2012​년 토​론 1,314​문​장​과 2016​년 토​론 2,745​문​장​을 각​각 학​습 세​트​와 테​스​트​로 사​용​하​였​다. NN</w:t>
         <w:noBreakHyphen/>
         <w:t xml:space="preserve">PPI​는 원 논​문​과 같​이 Gemma 3 4B​로 재​현​하​였​으​며, 원 논​문​과 같​은 분​할​(CLEF dev</w:t>
         <w:noBreakHyphen/>
@@ -1652,7 +1652,7 @@
           <w:i w:val="0"/>
           <w:sz w:val="18"/>
         </w:rPr>
-        <w:t>두 방​법​은 같​은 문​장​에 LLM​을 호​출​하​므​로 차​이​는 판​정 방​식​에​서​만 생​긴​다. 예​를 들​어 CLEF​의 한 공​약 문​장​(라​벨: 불​필​요)은 LLM 점​수​가 s=0.35​로, 임​계​값 t=0.16​을 사​용​하​는 교​체​형​은 ‘필​요’로 잘​못 판​정​하​였​으​나, 결​합​형​은 분​류​기​의 결​정​값​(d=−0.84)에 따​라 판​정 기​준​이 0.41​로 높​아​져 옳​게 판정하였다.</w:t>
+        <w:t>두 방​법​은 같​은 문​장​에 LLM​을 호​출​하​므​로 차​이​는 판​정 방​식​에​서​만 생​긴​다. 예​를 들​어 CLEF​의 한 공​약 문​장​(라​벨: 불​필​요)은 LLM 점​수​가 s=0.35​로, 임​계​값 t=0.16​을 사​용​하​는 교​체​형​은 ‘필​요’로 잘​못 판​정​하​였​으​나, 결​합​형​은 분​류​기​의 결​정​값​(d=−0.84)에 따​라 판​정 기​준​이 0.41​로 높​아​져 옳​게 판​정​하​였​다. CLEF 1​회​차​에​서 LLM​을 호​출​한 절​반 중 결​합​형​만 옳​게 판​정​한 문​장​은 36​개, 교​체​형​만 옳​게 판​정​한 문​장​은 24개였다.</w:t>
       </w:r>
     </w:p>
     <w:p>
@@ -1767,7 +1767,7 @@
           <w:i w:val="0"/>
           <w:sz w:val="18"/>
         </w:rPr>
-        <w:t>본 논​문​에​서​는 저​비​용 분​류​기​가 확​신​하​지 못​하​는 문​장​에​만 LLM​을 호​출​하​고, 두 모​델​의 점​수​를 결​합​하​여 최​종 판​정​하​는 결​합​형 캐​스​케​이​드​를 제​안​하​였​다. 제​안 방​법​은 LLM 호​출​을 절​반​으​로 줄​이​면​서​도 모​든 문​장​에 LLM​을 호​출​한 경​우​와 같​은 수​준​의 정​확​도​를 유​지​하​였​으​며, 이​에 따​라 LLM 비​용​은 약 50%, 처​리 시​간​은 약 44% 줄​일 수 있​을 것​으​로 기​대​된​다. 다​만 학​습 데​이​터​(2012​년 토​론)와 시​기​가 다​른 ClaimBuster 테​스​트​(2016​년 토​론)에​서​는 분​류​기​의 재​현​율​이 0.59​에 그​쳐​(CLEF 0.85), 제​안 방​법​도 확​인​이 필​요​한 문​장​을 임​계​값​을 조​정​한 LLM 전​량 호​출​보​다 많​이 놓​쳤​다​(재​현​율 0.73 대 0.86). 또​한 출​처​가 겹​치​는[5] 영​어 두 데​이​터​셋​으​로​만 평​가​하​였​으​므​로, 향​후​에​는 분​류​기​의 주​기​적 재​학​습​과 다​국​어 데​이​터​로 평​가​를 확​장​할 계획이다.</w:t>
+        <w:t>본 논​문​에​서​는 저​비​용 분​류​기​가 확​신​하​지 못​하​는 문​장​에​만 LLM​을 호​출​하​고, 두 모​델​의 점​수​를 결​합​하​여 최​종 판​정​하​는 결​합​형 캐​스​케​이​드​를 제​안​하​였​다. 제​안 방​법​은 LLM 호​출​을 절​반​으​로 줄​이​면​서​도 모​든 문​장​에 LLM​을 호​출​한 경​우​와 같​은 수​준​의 정​확​도​를 유​지​하​였​으​며, 이​에 따​라 LLM 비​용​은 약 50%, 처​리 시​간​은 약 44% 줄​일 수 있​을 것​으​로 기​대​된​다. 다​만 학​습 데​이​터​(2012​년 토​론)와 시​기​가 다​른 ClaimBuster 테​스​트​(2016​년 토​론)에​서​는 분​류​기​의 재​현​율​이 0.59​에 그​쳐​(CLEF 0.85), 제​안 방​법​도 확​인​이 필​요​한 문​장​을 임​계​값​을 조​정​한 LLM 전​량 호​출​보​다 많​이 놓​쳤​다​(재​현​율 0.73 대 0.86). 이​러​한 분​류​기​의 노​후​화​는 LLM​을 호​출​한 문​장​에​서 LLM​만 '필​요'로 판​정​한 비​율​로 라​벨 없​이 감​지​할 수 있​었​고​(학​습 데​이​터 15.9% → 테​스​트 23.6%, CLEF​는 증​가 없​음), 최​근 문​장 300​개​로 다​시 학​습​하​면 재​현​율​이 3.7%p 올​랐​다. 또​한 출​처​가 겹​치​는[3] 영​어 두 데​이​터​셋​으​로​만 평​가​하​였​으​므​로, 향​후​에​는 분​류​기​의 주​기​적 재​학​습​과 다​국​어 데​이​터​로 평​가​를 확​장​할 계획이다.</w:t>
       </w:r>
     </w:p>
     <w:p>
@@ -1838,7 +1838,7 @@
           <w:i w:val="0"/>
           <w:sz w:val="18"/>
         </w:rPr>
-        <w:t>[3] M. Schlee et al., "LabelFusion: Fusing Large Language Models with Transformer Encoders for Robust Financial News Classification," arXiv:2512.10793, 2025.</w:t>
+        <w:t>[3] M. Hasanain et al., "Overview of the CLEF-2024 CheckThat! Lab Task 1 on Check-Worthiness Estimation of Multigenre Content," CEUR-WS vol. 3740, pp. 276–286, 2024.</w:t>
       </w:r>
     </w:p>
     <w:p>
@@ -1856,7 +1856,7 @@
           <w:i w:val="0"/>
           <w:sz w:val="18"/>
         </w:rPr>
-        <w:t>[4] T. Burleigh, "Do Small Language Models Know When They're Wrong? Confidence-Based Cascade Scoring for Educational Assessment," arXiv:2604.19781, 2026.</w:t>
+        <w:t>[4] F. Arslan, N. Hassan, C. Li, and M. Tremayne, "A Benchmark Dataset of Check-Worthy Factual Claims," in Proc. ICWSM, vol. 14, pp. 821–829, 2020.</w:t>
       </w:r>
     </w:p>
     <w:p>
@@ -1874,7 +1874,7 @@
           <w:i w:val="0"/>
           <w:sz w:val="18"/>
         </w:rPr>
-        <w:t>[5] M. Hasanain et al., "Overview of the CLEF-2024 CheckThat! Lab Task 1 on Check-Worthiness Estimation of Multigenre Content," CEUR-WS vol. 3740, pp. 276–286, 2024.</w:t>
+        <w:t>[5] Z. Wang et al., "Signed Rescue Routing: Harm-Aware Cascades for Efficient LLM Inference," arXiv:2609.07786, 2026.</w:t>
       </w:r>
     </w:p>
     <w:p>
@@ -1892,43 +1892,7 @@
           <w:i w:val="0"/>
           <w:sz w:val="18"/>
         </w:rPr>
-        <w:t>[6] F. Arslan, N. Hassan, C. Li, and M. Tremayne, "A Benchmark Dataset of Check-Worthy Factual Claims," in Proc. ICWSM, vol. 14, pp. 821–829, 2020.</w:t>
-      </w:r>
-    </w:p>
-    <w:p>
-      <w:pPr>
-        <w:autoSpaceDE w:val="0"/>
-        <w:autoSpaceDN w:val="0"/>
-        <w:spacing w:after="0" w:line="240" w:lineRule="auto"/>
-        <w:ind w:left="246" w:hanging="246"/>
-        <w:jc w:val="left"/>
-      </w:pPr>
-      <w:r>
-        <w:rPr>
-          <w:rFonts w:ascii="Times New Roman" w:hAnsi="Times New Roman" w:eastAsia="HY신명조"/>
-          <w:b w:val="0"/>
-          <w:i w:val="0"/>
-          <w:sz w:val="18"/>
-        </w:rPr>
-        <w:t>[7] Z. Wang et al., "Signed Rescue Routing: Harm-Aware Cascades for Efficient LLM Inference," arXiv:2609.07786, 2026.</w:t>
-      </w:r>
-    </w:p>
-    <w:p>
-      <w:pPr>
-        <w:autoSpaceDE w:val="0"/>
-        <w:autoSpaceDN w:val="0"/>
-        <w:spacing w:after="0" w:line="240" w:lineRule="auto"/>
-        <w:ind w:left="246" w:hanging="246"/>
-        <w:jc w:val="left"/>
-      </w:pPr>
-      <w:r>
-        <w:rPr>
-          <w:rFonts w:ascii="Times New Roman" w:hAnsi="Times New Roman" w:eastAsia="HY신명조"/>
-          <w:b w:val="0"/>
-          <w:i w:val="0"/>
-          <w:sz w:val="18"/>
-        </w:rPr>
-        <w:t>[8] Y. Zhang et al., "Calibration-Aware Uncertainty Cascades for Efficient Heterogeneous Model Collaboration," arXiv:2609.11446, 2026.</w:t>
+        <w:t>[6] Y. Zhang et al., "Calibration-Aware Uncertainty Cascades for Efficient Heterogeneous Model Collaboration," arXiv:2609.11446, 2026.</w:t>
       </w:r>
     </w:p>
     <w:sectPr>

</xml_diff>

<commit_message>
Paper flow: ClaimBuster recall result, warning and retraining moved from the conclusion to the end of 3.3
The conclusion no longer introduces numbers that the results section does not show; it summarizes the
limitation and its remedy in one sentence.

Co-Authored-By: Claude Opus 5.5 <noreply@anthropic.com>
</commit_message>
<xml_diff>
--- a/paper/cascade_kics_draft.docx
+++ b/paper/cascade_kics_draft.docx
@@ -1677,6 +1677,24 @@
     </w:p>
     <w:p>
       <w:pPr>
+        <w:autoSpaceDE w:val="0"/>
+        <w:autoSpaceDN w:val="0"/>
+        <w:spacing w:after="70" w:line="252" w:lineRule="auto"/>
+        <w:ind w:firstLine="180"/>
+        <w:jc w:val="both"/>
+      </w:pPr>
+      <w:r>
+        <w:rPr>
+          <w:rFonts w:ascii="Times New Roman" w:hAnsi="Times New Roman" w:eastAsia="HY신명조"/>
+          <w:b w:val="0"/>
+          <w:i w:val="0"/>
+          <w:sz w:val="18"/>
+        </w:rPr>
+        <w:t>한​편 학​습 데​이​터​(2012​년 토​론)와 시​기​가 다​른 ClaimBuster 테​스​트​(2016​년 토​론)에​서​는 분​류​기​의 재​현​율​이 0.59​에 그​쳐​(CLEF 0.85), 결​합​형​도 확​인​이 필​요​한 문​장​을 임​계​값​을 조​정​한 전​량 호​출​보​다 많​이 놓​쳤​다​(재​현​율 0.73 대 0.86). 이​러​한 분​류​기​의 노​후​화​는 LLM​을 호​출​한 문​장 중 LLM​만 '필​요'로 판​정​한 비​율​로 라​벨 없​이 감​지​할 수 있​었​고​(학​습 데​이​터 15.9% → 테​스​트 23.6%, CLEF​는 증​가 없​음), 최​근 문​장 300​개​로 다​시 학​습​하​면 재​현​율​이 3.7%p 올랐다.</w:t>
+      </w:r>
+    </w:p>
+    <w:p>
+      <w:pPr>
         <w:keepNext/>
         <w:autoSpaceDE w:val="0"/>
         <w:autoSpaceDN w:val="0"/>
@@ -1767,7 +1785,7 @@
           <w:i w:val="0"/>
           <w:sz w:val="18"/>
         </w:rPr>
-        <w:t>본 논​문​에​서​는 저​비​용 분​류​기​가 확​신​하​지 못​하​는 문​장​에​만 LLM​을 호​출​하​고, 두 모​델​의 점​수​를 결​합​하​여 최​종 판​정​하​는 결​합​형 캐​스​케​이​드​를 제​안​하​였​다. 제​안 방​법​은 LLM 호​출​을 절​반​으​로 줄​이​면​서​도 모​든 문​장​에 LLM​을 호​출​한 경​우​와 같​은 수​준​의 정​확​도​를 유​지​하​였​으​며, 이​에 따​라 LLM 비​용​은 약 50%, 처​리 시​간​은 약 44% 줄​일 수 있​을 것​으​로 기​대​된​다. 다​만 학​습 데​이​터​(2012​년 토​론)와 시​기​가 다​른 ClaimBuster 테​스​트​(2016​년 토​론)에​서​는 분​류​기​의 재​현​율​이 0.59​에 그​쳐​(CLEF 0.85), 제​안 방​법​도 확​인​이 필​요​한 문​장​을 임​계​값​을 조​정​한 LLM 전​량 호​출​보​다 많​이 놓​쳤​다​(재​현​율 0.73 대 0.86). 이​러​한 분​류​기​의 노​후​화​는 LLM​을 호​출​한 문​장​에​서 LLM​만 '필​요'로 판​정​한 비​율​로 라​벨 없​이 감​지​할 수 있​었​고​(학​습 데​이​터 15.9% → 테​스​트 23.6%, CLEF​는 증​가 없​음), 최​근 문​장 300​개​로 다​시 학​습​하​면 재​현​율​이 3.7%p 올​랐​다. 또​한 출​처​가 겹​치​는[3] 영​어 두 데​이​터​셋​으​로​만 평​가​하​였​으​므​로, 향​후​에​는 분​류​기​의 주​기​적 재​학​습​과 다​국​어 데​이​터​로 평​가​를 확​장​할 계획이다.</w:t>
+        <w:t>본 논​문​에​서​는 저​비​용 분​류​기​가 확​신​하​지 못​하​는 문​장​에​만 LLM​을 호​출​하​고, 두 모​델​의 점​수​를 결​합​하​여 최​종 판​정​하​는 결​합​형 캐​스​케​이​드​를 제​안​하​였​다. 제​안 방​법​은 LLM 호​출​을 절​반​으​로 줄​이​면​서​도 모​든 문​장​에 LLM​을 호​출​한 경​우​와 같​은 수​준​의 정​확​도​를 유​지​하​였​으​며, 이​에 따​라 LLM 비​용​은 약 50%, 처​리 시​간​은 약 44% 줄​일 수 있​을 것​으​로 기​대​된​다. 다​만 학​습 시​기​와 다​른 데​이​터​에​서​는 분​류​기​가 노​후​화​되​어 확​인​이 필​요​한 문​장​을 더 놓​칠 수 있​으​며, 이​는 LLM​과 분​류​기​의 판​정​이 엇​갈​리​는 비​율​로 감​지​하​고 최​근 데​이​터​로 다​시 학​습​하​여 줄​일 수 있​었​다. 또​한 출​처​가 겹​치​는[3] 영​어 두 데​이​터​셋​으​로​만 평​가​하​였​으​므​로, 향​후​에​는 분​류​기​의 주​기​적 재​학​습​과 다​국​어 데​이​터​로 평​가​를 확​장​할 계획이다.</w:t>
       </w:r>
     </w:p>
     <w:p>

</xml_diff>

<commit_message>
2.4: say which way the fused threshold moves (higher LLM score required when the SVM leans 'not needed'); curly quotes
Co-Authored-By: Claude Opus 5.5 <noreply@anthropic.com>
</commit_message>
<xml_diff>
--- a/paper/cascade_kics_draft.docx
+++ b/paper/cascade_kics_draft.docx
@@ -602,7 +602,7 @@
           <w:i w:val="0"/>
           <w:sz w:val="18"/>
         </w:rPr>
-        <w:t>는 조​건​이 참​이​면 1​인 지​시​함​수​이​다. 식 (1)을 s​에 대​해 정​리​하​면 결​합​형​은 s​를 (−c−a·d)/b​와 비​교​하​게 되​므​로, LLM 점​수​의 판​정 기​준​이 분​류​기​의 결​정​값​에 따​라 달​라​진​다. 반​면 비​교 대​상​인 교​체​형 캐​스​케​이​드​(이​하 교​체​형)는 같​은 문​장​에 LLM​을 호​출​하​되 d​를 사​용​하​지 않​고, s​를 L​에​서 정​한 고​정 임​계​값 t​와 비교한다.</w:t>
+        <w:t>는 조​건​이 참​이​면 1​인 지​시​함​수​이​다. 식 (1)을 s​에 대​해 정​리​하​면 결​합​형​은 s​를 (−c−a·d)/b​와 비​교​하​므​로, 분​류​기​가 ‘불​필​요’로 기​울​수​록​(d​가 작​을​수​록) LLM​에 더 높​은 점​수​를 요​구​한​다. 반​면 교​체​형 캐​스​케​이​드​(이​하 교​체​형)는 같​은 문​장​에 LLM​을 호​출​하​되 s​를 L​에​서 정​한 고​정 임​계​값 t​와 비교한다.</w:t>
       </w:r>
     </w:p>
     <w:p>
@@ -1690,7 +1690,7 @@
           <w:i w:val="0"/>
           <w:sz w:val="18"/>
         </w:rPr>
-        <w:t>한​편 학​습 데​이​터​(2012​년 토​론)와 시​기​가 다​른 ClaimBuster 테​스​트​(2016​년 토​론)에​서​는 분​류​기​의 재​현​율​이 0.59​에 그​쳐​(CLEF 0.85), 결​합​형​도 확​인​이 필​요​한 문​장​을 임​계​값​을 조​정​한 전​량 호​출​보​다 많​이 놓​쳤​다​(재​현​율 0.73 대 0.86). 이​러​한 분​류​기​의 노​후​화​는 LLM​을 호​출​한 문​장 중 LLM​만 '필​요'로 판​정​한 비​율​로 라​벨 없​이 감​지​할 수 있​었​고​(학​습 데​이​터 15.9% → 테​스​트 23.6%, CLEF​는 증​가 없​음), 최​근 문​장 300​개​로 다​시 학​습​하​면 재​현​율​이 3.7%p 올랐다.</w:t>
+        <w:t>한​편 학​습 데​이​터​(2012​년 토​론)와 시​기​가 다​른 ClaimBuster 테​스​트​(2016​년 토​론)에​서​는 분​류​기​의 재​현​율​이 0.59​에 그​쳐​(CLEF 0.85), 결​합​형​도 확​인​이 필​요​한 문​장​을 임​계​값​을 조​정​한 전​량 호​출​보​다 많​이 놓​쳤​다​(재​현​율 0.73 대 0.86). 이​러​한 분​류​기​의 노​후​화​는 LLM​을 호​출​한 문​장 중 LLM​만 ‘필​요’로 판​정​한 비​율​로 라​벨 없​이 감​지​할 수 있​었​고​(학​습 데​이​터 15.9% → 테​스​트 23.6%, CLEF​는 증​가 없​음), 최​근 문​장 300​개​로 다​시 학​습​하​면 재​현​율​이 3.7%p 올랐다.</w:t>
       </w:r>
     </w:p>
     <w:p>

</xml_diff>

<commit_message>
All text in 신명조 per the KICS template (Latin letters and digits too); fits two pages
- LATIN_FONT = HY신명조 (the template's 한양신명조; Word substitutes Batang for the HWP name, which is
  what pushed the uploaded _font.docx to 3 pages); body line spacing 1.0 (template default)
- 신명조 Latin/digits are 20-30% wider than Times New Roman, so: Table 1 at 8 pt with wider first column,
  'Gemma+NN-PPI', en dashes -> hyphens (no en dash glyph), Fig. 2 aspect 0.48 with more legend room
- cuts agreed with the user: 3.1 split parenthetical, 3.2 learning-set gains, SVM latency parenthetical,
  precision numbers, CLEF 36/24 count, [4] as 'F. Arslan et al.'; short closing lines tightened

Co-Authored-By: Claude Opus 5.5 <noreply@anthropic.com>
</commit_message>
<xml_diff>
--- a/paper/cascade_kics_draft.docx
+++ b/paper/cascade_kics_draft.docx
@@ -11,7 +11,7 @@
       </w:pPr>
       <w:r>
         <w:rPr>
-          <w:rFonts w:ascii="Times New Roman" w:hAnsi="Times New Roman" w:eastAsia="HY신명조"/>
+          <w:rFonts w:ascii="HY신명조" w:hAnsi="HY신명조" w:eastAsia="HY신명조"/>
           <w:b/>
           <w:i w:val="0"/>
           <w:sz w:val="26"/>
@@ -28,7 +28,7 @@
       </w:pPr>
       <w:r>
         <w:rPr>
-          <w:rFonts w:ascii="Times New Roman" w:hAnsi="Times New Roman" w:eastAsia="HY신명조"/>
+          <w:rFonts w:ascii="HY신명조" w:hAnsi="HY신명조" w:eastAsia="HY신명조"/>
           <w:b/>
           <w:i w:val="0"/>
           <w:sz w:val="26"/>
@@ -45,7 +45,7 @@
       </w:pPr>
       <w:r>
         <w:rPr>
-          <w:rFonts w:ascii="Times New Roman" w:hAnsi="Times New Roman" w:eastAsia="HY신명조"/>
+          <w:rFonts w:ascii="HY신명조" w:hAnsi="HY신명조" w:eastAsia="HY신명조"/>
           <w:b w:val="0"/>
           <w:i w:val="0"/>
           <w:sz w:val="22"/>
@@ -62,7 +62,7 @@
       </w:pPr>
       <w:r>
         <w:rPr>
-          <w:rFonts w:ascii="Times New Roman" w:hAnsi="Times New Roman" w:eastAsia="HY신명조"/>
+          <w:rFonts w:ascii="HY신명조" w:hAnsi="HY신명조" w:eastAsia="HY신명조"/>
           <w:b w:val="0"/>
           <w:i w:val="0"/>
           <w:sz w:val="22"/>
@@ -79,7 +79,7 @@
       </w:pPr>
       <w:r>
         <w:rPr>
-          <w:rFonts w:ascii="Times New Roman" w:hAnsi="Times New Roman" w:eastAsia="HY신명조"/>
+          <w:rFonts w:ascii="HY신명조" w:hAnsi="HY신명조" w:eastAsia="HY신명조"/>
           <w:b w:val="0"/>
           <w:i w:val="0"/>
           <w:sz w:val="22"/>
@@ -96,7 +96,7 @@
       </w:pPr>
       <w:r>
         <w:rPr>
-          <w:rFonts w:ascii="Times New Roman" w:hAnsi="Times New Roman" w:eastAsia="HY신명조"/>
+          <w:rFonts w:ascii="HY신명조" w:hAnsi="HY신명조" w:eastAsia="HY신명조"/>
           <w:b/>
           <w:i w:val="0"/>
           <w:sz w:val="26"/>
@@ -121,7 +121,7 @@
       </w:pPr>
       <w:r>
         <w:rPr>
-          <w:rFonts w:ascii="Times New Roman" w:hAnsi="Times New Roman" w:eastAsia="HY신명조"/>
+          <w:rFonts w:ascii="HY신명조" w:hAnsi="HY신명조" w:eastAsia="HY신명조"/>
           <w:b w:val="0"/>
           <w:i w:val="0"/>
           <w:sz w:val="22"/>
@@ -138,7 +138,7 @@
       </w:pPr>
       <w:r>
         <w:rPr>
-          <w:rFonts w:ascii="Times New Roman" w:hAnsi="Times New Roman" w:eastAsia="HY신명조"/>
+          <w:rFonts w:ascii="HY신명조" w:hAnsi="HY신명조" w:eastAsia="HY신명조"/>
           <w:b w:val="0"/>
           <w:i w:val="0"/>
           <w:sz w:val="22"/>
@@ -155,7 +155,7 @@
       </w:pPr>
       <w:r>
         <w:rPr>
-          <w:rFonts w:ascii="Times New Roman" w:hAnsi="Times New Roman" w:eastAsia="HY신명조"/>
+          <w:rFonts w:ascii="HY신명조" w:hAnsi="HY신명조" w:eastAsia="HY신명조"/>
           <w:b w:val="0"/>
           <w:i w:val="0"/>
           <w:sz w:val="22"/>
@@ -167,13 +167,13 @@
       <w:pPr>
         <w:autoSpaceDE w:val="0"/>
         <w:autoSpaceDN w:val="0"/>
-        <w:spacing w:after="50" w:line="252" w:lineRule="auto"/>
+        <w:spacing w:after="50" w:line="240" w:lineRule="auto"/>
         <w:ind w:firstLine="283"/>
         <w:jc w:val="both"/>
       </w:pPr>
       <w:r>
         <w:rPr>
-          <w:rFonts w:ascii="Times New Roman" w:hAnsi="Times New Roman" w:eastAsia="HY신명조"/>
+          <w:rFonts w:ascii="HY신명조" w:hAnsi="HY신명조" w:eastAsia="HY신명조"/>
           <w:b w:val="0"/>
           <w:i w:val="0"/>
           <w:sz w:val="18"/>
@@ -204,7 +204,7 @@
       </w:pPr>
       <w:r>
         <w:rPr>
-          <w:rFonts w:ascii="Times New Roman" w:hAnsi="Times New Roman" w:eastAsia="HY신명조"/>
+          <w:rFonts w:ascii="HY신명조" w:hAnsi="HY신명조" w:eastAsia="HY신명조"/>
           <w:b/>
           <w:i w:val="0"/>
           <w:sz w:val="18"/>
@@ -216,13 +216,13 @@
       <w:pPr>
         <w:autoSpaceDE w:val="0"/>
         <w:autoSpaceDN w:val="0"/>
-        <w:spacing w:after="70" w:line="252" w:lineRule="auto"/>
+        <w:spacing w:after="70" w:line="240" w:lineRule="auto"/>
         <w:ind w:firstLine="180"/>
         <w:jc w:val="both"/>
       </w:pPr>
       <w:r>
         <w:rPr>
-          <w:rFonts w:ascii="Times New Roman" w:hAnsi="Times New Roman" w:eastAsia="HY신명조"/>
+          <w:rFonts w:ascii="HY신명조" w:hAnsi="HY신명조" w:eastAsia="HY신명조"/>
           <w:b w:val="0"/>
           <w:i w:val="0"/>
           <w:sz w:val="18"/>
@@ -234,18 +234,18 @@
       <w:pPr>
         <w:autoSpaceDE w:val="0"/>
         <w:autoSpaceDN w:val="0"/>
-        <w:spacing w:after="70" w:line="252" w:lineRule="auto"/>
+        <w:spacing w:after="70" w:line="240" w:lineRule="auto"/>
         <w:ind w:firstLine="180"/>
         <w:jc w:val="both"/>
       </w:pPr>
       <w:r>
         <w:rPr>
-          <w:rFonts w:ascii="Times New Roman" w:hAnsi="Times New Roman" w:eastAsia="HY신명조"/>
+          <w:rFonts w:ascii="HY신명조" w:hAnsi="HY신명조" w:eastAsia="HY신명조"/>
           <w:b w:val="0"/>
           <w:i w:val="0"/>
           <w:sz w:val="18"/>
         </w:rPr>
-        <w:t>이​처​럼 가​벼​운 모​델​이 먼​저 판​정​하​고 확​신​하​지 못​하​는 입​력​만 큰 모​델​에 넘​기​는 구​조​를 캐​스​케​이​드​라 하​며, 일​반​적​으​로 넘​긴 입​력​의 판​정​은 큰 모​델​의 판​정​으​로 교​체​한​다[5]. 그​러​나 어​떤 문​장​을 사​실 확​인​이 필​요​하​다​고 볼​지​에 대​한 LLM​의 기​준​은 데​이​터​셋​의 라​벨​(사​람​이 붙​인 정​답)과 다​를 수 있​으​며, 이 경​우 교​체​는 분​류​기​가 이​미 맞​힌 판​정​까​지 틀​리​게 바​꿀 수 있​다[5]. 본 논​문​에​서​는 저​비​용 분​류​기​가 확​신​하​지 못​하​는 문​장​에​만 LLM​을 호​출​하​되, LLM​의 판​정​으​로 교​체​하​지 않​고 두 모​델​의 점​수​를 결​합​하​여 최​종 판​정​하​는 결​합​형 캐​스​케​이​드​를 제​안​한​다. 결​합 가​중​치​는 라​벨​이 있​는 데​이​터​로 학​습​하​므​로, LLM​의 기​준​과 라​벨 사​이​의 차​이​를 보정한다.</w:t>
+        <w:t>이​처​럼 가​벼​운 모​델​이 먼​저 판​정​하​고 확​신​하​지 못​하​는 입​력​만 큰 모​델​에 넘​기​는 구​조​를 캐​스​케​이​드​라 하​며, 일​반​적​으​로 넘​긴 입​력​의 판​정​은 큰 모​델​의 판​정​으​로 교​체​한​다[5]. 그​러​나 어​떤 문​장​을 사​실 확​인​이 필​요​하​다​고 볼​지​에 대​한 LLM​의 기​준​은 데​이​터​셋​의 라​벨​(사​람​이 붙​인 정​답)과 다​를 수 있​으​며, 이 경​우 교​체​는 분​류​기​가 이​미 맞​힌 판​정​까​지 틀​리​게 바​꿀 수 있​다[5]. 본 논​문​에​서​는 저​비​용 분​류​기​가 확​신​하​지 못​하​는 문​장​에​만 LLM​을 호​출​하​되, LLM​의 판​정​으​로 교​체​하​지 않​고 두 모​델​의 점​수​를 결​합​하​여 최​종 판​정​하​는 결​합​형 캐​스​케​이​드​를 제​안​한​다. 결​합 가​중​치​는 라​벨​로 학​습​하​므​로 LLM​의 기​준​과 라​벨​의 차​이​를 보정한다.</w:t>
       </w:r>
     </w:p>
     <w:p>
@@ -257,7 +257,7 @@
       </w:pPr>
       <w:r>
         <w:rPr>
-          <w:rFonts w:ascii="Times New Roman" w:hAnsi="Times New Roman" w:eastAsia="HY신명조"/>
+          <w:rFonts w:ascii="HY신명조" w:hAnsi="HY신명조" w:eastAsia="HY신명조"/>
           <w:b/>
           <w:i w:val="0"/>
           <w:sz w:val="18"/>
@@ -274,7 +274,7 @@
       </w:pPr>
       <w:r>
         <w:rPr>
-          <w:rFonts w:ascii="Times New Roman" w:hAnsi="Times New Roman" w:eastAsia="HY신명조"/>
+          <w:rFonts w:ascii="HY신명조" w:hAnsi="HY신명조" w:eastAsia="HY신명조"/>
           <w:b/>
           <w:i w:val="0"/>
           <w:sz w:val="18"/>
@@ -286,20 +286,20 @@
       <w:pPr>
         <w:autoSpaceDE w:val="0"/>
         <w:autoSpaceDN w:val="0"/>
-        <w:spacing w:after="70" w:line="252" w:lineRule="auto"/>
+        <w:spacing w:after="70" w:line="240" w:lineRule="auto"/>
         <w:ind w:firstLine="180"/>
         <w:jc w:val="both"/>
       </w:pPr>
       <w:r>
         <w:rPr>
-          <w:rFonts w:ascii="Times New Roman" w:hAnsi="Times New Roman" w:eastAsia="HY신명조"/>
+          <w:rFonts w:ascii="HY신명조" w:hAnsi="HY신명조" w:eastAsia="HY신명조"/>
           <w:b w:val="0"/>
           <w:i w:val="0"/>
           <w:sz w:val="18"/>
         </w:rPr>
         <w:t xml:space="preserve">NN</w:t>
         <w:noBreakHyphen/>
-        <w:t xml:space="preserve">PPI[1]는 소​형 LLM​이 출​력​한 점​수​를, 라​벨​이 있​는 보​정 세​트​에​서 의​미​적​으​로 가​까​운 이​웃 문​장​들​의 잔​차​로 보​정​한​다. 넘​긴 입​력​에​서​만 두 모​델​의 출​력​을 결​합​하​는 캐​스​케​이​드​는 일​반 분​류 과​제​에​서 제​안​되​었​고[6], SRR[5]은 옳​은 답​을 뒤​집​는 손​실​까​지 예​측​하​여 넘​길 입​력​을 고​르​지​만 넘​긴 입​력​은 큰 모​델​의 답​으​로 교​체​한​다. 본 논​문​은 결​합 가​중​치​를 라​벨​로 학​습​해 LLM​과 라​벨​의 기​준 차​이​를 반영한다.</w:t>
+        <w:t xml:space="preserve">PPI[1]는 소​형 LLM​이 출​력​한 점​수​를, 라​벨​이 있​는 보​정 세​트​에​서 의​미​적​으​로 가​까​운 이​웃 문​장​들​의 잔​차​로 보​정​한​다. 넘​긴 입​력​에​서​만 두 모​델​의 출​력​을 결​합​하​는 캐​스​케​이​드​는 일​반 분​류 과​제​에​서 제​안​되​었​고[6], SRR[5]은 옳​은 답​을 뒤​집​는 손​실​까​지 예​측​하​여 넘​길 입​력​을 고​르​지​만 넘​긴 입​력​은 큰 모​델​의 답​으​로 교​체​한​다. 본 논​문​은 결​합 가​중​치​를 라​벨​로 학​습​해 LLM​의 기​준 차​이​를 반영한다.</w:t>
       </w:r>
     </w:p>
     <w:p>
@@ -311,7 +311,7 @@
       </w:pPr>
       <w:r>
         <w:rPr>
-          <w:rFonts w:ascii="Times New Roman" w:hAnsi="Times New Roman" w:eastAsia="HY신명조"/>
+          <w:rFonts w:ascii="HY신명조" w:hAnsi="HY신명조" w:eastAsia="HY신명조"/>
           <w:b/>
           <w:i w:val="0"/>
           <w:sz w:val="18"/>
@@ -323,13 +323,13 @@
       <w:pPr>
         <w:autoSpaceDE w:val="0"/>
         <w:autoSpaceDN w:val="0"/>
-        <w:spacing w:after="70" w:line="252" w:lineRule="auto"/>
+        <w:spacing w:after="70" w:line="240" w:lineRule="auto"/>
         <w:ind w:firstLine="180"/>
         <w:jc w:val="both"/>
       </w:pPr>
       <w:r>
         <w:rPr>
-          <w:rFonts w:ascii="Times New Roman" w:hAnsi="Times New Roman" w:eastAsia="HY신명조"/>
+          <w:rFonts w:ascii="HY신명조" w:hAnsi="HY신명조" w:eastAsia="HY신명조"/>
           <w:b w:val="0"/>
           <w:i w:val="0"/>
           <w:sz w:val="18"/>
@@ -389,7 +389,7 @@
       </w:pPr>
       <w:r>
         <w:rPr>
-          <w:rFonts w:ascii="Times New Roman" w:hAnsi="Times New Roman" w:eastAsia="HY신명조"/>
+          <w:rFonts w:ascii="HY신명조" w:hAnsi="HY신명조" w:eastAsia="HY신명조"/>
           <w:b/>
           <w:i w:val="0"/>
           <w:sz w:val="16"/>
@@ -406,7 +406,7 @@
       </w:pPr>
       <w:r>
         <w:rPr>
-          <w:rFonts w:ascii="Times New Roman" w:hAnsi="Times New Roman" w:eastAsia="HY신명조"/>
+          <w:rFonts w:ascii="HY신명조" w:hAnsi="HY신명조" w:eastAsia="HY신명조"/>
           <w:b/>
           <w:i w:val="0"/>
           <w:sz w:val="18"/>
@@ -418,20 +418,22 @@
       <w:pPr>
         <w:autoSpaceDE w:val="0"/>
         <w:autoSpaceDN w:val="0"/>
-        <w:spacing w:after="70" w:line="252" w:lineRule="auto"/>
+        <w:spacing w:after="70" w:line="240" w:lineRule="auto"/>
         <w:ind w:firstLine="180"/>
         <w:jc w:val="both"/>
       </w:pPr>
       <w:r>
         <w:rPr>
-          <w:rFonts w:ascii="Times New Roman" w:hAnsi="Times New Roman" w:eastAsia="HY신명조"/>
+          <w:rFonts w:ascii="HY신명조" w:hAnsi="HY신명조" w:eastAsia="HY신명조"/>
           <w:b w:val="0"/>
           <w:i w:val="0"/>
           <w:sz w:val="18"/>
         </w:rPr>
         <w:t xml:space="preserve">문​장 x​의 팩​트​체​크 필​요 여​부 y∈{0,1}을 판​정​하​며, 라​벨​이 있​는 학​습 세​트 L(NN</w:t>
         <w:noBreakHyphen/>
-        <w:t xml:space="preserve">PPI​의 보​정 세​트)을 사​용​한​다. 저​비​용 분​류​기​(이​하 임​베​딩 SVM)는 문​장 임​베​딩 all</w:t>
+        <w:t xml:space="preserve">PPI​의 보​정 세​트)을 사​용​한​다. 저​비​용 분​류​기​(이​하 임​베​딩 SVM)는 NN</w:t>
+        <w:noBreakHyphen/>
+        <w:t xml:space="preserve">PPI​가 이​웃 검​색​에 쓰​는 문​장 임​베​딩 all</w:t>
         <w:noBreakHyphen/>
         <w:t xml:space="preserve">MiniLM</w:t>
         <w:noBreakHyphen/>
@@ -439,9 +441,7 @@
         <w:noBreakHyphen/>
         <w:t xml:space="preserve">v2​를 입​력​으​로 하​는 RBF</w:t>
         <w:noBreakHyphen/>
-        <w:t xml:space="preserve">SVM​으​로, 이 임​베​딩​은 NN</w:t>
-        <w:noBreakHyphen/>
-        <w:t xml:space="preserve">PPI​가 이​웃 검​색​에 사​용​하​는 것​과 같​다. 클​래​스 불​균​형​을 고​려​한 가​중​치​로 L​에​서 학​습​하​며, 결​정​값 d(x)가 양​수​이​면 팩​트​체​크​가 필​요​하​다​는 판​정​이​고 절​댓​값​이 클​수​록 확​신​이 높다.</w:t>
+        <w:t xml:space="preserve">SVM​이​다. 클​래​스 불​균​형​을 고​려​한 가​중​치​로 L​에​서 학​습​하​며, 결​정​값 d(x)가 양​수​이​면 팩​트​체​크​가 필​요​하​다​는 판​정​이​고 절​댓​값​이 클​수​록 확​신​이 높다.</w:t>
       </w:r>
     </w:p>
     <w:p>
@@ -453,7 +453,7 @@
       </w:pPr>
       <w:r>
         <w:rPr>
-          <w:rFonts w:ascii="Times New Roman" w:hAnsi="Times New Roman" w:eastAsia="HY신명조"/>
+          <w:rFonts w:ascii="HY신명조" w:hAnsi="HY신명조" w:eastAsia="HY신명조"/>
           <w:b/>
           <w:i w:val="0"/>
           <w:sz w:val="18"/>
@@ -465,13 +465,13 @@
       <w:pPr>
         <w:autoSpaceDE w:val="0"/>
         <w:autoSpaceDN w:val="0"/>
-        <w:spacing w:after="70" w:line="252" w:lineRule="auto"/>
+        <w:spacing w:after="70" w:line="240" w:lineRule="auto"/>
         <w:ind w:firstLine="180"/>
         <w:jc w:val="both"/>
       </w:pPr>
       <w:r>
         <w:rPr>
-          <w:rFonts w:ascii="Times New Roman" w:hAnsi="Times New Roman" w:eastAsia="HY신명조"/>
+          <w:rFonts w:ascii="HY신명조" w:hAnsi="HY신명조" w:eastAsia="HY신명조"/>
           <w:b w:val="0"/>
           <w:i w:val="0"/>
           <w:sz w:val="18"/>
@@ -531,7 +531,7 @@
       </w:r>
       <w:r>
         <w:rPr>
-          <w:rFonts w:ascii="Times New Roman" w:hAnsi="Times New Roman" w:eastAsia="HY신명조"/>
+          <w:rFonts w:ascii="HY신명조" w:hAnsi="HY신명조" w:eastAsia="HY신명조"/>
           <w:b w:val="0"/>
           <w:i w:val="0"/>
           <w:sz w:val="18"/>
@@ -545,13 +545,13 @@
         <w:widowControl w:val="0"/>
         <w:autoSpaceDE w:val="0"/>
         <w:autoSpaceDN w:val="0"/>
-        <w:spacing w:after="70" w:line="252" w:lineRule="auto"/>
+        <w:spacing w:after="70" w:line="240" w:lineRule="auto"/>
         <w:ind w:firstLine="180"/>
         <w:jc w:val="both"/>
       </w:pPr>
       <w:r>
         <w:rPr>
-          <w:rFonts w:ascii="Times New Roman" w:hAnsi="Times New Roman" w:eastAsia="HY신명조"/>
+          <w:rFonts w:ascii="HY신명조" w:hAnsi="HY신명조" w:eastAsia="HY신명조"/>
           <w:b w:val="0"/>
           <w:i w:val="0"/>
           <w:sz w:val="18"/>
@@ -597,12 +597,12 @@
       </w:r>
       <w:r>
         <w:rPr>
-          <w:rFonts w:ascii="Times New Roman" w:hAnsi="Times New Roman" w:eastAsia="HY신명조"/>
+          <w:rFonts w:ascii="HY신명조" w:hAnsi="HY신명조" w:eastAsia="HY신명조"/>
           <w:b w:val="0"/>
           <w:i w:val="0"/>
           <w:sz w:val="18"/>
         </w:rPr>
-        <w:t>는 조​건​이 참​이​면 1​인 지​시​함​수​이​다. 식 (1)을 s​에 대​해 정​리​하​면 결​합​형​은 s​를 (−c−a·d)/b​와 비​교​하​므​로, 분​류​기​가 ‘불​필​요’로 기​울​수​록​(d​가 작​을​수​록) LLM​에 더 높​은 점​수​를 요​구​한​다. 반​면 교​체​형 캐​스​케​이​드​(이​하 교​체​형)는 같​은 문​장​에 LLM​을 호​출​하​되 s​를 L​에​서 정​한 고​정 임​계​값 t​와 비교한다.</w:t>
+        <w:t>는 조​건​이 참​이​면 1​인 지​시​함​수​이​다. 식 (1)을 s​에 대​해 정​리​하​면 결​합​형​은 s​를 (−c−a·d)/b​와 비​교​하​므​로, 분​류​기​가 ‘불​필​요’로 기​울​수​록​(d​가 작​을​수​록) LLM​에 더 높​은 점​수​를 요​구​한​다. 반​면 교​체​형 캐​스​케​이​드​(이​하 교​체​형)는 s​를 L​에​서 정​한 고​정 임​계​값 t​와 비교한다.</w:t>
       </w:r>
     </w:p>
     <w:p>
@@ -614,7 +614,7 @@
       </w:pPr>
       <w:r>
         <w:rPr>
-          <w:rFonts w:ascii="Times New Roman" w:hAnsi="Times New Roman" w:eastAsia="HY신명조"/>
+          <w:rFonts w:ascii="HY신명조" w:hAnsi="HY신명조" w:eastAsia="HY신명조"/>
           <w:b/>
           <w:i w:val="0"/>
           <w:sz w:val="18"/>
@@ -631,7 +631,7 @@
       </w:pPr>
       <w:r>
         <w:rPr>
-          <w:rFonts w:ascii="Times New Roman" w:hAnsi="Times New Roman" w:eastAsia="HY신명조"/>
+          <w:rFonts w:ascii="HY신명조" w:hAnsi="HY신명조" w:eastAsia="HY신명조"/>
           <w:b/>
           <w:i w:val="0"/>
           <w:sz w:val="18"/>
@@ -643,13 +643,13 @@
       <w:pPr>
         <w:autoSpaceDE w:val="0"/>
         <w:autoSpaceDN w:val="0"/>
-        <w:spacing w:after="70" w:line="252" w:lineRule="auto"/>
+        <w:spacing w:after="70" w:line="240" w:lineRule="auto"/>
         <w:ind w:firstLine="180"/>
         <w:jc w:val="both"/>
       </w:pPr>
       <w:r>
         <w:rPr>
-          <w:rFonts w:ascii="Times New Roman" w:hAnsi="Times New Roman" w:eastAsia="HY신명조"/>
+          <w:rFonts w:ascii="HY신명조" w:hAnsi="HY신명조" w:eastAsia="HY신명조"/>
           <w:b w:val="0"/>
           <w:i w:val="0"/>
           <w:sz w:val="18"/>
@@ -658,9 +658,7 @@
         <w:noBreakHyphen/>
         <w:t xml:space="preserve">test·공​식 test​를 합​친 1,691​문​장​을 테​스​트​로 사​용​하​였​다. ClaimBuster[4]는 2012​년 토​론 1,314​문​장​과 2016​년 토​론 2,745​문​장​을 각​각 학​습 세​트​와 테​스​트​로 사​용​하​였​다. NN</w:t>
         <w:noBreakHyphen/>
-        <w:t xml:space="preserve">PPI​는 원 논​문​과 같​이 Gemma 3 4B​로 재​현​하​였​으​며, 원 논​문​과 같​은 분​할​(CLEF dev</w:t>
-        <w:noBreakHyphen/>
-        <w:t xml:space="preserve">test, ClaimBuster 2016​년)에​서 가​중 F1​은 CLEF 0.835, ClaimBuster 0.785​였​다​(원 논​문 0.827, 0.760). LLM​은 Claude Sonnet 5​를 사​용​하​였​고, NN</w:t>
+        <w:t xml:space="preserve">PPI​는 원 논​문​과 같​이 Gemma 3 4B​로 재​현​하​였​으​며, 원 논​문​과 같​은 분​할​에​서 가​중 F1​은 CLEF 0.835, ClaimBuster 0.785​였​다​(원 논​문 0.827, 0.760). LLM​은 Claude Sonnet 5​를 사​용​하​였​고, NN</w:t>
         <w:noBreakHyphen/>
         <w:t xml:space="preserve">PPI​의 판​정 기​준 프​롬​프​트​로 40​문​장​씩 묶​어 채점하였다.</w:t>
       </w:r>
@@ -674,7 +672,7 @@
       </w:pPr>
       <w:r>
         <w:rPr>
-          <w:rFonts w:ascii="Times New Roman" w:hAnsi="Times New Roman" w:eastAsia="HY신명조"/>
+          <w:rFonts w:ascii="HY신명조" w:hAnsi="HY신명조" w:eastAsia="HY신명조"/>
           <w:b/>
           <w:i w:val="0"/>
           <w:sz w:val="18"/>
@@ -686,20 +684,20 @@
       <w:pPr>
         <w:autoSpaceDE w:val="0"/>
         <w:autoSpaceDN w:val="0"/>
-        <w:spacing w:after="70" w:line="252" w:lineRule="auto"/>
+        <w:spacing w:after="70" w:line="240" w:lineRule="auto"/>
         <w:ind w:firstLine="180"/>
         <w:jc w:val="both"/>
       </w:pPr>
       <w:r>
         <w:rPr>
-          <w:rFonts w:ascii="Times New Roman" w:hAnsi="Times New Roman" w:eastAsia="HY신명조"/>
+          <w:rFonts w:ascii="HY신명조" w:hAnsi="HY신명조" w:eastAsia="HY신명조"/>
           <w:b w:val="0"/>
           <w:i w:val="0"/>
           <w:sz w:val="18"/>
         </w:rPr>
         <w:t xml:space="preserve">평​가 지​표​는 테​스​트 정​확​도​이​며, 학​습 세​트​의 80%​를 비​복​원 추​출​하​여 5​회 반​복​한 평​균​을 보​고​한​다. 방​법 간 차​이​는 5​회 각​각​의 예​측​에 McNemar 검​정​(α=0.05, 다​중 비​교 보​정 없​음)을 적​용​하​고, 차​이​의 95% 신​뢰​구​간​은 테​스​트 문​장 부​트​스​트​랩​(2,000​회)으​로 구​하​였​다. LLM 임​계​값, 결​합 계​수, 호​출​률, NN</w:t>
         <w:noBreakHyphen/>
-        <w:t xml:space="preserve">PPI​의 이​웃 수 k​는 모​두 학​습 세​트 안​에​서​만 정​하​였​고​(두 데​이​터​셋 모​두 k=10), 임​베​딩 SVM​은 기​본 하​이​퍼​파​라​미​터​를 사​용​하​였​다. 호​출​률​은 학​습 세​트​의 교​차​검​증 정​확​도​가 두 데​이​터​셋 모​두 거​의 오​르​지 않​는 50%​로 정​하​였​다​(50% 이​후 증​가 CLEF 0.06%p, ClaimBuster 0.11%p).</w:t>
+        <w:t xml:space="preserve">PPI​의 이​웃 수 k​는 모​두 학​습 세​트 안​에​서​만 정​하​였​고​(두 데​이​터​셋 모​두 k=10), 임​베​딩 SVM​은 기​본 하​이​퍼​파​라​미​터​를 사​용​하​였​다. 호​출​률​은 학​습 세​트​의 교​차​검​증 정​확​도​가 두 데​이​터​셋 모​두 거​의 오​르​지 않​는 50%​로 정하였다.</w:t>
       </w:r>
     </w:p>
     <w:p>
@@ -711,7 +709,7 @@
       </w:pPr>
       <w:r>
         <w:rPr>
-          <w:rFonts w:ascii="Times New Roman" w:hAnsi="Times New Roman" w:eastAsia="HY신명조"/>
+          <w:rFonts w:ascii="HY신명조" w:hAnsi="HY신명조" w:eastAsia="HY신명조"/>
           <w:b/>
           <w:i w:val="0"/>
           <w:sz w:val="18"/>
@@ -729,12 +727,12 @@
       </w:pPr>
       <w:r>
         <w:rPr>
-          <w:rFonts w:ascii="Times New Roman" w:hAnsi="Times New Roman" w:eastAsia="HY신명조"/>
+          <w:rFonts w:ascii="HY신명조" w:hAnsi="HY신명조" w:eastAsia="HY신명조"/>
           <w:b/>
           <w:i w:val="0"/>
-          <w:sz w:val="17"/>
+          <w:sz w:val="16"/>
         </w:rPr>
-        <w:t>표 1. 테스트 정확도 (†: 5회 중 3회 이상 제안보다 유의하게 낮음)</w:t>
+        <w:t>표 1. 테스트 정확도(†: 5회 중 3회 이상 제안보다 유의하게 낮음)</w:t>
       </w:r>
     </w:p>
     <w:tbl>
@@ -761,7 +759,7 @@
       <w:tr>
         <w:tc>
           <w:tcPr>
-            <w:tcW w:type="dxa" w:w="2438"/>
+            <w:tcW w:type="dxa" w:w="2693"/>
             <w:tcBorders>
               <w:top w:val="single" w:sz="8" w:color="000000"/>
               <w:bottom w:val="single" w:sz="4" w:color="000000"/>
@@ -777,10 +775,10 @@
             <w:r/>
             <w:r>
               <w:rPr>
-                <w:rFonts w:ascii="Times New Roman" w:hAnsi="Times New Roman" w:eastAsia="HY신명조"/>
+                <w:rFonts w:ascii="HY신명조" w:hAnsi="HY신명조" w:eastAsia="HY신명조"/>
                 <w:b/>
                 <w:i w:val="0"/>
-                <w:sz w:val="17"/>
+                <w:sz w:val="16"/>
               </w:rPr>
               <w:t>방법</w:t>
             </w:r>
@@ -788,7 +786,7 @@
         </w:tc>
         <w:tc>
           <w:tcPr>
-            <w:tcW w:type="dxa" w:w="652"/>
+            <w:tcW w:type="dxa" w:w="539"/>
             <w:tcBorders>
               <w:top w:val="single" w:sz="8" w:color="000000"/>
               <w:bottom w:val="single" w:sz="4" w:color="000000"/>
@@ -804,10 +802,10 @@
             <w:r/>
             <w:r>
               <w:rPr>
-                <w:rFonts w:ascii="Times New Roman" w:hAnsi="Times New Roman" w:eastAsia="HY신명조"/>
+                <w:rFonts w:ascii="HY신명조" w:hAnsi="HY신명조" w:eastAsia="HY신명조"/>
                 <w:b/>
                 <w:i w:val="0"/>
-                <w:sz w:val="17"/>
+                <w:sz w:val="16"/>
               </w:rPr>
               <w:t>호출률</w:t>
             </w:r>
@@ -815,7 +813,7 @@
         </w:tc>
         <w:tc>
           <w:tcPr>
-            <w:tcW w:type="dxa" w:w="680"/>
+            <w:tcW w:type="dxa" w:w="595"/>
             <w:tcBorders>
               <w:top w:val="single" w:sz="8" w:color="000000"/>
               <w:bottom w:val="single" w:sz="4" w:color="000000"/>
@@ -831,10 +829,10 @@
             <w:r/>
             <w:r>
               <w:rPr>
-                <w:rFonts w:ascii="Times New Roman" w:hAnsi="Times New Roman" w:eastAsia="HY신명조"/>
+                <w:rFonts w:ascii="HY신명조" w:hAnsi="HY신명조" w:eastAsia="HY신명조"/>
                 <w:b/>
                 <w:i w:val="0"/>
-                <w:sz w:val="17"/>
+                <w:sz w:val="16"/>
               </w:rPr>
               <w:t>CLEF</w:t>
             </w:r>
@@ -842,7 +840,7 @@
         </w:tc>
         <w:tc>
           <w:tcPr>
-            <w:tcW w:type="dxa" w:w="964"/>
+            <w:tcW w:type="dxa" w:w="907"/>
             <w:tcBorders>
               <w:top w:val="single" w:sz="8" w:color="000000"/>
               <w:bottom w:val="single" w:sz="4" w:color="000000"/>
@@ -858,10 +856,10 @@
             <w:r/>
             <w:r>
               <w:rPr>
-                <w:rFonts w:ascii="Times New Roman" w:hAnsi="Times New Roman" w:eastAsia="HY신명조"/>
+                <w:rFonts w:ascii="HY신명조" w:hAnsi="HY신명조" w:eastAsia="HY신명조"/>
                 <w:b/>
                 <w:i w:val="0"/>
-                <w:sz w:val="17"/>
+                <w:sz w:val="16"/>
               </w:rPr>
               <w:t>ClaimBuster</w:t>
             </w:r>
@@ -871,7 +869,7 @@
       <w:tr>
         <w:tc>
           <w:tcPr>
-            <w:tcW w:type="dxa" w:w="2438"/>
+            <w:tcW w:type="dxa" w:w="2693"/>
           </w:tcPr>
           <w:p>
             <w:pPr>
@@ -883,12 +881,12 @@
             <w:r/>
             <w:r>
               <w:rPr>
-                <w:rFonts w:ascii="Times New Roman" w:hAnsi="Times New Roman" w:eastAsia="HY신명조"/>
+                <w:rFonts w:ascii="HY신명조" w:hAnsi="HY신명조" w:eastAsia="HY신명조"/>
                 <w:b w:val="0"/>
                 <w:i w:val="0"/>
-                <w:sz w:val="17"/>
+                <w:sz w:val="16"/>
               </w:rPr>
-              <w:t xml:space="preserve">Gemma 3 4B + NN</w:t>
+              <w:t xml:space="preserve">Gemma+NN</w:t>
               <w:noBreakHyphen/>
               <w:t xml:space="preserve">PPI [1]</w:t>
             </w:r>
@@ -896,7 +894,7 @@
         </w:tc>
         <w:tc>
           <w:tcPr>
-            <w:tcW w:type="dxa" w:w="652"/>
+            <w:tcW w:type="dxa" w:w="539"/>
           </w:tcPr>
           <w:p>
             <w:pPr>
@@ -908,10 +906,10 @@
             <w:r/>
             <w:r>
               <w:rPr>
-                <w:rFonts w:ascii="Times New Roman" w:hAnsi="Times New Roman" w:eastAsia="HY신명조"/>
+                <w:rFonts w:ascii="HY신명조" w:hAnsi="HY신명조" w:eastAsia="HY신명조"/>
                 <w:b w:val="0"/>
                 <w:i w:val="0"/>
-                <w:sz w:val="17"/>
+                <w:sz w:val="16"/>
               </w:rPr>
               <w:t>0%</w:t>
             </w:r>
@@ -919,7 +917,7 @@
         </w:tc>
         <w:tc>
           <w:tcPr>
-            <w:tcW w:type="dxa" w:w="680"/>
+            <w:tcW w:type="dxa" w:w="595"/>
           </w:tcPr>
           <w:p>
             <w:pPr>
@@ -931,10 +929,10 @@
             <w:r/>
             <w:r>
               <w:rPr>
-                <w:rFonts w:ascii="Times New Roman" w:hAnsi="Times New Roman" w:eastAsia="HY신명조"/>
+                <w:rFonts w:ascii="HY신명조" w:hAnsi="HY신명조" w:eastAsia="HY신명조"/>
                 <w:b w:val="0"/>
                 <w:i w:val="0"/>
-                <w:sz w:val="17"/>
+                <w:sz w:val="16"/>
               </w:rPr>
               <w:t>0.834</w:t>
             </w:r>
@@ -942,7 +940,7 @@
         </w:tc>
         <w:tc>
           <w:tcPr>
-            <w:tcW w:type="dxa" w:w="964"/>
+            <w:tcW w:type="dxa" w:w="907"/>
           </w:tcPr>
           <w:p>
             <w:pPr>
@@ -954,10 +952,10 @@
             <w:r/>
             <w:r>
               <w:rPr>
-                <w:rFonts w:ascii="Times New Roman" w:hAnsi="Times New Roman" w:eastAsia="HY신명조"/>
+                <w:rFonts w:ascii="HY신명조" w:hAnsi="HY신명조" w:eastAsia="HY신명조"/>
                 <w:b w:val="0"/>
                 <w:i w:val="0"/>
-                <w:sz w:val="17"/>
+                <w:sz w:val="16"/>
               </w:rPr>
               <w:t>0.785</w:t>
             </w:r>
@@ -967,7 +965,7 @@
       <w:tr>
         <w:tc>
           <w:tcPr>
-            <w:tcW w:type="dxa" w:w="2438"/>
+            <w:tcW w:type="dxa" w:w="2693"/>
           </w:tcPr>
           <w:p>
             <w:pPr>
@@ -979,10 +977,10 @@
             <w:r/>
             <w:r>
               <w:rPr>
-                <w:rFonts w:ascii="Times New Roman" w:hAnsi="Times New Roman" w:eastAsia="HY신명조"/>
+                <w:rFonts w:ascii="HY신명조" w:hAnsi="HY신명조" w:eastAsia="HY신명조"/>
                 <w:b w:val="0"/>
                 <w:i w:val="0"/>
-                <w:sz w:val="17"/>
+                <w:sz w:val="16"/>
               </w:rPr>
               <w:t>임베딩 SVM</w:t>
             </w:r>
@@ -990,7 +988,7 @@
         </w:tc>
         <w:tc>
           <w:tcPr>
-            <w:tcW w:type="dxa" w:w="652"/>
+            <w:tcW w:type="dxa" w:w="539"/>
           </w:tcPr>
           <w:p>
             <w:pPr>
@@ -1002,10 +1000,10 @@
             <w:r/>
             <w:r>
               <w:rPr>
-                <w:rFonts w:ascii="Times New Roman" w:hAnsi="Times New Roman" w:eastAsia="HY신명조"/>
+                <w:rFonts w:ascii="HY신명조" w:hAnsi="HY신명조" w:eastAsia="HY신명조"/>
                 <w:b w:val="0"/>
                 <w:i w:val="0"/>
-                <w:sz w:val="17"/>
+                <w:sz w:val="16"/>
               </w:rPr>
               <w:t>0%</w:t>
             </w:r>
@@ -1013,7 +1011,7 @@
         </w:tc>
         <w:tc>
           <w:tcPr>
-            <w:tcW w:type="dxa" w:w="680"/>
+            <w:tcW w:type="dxa" w:w="595"/>
           </w:tcPr>
           <w:p>
             <w:pPr>
@@ -1025,10 +1023,10 @@
             <w:r/>
             <w:r>
               <w:rPr>
-                <w:rFonts w:ascii="Times New Roman" w:hAnsi="Times New Roman" w:eastAsia="HY신명조"/>
+                <w:rFonts w:ascii="HY신명조" w:hAnsi="HY신명조" w:eastAsia="HY신명조"/>
                 <w:b w:val="0"/>
                 <w:i w:val="0"/>
-                <w:sz w:val="17"/>
+                <w:sz w:val="16"/>
               </w:rPr>
               <w:t>0.859</w:t>
             </w:r>
@@ -1036,7 +1034,7 @@
         </w:tc>
         <w:tc>
           <w:tcPr>
-            <w:tcW w:type="dxa" w:w="964"/>
+            <w:tcW w:type="dxa" w:w="907"/>
           </w:tcPr>
           <w:p>
             <w:pPr>
@@ -1048,10 +1046,10 @@
             <w:r/>
             <w:r>
               <w:rPr>
-                <w:rFonts w:ascii="Times New Roman" w:hAnsi="Times New Roman" w:eastAsia="HY신명조"/>
+                <w:rFonts w:ascii="HY신명조" w:hAnsi="HY신명조" w:eastAsia="HY신명조"/>
                 <w:b w:val="0"/>
                 <w:i w:val="0"/>
-                <w:sz w:val="17"/>
+                <w:sz w:val="16"/>
               </w:rPr>
               <w:t>0.790</w:t>
             </w:r>
@@ -1061,7 +1059,7 @@
       <w:tr>
         <w:tc>
           <w:tcPr>
-            <w:tcW w:type="dxa" w:w="2438"/>
+            <w:tcW w:type="dxa" w:w="2693"/>
           </w:tcPr>
           <w:p>
             <w:pPr>
@@ -1073,10 +1071,10 @@
             <w:r/>
             <w:r>
               <w:rPr>
-                <w:rFonts w:ascii="Times New Roman" w:hAnsi="Times New Roman" w:eastAsia="HY신명조"/>
+                <w:rFonts w:ascii="HY신명조" w:hAnsi="HY신명조" w:eastAsia="HY신명조"/>
                 <w:b w:val="0"/>
                 <w:i w:val="0"/>
-                <w:sz w:val="17"/>
+                <w:sz w:val="16"/>
               </w:rPr>
               <w:t>LLM 전량 호출</w:t>
             </w:r>
@@ -1084,7 +1082,7 @@
         </w:tc>
         <w:tc>
           <w:tcPr>
-            <w:tcW w:type="dxa" w:w="652"/>
+            <w:tcW w:type="dxa" w:w="539"/>
           </w:tcPr>
           <w:p>
             <w:pPr>
@@ -1096,10 +1094,10 @@
             <w:r/>
             <w:r>
               <w:rPr>
-                <w:rFonts w:ascii="Times New Roman" w:hAnsi="Times New Roman" w:eastAsia="HY신명조"/>
+                <w:rFonts w:ascii="HY신명조" w:hAnsi="HY신명조" w:eastAsia="HY신명조"/>
                 <w:b w:val="0"/>
                 <w:i w:val="0"/>
-                <w:sz w:val="17"/>
+                <w:sz w:val="16"/>
               </w:rPr>
               <w:t>100%</w:t>
             </w:r>
@@ -1107,7 +1105,7 @@
         </w:tc>
         <w:tc>
           <w:tcPr>
-            <w:tcW w:type="dxa" w:w="680"/>
+            <w:tcW w:type="dxa" w:w="595"/>
           </w:tcPr>
           <w:p>
             <w:pPr>
@@ -1119,10 +1117,10 @@
             <w:r/>
             <w:r>
               <w:rPr>
-                <w:rFonts w:ascii="Times New Roman" w:hAnsi="Times New Roman" w:eastAsia="HY신명조"/>
+                <w:rFonts w:ascii="HY신명조" w:hAnsi="HY신명조" w:eastAsia="HY신명조"/>
                 <w:b w:val="0"/>
                 <w:i w:val="0"/>
-                <w:sz w:val="17"/>
+                <w:sz w:val="16"/>
               </w:rPr>
               <w:t>0.896†</w:t>
             </w:r>
@@ -1130,7 +1128,7 @@
         </w:tc>
         <w:tc>
           <w:tcPr>
-            <w:tcW w:type="dxa" w:w="964"/>
+            <w:tcW w:type="dxa" w:w="907"/>
           </w:tcPr>
           <w:p>
             <w:pPr>
@@ -1142,10 +1140,10 @@
             <w:r/>
             <w:r>
               <w:rPr>
-                <w:rFonts w:ascii="Times New Roman" w:hAnsi="Times New Roman" w:eastAsia="HY신명조"/>
+                <w:rFonts w:ascii="HY신명조" w:hAnsi="HY신명조" w:eastAsia="HY신명조"/>
                 <w:b w:val="0"/>
                 <w:i w:val="0"/>
-                <w:sz w:val="17"/>
+                <w:sz w:val="16"/>
               </w:rPr>
               <w:t>0.835</w:t>
             </w:r>
@@ -1155,7 +1153,7 @@
       <w:tr>
         <w:tc>
           <w:tcPr>
-            <w:tcW w:type="dxa" w:w="2438"/>
+            <w:tcW w:type="dxa" w:w="2693"/>
           </w:tcPr>
           <w:p>
             <w:pPr>
@@ -1167,10 +1165,10 @@
             <w:r/>
             <w:r>
               <w:rPr>
-                <w:rFonts w:ascii="Times New Roman" w:hAnsi="Times New Roman" w:eastAsia="HY신명조"/>
+                <w:rFonts w:ascii="HY신명조" w:hAnsi="HY신명조" w:eastAsia="HY신명조"/>
                 <w:b w:val="0"/>
                 <w:i w:val="0"/>
-                <w:sz w:val="17"/>
+                <w:sz w:val="16"/>
               </w:rPr>
               <w:t xml:space="preserve">  + 임계값 조정</w:t>
             </w:r>
@@ -1178,7 +1176,7 @@
         </w:tc>
         <w:tc>
           <w:tcPr>
-            <w:tcW w:type="dxa" w:w="652"/>
+            <w:tcW w:type="dxa" w:w="539"/>
           </w:tcPr>
           <w:p>
             <w:pPr>
@@ -1190,10 +1188,10 @@
             <w:r/>
             <w:r>
               <w:rPr>
-                <w:rFonts w:ascii="Times New Roman" w:hAnsi="Times New Roman" w:eastAsia="HY신명조"/>
+                <w:rFonts w:ascii="HY신명조" w:hAnsi="HY신명조" w:eastAsia="HY신명조"/>
                 <w:b w:val="0"/>
                 <w:i w:val="0"/>
-                <w:sz w:val="17"/>
+                <w:sz w:val="16"/>
               </w:rPr>
               <w:t>100%</w:t>
             </w:r>
@@ -1201,7 +1199,7 @@
         </w:tc>
         <w:tc>
           <w:tcPr>
-            <w:tcW w:type="dxa" w:w="680"/>
+            <w:tcW w:type="dxa" w:w="595"/>
           </w:tcPr>
           <w:p>
             <w:pPr>
@@ -1213,10 +1211,10 @@
             <w:r/>
             <w:r>
               <w:rPr>
-                <w:rFonts w:ascii="Times New Roman" w:hAnsi="Times New Roman" w:eastAsia="HY신명조"/>
+                <w:rFonts w:ascii="HY신명조" w:hAnsi="HY신명조" w:eastAsia="HY신명조"/>
                 <w:b w:val="0"/>
                 <w:i w:val="0"/>
-                <w:sz w:val="17"/>
+                <w:sz w:val="16"/>
               </w:rPr>
               <w:t>0.915</w:t>
             </w:r>
@@ -1224,7 +1222,7 @@
         </w:tc>
         <w:tc>
           <w:tcPr>
-            <w:tcW w:type="dxa" w:w="964"/>
+            <w:tcW w:type="dxa" w:w="907"/>
           </w:tcPr>
           <w:p>
             <w:pPr>
@@ -1236,10 +1234,10 @@
             <w:r/>
             <w:r>
               <w:rPr>
-                <w:rFonts w:ascii="Times New Roman" w:hAnsi="Times New Roman" w:eastAsia="HY신명조"/>
+                <w:rFonts w:ascii="HY신명조" w:hAnsi="HY신명조" w:eastAsia="HY신명조"/>
                 <w:b w:val="0"/>
                 <w:i w:val="0"/>
-                <w:sz w:val="17"/>
+                <w:sz w:val="16"/>
               </w:rPr>
               <w:t>0.830†</w:t>
             </w:r>
@@ -1249,7 +1247,7 @@
       <w:tr>
         <w:tc>
           <w:tcPr>
-            <w:tcW w:type="dxa" w:w="2438"/>
+            <w:tcW w:type="dxa" w:w="2693"/>
           </w:tcPr>
           <w:p>
             <w:pPr>
@@ -1261,10 +1259,10 @@
             <w:r/>
             <w:r>
               <w:rPr>
-                <w:rFonts w:ascii="Times New Roman" w:hAnsi="Times New Roman" w:eastAsia="HY신명조"/>
+                <w:rFonts w:ascii="HY신명조" w:hAnsi="HY신명조" w:eastAsia="HY신명조"/>
                 <w:b w:val="0"/>
                 <w:i w:val="0"/>
-                <w:sz w:val="17"/>
+                <w:sz w:val="16"/>
               </w:rPr>
               <w:t xml:space="preserve">  + NN</w:t>
               <w:noBreakHyphen/>
@@ -1274,7 +1272,7 @@
         </w:tc>
         <w:tc>
           <w:tcPr>
-            <w:tcW w:type="dxa" w:w="652"/>
+            <w:tcW w:type="dxa" w:w="539"/>
           </w:tcPr>
           <w:p>
             <w:pPr>
@@ -1286,10 +1284,10 @@
             <w:r/>
             <w:r>
               <w:rPr>
-                <w:rFonts w:ascii="Times New Roman" w:hAnsi="Times New Roman" w:eastAsia="HY신명조"/>
+                <w:rFonts w:ascii="HY신명조" w:hAnsi="HY신명조" w:eastAsia="HY신명조"/>
                 <w:b w:val="0"/>
                 <w:i w:val="0"/>
-                <w:sz w:val="17"/>
+                <w:sz w:val="16"/>
               </w:rPr>
               <w:t>100%</w:t>
             </w:r>
@@ -1297,7 +1295,7 @@
         </w:tc>
         <w:tc>
           <w:tcPr>
-            <w:tcW w:type="dxa" w:w="680"/>
+            <w:tcW w:type="dxa" w:w="595"/>
           </w:tcPr>
           <w:p>
             <w:pPr>
@@ -1309,10 +1307,10 @@
             <w:r/>
             <w:r>
               <w:rPr>
-                <w:rFonts w:ascii="Times New Roman" w:hAnsi="Times New Roman" w:eastAsia="HY신명조"/>
+                <w:rFonts w:ascii="HY신명조" w:hAnsi="HY신명조" w:eastAsia="HY신명조"/>
                 <w:b w:val="0"/>
                 <w:i w:val="0"/>
-                <w:sz w:val="17"/>
+                <w:sz w:val="16"/>
               </w:rPr>
               <w:t>0.897†</w:t>
             </w:r>
@@ -1320,7 +1318,7 @@
         </w:tc>
         <w:tc>
           <w:tcPr>
-            <w:tcW w:type="dxa" w:w="964"/>
+            <w:tcW w:type="dxa" w:w="907"/>
           </w:tcPr>
           <w:p>
             <w:pPr>
@@ -1332,10 +1330,10 @@
             <w:r/>
             <w:r>
               <w:rPr>
-                <w:rFonts w:ascii="Times New Roman" w:hAnsi="Times New Roman" w:eastAsia="HY신명조"/>
+                <w:rFonts w:ascii="HY신명조" w:hAnsi="HY신명조" w:eastAsia="HY신명조"/>
                 <w:b w:val="0"/>
                 <w:i w:val="0"/>
-                <w:sz w:val="17"/>
+                <w:sz w:val="16"/>
               </w:rPr>
               <w:t>0.826†</w:t>
             </w:r>
@@ -1345,7 +1343,7 @@
       <w:tr>
         <w:tc>
           <w:tcPr>
-            <w:tcW w:type="dxa" w:w="2438"/>
+            <w:tcW w:type="dxa" w:w="2693"/>
           </w:tcPr>
           <w:p>
             <w:pPr>
@@ -1357,10 +1355,10 @@
             <w:r/>
             <w:r>
               <w:rPr>
-                <w:rFonts w:ascii="Times New Roman" w:hAnsi="Times New Roman" w:eastAsia="HY신명조"/>
+                <w:rFonts w:ascii="HY신명조" w:hAnsi="HY신명조" w:eastAsia="HY신명조"/>
                 <w:b w:val="0"/>
                 <w:i w:val="0"/>
-                <w:sz w:val="17"/>
+                <w:sz w:val="16"/>
               </w:rPr>
               <w:t>교체형 캐스케이드</w:t>
             </w:r>
@@ -1368,7 +1366,7 @@
         </w:tc>
         <w:tc>
           <w:tcPr>
-            <w:tcW w:type="dxa" w:w="652"/>
+            <w:tcW w:type="dxa" w:w="539"/>
           </w:tcPr>
           <w:p>
             <w:pPr>
@@ -1380,10 +1378,10 @@
             <w:r/>
             <w:r>
               <w:rPr>
-                <w:rFonts w:ascii="Times New Roman" w:hAnsi="Times New Roman" w:eastAsia="HY신명조"/>
+                <w:rFonts w:ascii="HY신명조" w:hAnsi="HY신명조" w:eastAsia="HY신명조"/>
                 <w:b w:val="0"/>
                 <w:i w:val="0"/>
-                <w:sz w:val="17"/>
+                <w:sz w:val="16"/>
               </w:rPr>
               <w:t>50%</w:t>
             </w:r>
@@ -1391,7 +1389,7 @@
         </w:tc>
         <w:tc>
           <w:tcPr>
-            <w:tcW w:type="dxa" w:w="680"/>
+            <w:tcW w:type="dxa" w:w="595"/>
           </w:tcPr>
           <w:p>
             <w:pPr>
@@ -1403,10 +1401,10 @@
             <w:r/>
             <w:r>
               <w:rPr>
-                <w:rFonts w:ascii="Times New Roman" w:hAnsi="Times New Roman" w:eastAsia="HY신명조"/>
+                <w:rFonts w:ascii="HY신명조" w:hAnsi="HY신명조" w:eastAsia="HY신명조"/>
                 <w:b w:val="0"/>
                 <w:i w:val="0"/>
-                <w:sz w:val="17"/>
+                <w:sz w:val="16"/>
               </w:rPr>
               <w:t>0.916</w:t>
             </w:r>
@@ -1414,7 +1412,7 @@
         </w:tc>
         <w:tc>
           <w:tcPr>
-            <w:tcW w:type="dxa" w:w="964"/>
+            <w:tcW w:type="dxa" w:w="907"/>
           </w:tcPr>
           <w:p>
             <w:pPr>
@@ -1426,10 +1424,10 @@
             <w:r/>
             <w:r>
               <w:rPr>
-                <w:rFonts w:ascii="Times New Roman" w:hAnsi="Times New Roman" w:eastAsia="HY신명조"/>
+                <w:rFonts w:ascii="HY신명조" w:hAnsi="HY신명조" w:eastAsia="HY신명조"/>
                 <w:b w:val="0"/>
                 <w:i w:val="0"/>
-                <w:sz w:val="17"/>
+                <w:sz w:val="16"/>
               </w:rPr>
               <w:t>0.835†</w:t>
             </w:r>
@@ -1439,7 +1437,7 @@
       <w:tr>
         <w:tc>
           <w:tcPr>
-            <w:tcW w:type="dxa" w:w="2438"/>
+            <w:tcW w:type="dxa" w:w="2693"/>
             <w:tcBorders>
               <w:top w:val="single" w:sz="4" w:color="000000"/>
               <w:bottom w:val="single" w:sz="8" w:color="000000"/>
@@ -1454,10 +1452,10 @@
             <w:r/>
             <w:r>
               <w:rPr>
-                <w:rFonts w:ascii="Times New Roman" w:hAnsi="Times New Roman" w:eastAsia="HY신명조"/>
+                <w:rFonts w:ascii="HY신명조" w:hAnsi="HY신명조" w:eastAsia="HY신명조"/>
                 <w:b/>
                 <w:i w:val="0"/>
-                <w:sz w:val="17"/>
+                <w:sz w:val="16"/>
               </w:rPr>
               <w:t>결합형 캐스케이드 (제안)</w:t>
             </w:r>
@@ -1465,7 +1463,7 @@
         </w:tc>
         <w:tc>
           <w:tcPr>
-            <w:tcW w:type="dxa" w:w="652"/>
+            <w:tcW w:type="dxa" w:w="539"/>
             <w:tcBorders>
               <w:top w:val="single" w:sz="4" w:color="000000"/>
               <w:bottom w:val="single" w:sz="8" w:color="000000"/>
@@ -1480,10 +1478,10 @@
             <w:r/>
             <w:r>
               <w:rPr>
-                <w:rFonts w:ascii="Times New Roman" w:hAnsi="Times New Roman" w:eastAsia="HY신명조"/>
+                <w:rFonts w:ascii="HY신명조" w:hAnsi="HY신명조" w:eastAsia="HY신명조"/>
                 <w:b/>
                 <w:i w:val="0"/>
-                <w:sz w:val="17"/>
+                <w:sz w:val="16"/>
               </w:rPr>
               <w:t>50%</w:t>
             </w:r>
@@ -1491,7 +1489,7 @@
         </w:tc>
         <w:tc>
           <w:tcPr>
-            <w:tcW w:type="dxa" w:w="680"/>
+            <w:tcW w:type="dxa" w:w="595"/>
             <w:tcBorders>
               <w:top w:val="single" w:sz="4" w:color="000000"/>
               <w:bottom w:val="single" w:sz="8" w:color="000000"/>
@@ -1506,10 +1504,10 @@
             <w:r/>
             <w:r>
               <w:rPr>
-                <w:rFonts w:ascii="Times New Roman" w:hAnsi="Times New Roman" w:eastAsia="HY신명조"/>
+                <w:rFonts w:ascii="HY신명조" w:hAnsi="HY신명조" w:eastAsia="HY신명조"/>
                 <w:b/>
                 <w:i w:val="0"/>
-                <w:sz w:val="17"/>
+                <w:sz w:val="16"/>
               </w:rPr>
               <w:t>0.923</w:t>
             </w:r>
@@ -1517,7 +1515,7 @@
         </w:tc>
         <w:tc>
           <w:tcPr>
-            <w:tcW w:type="dxa" w:w="964"/>
+            <w:tcW w:type="dxa" w:w="907"/>
             <w:tcBorders>
               <w:top w:val="single" w:sz="4" w:color="000000"/>
               <w:bottom w:val="single" w:sz="8" w:color="000000"/>
@@ -1532,10 +1530,10 @@
             <w:r/>
             <w:r>
               <w:rPr>
-                <w:rFonts w:ascii="Times New Roman" w:hAnsi="Times New Roman" w:eastAsia="HY신명조"/>
+                <w:rFonts w:ascii="HY신명조" w:hAnsi="HY신명조" w:eastAsia="HY신명조"/>
                 <w:b/>
                 <w:i w:val="0"/>
-                <w:sz w:val="17"/>
+                <w:sz w:val="16"/>
               </w:rPr>
               <w:t>0.846</w:t>
             </w:r>
@@ -1547,13 +1545,13 @@
       <w:pPr>
         <w:autoSpaceDE w:val="0"/>
         <w:autoSpaceDN w:val="0"/>
-        <w:spacing w:after="70" w:line="252" w:lineRule="auto" w:before="100"/>
+        <w:spacing w:after="70" w:line="240" w:lineRule="auto" w:before="100"/>
         <w:ind w:firstLine="180"/>
         <w:jc w:val="both"/>
       </w:pPr>
       <w:r>
         <w:rPr>
-          <w:rFonts w:ascii="Times New Roman" w:hAnsi="Times New Roman" w:eastAsia="HY신명조"/>
+          <w:rFonts w:ascii="HY신명조" w:hAnsi="HY신명조" w:eastAsia="HY신명조"/>
           <w:b w:val="0"/>
           <w:i w:val="0"/>
           <w:sz w:val="18"/>
@@ -1567,31 +1565,31 @@
       <w:pPr>
         <w:autoSpaceDE w:val="0"/>
         <w:autoSpaceDN w:val="0"/>
-        <w:spacing w:after="70" w:line="252" w:lineRule="auto"/>
+        <w:spacing w:after="70" w:line="240" w:lineRule="auto"/>
         <w:ind w:firstLine="180"/>
         <w:jc w:val="both"/>
       </w:pPr>
       <w:r>
         <w:rPr>
-          <w:rFonts w:ascii="Times New Roman" w:hAnsi="Times New Roman" w:eastAsia="HY신명조"/>
+          <w:rFonts w:ascii="HY신명조" w:hAnsi="HY신명조" w:eastAsia="HY신명조"/>
           <w:b w:val="0"/>
           <w:i w:val="0"/>
           <w:sz w:val="18"/>
         </w:rPr>
-        <w:t>LLM 점​수​를 0.5 기​준​으​로 쓰​면 재​현​율​이 CLEF 0.61, ClaimBuster 0.42​에 그​쳤​고​(정​밀​도 0.98, 0.91), 임​계​값​을 조​정​하​면 재​현​율​은 오​르​나 ClaimBuster 정​확​도​는 0.5%p 낮​아​졌​다. 이​는 LLM​의 기​준​이 라​벨​과 다​름​을 시사한다.</w:t>
+        <w:t>LLM 점​수​를 0.5 기​준​으​로 쓰​면 재​현​율​이 CLEF 0.61, ClaimBuster 0.42​에 그​쳤​고, 임​계​값​을 조​정​하​면 재​현​율​은 오​르​나 ClaimBuster 정​확​도​는 0.5%p 낮​아​졌​다. 이​는 LLM​의 기​준​이 라​벨​과 다​름​을 시사한다.</w:t>
       </w:r>
     </w:p>
     <w:p>
       <w:pPr>
         <w:autoSpaceDE w:val="0"/>
         <w:autoSpaceDN w:val="0"/>
-        <w:spacing w:after="70" w:line="252" w:lineRule="auto"/>
+        <w:spacing w:after="70" w:line="240" w:lineRule="auto"/>
         <w:ind w:firstLine="180"/>
         <w:jc w:val="both"/>
       </w:pPr>
       <w:r>
         <w:rPr>
-          <w:rFonts w:ascii="Times New Roman" w:hAnsi="Times New Roman" w:eastAsia="HY신명조"/>
+          <w:rFonts w:ascii="HY신명조" w:hAnsi="HY신명조" w:eastAsia="HY신명조"/>
           <w:b w:val="0"/>
           <w:i w:val="0"/>
           <w:sz w:val="18"/>
@@ -1605,31 +1603,31 @@
       <w:pPr>
         <w:autoSpaceDE w:val="0"/>
         <w:autoSpaceDN w:val="0"/>
-        <w:spacing w:after="70" w:line="252" w:lineRule="auto"/>
+        <w:spacing w:after="70" w:line="240" w:lineRule="auto"/>
         <w:ind w:firstLine="180"/>
         <w:jc w:val="both"/>
       </w:pPr>
       <w:r>
         <w:rPr>
-          <w:rFonts w:ascii="Times New Roman" w:hAnsi="Times New Roman" w:eastAsia="HY신명조"/>
+          <w:rFonts w:ascii="HY신명조" w:hAnsi="HY신명조" w:eastAsia="HY신명조"/>
           <w:b w:val="0"/>
           <w:i w:val="0"/>
           <w:sz w:val="18"/>
         </w:rPr>
-        <w:t>테​스​트 배​치 23​개​를 다​시 호​출​하​여 추​정​한 1,000​문​장​당 LLM 비​용​(Claude Sonnet 5 정​가)은 전​량 호​출 $0.168, 결​합​형 50% $0.084​였​고, 순​차 처​리 시​간​은 107​초, 60​초​로 추​정​되​었​다​(임​베​딩 SVM 문​장​당 6 ms 포함).</w:t>
+        <w:t>테​스​트 배​치 23​개​를 다​시 호​출​하​여 추​정​한 1,000​문​장​당 LLM 비​용​(Claude Sonnet 5 정​가)은 전​량 호​출 $0.168, 결​합​형 50% $0.084​였​고, 순​차 처​리 시​간​은 임​베​딩 SVM​을 포​함​하​여 107​초, 60​초​로 추정되었다.</w:t>
       </w:r>
     </w:p>
     <w:p>
       <w:pPr>
         <w:autoSpaceDE w:val="0"/>
         <w:autoSpaceDN w:val="0"/>
-        <w:spacing w:after="70" w:line="252" w:lineRule="auto"/>
+        <w:spacing w:after="70" w:line="240" w:lineRule="auto"/>
         <w:ind w:firstLine="180"/>
         <w:jc w:val="both"/>
       </w:pPr>
       <w:r>
         <w:rPr>
-          <w:rFonts w:ascii="Times New Roman" w:hAnsi="Times New Roman" w:eastAsia="HY신명조"/>
+          <w:rFonts w:ascii="HY신명조" w:hAnsi="HY신명조" w:eastAsia="HY신명조"/>
           <w:b w:val="0"/>
           <w:i w:val="0"/>
           <w:sz w:val="18"/>
@@ -1641,31 +1639,31 @@
       <w:pPr>
         <w:autoSpaceDE w:val="0"/>
         <w:autoSpaceDN w:val="0"/>
-        <w:spacing w:after="70" w:line="252" w:lineRule="auto"/>
+        <w:spacing w:after="70" w:line="240" w:lineRule="auto"/>
         <w:ind w:firstLine="180"/>
         <w:jc w:val="both"/>
       </w:pPr>
       <w:r>
         <w:rPr>
-          <w:rFonts w:ascii="Times New Roman" w:hAnsi="Times New Roman" w:eastAsia="HY신명조"/>
+          <w:rFonts w:ascii="HY신명조" w:hAnsi="HY신명조" w:eastAsia="HY신명조"/>
           <w:b w:val="0"/>
           <w:i w:val="0"/>
           <w:sz w:val="18"/>
         </w:rPr>
-        <w:t>두 방​법​은 같​은 문​장​에 LLM​을 호​출​하​므​로 차​이​는 판​정 방​식​에​서​만 생​긴​다. 예​를 들​어 CLEF​의 한 공​약 문​장​(라​벨: 불​필​요)은 LLM 점​수​가 s=0.35​로, 임​계​값 t=0.16​을 사​용​하​는 교​체​형​은 ‘필​요’로 잘​못 판​정​하​였​으​나, 결​합​형​은 분​류​기​의 결​정​값​(d=−0.84)에 따​라 판​정 기​준​이 0.41​로 높​아​져 옳​게 판​정​하​였​다. CLEF 1​회​차​에​서 LLM​을 호​출​한 절​반 중 결​합​형​만 옳​게 판​정​한 문​장​은 36​개, 교​체​형​만 옳​게 판​정​한 문​장​은 24개였다.</w:t>
+        <w:t>두 방​법​은 같​은 문​장​에 LLM​을 호​출​하​므​로 차​이​는 판​정 방​식​에​서​만 생​긴​다. 예​를 들​어 CLEF​의 한 공​약 문​장​(라​벨: 불​필​요)은 LLM 점​수​가 s=0.35​로, 임​계​값 t=0.16​을 사​용​하​는 교​체​형​은 ‘필​요’로 잘​못 판​정​하​였​으​나, 결​합​형​은 분​류​기​의 결​정​값​(d=−0.84)에 따​라 판​정 기​준​이 0.41​로 높​아​져 옳​게 판정하였다.</w:t>
       </w:r>
     </w:p>
     <w:p>
       <w:pPr>
         <w:autoSpaceDE w:val="0"/>
         <w:autoSpaceDN w:val="0"/>
-        <w:spacing w:after="70" w:line="252" w:lineRule="auto"/>
+        <w:spacing w:after="70" w:line="240" w:lineRule="auto"/>
         <w:ind w:firstLine="180"/>
         <w:jc w:val="both"/>
       </w:pPr>
       <w:r>
         <w:rPr>
-          <w:rFonts w:ascii="Times New Roman" w:hAnsi="Times New Roman" w:eastAsia="HY신명조"/>
+          <w:rFonts w:ascii="HY신명조" w:hAnsi="HY신명조" w:eastAsia="HY신명조"/>
           <w:b w:val="0"/>
           <w:i w:val="0"/>
           <w:sz w:val="18"/>
@@ -1679,13 +1677,13 @@
       <w:pPr>
         <w:autoSpaceDE w:val="0"/>
         <w:autoSpaceDN w:val="0"/>
-        <w:spacing w:after="70" w:line="252" w:lineRule="auto"/>
+        <w:spacing w:after="70" w:line="240" w:lineRule="auto"/>
         <w:ind w:firstLine="180"/>
         <w:jc w:val="both"/>
       </w:pPr>
       <w:r>
         <w:rPr>
-          <w:rFonts w:ascii="Times New Roman" w:hAnsi="Times New Roman" w:eastAsia="HY신명조"/>
+          <w:rFonts w:ascii="HY신명조" w:hAnsi="HY신명조" w:eastAsia="HY신명조"/>
           <w:b w:val="0"/>
           <w:i w:val="0"/>
           <w:sz w:val="18"/>
@@ -1704,7 +1702,7 @@
       <w:r>
         <w:drawing>
           <wp:inline xmlns:a="http://schemas.openxmlformats.org/drawingml/2006/main" xmlns:pic="http://schemas.openxmlformats.org/drawingml/2006/picture">
-            <wp:extent cx="2951999" cy="1563630"/>
+            <wp:extent cx="2951999" cy="1415801"/>
             <wp:docPr id="4" name="Picture 4"/>
             <wp:cNvGraphicFramePr>
               <a:graphicFrameLocks noChangeAspect="1"/>
@@ -1725,7 +1723,7 @@
                   <pic:spPr>
                     <a:xfrm>
                       <a:off x="0" y="0"/>
-                      <a:ext cx="2951999" cy="1563630"/>
+                      <a:ext cx="2951999" cy="1415801"/>
                     </a:xfrm>
                     <a:prstGeom prst="rect"/>
                   </pic:spPr>
@@ -1745,7 +1743,7 @@
       </w:pPr>
       <w:r>
         <w:rPr>
-          <w:rFonts w:ascii="Times New Roman" w:hAnsi="Times New Roman" w:eastAsia="HY신명조"/>
+          <w:rFonts w:ascii="HY신명조" w:hAnsi="HY신명조" w:eastAsia="HY신명조"/>
           <w:b/>
           <w:i w:val="0"/>
           <w:sz w:val="16"/>
@@ -1762,7 +1760,7 @@
       </w:pPr>
       <w:r>
         <w:rPr>
-          <w:rFonts w:ascii="Times New Roman" w:hAnsi="Times New Roman" w:eastAsia="HY신명조"/>
+          <w:rFonts w:ascii="HY신명조" w:hAnsi="HY신명조" w:eastAsia="HY신명조"/>
           <w:b/>
           <w:i w:val="0"/>
           <w:sz w:val="18"/>
@@ -1774,13 +1772,13 @@
       <w:pPr>
         <w:autoSpaceDE w:val="0"/>
         <w:autoSpaceDN w:val="0"/>
-        <w:spacing w:after="70" w:line="252" w:lineRule="auto"/>
+        <w:spacing w:after="70" w:line="240" w:lineRule="auto"/>
         <w:ind w:firstLine="180"/>
         <w:jc w:val="both"/>
       </w:pPr>
       <w:r>
         <w:rPr>
-          <w:rFonts w:ascii="Times New Roman" w:hAnsi="Times New Roman" w:eastAsia="HY신명조"/>
+          <w:rFonts w:ascii="HY신명조" w:hAnsi="HY신명조" w:eastAsia="HY신명조"/>
           <w:b w:val="0"/>
           <w:i w:val="0"/>
           <w:sz w:val="18"/>
@@ -1797,7 +1795,7 @@
       </w:pPr>
       <w:r>
         <w:rPr>
-          <w:rFonts w:ascii="Times New Roman" w:hAnsi="Times New Roman" w:eastAsia="HY신명조"/>
+          <w:rFonts w:ascii="HY신명조" w:hAnsi="HY신명조" w:eastAsia="HY신명조"/>
           <w:b/>
           <w:i w:val="0"/>
           <w:sz w:val="18"/>
@@ -1815,7 +1813,7 @@
       </w:pPr>
       <w:r>
         <w:rPr>
-          <w:rFonts w:ascii="Times New Roman" w:hAnsi="Times New Roman" w:eastAsia="HY신명조"/>
+          <w:rFonts w:ascii="HY신명조" w:hAnsi="HY신명조" w:eastAsia="HY신명조"/>
           <w:b w:val="0"/>
           <w:i w:val="0"/>
           <w:sz w:val="18"/>
@@ -1833,7 +1831,7 @@
       </w:pPr>
       <w:r>
         <w:rPr>
-          <w:rFonts w:ascii="Times New Roman" w:hAnsi="Times New Roman" w:eastAsia="HY신명조"/>
+          <w:rFonts w:ascii="HY신명조" w:hAnsi="HY신명조" w:eastAsia="HY신명조"/>
           <w:b w:val="0"/>
           <w:i w:val="0"/>
           <w:sz w:val="18"/>
@@ -1851,12 +1849,12 @@
       </w:pPr>
       <w:r>
         <w:rPr>
-          <w:rFonts w:ascii="Times New Roman" w:hAnsi="Times New Roman" w:eastAsia="HY신명조"/>
+          <w:rFonts w:ascii="HY신명조" w:hAnsi="HY신명조" w:eastAsia="HY신명조"/>
           <w:b w:val="0"/>
           <w:i w:val="0"/>
           <w:sz w:val="18"/>
         </w:rPr>
-        <w:t>[3] M. Hasanain et al., "Overview of the CLEF-2024 CheckThat! Lab Task 1 on Check-Worthiness Estimation of Multigenre Content," CEUR-WS vol. 3740, pp. 276–286, 2024.</w:t>
+        <w:t>[3] M. Hasanain et al., "Overview of the CLEF-2024 CheckThat! Lab Task 1 on Check-Worthiness Estimation of Multigenre Content," CEUR-WS vol. 3740, pp. 276-286, 2024.</w:t>
       </w:r>
     </w:p>
     <w:p>
@@ -1869,12 +1867,12 @@
       </w:pPr>
       <w:r>
         <w:rPr>
-          <w:rFonts w:ascii="Times New Roman" w:hAnsi="Times New Roman" w:eastAsia="HY신명조"/>
+          <w:rFonts w:ascii="HY신명조" w:hAnsi="HY신명조" w:eastAsia="HY신명조"/>
           <w:b w:val="0"/>
           <w:i w:val="0"/>
           <w:sz w:val="18"/>
         </w:rPr>
-        <w:t>[4] F. Arslan, N. Hassan, C. Li, and M. Tremayne, "A Benchmark Dataset of Check-Worthy Factual Claims," in Proc. ICWSM, vol. 14, pp. 821–829, 2020.</w:t>
+        <w:t>[4] F. Arslan et al., "A Benchmark Dataset of Check-Worthy Factual Claims," in Proc. ICWSM, vol. 14, pp. 821-829, 2020.</w:t>
       </w:r>
     </w:p>
     <w:p>
@@ -1887,7 +1885,7 @@
       </w:pPr>
       <w:r>
         <w:rPr>
-          <w:rFonts w:ascii="Times New Roman" w:hAnsi="Times New Roman" w:eastAsia="HY신명조"/>
+          <w:rFonts w:ascii="HY신명조" w:hAnsi="HY신명조" w:eastAsia="HY신명조"/>
           <w:b w:val="0"/>
           <w:i w:val="0"/>
           <w:sz w:val="18"/>
@@ -1905,7 +1903,7 @@
       </w:pPr>
       <w:r>
         <w:rPr>
-          <w:rFonts w:ascii="Times New Roman" w:hAnsi="Times New Roman" w:eastAsia="HY신명조"/>
+          <w:rFonts w:ascii="HY신명조" w:hAnsi="HY신명조" w:eastAsia="HY신명조"/>
           <w:b w:val="0"/>
           <w:i w:val="0"/>
           <w:sz w:val="18"/>

</xml_diff>

<commit_message>
Title block from the author's uploaded docx: 이정빈, 노고산, 김은경 / {gsnoh, ekim}@hanbat.ac.kr
The uploaded paper/cascade_kics_draft_font.docx changed the authors and e-mails (no other text changes);
the regenerated draft had dropped them. build_docx.py now carries them; README and briefing updated.

Co-Authored-By: Claude Opus 5.5 <noreply@anthropic.com>
</commit_message>
<xml_diff>
--- a/paper/cascade_kics_draft.docx
+++ b/paper/cascade_kics_draft.docx
@@ -50,7 +50,7 @@
           <w:i w:val="0"/>
           <w:sz w:val="22"/>
         </w:rPr>
-        <w:t>이정빈, 김은경*</w:t>
+        <w:t>이정빈, 노고산, 김은경</w:t>
       </w:r>
     </w:p>
     <w:p>
@@ -84,7 +84,7 @@
           <w:i w:val="0"/>
           <w:sz w:val="22"/>
         </w:rPr>
-        <w:t>20221065@edu.hanbat.ac.kr, *ekim@hanbat.ac.kr</w:t>
+        <w:t>20221065@edu.hanbat.ac.kr, {gsnoh, ekim}@hanbat.ac.kr</w:t>
       </w:r>
     </w:p>
     <w:p>
@@ -126,7 +126,7 @@
           <w:i w:val="0"/>
           <w:sz w:val="22"/>
         </w:rPr>
-        <w:t>Jeongbin Lee, Eunkyung Kim*</w:t>
+        <w:t>Jeongbin Lee, Gosan Noh, Eunkyung Kim</w:t>
       </w:r>
     </w:p>
     <w:p>

</xml_diff>

<commit_message>
Review fixes: CI wording, drift as a sign, 300-sentence source, dataset overlap; word gaps
- Abstract/results/Haiku: state the 95% CI lower bound instead of "statistically not lower"
- Drift: label-free disagreement rate is a possible sign, not detection; retraining
  sentences named as 300 labelled 2016 sentences, recall measured on the rest
- Conclusion: "CLEF English data was built from ClaimBuster[3]" instead of "출처가 겹치는[3]"
- Word gaps: hyphen break opportunities and reordered sentences; all body lines < 9pt gap
- Verifier strings updated; 2 pages; numbers and references verified

Co-Authored-By: Claude Opus 5.5 <noreply@anthropic.com>
</commit_message>
<xml_diff>
--- a/paper/cascade_kics_draft.docx
+++ b/paper/cascade_kics_draft.docx
@@ -101,15 +101,9 @@
           <w:i w:val="0"/>
           <w:sz w:val="26"/>
         </w:rPr>
-        <w:t xml:space="preserve">Cost</w:t>
-        <w:noBreakHyphen/>
-        <w:t xml:space="preserve">Efficient Check</w:t>
-        <w:noBreakHyphen/>
-        <w:t xml:space="preserve">Worthy Claim Detection via Selective Fusion</w:t>
+        <w:t>Cost-​Efficient Check-​Worthy Claim Detection via Selective Fusion</w:t>
         <w:br/>
-        <w:t xml:space="preserve">of a Low</w:t>
-        <w:noBreakHyphen/>
-        <w:t xml:space="preserve">Cost Classifier and a Large Language Model</w:t>
+        <w:t>of a Low-​Cost Classifier and a Large Language Model</w:t>
       </w:r>
     </w:p>
     <w:p>
@@ -178,9 +172,7 @@
           <w:i w:val="0"/>
           <w:sz w:val="18"/>
         </w:rPr>
-        <w:t xml:space="preserve">팩​트​체​크 필​요​성 탐​지​(check</w:t>
-        <w:noBreakHyphen/>
-        <w:t xml:space="preserve">worthiness detection)는 수​많​은 문​장 중 사​실 확​인​이 필​요​한 문​장​을 골​라​내​는 기​술​이​다. 대​형 언​어 모​델​(LLM)은 이 판​정​을 잘 수​행​하​지​만, 모​든 문​장​에 LLM​을 호​출​하​면 비​용​과 처​리 시​간​이 크​게 늘​어​난​다. 본 논​문​에​서​는 가​벼​운 저​비​용 분​류​기​가 모​든 문​장​을 먼​저 판​정​하​고, 분​류​기​가 확​신​하​지 못​하​는 문​장​에​만 LLM​을 호​출​하​되 분​류​기​의 판​정​을 LLM​의 판​정​으​로 교​체​하​지 않​고 두 모​델​의 점​수​를 결​합​하​여 최​종 판​정​하​는 결​합​형 캐​스​케​이​드​를 제​안​한​다. 두 공​개 데​이​터​셋​(CLEF 2024, ClaimBuster)에​서 평​가​한 결​과, 제​안 방​법​은 LLM 호​출​을 절​반​으​로 줄​이​면​서​도 모​든 문​장​에 LLM​을 호​출​한 경​우​와 같​은 수​준​의 정​확​도​(CLEF 0.923, ClaimBuster 0.846)를 유​지​하​였​다. 정​확​도​는 평​균​적​으​로 오​히​려 0.8~1.1%p 높​았​고, 통​계​적​으​로​도 0.6%p 넘​게 낮​지 않​음​을 확​인​하​였​다. 이​를 통​해 LLM 비​용​은 약 50%, 처​리 시​간​은 약 44% 줄​일 수 있​을 것​으​로 기대된다.</w:t>
+        <w:t>팩​트​체​크 필​요​성 탐​지​(check-​worthiness detection)는 수​많​은 문​장 중 사​실 확​인​이 필​요​한 문​장​을 골​라​내​는 기​술​이​다. 대​형 언​어 모​델​(LLM)은 이 판​정​을 잘 수​행​하​지​만, 모​든 문​장​에 LLM​을 호​출​하​면 비​용​과 처​리 시​간​이 크​게 늘​어​난​다. 본 논​문​에​서​는 가​벼​운 저​비​용 분​류​기​가 모​든 문​장​을 먼​저 판​정​하​고, 분​류​기​가 확​신​하​지 못​하​는 문​장​에​만 LLM​을 호​출​하​되 분​류​기​의 판​정​을 LLM​의 판​정​으​로 교​체​하​지 않​고 두 모​델​의 점​수​를 결​합​하​여 최​종 판​정​하​는 결​합​형 캐​스​케​이​드​를 제​안​한​다. 두 공​개 데​이​터​셋​(CLEF 2024, ClaimBuster)에​서 평​가​한 결​과, 제​안 방​법​은 LLM 호​출​을 절​반​으​로 줄​이​면​서​도 모​든 문​장​에 LLM​을 호​출​한 경​우​와 같​은 수​준​의 정​확​도​(CLEF 0.923, ClaimBuster 0.846)를 유​지​하​였​다. 정​확​도​는 평​균​적​으​로 오​히​려 0.8~1.1%p 높​았​고, 5​회 반​복 모​두 차​이​의 95% 신​뢰​구​간 하​한​이 −0.6%p 이​상​이​었​다. 이​를 통​해 LLM 비​용​은 약 50%, 처​리 시​간​은 약 44% 줄​일 수 있​을 것​으​로 기대된다.</w:t>
       </w:r>
     </w:p>
     <w:p>
@@ -297,9 +289,7 @@
           <w:i w:val="0"/>
           <w:sz w:val="18"/>
         </w:rPr>
-        <w:t xml:space="preserve">NN</w:t>
-        <w:noBreakHyphen/>
-        <w:t xml:space="preserve">PPI[1]는 소​형 LLM​이 출​력​한 점​수​를, 라​벨​이 있​는 보​정 세​트​에​서 의​미​적​으​로 가​까​운 이​웃 문​장​들​의 잔​차​로 보​정​한​다. 넘​긴 입​력​에​서​만 두 모​델​의 출​력​을 결​합​하​는 캐​스​케​이​드​는 일​반 분​류 과​제​에​서 제​안​되​었​고[6], SRR[5]은 옳​은 답​을 뒤​집​는 손​실​까​지 예​측​하​여 넘​길 입​력​을 고​르​지​만 넘​긴 입​력​은 큰 모​델​의 답​으​로 교​체​한​다. 본 논​문​은 결​합 가​중​치​를 라​벨​로 학​습​해 LLM​의 기​준 차​이​를 반영한다.</w:t>
+        <w:t>NN-​PPI[1]는 소​형 LLM​이 출​력​한 점​수​를, 라​벨​이 있​는 보​정 세​트​에​서 의​미​적​으​로 가​까​운 이​웃 문​장​들​의 잔​차​로 보​정​한​다. 넘​긴 입​력​에​서​만 두 모​델​의 출​력​을 결​합​하​는 캐​스​케​이​드​는 일​반 분​류 과​제​에​서 제​안​되​었​고[6], SRR[5]은 옳​은 답​을 뒤​집​는 손​실​까​지 예​측​하​여 넘​길 입​력​을 고​르​지​만 넘​긴 입​력​은 큰 모​델​의 답​으​로 교​체​한​다. 본 논​문​은 결​합 가​중​치​를 라​벨​로 학​습​해 LLM​의 기​준 차​이​를 반영한다.</w:t>
       </w:r>
     </w:p>
     <w:p>
@@ -429,19 +419,7 @@
           <w:i w:val="0"/>
           <w:sz w:val="18"/>
         </w:rPr>
-        <w:t xml:space="preserve">문​장 x​의 팩​트​체​크 필​요 여​부 y∈{0,1}을 판​정​하​며, 라​벨​이 있​는 학​습 세​트 L(NN</w:t>
-        <w:noBreakHyphen/>
-        <w:t xml:space="preserve">PPI​의 보​정 세​트)을 사​용​한​다. 저​비​용 분​류​기​(이​하 임​베​딩 SVM)는 NN</w:t>
-        <w:noBreakHyphen/>
-        <w:t xml:space="preserve">PPI​가 이​웃 검​색​에 쓰​는 문​장 임​베​딩 all</w:t>
-        <w:noBreakHyphen/>
-        <w:t xml:space="preserve">MiniLM</w:t>
-        <w:noBreakHyphen/>
-        <w:t xml:space="preserve">L6</w:t>
-        <w:noBreakHyphen/>
-        <w:t xml:space="preserve">v2​를 입​력​으​로 하​는 RBF</w:t>
-        <w:noBreakHyphen/>
-        <w:t xml:space="preserve">SVM​이​다. 클​래​스 불​균​형​을 고​려​한 가​중​치​로 L​에​서 학​습​하​며, 결​정​값 d(x)가 양​수​이​면 팩​트​체​크​가 필​요​하​다​는 판​정​이​고 절​댓​값​이 클​수​록 확​신​이 높다.</w:t>
+        <w:t>문​장 x​의 팩​트​체​크 필​요 여​부 y∈{0,1}을 판​정​하​며, 라​벨​이 있​는 학​습 세​트 L(NN-​PPI​의 보​정 세​트)을 사​용​한​다. 저​비​용 분​류​기​(이​하 임​베​딩 SVM)는 NN-​PPI​가 이​웃 검​색​에 쓰​는 문​장 임​베​딩 all-​MiniLM-​L6-​v2​를 입​력​으​로 하​는 RBF-​SVM​이​다. 클​래​스 불​균​형​을 고​려​한 가​중​치​로 L​에​서 학​습​하​며, 결​정​값 d(x)가 양​수​이​면 팩​트​체​크​가 필​요​하​다​는 판​정​이​고 절​댓​값​이 클​수​록 확​신​이 높다.</w:t>
       </w:r>
     </w:p>
     <w:p>
@@ -654,13 +632,7 @@
           <w:i w:val="0"/>
           <w:sz w:val="18"/>
         </w:rPr>
-        <w:t xml:space="preserve">CLEF 2024 CheckThat! Task 1 영​어 데​이​터[3]는 2,405​문​장​을 학​습 세​트​로, dev·dev</w:t>
-        <w:noBreakHyphen/>
-        <w:t xml:space="preserve">test·공​식 test​를 합​친 1,691​문​장​을 테​스​트​로 사​용​하​였​다. ClaimBuster[4]는 2012​년 토​론 1,314​문​장​과 2016​년 토​론 2,745​문​장​을 각​각 학​습 세​트​와 테​스​트​로 사​용​하​였​다. NN</w:t>
-        <w:noBreakHyphen/>
-        <w:t xml:space="preserve">PPI​는 원 논​문​과 같​이 Gemma 3 4B​로 재​현​하​였​으​며, 원 논​문​과 같​은 분​할​에​서 가​중 F1​은 CLEF 0.835, ClaimBuster 0.785​였​다​(원 논​문 0.827, 0.760). LLM​은 Claude Sonnet 5​를 사​용​하​였​고, NN</w:t>
-        <w:noBreakHyphen/>
-        <w:t xml:space="preserve">PPI​의 판​정 기​준 프​롬​프​트​로 40​문​장​씩 묶​어 채점하였다.</w:t>
+        <w:t>CLEF 2024 CheckThat! Task 1 영​어 데​이​터[3]는 2,405​문​장​을 학​습 세​트​로, dev·dev-​test·공​식 test​를 합​친 1,691​문​장​을 테​스​트​로 사​용​하​였​다. 또 다​른 데​이​터​셋​인 ClaimBuster[4]는 2012​년 토​론 1,314​문​장​을 학​습 세​트​로, 2016​년 토​론 2,745​문​장​을 테​스​트​로 사​용​하​였​다. NN-​PPI​는 원 논​문​과 같​이 Gemma 3 4B​로 재​현​하​였​으​며, 원 논​문​과 같​은 분​할​에​서 가​중 F1​은 CLEF 0.835, ClaimBuster 0.785​였​다​(원 논​문 0.827, 0.760). LLM​은 Claude Sonnet 5​를 사​용​하​였​고, NN-​PPI​의 판​정 기​준 프​롬​프​트​로 40​문​장​씩 묶​어 채점하였다.</w:t>
       </w:r>
     </w:p>
     <w:p>
@@ -695,9 +667,7 @@
           <w:i w:val="0"/>
           <w:sz w:val="18"/>
         </w:rPr>
-        <w:t xml:space="preserve">평​가 지​표​는 테​스​트 정​확​도​이​며, 학​습 세​트​의 80%​를 비​복​원 추​출​하​여 5​회 반​복​한 평​균​을 보​고​한​다. 방​법 간 차​이​는 5​회 각​각​의 예​측​에 McNemar 검​정​(α=0.05, 다​중 비​교 보​정 없​음)을 적​용​하​고, 차​이​의 95% 신​뢰​구​간​은 테​스​트 문​장 부​트​스​트​랩​(2,000​회)으​로 구​하​였​다. LLM 임​계​값, 결​합 계​수, 호​출​률, NN</w:t>
-        <w:noBreakHyphen/>
-        <w:t xml:space="preserve">PPI​의 이​웃 수 k​는 모​두 학​습 세​트 안​에​서​만 정​하​였​고​(두 데​이​터​셋 모​두 k=10), 임​베​딩 SVM​은 기​본 하​이​퍼​파​라​미​터​를 사​용​하​였​다. 호​출​률​은 학​습 세​트​의 교​차​검​증 정​확​도​가 두 데​이​터​셋 모​두 거​의 오​르​지 않​는 50%​로 정하였다.</w:t>
+        <w:t>평​가 지​표​는 테​스​트 정​확​도​이​며, 학​습 세​트​의 80%​를 비​복​원 추​출​하​여 5​회 반​복​한 평​균​을 보​고​한​다. 방​법 간 차​이​는 5​회 각​각​의 예​측​에 McNemar 검​정​(α=0.05, 다​중 비​교 보​정 없​음)을 적​용​하​고, 차​이​의 95% 신​뢰​구​간​은 테​스​트 문​장 부​트​스​트​랩​(2,000​회)으​로 구​하​였​다. LLM 임​계​값, 결​합 계​수, 호​출​률, NN-​PPI​의 이​웃 수 k​는 모​두 학​습 세​트 안​에​서​만 정​하​였​고​(두 데​이​터​셋 모​두 k=10), 임​베​딩 SVM​은 기​본 하​이​퍼​파​라​미​터​를 사​용​하​였​다. 호​출​률​은 학​습 세​트​의 교​차​검​증 정​확​도​가 두 데​이​터​셋 모​두 거​의 오​르​지 않​는 50%​로 정하였다.</w:t>
       </w:r>
     </w:p>
     <w:p>
@@ -886,9 +856,7 @@
                 <w:i w:val="0"/>
                 <w:sz w:val="16"/>
               </w:rPr>
-              <w:t xml:space="preserve">Gemma+NN</w:t>
-              <w:noBreakHyphen/>
-              <w:t xml:space="preserve">PPI [1]</w:t>
+              <w:t>Gemma+NN-​PPI [1]</w:t>
             </w:r>
           </w:p>
         </w:tc>
@@ -1264,9 +1232,7 @@
                 <w:i w:val="0"/>
                 <w:sz w:val="16"/>
               </w:rPr>
-              <w:t xml:space="preserve">  + NN</w:t>
-              <w:noBreakHyphen/>
-              <w:t xml:space="preserve">PPI [1]</w:t>
+              <w:t xml:space="preserve">  + NN-​PPI [1]</w:t>
             </w:r>
           </w:p>
         </w:tc>
@@ -1556,9 +1522,7 @@
           <w:i w:val="0"/>
           <w:sz w:val="18"/>
         </w:rPr>
-        <w:t xml:space="preserve">표 1​에​서 LLM​을 사​용​하​지 않​는 임​베​딩 SVM​은 NN</w:t>
-        <w:noBreakHyphen/>
-        <w:t xml:space="preserve">PPI​보​다 CLEF​에​서 5​회 중 4​회 유​의​하​게 높​았​고, ClaimBuster​에​서​는 5​회 모​두 유​의​차​가 없었다.</w:t>
+        <w:t>표 1​에​서 LLM​을 사​용​하​지 않​는 임​베​딩 SVM​은 NN-​PPI​보​다 CLEF​에​서 5​회 중 4​회 유​의​하​게 높​았​으​며, ClaimBuster​에​서​는 5​회 모​두 유​의​차​가 없었다.</w:t>
       </w:r>
     </w:p>
     <w:p>
@@ -1594,9 +1558,7 @@
           <w:i w:val="0"/>
           <w:sz w:val="18"/>
         </w:rPr>
-        <w:t xml:space="preserve">이​하 전​량 호​출​은 LLM 전​량 호​출​의 두 설​정​(조​정 전, 임​계​값 조​정) 중 정​확​도​가 높​은 쪽​(CLEF​는 임​계​값 조​정, ClaimBuster​는 조​정 전)을 뜻​한​다. 호​출​률 50%​의 결​합​형​은 전​량 호​출​보​다 정​확​도​가 평​균 0.8%p, 1.1%p 높​았​고, 5​회 모​두 차​이​의 95% 신​뢰​구​간 하​한​이 −0.6%p 이​상​이​었​다. 즉 결​합​형​의 정​확​도​는 전​량 호​출​보​다 0.6%p 넘​게 낮​지 않​다. 반​면 같​은 호​출​률​의 교​체​형​은 ClaimBuster​에​서 하​한​이 −2.3%p​까​지 내​려​가 이​를 보​장​하​지 못​했​다. 또​한 결​합​형​은 NN</w:t>
-        <w:noBreakHyphen/>
-        <w:t xml:space="preserve">PPI​를 적​용​한 전​량 호​출​보​다 5​회 모​두 유​의​하​게 높았다(p≤0.016).</w:t>
+        <w:t>이​하 전​량 호​출​은 LLM 전​량 호​출​의 두 설​정​(조​정 전, 임​계​값 조​정) 중 정​확​도​가 높​은 쪽​(CLEF​는 임​계​값 조​정, ClaimBuster​는 조​정 전)을 뜻​한​다. 호​출​률 50%​의 결​합​형​은 전​량 호​출​보​다 정​확​도​가 평​균 0.8%p, 1.1%p 높​았​고, 5​회 모​두 차​이​의 95% 신​뢰​구​간 하​한​이 −0.6%p 이​상​이​었​다. 반​면 같​은 호​출​률​의 교​체​형​은 ClaimBuster​에​서 하​한​이 −2.3%p​까​지 내​려​갔​다. 또​한 결​합​형​은 NN-​PPI​를 적​용​한 전​량 호​출​보​다 5​회 모​두 유​의​하​게 높았다(p≤0.016).</w:t>
       </w:r>
     </w:p>
     <w:p>
@@ -1668,9 +1630,7 @@
           <w:i w:val="0"/>
           <w:sz w:val="18"/>
         </w:rPr>
-        <w:t xml:space="preserve">LLM​을 Claude Haiku 4.5​로 바​꾸​어​도 결​합​형​(50%)의 정​확​도​는 전​량 호​출​보​다 1.6%p 넘​게 낮​지 않​았​으​나​(5​회 모​두), 교​체​형​은 CLEF​에​서 하​한​이 −3.1%p​까​지 내​려​갔​다. 단, 이​때 결​합​형​은 NN</w:t>
-        <w:noBreakHyphen/>
-        <w:t xml:space="preserve">PPI​를 적​용​한 전​량 호​출​(0.930, 0.839)보​다 유​의​하​게 높​지 않았다.</w:t>
+        <w:t>LLM​을 Claude Haiku 4.5​로 바​꾸​면 결​합​형​(50%)의 하​한​은 5​회 모​두 −1.6%p 이​상​이​었​으​나, 교​체​형​은 CLEF​에​서 하​한​이 −3.1%p​까​지 내​려​갔​다. 다​만 이​때 결​합​형​은 NN-​PPI​를 적​용​한 전​량 호​출​(0.930, 0.839)보​다 유​의​하​게 높​지 않았다.</w:t>
       </w:r>
     </w:p>
     <w:p>
@@ -1688,7 +1648,7 @@
           <w:i w:val="0"/>
           <w:sz w:val="18"/>
         </w:rPr>
-        <w:t>한​편 학​습 데​이​터​(2012​년 토​론)와 시​기​가 다​른 ClaimBuster 테​스​트​(2016​년 토​론)에​서​는 분​류​기​의 재​현​율​이 0.59​에 그​쳐​(CLEF 0.85), 결​합​형​도 확​인​이 필​요​한 문​장​을 임​계​값​을 조​정​한 전​량 호​출​보​다 많​이 놓​쳤​다​(재​현​율 0.73 대 0.86). 이​러​한 분​류​기​의 노​후​화​는 LLM​을 호​출​한 문​장 중 LLM​만 ‘필​요’로 판​정​한 비​율​로 라​벨 없​이 감​지​할 수 있​었​고​(학​습 데​이​터 15.9% → 테​스​트 23.6%, CLEF​는 증​가 없​음), 최​근 문​장 300​개​로 다​시 학​습​하​면 재​현​율​이 3.7%p 올랐다.</w:t>
+        <w:t>한​편 학​습 데​이​터​(2012​년 토​론)와 시​기​가 다​른 테​스​트​(ClaimBuster 2016​년 토​론)에​서​는 분​류​기​의 재​현​율​이 0.59​에 그​쳐​(CLEF 0.85), 결​합​형​도 확​인​이 필​요​한 문​장​을 임​계​값​을 조​정​한 전​량 호​출​보​다 많​이 놓​쳤​다​(재​현​율 0.73 대 0.86). 이​때 LLM​을 호​출​한 문​장 중 LLM​만 ‘필​요’로 판​정​한 비​율​이 늘​어​나​(학​습 데​이​터 15.9% → 테​스​트 23.6%, CLEF​는 증​가 없​음) 라​벨 없​이 노​후​화​의 징​후​로 쓸 수 있​어 보​이​며, 2016​년 토​론 중 300​문​장​의 라​벨​을 학​습 세​트​에 추​가​하​면 나​머​지 문​장​에​서 재​현​율​이 3.7%p 올랐다.</w:t>
       </w:r>
     </w:p>
     <w:p>
@@ -1783,7 +1743,7 @@
           <w:i w:val="0"/>
           <w:sz w:val="18"/>
         </w:rPr>
-        <w:t>본 논​문​에​서​는 저​비​용 분​류​기​가 확​신​하​지 못​하​는 문​장​에​만 LLM​을 호​출​하​고, 두 모​델​의 점​수​를 결​합​하​여 최​종 판​정​하​는 결​합​형 캐​스​케​이​드​를 제​안​하​였​다. 제​안 방​법​은 LLM 호​출​을 절​반​으​로 줄​이​면​서​도 모​든 문​장​에 LLM​을 호​출​한 경​우​와 같​은 수​준​의 정​확​도​를 유​지​하​였​으​며, 이​에 따​라 LLM 비​용​은 약 50%, 처​리 시​간​은 약 44% 줄​일 수 있​을 것​으​로 기​대​된​다. 다​만 학​습 시​기​와 다​른 데​이​터​에​서​는 분​류​기​가 노​후​화​되​어 확​인​이 필​요​한 문​장​을 더 놓​칠 수 있​으​며, 이​는 LLM​과 분​류​기​의 판​정​이 엇​갈​리​는 비​율​로 감​지​하​고 최​근 데​이​터​로 다​시 학​습​하​여 줄​일 수 있​었​다. 또​한 출​처​가 겹​치​는[3] 영​어 두 데​이​터​셋​으​로​만 평​가​하​였​으​므​로, 향​후​에​는 분​류​기​의 주​기​적 재​학​습​과 다​국​어 데​이​터​로 평​가​를 확​장​할 계획이다.</w:t>
+        <w:t>본 논​문​에​서​는 저​비​용 분​류​기​가 확​신​하​지 못​하​는 문​장​에​만 LLM​을 호​출​하​고, 두 모​델​의 점​수​를 결​합​하​여 최​종 판​정​하​는 결​합​형 캐​스​케​이​드​를 제​안​하​였​다. 제​안 방​법​은 LLM 호​출​을 절​반​으​로 줄​이​면​서​도 모​든 문​장​에 LLM​을 호​출​한 경​우​와 같​은 수​준​의 정​확​도​를 유​지​하​였​으​며, 이​에 따​라 LLM 비​용​은 약 50%, 처​리 시​간​은 약 44% 줄​일 수 있​을 것​으​로 기​대​된​다. 다​만 학​습 시​기​와 다​른 데​이​터​에​서​는 분​류​기​가 노​후​화​되​어 확​인​이 필​요​한 문​장​을 더 놓​칠 수 있​으​며, LLM​과 분​류​기​의 판​정​이 엇​갈​리​는 비​율​이 그 징​후​가 될 수 있​고 새 데​이​터 일​부​로 다​시 학​습​하​면 이​를 줄​일 수 있​었​다. 또​한 CLEF 영​어 데​이​터​가 ClaimBuster​에​서 구​축​된[3] 두 영​어 데​이​터​셋​으​로​만 평​가​하​였​으​므​로, 향​후​에​는 분​류​기​의 주​기​적 재​학​습​과 다​국​어 데​이​터​로 평​가​를 확​장​할 계획이다.</w:t>
       </w:r>
     </w:p>
     <w:p>

</xml_diff>

<commit_message>
Proofreading pass: grammar, tense, and flow
- Intro: double topic marker (운영사는 … 호출하는 것은 → 것이)
- 3.2: rate rule says gains stop "beyond" 50%
- 3.3: tense (이르지만 → 이르렀지만); Haiku "신뢰구간 하한"; drift sentence gets
  its subject (이 비율을) and the 300-sentence remedy its own sentence
- Conclusion: split the run-on limitation sentence; parallel future-work clause
- 2 pages; numbers and references verified; all body lines < 9pt word gap

Co-Authored-By: Claude Opus 5.5 <noreply@anthropic.com>
</commit_message>
<xml_diff>
--- a/paper/cascade_kics_draft.docx
+++ b/paper/cascade_kics_draft.docx
@@ -219,7 +219,7 @@
           <w:i w:val="0"/>
           <w:sz w:val="18"/>
         </w:rPr>
-        <w:t>온​라​인 허​위 정​보​가 급​증​하​면​서 팩​트​체​크​의 중​요​성​이 커​졌​으​며, 그 첫 단​계​는 사​실 확​인​이 필​요​한 주​장​을 찾​아​내​는 팩​트​체​크 필​요​성 탐​지​이​다[3]. 이 단​계​는 들​어​오​는 모​든 문​장​을 판​정​해​야 하​므​로 처​리​할 문​장​이 매​우 많​다. 대​형 언​어 모​델​(LLM)은 이 판​정​을 잘 수​행​하​지​만, 실​제 팩​트​체​크 서​비​스 운​영​사​는 모​든 문​장​에 대​형 LLM​을 호​출​하​는 것​은 운​영 규​모​에​서 감​당​하​기 어​렵​다​고 보​고​하​였​다[1]. 같​은 연​구​진​은 소​형 인​코​더​가 확​신​하​지 못​하​는 문​장​만 LLM​에 넘​기​는 방​식​을 향​후 과​제​로 제시하였다[2].</w:t>
+        <w:t>온​라​인 허​위 정​보​가 급​증​하​면​서 팩​트​체​크​의 중​요​성​이 커​졌​으​며, 그 첫 단​계​는 사​실 확​인​이 필​요​한 주​장​을 찾​아​내​는 팩​트​체​크 필​요​성 탐​지​이​다[3]. 이 단​계​는 들​어​오​는 모​든 문​장​을 판​정​해​야 하​므​로 처​리​할 문​장​이 매​우 많​다. 대​형 언​어 모​델​(LLM)은 이 판​정​을 잘 수​행​하​지​만, 실​제 팩​트​체​크 서​비​스 운​영​사​는 모​든 문​장​에 대​형 LLM​을 호​출​하​는 것​이 운​영 규​모​에​서 감​당​하​기 어​렵​다​고 보​고​하​였​다[1]. 같​은 연​구​진​은 소​형 인​코​더​가 확​신​하​지 못​하​는 문​장​만 LLM​에 넘​기​는 방​식​을 향​후 과​제​로 제시하였다[2].</w:t>
       </w:r>
     </w:p>
     <w:p>
@@ -667,7 +667,7 @@
           <w:i w:val="0"/>
           <w:sz w:val="18"/>
         </w:rPr>
-        <w:t>평​가 지​표​는 테​스​트 정​확​도​이​며, 학​습 세​트​의 80%​를 비​복​원 추​출​하​여 5​회 반​복​한 평​균​을 보​고​한​다. 방​법 간 차​이​는 5​회 각​각​의 예​측​에 McNemar 검​정​(α=0.05, 다​중 비​교 보​정 없​음)을 적​용​하​고, 차​이​의 95% 신​뢰​구​간​은 테​스​트 문​장 부​트​스​트​랩​(2,000​회)으​로 구​하​였​다. LLM 임​계​값, 결​합 계​수, 호​출​률, NN-​PPI​의 이​웃 수 k​는 모​두 학​습 세​트 안​에​서​만 정​하​였​고​(두 데​이​터​셋 모​두 k=10), 임​베​딩 SVM​은 기​본 하​이​퍼​파​라​미​터​를 사​용​하​였​다. 호​출​률​은 학​습 세​트​의 교​차​검​증 정​확​도​가 두 데​이​터​셋 모​두 거​의 오​르​지 않​는 50%​로 정하였다.</w:t>
+        <w:t>평​가 지​표​는 테​스​트 정​확​도​이​며, 학​습 세​트​의 80%​를 비​복​원 추​출​하​여 5​회 반​복​한 평​균​을 보​고​한​다. 방​법 간 차​이​는 5​회 각​각​의 예​측​에 McNemar 검​정​(α=0.05, 다​중 비​교 보​정 없​음)을 적​용​하​고, 차​이​의 95% 신​뢰​구​간​은 테​스​트 문​장 부​트​스​트​랩​(2,000​회)으​로 구​하​였​다. LLM 임​계​값, 결​합 계​수, 호​출​률, NN-​PPI​의 이​웃 수 k​는 모​두 학​습 세​트 안​에​서​만 정​하​였​고​(두 데​이​터​셋 모​두 k=10), 임​베​딩 SVM​은 기​본 하​이​퍼​파​라​미​터​를 사​용​하​였​다. 호​출​률​은 그 이​상 높​여​도 학​습 세​트​의 교​차​검​증 정​확​도​가 두 데​이​터​셋 모​두 거​의 오​르​지 않​는 50%​로 정하였다.</w:t>
       </w:r>
     </w:p>
     <w:p>
@@ -1594,7 +1594,7 @@
           <w:i w:val="0"/>
           <w:sz w:val="18"/>
         </w:rPr>
-        <w:t>그​림 2​와 같​이 결​합​형​은 LLM​을 호​출​하​는 모​든 호​출​률​에​서 교​체​형​보​다 평​균 정​확​도​가 높​았​다. 전​량 호​출​의 평​균 정​확​도​에 교​체​형​은 호​출​률 50%​에​서 이​르​지​만, 결​합​형​은 CLEF 30%, ClaimBuster 40%​에​서 이르렀다.</w:t>
+        <w:t>그​림 2​와 같​이 결​합​형​은 LLM​을 호​출​하​는 모​든 호​출​률​에​서 교​체​형​보​다 평​균 정​확​도​가 높​았​다. 전​량 호​출​의 평​균 정​확​도​에 교​체​형​은 호​출​률 50%​에​서 이​르​렀​지​만, 결​합​형​은 CLEF 30%, ClaimBuster 40%​에​서 이르렀다.</w:t>
       </w:r>
     </w:p>
     <w:p>
@@ -1630,7 +1630,7 @@
           <w:i w:val="0"/>
           <w:sz w:val="18"/>
         </w:rPr>
-        <w:t>LLM​을 Claude Haiku 4.5​로 바​꾸​면 결​합​형​(50%)의 하​한​은 5​회 모​두 −1.6%p 이​상​이​었​으​나, 교​체​형​은 CLEF​에​서 하​한​이 −3.1%p​까​지 내​려​갔​다. 다​만 이​때 결​합​형​은 NN-​PPI​를 적​용​한 전​량 호​출​(0.930, 0.839)보​다 유​의​하​게 높​지 않았다.</w:t>
+        <w:t>LLM​을 Claude Haiku 4.5​로 바​꾸​면 결​합​형​(50%)의 신​뢰​구​간 하​한​은 5​회 모​두 −1.6%p 이​상​이​었​으​나, 교​체​형​은 CLEF​에​서 하​한​이 −3.1%p​까​지 내​려​갔​다. 다​만 이​때 결​합​형​은 NN-​PPI​를 적​용​한 전​량 호​출​(0.930, 0.839)보​다 유​의​하​게 높​지 않았다.</w:t>
       </w:r>
     </w:p>
     <w:p>
@@ -1648,7 +1648,7 @@
           <w:i w:val="0"/>
           <w:sz w:val="18"/>
         </w:rPr>
-        <w:t>한​편 학​습 데​이​터​(2012​년 토​론)와 시​기​가 다​른 테​스​트​(ClaimBuster 2016​년 토​론)에​서​는 분​류​기​의 재​현​율​이 0.59​에 그​쳐​(CLEF 0.85), 결​합​형​도 확​인​이 필​요​한 문​장​을 임​계​값​을 조​정​한 전​량 호​출​보​다 많​이 놓​쳤​다​(재​현​율 0.73 대 0.86). 이​때 LLM​을 호​출​한 문​장 중 LLM​만 ‘필​요’로 판​정​한 비​율​이 늘​어​나​(학​습 데​이​터 15.9% → 테​스​트 23.6%, CLEF​는 증​가 없​음) 라​벨 없​이 노​후​화​의 징​후​로 쓸 수 있​어 보​이​며, 2016​년 토​론 중 300​문​장​의 라​벨​을 학​습 세​트​에 추​가​하​면 나​머​지 문​장​에​서 재​현​율​이 3.7%p 올랐다.</w:t>
+        <w:t>한​편 학​습 데​이​터​(2012​년 토​론)와 시​기​가 다​른 테​스​트​(ClaimBuster 2016​년 토​론)에​서​는 분​류​기​의 재​현​율​이 0.59​에 그​쳐​(CLEF 0.85), 결​합​형​도 확​인​이 필​요​한 문​장​을 임​계​값​을 조​정​한 전​량 호​출​보​다 많​이 놓​쳤​다​(재​현​율 0.73 대 0.86). 이​때 LLM​을 호​출​한 문​장 중 LLM​만 ‘필​요’로 판​정​한 비​율​이 늘​어​나​(학​습 데​이​터 15.9% → 테​스​트 23.6%, CLEF​는 증​가 없​음) 이 비​율​을 라​벨 없​이 분​류​기 노​후​화​의 징​후​로 쓸 수 있​어 보​인​다. 또​한 2016​년 토​론 중 300​문​장​의 라​벨​을 학​습 세​트​에 추​가​하​면 나​머​지 문​장​에​서 재​현​율​이 3.7%p 올랐다.</w:t>
       </w:r>
     </w:p>
     <w:p>
@@ -1743,7 +1743,7 @@
           <w:i w:val="0"/>
           <w:sz w:val="18"/>
         </w:rPr>
-        <w:t>본 논​문​에​서​는 저​비​용 분​류​기​가 확​신​하​지 못​하​는 문​장​에​만 LLM​을 호​출​하​고, 두 모​델​의 점​수​를 결​합​하​여 최​종 판​정​하​는 결​합​형 캐​스​케​이​드​를 제​안​하​였​다. 제​안 방​법​은 LLM 호​출​을 절​반​으​로 줄​이​면​서​도 모​든 문​장​에 LLM​을 호​출​한 경​우​와 같​은 수​준​의 정​확​도​를 유​지​하​였​으​며, 이​에 따​라 LLM 비​용​은 약 50%, 처​리 시​간​은 약 44% 줄​일 수 있​을 것​으​로 기​대​된​다. 다​만 학​습 시​기​와 다​른 데​이​터​에​서​는 분​류​기​가 노​후​화​되​어 확​인​이 필​요​한 문​장​을 더 놓​칠 수 있​으​며, LLM​과 분​류​기​의 판​정​이 엇​갈​리​는 비​율​이 그 징​후​가 될 수 있​고 새 데​이​터 일​부​로 다​시 학​습​하​면 이​를 줄​일 수 있​었​다. 또​한 CLEF 영​어 데​이​터​가 ClaimBuster​에​서 구​축​된[3] 두 영​어 데​이​터​셋​으​로​만 평​가​하​였​으​므​로, 향​후​에​는 분​류​기​의 주​기​적 재​학​습​과 다​국​어 데​이​터​로 평​가​를 확​장​할 계획이다.</w:t>
+        <w:t>본 논​문​에​서​는 저​비​용 분​류​기​가 확​신​하​지 못​하​는 문​장​에​만 LLM​을 호​출​하​고, 두 모​델​의 점​수​를 결​합​하​여 최​종 판​정​하​는 결​합​형 캐​스​케​이​드​를 제​안​하​였​다. 제​안 방​법​은 LLM 호​출​을 절​반​으​로 줄​이​면​서​도 모​든 문​장​에 LLM​을 호​출​한 경​우​와 같​은 수​준​의 정​확​도​를 유​지​하​였​으​며, 이​에 따​라 LLM 비​용​은 약 50%, 처​리 시​간​은 약 44% 줄​일 수 있​을 것​으​로 기​대​된​다. 다​만 학​습 시​기​와 다​른 데​이​터​에​서​는 분​류​기​가 노​후​화​되​어 확​인​이 필​요​한 문​장​을 더 놓​칠 수 있​다. 이​때 LLM​과 분​류​기​의 판​정​이 엇​갈​리​는 비​율​이 그 징​후​가 될 수 있​으​며, 새 데​이​터 일​부​로 다​시 학​습​하​면 놓​치​는 문​장​이 줄​었​다. 또​한 CLEF 영​어 데​이​터​가 ClaimBuster​에​서 구​축​된[3] 두 영​어 데​이​터​셋​으​로​만 평​가​하​였​으​므​로, 향​후​에​는 분​류​기​의 주​기​적 재​학​습​을 검​증​하​고 다​국​어 데​이​터​로 평​가​를 확​장​할 계획이다.</w:t>
       </w:r>
     </w:p>
     <w:p>

</xml_diff>

<commit_message>
Soften the drift claims: one observed case, no causal "노후화"
- Conclusion: limited to the ClaimBuster test; disagreement rate "징후로 활용할
  가능성"; retraining reduces misses "다소"
- 3.3: "분류기 노후화의 징후" -> "분류기 성능 저하의 징후"
- 2 pages; numbers and references verified; word-gap scan clean

Co-Authored-By: Claude Opus 5.5 <noreply@anthropic.com>
</commit_message>
<xml_diff>
--- a/paper/cascade_kics_draft.docx
+++ b/paper/cascade_kics_draft.docx
@@ -1648,7 +1648,7 @@
           <w:i w:val="0"/>
           <w:sz w:val="18"/>
         </w:rPr>
-        <w:t>한​편 학​습 데​이​터​(2012​년 토​론)와 시​기​가 다​른 테​스​트​(ClaimBuster 2016​년 토​론)에​서​는 분​류​기​의 재​현​율​이 0.59​에 그​쳐​(CLEF 0.85), 결​합​형​도 확​인​이 필​요​한 문​장​을 임​계​값​을 조​정​한 전​량 호​출​보​다 많​이 놓​쳤​다​(재​현​율 0.73 대 0.86). 이​때 LLM​을 호​출​한 문​장 중 LLM​만 ‘필​요’로 판​정​한 비​율​이 늘​어​나​(학​습 데​이​터 15.9% → 테​스​트 23.6%, CLEF​는 증​가 없​음) 이 비​율​을 라​벨 없​이 분​류​기 노​후​화​의 징​후​로 쓸 수 있​어 보​인​다. 또​한 2016​년 토​론 중 300​문​장​의 라​벨​을 학​습 세​트​에 추​가​하​면 나​머​지 문​장​에​서 재​현​율​이 3.7%p 올랐다.</w:t>
+        <w:t>한​편 학​습 데​이​터​(2012​년 토​론)와 시​기​가 다​른 테​스​트​(ClaimBuster 2016​년 토​론)에​서​는 분​류​기​의 재​현​율​이 0.59​에 그​쳐​(CLEF 0.85), 결​합​형​도 확​인​이 필​요​한 문​장​을 임​계​값​을 조​정​한 전​량 호​출​보​다 많​이 놓​쳤​다​(재​현​율 0.73 대 0.86). 이​때 LLM​을 호​출​한 문​장 중 LLM​만 ‘필​요’로 판​정​한 비​율​이 늘​어​나​(학​습 데​이​터 15.9% → 테​스​트 23.6%, CLEF​는 증​가 없​음) 이 비​율​을 라​벨 없​이 분​류​기 성​능 저​하​의 징​후​로 쓸 수 있​어 보​인​다. 또​한 2016​년 토​론 중 300​문​장​의 라​벨​을 학​습 세​트​에 추​가​하​면 나​머​지 문​장​에​서 재​현​율​이 3.7%p 올랐다.</w:t>
       </w:r>
     </w:p>
     <w:p>
@@ -1743,7 +1743,7 @@
           <w:i w:val="0"/>
           <w:sz w:val="18"/>
         </w:rPr>
-        <w:t>본 논​문​에​서​는 저​비​용 분​류​기​가 확​신​하​지 못​하​는 문​장​에​만 LLM​을 호​출​하​고, 두 모​델​의 점​수​를 결​합​하​여 최​종 판​정​하​는 결​합​형 캐​스​케​이​드​를 제​안​하​였​다. 제​안 방​법​은 LLM 호​출​을 절​반​으​로 줄​이​면​서​도 모​든 문​장​에 LLM​을 호​출​한 경​우​와 같​은 수​준​의 정​확​도​를 유​지​하​였​으​며, 이​에 따​라 LLM 비​용​은 약 50%, 처​리 시​간​은 약 44% 줄​일 수 있​을 것​으​로 기​대​된​다. 다​만 학​습 시​기​와 다​른 데​이​터​에​서​는 분​류​기​가 노​후​화​되​어 확​인​이 필​요​한 문​장​을 더 놓​칠 수 있​다. 이​때 LLM​과 분​류​기​의 판​정​이 엇​갈​리​는 비​율​이 그 징​후​가 될 수 있​으​며, 새 데​이​터 일​부​로 다​시 학​습​하​면 놓​치​는 문​장​이 줄​었​다. 또​한 CLEF 영​어 데​이​터​가 ClaimBuster​에​서 구​축​된[3] 두 영​어 데​이​터​셋​으​로​만 평​가​하​였​으​므​로, 향​후​에​는 분​류​기​의 주​기​적 재​학​습​을 검​증​하​고 다​국​어 데​이​터​로 평​가​를 확​장​할 계획이다.</w:t>
+        <w:t>본 논​문​에​서​는 저​비​용 분​류​기​가 확​신​하​지 못​하​는 문​장​에​만 LLM​을 호​출​하​고, 두 모​델​의 점​수​를 결​합​하​여 최​종 판​정​하​는 결​합​형 캐​스​케​이​드​를 제​안​하​였​다. 제​안 방​법​은 LLM 호​출​을 절​반​으​로 줄​이​면​서​도 모​든 문​장​에 LLM​을 호​출​한 경​우​와 같​은 수​준​의 정​확​도​를 유​지​하​였​으​며, 이​에 따​라 LLM 비​용​은 약 50%, 처​리 시​간​은 약 44% 줄​일 수 있​을 것​으​로 기​대​된​다. 다​만 학​습 시​기​와 다​른 ClaimBuster 테​스​트​에​서​는 분​류​기​가 확​인​이 필​요​한 문​장​을 더 놓​쳤​다. 이​때 LLM​과 분​류​기​의 판​정​이 엇​갈​리​는 비​율​이 늘​어​나 이​를 징​후​로 활​용​할 가​능​성​이 있​으​며, 같​은 시​기 문​장 일​부​로 다​시 학​습​하​면 놓​치​는 문​장​이 다​소 줄​었​다. 또​한 CLEF 영​어 데​이​터​가 ClaimBuster​에​서 구​축​된[3] 두 영​어 데​이​터​셋​으​로​만 평​가​하​였​으​므​로, 향​후​에​는 분​류​기​의 주​기​적 재​학​습​을 검​증​하​고 다​국​어 데​이​터​로 평​가​를 확​장​할 계획이다.</w:t>
       </w:r>
     </w:p>
     <w:p>

</xml_diff>

<commit_message>
100-run re-evaluation (advisor: 5 runs too few) and the paper rewritten to it
- final_eval: SEEDS from CWC_SEEDS (default 100), optional CWC_CACHE prediction cache, progress lines
- results/paper/*.json, logs: 100 runs (seeds 0-4 = the earlier 5)
- pre-registered rule 4 applied: fused@50% meets the -0.6pp bound in 90/83 of 100 runs (<95), so the
  'same level as all-call' claim is dropped; abstract/results report mean gain (+0.7/+1.1pp), 0/100 runs
  significantly lower, and the counts; replacement reaches all-call mean only on CLEF (60%)
- Haiku: fused mean -0.4/-0.2pp, never significantly lower, bound met 91/96 (replacement 2/50)
- Fig. 1: rho on the yes arrow; Table 1 dagger = majority of runs; text tightened to stay at 2 pages
- verify_paper_numbers.py updated (ALL MATCH); references verified; references.json renumbered
- paper/make_redline.ps1 + paper/review_1004/수정내역.md (marked-up docx/pdf vs advisor ver.2 kept local)

Co-Authored-By: Claude Opus 5.5 <noreply@anthropic.com>
</commit_message>
<xml_diff>
--- a/paper/cascade_kics_draft.docx
+++ b/paper/cascade_kics_draft.docx
@@ -137,7 +137,7 @@
           <w:i w:val="0"/>
           <w:sz w:val="22"/>
         </w:rPr>
-        <w:t>Hanbat National Univ.</w:t>
+        <w:t>Hanbat National University</w:t>
       </w:r>
     </w:p>
     <w:p>
@@ -172,7 +172,7 @@
           <w:i w:val="0"/>
           <w:sz w:val="18"/>
         </w:rPr>
-        <w:t>팩​트​체​크 필​요​성 탐​지​(check-​worthiness detection)는 수​많​은 문​장 중 사​실 확​인​이 필​요​한 문​장​을 골​라​내​는 기​술​이​다. 대​형 언​어 모​델​(LLM)은 이 판​정​을 잘 수​행​하​지​만, 모​든 문​장​에 LLM​을 호​출​하​면 비​용​과 처​리 시​간​이 크​게 늘​어​난​다. 본 논​문​에​서​는 가​벼​운 저​비​용 분​류​기​가 모​든 문​장​을 먼​저 판​정​하​고, 분​류​기​가 확​신​하​지 못​하​는 문​장​에​만 LLM​을 호​출​하​되 분​류​기​의 판​정​을 LLM​의 판​정​으​로 교​체​하​지 않​고 두 모​델​의 점​수​를 결​합​하​여 최​종 판​정​하​는 결​합​형 캐​스​케​이​드​를 제​안​한​다. 두 공​개 데​이​터​셋​(CLEF 2024, ClaimBuster)에​서 평​가​한 결​과, 제​안 방​법​은 LLM 호​출​을 절​반​으​로 줄​이​면​서​도 모​든 문​장​에 LLM​을 호​출​한 경​우​와 같​은 수​준​의 정​확​도​(CLEF 0.923, ClaimBuster 0.846)를 유​지​하​였​다. 정​확​도​는 평​균​적​으​로 오​히​려 0.8~1.1%p 높​았​고, 5​회 반​복 모​두 차​이​의 95% 신​뢰​구​간 하​한​이 −0.6%p 이​상​이​었​다. 이​를 통​해 LLM 비​용​은 약 50%, 처​리 시​간​은 약 44% 줄​일 수 있​을 것​으​로 기대된다.</w:t>
+        <w:t>팩​트​체​크 필​요​성 탐​지​(check-​worthiness detection)는 수​많​은 문​장 중 사​실 확​인​이 필​요​한 문​장​을 골​라​내​는 기​술​이​다. 대​형 언​어 모​델​(LLM)은 이 판​정​을 잘 수​행​하​지​만, 모​든 문​장​에 LLM​을 호​출​하​면 비​용​과 처​리 시​간​이 크​게 늘​어​난​다. 본 논​문​에​서​는 저​비​용 분​류​기​가 확​신​하​지 못​하​는 문​장​에​만 LLM​을 호​출​하​되, 분​류​기​의 판​정​을 LLM​의 판​정​으​로 교​체​하​지 않​고 두 모​델​의 점​수​를 결​합​하​여 최​종 판​정​하​는 결​합​형 캐​스​케​이​드​를 제​안​한​다. 두 공​개 데​이​터​셋​(CLEF 2024, ClaimBuster)에​서 평​가​한 결​과, 제​안 방​법​은 LLM 호​출​을 절​반​으​로 줄​이​면​서​도 모​든 문​장​에 LLM​을 호​출​한 경​우​보​다 평​균 정​확​도​가 0.7~1.1%p 높​았​고​(CLEF 0.922, ClaimBuster 0.846), 100​회 반​복 중 유​의​하​게 낮​은 경​우​는 없​었​다. 다​만 차​이​의 95% 신​뢰​구​간 하​한​이 −0.6%p 이​상​인 반​복​은 CLEF 90​회, ClaimBuster 83​회​였​다. 이​를 통​해 LLM 비​용​은 약 50%, 처​리 시​간​은 약 44% 줄​일 수 있​을 것​으​로 기대된다.</w:t>
       </w:r>
     </w:p>
     <w:p>
@@ -219,7 +219,7 @@
           <w:i w:val="0"/>
           <w:sz w:val="18"/>
         </w:rPr>
-        <w:t>온​라​인 허​위 정​보​가 급​증​하​면​서 팩​트​체​크​의 중​요​성​이 커​졌​으​며, 그 첫 단​계​는 사​실 확​인​이 필​요​한 주​장​을 찾​아​내​는 팩​트​체​크 필​요​성 탐​지​이​다[3]. 이 단​계​는 들​어​오​는 모​든 문​장​을 판​정​해​야 하​므​로 처​리​할 문​장​이 매​우 많​다. 대​형 언​어 모​델​(LLM)은 이 판​정​을 잘 수​행​하​지​만, 실​제 팩​트​체​크 서​비​스 운​영​사​는 모​든 문​장​에 대​형 LLM​을 호​출​하​는 것​이 운​영 규​모​에​서 감​당​하​기 어​렵​다​고 보​고​하​였​다[1]. 같​은 연​구​진​은 소​형 인​코​더​가 확​신​하​지 못​하​는 문​장​만 LLM​에 넘​기​는 방​식​을 향​후 과​제​로 제시하였다[2].</w:t>
+        <w:t>온​라​인 허​위 정​보​가 급​증​하​면​서 팩​트​체​크​의 중​요​성​이 커​졌​으​며, 그 첫 단​계​는 사​실 확​인​이 필​요​한 주​장​을 찾​아​내​는 팩​트​체​크 필​요​성 탐​지​이​다[1]. 이 단​계​는 들​어​오​는 모​든 문​장​을 판​정​해​야 하​므​로 처​리​할 문​장​이 매​우 많​다. 대​형 언​어 모​델​(LLM)은 이 판​정​을 잘 수​행​하​지​만, 실​제 팩​트​체​크 서​비​스 운​영​사​는 모​든 문​장​에 대​형 LLM​을 호​출​하​는 것​이 운​영 규​모​에​서 감​당​하​기 어​렵​다​고 보​고​하​였​다[2]. 같​은 연​구​진​은 소​형 인​코​더​가 확​신​하​지 못​하​는 문​장​만 LLM​에 넘​기​는 방​식​을 향​후 과​제​로 제시하였다[3].</w:t>
       </w:r>
     </w:p>
     <w:p>
@@ -237,7 +237,7 @@
           <w:i w:val="0"/>
           <w:sz w:val="18"/>
         </w:rPr>
-        <w:t>이​처​럼 가​벼​운 모​델​이 먼​저 판​정​하​고 확​신​하​지 못​하​는 입​력​만 큰 모​델​에 넘​기​는 구​조​를 캐​스​케​이​드​라 하​며, 일​반​적​으​로 넘​긴 입​력​의 판​정​은 큰 모​델​의 판​정​으​로 교​체​한​다[5]. 그​러​나 어​떤 문​장​을 사​실 확​인​이 필​요​하​다​고 볼​지​에 대​한 LLM​의 기​준​은 데​이​터​셋​의 라​벨​(사​람​이 붙​인 정​답)과 다​를 수 있​으​며, 이 경​우 교​체​는 분​류​기​가 이​미 맞​힌 판​정​까​지 틀​리​게 바​꿀 수 있​다[5]. 본 논​문​에​서​는 저​비​용 분​류​기​가 확​신​하​지 못​하​는 문​장​에​만 LLM​을 호​출​하​되, LLM​의 판​정​으​로 교​체​하​지 않​고 두 모​델​의 점​수​를 결​합​하​여 최​종 판​정​하​는 결​합​형 캐​스​케​이​드​를 제​안​한​다. 결​합 가​중​치​는 라​벨​로 학​습​하​므​로 LLM​의 기​준​과 라​벨​의 차​이​를 보정한다.</w:t>
+        <w:t>이​처​럼 가​벼​운 모​델​이 먼​저 판​정​하​고 확​신​하​지 못​하​는 입​력​만 큰 모​델​에 넘​기​는 구​조​를 캐​스​케​이​드​라 하​며, 일​반​적​으​로 넘​긴 입​력​의 판​정​은 큰 모​델​의 판​정​으​로 교​체​한​다[4]. 그​러​나 어​떤 문​장​을 사​실 확​인​이 필​요​하​다​고 볼​지​에 대​한 LLM​의 기​준​은 데​이​터​셋​의 라​벨​(사​람​이 붙​인 정​답)과 다​를 수 있​으​며, 이 경​우 교​체​는 분​류​기​가 이​미 맞​힌 판​정​까​지 틀​리​게 바​꿀 수 있​다. 본 논​문​에​서​는 저​비​용 분​류​기​가 확​신​하​지 못​하​는 문​장​에​만 LLM​을 호​출​하​되, LLM​의 판​정​으​로 교​체​하​지 않​고 두 모​델​의 점​수​를 결​합​하​여 최​종 판​정​하​는 결​합​형 캐​스​케​이​드​를 제​안​한​다. 결​합 가​중​치​는 라​벨​로 학​습​하​므​로 LLM​의 기​준​과 라​벨​의 차​이​를 보정한다.</w:t>
       </w:r>
     </w:p>
     <w:p>
@@ -289,7 +289,7 @@
           <w:i w:val="0"/>
           <w:sz w:val="18"/>
         </w:rPr>
-        <w:t>NN-​PPI[1]는 소​형 LLM​이 출​력​한 점​수​를, 라​벨​이 있​는 보​정 세​트​에​서 의​미​적​으​로 가​까​운 이​웃 문​장​들​의 잔​차​로 보​정​한​다. 넘​긴 입​력​에​서​만 두 모​델​의 출​력​을 결​합​하​는 캐​스​케​이​드​는 일​반 분​류 과​제​에​서 제​안​되​었​고[6], SRR[5]은 옳​은 답​을 뒤​집​는 손​실​까​지 예​측​하​여 넘​길 입​력​을 고​르​지​만 넘​긴 입​력​은 큰 모​델​의 답​으​로 교​체​한​다. 본 논​문​은 결​합 가​중​치​를 라​벨​로 학​습​해 LLM​의 기​준 차​이​를 반영한다.</w:t>
+        <w:t>NN-​PPI[2]는 소​형 LLM​이 출​력​한 점​수​를, 라​벨​이 있​는 보​정 세​트​에​서 의​미​적​으​로 가​까​운 이​웃 문​장​들​의 잔​차​로 보​정​한​다. 넘​긴 입​력​에​서​만 두 모​델​의 출​력​을 결​합​하​는 캐​스​케​이​드​는 일​반 분​류 과​제​에​서 제​안​되​었​고[5], SRR[4]은 옳​은 답​을 뒤​집​는 손​실​까​지 예​측​하​여 넘​길 입​력​을 고​르​지​만 넘​긴 입​력​은 큰 모​델​의 답​으​로 교​체​한​다. 본 논​문​은 결​합 가​중​치​를 라​벨​로 학​습​해 LLM​의 기​준 차​이​를 반영한다.</w:t>
       </w:r>
     </w:p>
     <w:p>
@@ -324,7 +324,7 @@
           <w:i w:val="0"/>
           <w:sz w:val="18"/>
         </w:rPr>
-        <w:t>제​안 방​법​(그​림 1)에​서​는 저​비​용 분​류​기​가 모​든 문​장​을 먼​저 판​정​하​고, 분​류​기​가 가​장 불​확​실​한 문​장, 즉 결​정​값​의 절​댓​값 |d(x)|가 가​장 작​은 문​장​부​터 전​체​의 ρ(호​출​률)만​큼 골​라 LLM​을 호​출​한​다. 호​출​하​지 않​은 문​장​은 분​류​기​의 판​정​(d(x)&gt;0)을 그​대​로 사​용​하​고, 호​출​한 문​장​은 2.4​절​의 결​합 판​정​으​로 최​종 판정한다.</w:t>
+        <w:t>그​림 1​은 제​안​하​는 결​합​형 캐​스​케​이​드​의 전​체 구​조​이​다. 저​비​용 분​류​기​가 모​든 문​장​을 먼​저 판​정​하​고, 분​류​기​가 가​장 불​확​실​한 문​장, 즉 결​정​값​의 절​댓​값 |d(x)|가 가​장 작​은 문​장​부​터 전​체​의 ρ(호​출​률)만​큼 골​라​(그​림 1​의 yes 경​로) LLM​을 호​출​한​다. 호​출​하​지 않​은 문​장​은 분​류​기​의 판​정​(d(x)&gt;0)을 그​대​로 사​용​하​고, 호​출​한 문​장​은 2.4​절​의 결​합 판​정​으​로 최​종 판정한다.</w:t>
       </w:r>
     </w:p>
     <w:p>
@@ -514,6 +514,7 @@
           <w:i w:val="0"/>
           <w:sz w:val="18"/>
         </w:rPr>
+        <w:t>,</w:t>
         <w:tab/>
         <w:t>(1)</w:t>
       </w:r>
@@ -580,7 +581,7 @@
           <w:i w:val="0"/>
           <w:sz w:val="18"/>
         </w:rPr>
-        <w:t>는 조​건​이 참​이​면 1​인 지​시​함​수​이​다. 식 (1)을 s​에 대​해 정​리​하​면 결​합​형​은 s​를 (−c−a·d)/b​와 비​교​하​므​로, 분​류​기​가 ‘불​필​요’로 기​울​수​록​(d​가 작​을​수​록) LLM​에 더 높​은 점​수​를 요​구​한​다. 반​면 교​체​형 캐​스​케​이​드​(이​하 교​체​형)는 s​를 L​에​서 정​한 고​정 임​계​값 t​와 비교한다.</w:t>
+        <w:t>는 조​건​이 참​이​면 1​인 지​시​함​수​이​다. 식 (1)을 s​에 대​해 정​리​하​면 결​합​형​은 s​를 (−c−a×d)/b​와 비​교​하​므​로, 분​류​기​가 ‘불​필​요’로 기​울​수​록​(즉, d​가 작​을​수​록) LLM​에 더 높​은 점​수​를 요​구​한​다. 반​면 교​체​형 캐​스​케​이​드​(이​하 교​체​형)는 s​를 L​에​서 정​확​도​가 가​장 높​은 임​계​값 t(표 1​의 임​계​값 조​정)와 비교한다.</w:t>
       </w:r>
     </w:p>
     <w:p>
@@ -632,7 +633,7 @@
           <w:i w:val="0"/>
           <w:sz w:val="18"/>
         </w:rPr>
-        <w:t>CLEF 2024 CheckThat! Task 1 영​어 데​이​터[3]는 2,405​문​장​을 학​습 세​트​로, dev·dev-​test·공​식 test​를 합​친 1,691​문​장​을 테​스​트​로 사​용​하​였​다. 또 다​른 데​이​터​셋​인 ClaimBuster[4]는 2012​년 토​론 1,314​문​장​을 학​습 세​트​로, 2016​년 토​론 2,745​문​장​을 테​스​트​로 사​용​하​였​다. NN-​PPI​는 원 논​문​과 같​이 Gemma 3 4B​로 재​현​하​였​으​며, 원 논​문​과 같​은 분​할​에​서 가​중 F1​은 CLEF 0.835, ClaimBuster 0.785​였​다​(원 논​문 0.827, 0.760). LLM​은 Claude Sonnet 5​를 사​용​하​였​고, NN-​PPI​의 판​정 기​준 프​롬​프​트​로 40​문​장​씩 묶​어 채점하였다.</w:t>
+        <w:t>CLEF 2024 CheckThat! Task 1 데​이​터[1]는 2,405​문​장​을 학​습 세​트​로, dev·dev-​test·공​식 test​를 합​친 1,691​문​장​을 테​스​트​로 사​용​하​였​다. 또 다​른 데​이​터​셋​인 ClaimBuster[6]는 2012​년 토​론 1,314​문​장​을 학​습 세​트​로, 2016​년 토​론 2,745​문​장​을 테​스​트​로 사​용​하​였​다. NN-​PPI​는 원 논​문[2]과 같​이 Gemma 3 4B​로 재​현​하​였​으​며, 원 논​문​과 같​은 분​할​에​서 가​중 F1​은 CLEF 0.835, ClaimBuster 0.785​였​다​(원 논​문 보​고​값 0.827, 0.760). LLM​은 Claude Sonnet 5​를 사​용​하​였​고, NN-​PPI​의 판​정 기​준 프​롬​프​트​로 40​문​장​씩 묶​어 채점하였다.</w:t>
       </w:r>
     </w:p>
     <w:p>
@@ -667,7 +668,7 @@
           <w:i w:val="0"/>
           <w:sz w:val="18"/>
         </w:rPr>
-        <w:t>평​가 지​표​는 테​스​트 정​확​도​이​며, 학​습 세​트​의 80%​를 비​복​원 추​출​하​여 5​회 반​복​한 평​균​을 보​고​한​다. 방​법 간 차​이​는 5​회 각​각​의 예​측​에 McNemar 검​정​(α=0.05, 다​중 비​교 보​정 없​음)을 적​용​하​고, 차​이​의 95% 신​뢰​구​간​은 테​스​트 문​장 부​트​스​트​랩​(2,000​회)으​로 구​하​였​다. LLM 임​계​값, 결​합 계​수, 호​출​률, NN-​PPI​의 이​웃 수 k​는 모​두 학​습 세​트 안​에​서​만 정​하​였​고​(두 데​이​터​셋 모​두 k=10), 임​베​딩 SVM​은 기​본 하​이​퍼​파​라​미​터​를 사​용​하​였​다. 호​출​률​은 그 이​상 높​여​도 학​습 세​트​의 교​차​검​증 정​확​도​가 두 데​이​터​셋 모​두 거​의 오​르​지 않​는 50%​로 정하였다.</w:t>
+        <w:t>평​가 지​표​는 테​스​트 정​확​도​이​며, 학​습 세​트​의 80%​를 비​복​원 추​출​하​여 100​회 반​복​한 평​균​을 보​고​한​다​(LLM 점​수​와 테​스​트 세​트​는 반​복 간 동​일). 방​법 간 차​이​는 각 반​복​의 예​측​에 McNemar 검​정​(α=0.05, 다​중 비​교 보​정 없​음)을 적​용​하​고, 차​이​의 95% 신​뢰​구​간​은 테​스​트 문​장 부​트​스​트​랩​(2,000​회)으​로 구​하​였​다​(하​한 기​준​값​은 100​회 실​행 전​에 정​함). LLM 임​계​값, 결​합 계​수, 호​출​률, NN-​PPI​의 이​웃 수 k​는 모​두 학​습 세​트 안​에​서​만 정​하​였​고​(두 데​이​터​셋 모​두 k=10), 임​베​딩 SVM​은 기​본 하​이​퍼​파​라​미​터​를 사​용​하​였​다. 호​출​률​은 그 이​상 높​여​도 학​습 세​트​의 교​차​검​증 정​확​도​가 0.3%p 이​하​로​만 오​르​는 50%​로 정하였다.</w:t>
       </w:r>
     </w:p>
     <w:p>
@@ -702,7 +703,7 @@
           <w:i w:val="0"/>
           <w:sz w:val="16"/>
         </w:rPr>
-        <w:t>표 1. 테스트 정확도(†: 5회 중 3회 이상 제안보다 유의하게 낮음)</w:t>
+        <w:t>표 1. 테스트 정확도(†: 과반 반복에서 제안보다 유의하게 낮음)</w:t>
       </w:r>
     </w:p>
     <w:tbl>
@@ -856,7 +857,7 @@
                 <w:i w:val="0"/>
                 <w:sz w:val="16"/>
               </w:rPr>
-              <w:t>Gemma+NN-​PPI [1]</w:t>
+              <w:t>Gemma+NN-​PPI [2]</w:t>
             </w:r>
           </w:p>
         </w:tc>
@@ -1019,7 +1020,7 @@
                 <w:i w:val="0"/>
                 <w:sz w:val="16"/>
               </w:rPr>
-              <w:t>0.790</w:t>
+              <w:t>0.788</w:t>
             </w:r>
           </w:p>
         </w:tc>
@@ -1207,7 +1208,7 @@
                 <w:i w:val="0"/>
                 <w:sz w:val="16"/>
               </w:rPr>
-              <w:t>0.830†</w:t>
+              <w:t>0.827†</w:t>
             </w:r>
           </w:p>
         </w:tc>
@@ -1232,7 +1233,7 @@
                 <w:i w:val="0"/>
                 <w:sz w:val="16"/>
               </w:rPr>
-              <w:t xml:space="preserve">  + NN-​PPI [1]</w:t>
+              <w:t xml:space="preserve">  + NN-​PPI [2]</w:t>
             </w:r>
           </w:p>
         </w:tc>
@@ -1278,7 +1279,7 @@
                 <w:i w:val="0"/>
                 <w:sz w:val="16"/>
               </w:rPr>
-              <w:t>0.897†</w:t>
+              <w:t>0.899†</w:t>
             </w:r>
           </w:p>
         </w:tc>
@@ -1301,7 +1302,7 @@
                 <w:i w:val="0"/>
                 <w:sz w:val="16"/>
               </w:rPr>
-              <w:t>0.826†</w:t>
+              <w:t>0.825†</w:t>
             </w:r>
           </w:p>
         </w:tc>
@@ -1372,7 +1373,7 @@
                 <w:i w:val="0"/>
                 <w:sz w:val="16"/>
               </w:rPr>
-              <w:t>0.916</w:t>
+              <w:t>0.915</w:t>
             </w:r>
           </w:p>
         </w:tc>
@@ -1395,7 +1396,7 @@
                 <w:i w:val="0"/>
                 <w:sz w:val="16"/>
               </w:rPr>
-              <w:t>0.835†</w:t>
+              <w:t>0.831†</w:t>
             </w:r>
           </w:p>
         </w:tc>
@@ -1475,7 +1476,7 @@
                 <w:i w:val="0"/>
                 <w:sz w:val="16"/>
               </w:rPr>
-              <w:t>0.923</w:t>
+              <w:t>0.922</w:t>
             </w:r>
           </w:p>
         </w:tc>
@@ -1522,7 +1523,7 @@
           <w:i w:val="0"/>
           <w:sz w:val="18"/>
         </w:rPr>
-        <w:t>표 1​에​서 LLM​을 사​용​하​지 않​는 임​베​딩 SVM​은 NN-​PPI​보​다 CLEF​에​서 5​회 중 4​회 유​의​하​게 높​았​으​며, ClaimBuster​에​서​는 5​회 모​두 유​의​차​가 없었다.</w:t>
+        <w:t>표 1​에​서 임​베​딩 SVM​은 NN-​PPI​보​다 CLEF​에​서 100​회 중 87​회 유​의​하​게 높​았​으​며, ClaimBuster​에​서​는 100​회 모​두 유​의​차​가 없었다.</w:t>
       </w:r>
     </w:p>
     <w:p>
@@ -1540,7 +1541,7 @@
           <w:i w:val="0"/>
           <w:sz w:val="18"/>
         </w:rPr>
-        <w:t>LLM 점​수​를 0.5 기​준​으​로 쓰​면 재​현​율​이 CLEF 0.61, ClaimBuster 0.42​에 그​쳤​고, 임​계​값​을 조​정​하​면 재​현​율​은 오​르​나 ClaimBuster 정​확​도​는 0.5%p 낮​아​졌​다. 이​는 LLM​의 기​준​이 라​벨​과 다​름​을 시사한다.</w:t>
+        <w:t>LLM 점​수​를 0.5 기​준​으​로 쓰​면 재​현​율​이 CLEF 0.61, ClaimBuster 0.42​에 그​쳤​고, 임​계​값​을 조​정​하​면 재​현​율​은 오​르​나 ClaimBuster 정​확​도​는 0.8%p 낮​아​져, LLM​의 기​준​이 라​벨​과 다​름​을 시사한다.</w:t>
       </w:r>
     </w:p>
     <w:p>
@@ -1558,7 +1559,7 @@
           <w:i w:val="0"/>
           <w:sz w:val="18"/>
         </w:rPr>
-        <w:t>이​하 전​량 호​출​은 LLM 전​량 호​출​의 두 설​정​(조​정 전, 임​계​값 조​정) 중 정​확​도​가 높​은 쪽​(CLEF​는 임​계​값 조​정, ClaimBuster​는 조​정 전)을 뜻​한​다. 호​출​률 50%​의 결​합​형​은 전​량 호​출​보​다 정​확​도​가 평​균 0.8%p, 1.1%p 높​았​고, 5​회 모​두 차​이​의 95% 신​뢰​구​간 하​한​이 −0.6%p 이​상​이​었​다. 반​면 같​은 호​출​률​의 교​체​형​은 ClaimBuster​에​서 하​한​이 −2.3%p​까​지 내​려​갔​다. 또​한 결​합​형​은 NN-​PPI​를 적​용​한 전​량 호​출​보​다 5​회 모​두 유​의​하​게 높았다(p≤0.016).</w:t>
+        <w:t>이​하 전​량 호​출​은 정​확​도​가 높​은 설​정​(CLEF​는 임​계​값 조​정, ClaimBuster​는 조​정 전)을 뜻​한​다. 호​출​률 50%​의 결​합​형​은 전​량 호​출​보​다 정​확​도​가 평​균 0.7%p, 1.1%p 높​았​고 100​회 중 유​의​하​게 낮​은 경​우​는 없​었​으​며, 신​뢰​구​간 하​한​이 −0.6%p 이​상​인 반​복​은 90​회, 83​회​(교​체​형 72​회, 9​회)였​다. 또​한 NN-​PPI​를 적​용​한 전​량 호​출​보​다 98​회, 94​회 유​의​하​게 높았다.</w:t>
       </w:r>
     </w:p>
     <w:p>
@@ -1576,7 +1577,7 @@
           <w:i w:val="0"/>
           <w:sz w:val="18"/>
         </w:rPr>
-        <w:t>테​스​트 배​치 23​개​를 다​시 호​출​하​여 추​정​한 1,000​문​장​당 LLM 비​용​(Claude Sonnet 5 정​가)은 전​량 호​출 $0.168, 결​합​형 50% $0.084​였​고, 순​차 처​리 시​간​은 임​베​딩 SVM​을 포​함​하​여 107​초, 60​초​로 추정되었다.</w:t>
+        <w:t>테​스​트 배​치 23​개​를 다​시 호​출​하​여 추​정​한 1,000​문​장​당 LLM 비​용​(Claude Sonnet 5 정​가)은 전​량 호​출 $0.168, 결​합​형 50% $0.084, 순​차 처​리 시​간​(임​베​딩 SVM 포​함)은 107​초, 60초였다.</w:t>
       </w:r>
     </w:p>
     <w:p>
@@ -1594,7 +1595,26 @@
           <w:i w:val="0"/>
           <w:sz w:val="18"/>
         </w:rPr>
-        <w:t>그​림 2​와 같​이 결​합​형​은 LLM​을 호​출​하​는 모​든 호​출​률​에​서 교​체​형​보​다 평​균 정​확​도​가 높​았​다. 전​량 호​출​의 평​균 정​확​도​에 교​체​형​은 호​출​률 50%​에​서 이​르​렀​지​만, 결​합​형​은 CLEF 30%, ClaimBuster 40%​에​서 이르렀다.</w:t>
+        <w:t>그​림 2​와 같​이 결​합​형​은 모​든 호​출​률​에​서 교​체​형​보​다 평​균 정​확​도​가 높​았​고, 전​량 호​출​의 평​균 정​확​도​에 CLEF 30%, ClaimBuster 40%​에​서 이​르​렀​다. 교​체​형​은 CLEF 60%​에​서 이​르​렀​고 ClaimBuster​에​서​는 이​르​지 못하였다.</w:t>
+      </w:r>
+    </w:p>
+    <w:p>
+      <w:pPr>
+        <w:widowControl w:val="0"/>
+        <w:autoSpaceDE w:val="0"/>
+        <w:autoSpaceDN w:val="0"/>
+        <w:spacing w:after="70" w:line="240" w:lineRule="auto"/>
+        <w:ind w:firstLine="180"/>
+        <w:jc w:val="both"/>
+      </w:pPr>
+      <w:r>
+        <w:rPr>
+          <w:rFonts w:ascii="HY신명조" w:hAnsi="HY신명조" w:eastAsia="HY신명조"/>
+          <w:b w:val="0"/>
+          <w:i w:val="0"/>
+          <w:sz w:val="18"/>
+        </w:rPr>
+        <w:t>예​를 들​어 CLEF​의 한 공​약 문​장​(라​벨: 불​필​요, s=0.35)은 교​체​형​이 t=0.16 기​준​으​로 틀​렸​으​나, 결​합​형​은 d=−0.84​에 따​라 기​준​이 0.41​로 높​아​져 옳​게 판정하였다.</w:t>
       </w:r>
     </w:p>
     <w:p>
@@ -1612,7 +1632,7 @@
           <w:i w:val="0"/>
           <w:sz w:val="18"/>
         </w:rPr>
-        <w:t>두 방​법​은 같​은 문​장​에 LLM​을 호​출​하​므​로 차​이​는 판​정 방​식​에​서​만 생​긴​다. 예​를 들​어 CLEF​의 한 공​약 문​장​(라​벨: 불​필​요)은 LLM 점​수​가 s=0.35​로, 임​계​값 t=0.16​을 사​용​하​는 교​체​형​은 ‘필​요’로 잘​못 판​정​하​였​으​나, 결​합​형​은 분​류​기​의 결​정​값​(d=−0.84)에 따​라 판​정 기​준​이 0.41​로 높​아​져 옳​게 판정하였다.</w:t>
+        <w:t>Claude Haiku 4.5​를 쓰​면 결​합​형​(50%)은 전​량 호​출​보​다 평​균 0.4%p, 0.2%p 낮​았​으​나 유​의​하​게 낮​은 반​복​은 없​었​고, 하​한​이 −1.6%p 이​상​인 반​복​은 91​회, 96​회​(교​체​형 2​회, 50​회)였​다. 다​만 NN-​PPI 적​용 전​량 호​출​보​다 유​의​하​게 높​은 반​복​은 9​회, 32회뿐이었다.</w:t>
       </w:r>
     </w:p>
     <w:p>
@@ -1630,25 +1650,7 @@
           <w:i w:val="0"/>
           <w:sz w:val="18"/>
         </w:rPr>
-        <w:t>LLM​을 Claude Haiku 4.5​로 바​꾸​면 결​합​형​(50%)의 신​뢰​구​간 하​한​은 5​회 모​두 −1.6%p 이​상​이​었​으​나, 교​체​형​은 CLEF​에​서 하​한​이 −3.1%p​까​지 내​려​갔​다. 다​만 이​때 결​합​형​은 NN-​PPI​를 적​용​한 전​량 호​출​(0.930, 0.839)보​다 유​의​하​게 높​지 않았다.</w:t>
-      </w:r>
-    </w:p>
-    <w:p>
-      <w:pPr>
-        <w:autoSpaceDE w:val="0"/>
-        <w:autoSpaceDN w:val="0"/>
-        <w:spacing w:after="70" w:line="240" w:lineRule="auto"/>
-        <w:ind w:firstLine="180"/>
-        <w:jc w:val="both"/>
-      </w:pPr>
-      <w:r>
-        <w:rPr>
-          <w:rFonts w:ascii="HY신명조" w:hAnsi="HY신명조" w:eastAsia="HY신명조"/>
-          <w:b w:val="0"/>
-          <w:i w:val="0"/>
-          <w:sz w:val="18"/>
-        </w:rPr>
-        <w:t>한​편 학​습 데​이​터​(2012​년 토​론)와 시​기​가 다​른 테​스​트​(ClaimBuster 2016​년 토​론)에​서​는 분​류​기​의 재​현​율​이 0.59​에 그​쳐​(CLEF 0.85), 결​합​형​도 확​인​이 필​요​한 문​장​을 임​계​값​을 조​정​한 전​량 호​출​보​다 많​이 놓​쳤​다​(재​현​율 0.73 대 0.86). 이​때 LLM​을 호​출​한 문​장 중 LLM​만 ‘필​요’로 판​정​한 비​율​이 늘​어​나​(학​습 데​이​터 15.9% → 테​스​트 23.6%, CLEF​는 증​가 없​음) 이 비​율​을 라​벨 없​이 분​류​기 성​능 저​하​의 징​후​로 쓸 수 있​어 보​인​다. 또​한 2016​년 토​론 중 300​문​장​의 라​벨​을 학​습 세​트​에 추​가​하​면 나​머​지 문​장​에​서 재​현​율​이 3.7%p 올랐다.</w:t>
+        <w:t>한​편 학​습 시​기​와 다​른 ClaimBuster 테​스​트​(2016​년 토​론)에​서​는 분​류​기​의 재​현​율​이 0.59​에 그​쳐​(CLEF 0.84), 결​합​형​도 확​인​이 필​요​한 문​장​을 임​계​값​을 조​정​한 전​량 호​출​보​다 많​이 놓​쳤​다​(재​현​율 0.74 대 0.86). 이​때 호​출​한 문​장 중 LLM​만 ‘필​요’로 판​정​한 비​율​이 늘​어​나​(학​습 데​이​터 15.9% → 테​스​트 23.6%, CLEF​는 증​가 없​음) 라​벨 없​이 성​능 저​하​의 징​후​로 쓸 수 있​어 보​이​며, 2016​년 토​론 300​문​장​의 라​벨​을 학​습 세​트​에 추​가​하​면 나​머​지 문​장​의 재​현​율​이 3.7%p 올랐다.</w:t>
       </w:r>
     </w:p>
     <w:p>
@@ -1708,7 +1710,7 @@
           <w:i w:val="0"/>
           <w:sz w:val="16"/>
         </w:rPr>
-        <w:t>그림 2. 호출률에 따른 테스트 정확도 (5회 평균, 띠는 표준편차)</w:t>
+        <w:t>그림 2. 호출률에 따른 테스트 정확도 (100회 평균, 띠는 표준편차)</w:t>
       </w:r>
     </w:p>
     <w:p>
@@ -1743,7 +1745,7 @@
           <w:i w:val="0"/>
           <w:sz w:val="18"/>
         </w:rPr>
-        <w:t>본 논​문​에​서​는 저​비​용 분​류​기​가 확​신​하​지 못​하​는 문​장​에​만 LLM​을 호​출​하​고, 두 모​델​의 점​수​를 결​합​하​여 최​종 판​정​하​는 결​합​형 캐​스​케​이​드​를 제​안​하​였​다. 제​안 방​법​은 LLM 호​출​을 절​반​으​로 줄​이​면​서​도 모​든 문​장​에 LLM​을 호​출​한 경​우​와 같​은 수​준​의 정​확​도​를 유​지​하​였​으​며, 이​에 따​라 LLM 비​용​은 약 50%, 처​리 시​간​은 약 44% 줄​일 수 있​을 것​으​로 기​대​된​다. 다​만 학​습 시​기​와 다​른 ClaimBuster 테​스​트​에​서​는 분​류​기​가 확​인​이 필​요​한 문​장​을 더 놓​쳤​다. 이​때 LLM​과 분​류​기​의 판​정​이 엇​갈​리​는 비​율​이 늘​어​나 이​를 징​후​로 활​용​할 가​능​성​이 있​으​며, 같​은 시​기 문​장 일​부​로 다​시 학​습​하​면 놓​치​는 문​장​이 다​소 줄​었​다. 또​한 CLEF 영​어 데​이​터​가 ClaimBuster​에​서 구​축​된[3] 두 영​어 데​이​터​셋​으​로​만 평​가​하​였​으​므​로, 향​후​에​는 분​류​기​의 주​기​적 재​학​습​을 검​증​하​고 다​국​어 데​이​터​로 평​가​를 확​장​할 계획이다.</w:t>
+        <w:t>본 논​문​에​서​는 저​비​용 분​류​기​가 확​신​하​지 못​하​는 문​장​에​만 LLM​을 호​출​하​고, 두 모​델​의 점​수​를 결​합​하​여 최​종 판​정​하​는 결​합​형 캐​스​케​이​드​를 제​안​하​였​다. 제​안 방​법​은 LLM 호​출​을 절​반​으​로 줄​이​면​서​도 모​든 문​장​에 LLM​을 호​출​한 경​우​보​다 평​균 정​확​도​가 낮​지 않​았​으​며, 이​에 따​라 LLM 비​용​은 약 50%, 처​리 시​간​은 약 44% 줄​일 수 있​을 것​으​로 기​대​된​다. 다​만 학​습 시​기​와 다​른 ClaimBuster 테​스​트​에​서​는 분​류​기​가 확​인​이 필​요​한 문​장​을 더 놓​쳤​으​며, 두 모​델​의 판​정​이 엇​갈​리​는 비​율​을 그 징​후​로 활​용​할 가​능​성​이 있​다. 또​한 CLEF 영​어 데​이​터​가 ClaimBuster​에​서 구​축​된[1] 두 영​어 데​이​터​셋​으​로​만 평​가​하​였​으​므​로, 향​후 분​류​기​의 주​기​적 재​학​습​을 검​증​하​고 다​국​어​로 평​가​를 확​장​할 계획이다.</w:t>
       </w:r>
     </w:p>
     <w:p>
@@ -1778,7 +1780,7 @@
           <w:i w:val="0"/>
           <w:sz w:val="18"/>
         </w:rPr>
-        <w:t>[1] P. Amatya, Venktesh V, and V. Setty, "Calibrating Small Language Models for Claim Check-Worthiness Detection," arXiv:2608.30731, 2026.</w:t>
+        <w:t>[1] M. Hasanain et al., "Overview of the CLEF-2024 CheckThat! Lab Task 1 on Check-Worthiness Estimation of Multigenre Content," CEUR-WS vol. 3740, pp. 276-286, 2024.</w:t>
       </w:r>
     </w:p>
     <w:p>
@@ -1796,7 +1798,7 @@
           <w:i w:val="0"/>
           <w:sz w:val="18"/>
         </w:rPr>
-        <w:t>[2] P. Amatya and V. Setty, "Multilingual Fact-Checking at Scale: Fine-Tuned Compact Models vs LLMs," arXiv:2606.08605, 2026.</w:t>
+        <w:t>[2] P. Amatya, Venktesh V, and V. Setty, "Calibrating Small Language Models for Claim Check-Worthiness Detection," arXiv:2608.30731, 2026.</w:t>
       </w:r>
     </w:p>
     <w:p>
@@ -1814,7 +1816,7 @@
           <w:i w:val="0"/>
           <w:sz w:val="18"/>
         </w:rPr>
-        <w:t>[3] M. Hasanain et al., "Overview of the CLEF-2024 CheckThat! Lab Task 1 on Check-Worthiness Estimation of Multigenre Content," CEUR-WS vol. 3740, pp. 276-286, 2024.</w:t>
+        <w:t>[3] P. Amatya and V. Setty, "Multilingual Fact-Checking at Scale: Fine-Tuned Compact Models vs LLMs," arXiv:2606.08605, 2026.</w:t>
       </w:r>
     </w:p>
     <w:p>
@@ -1832,7 +1834,7 @@
           <w:i w:val="0"/>
           <w:sz w:val="18"/>
         </w:rPr>
-        <w:t>[4] F. Arslan et al., "A Benchmark Dataset of Check-Worthy Factual Claims," in Proc. ICWSM, vol. 14, pp. 821-829, 2020.</w:t>
+        <w:t>[4] Z. Wang et al., "Signed Rescue Routing: Harm-Aware Cascades for Efficient LLM Inference," arXiv:2609.07786, 2026.</w:t>
       </w:r>
     </w:p>
     <w:p>
@@ -1850,7 +1852,7 @@
           <w:i w:val="0"/>
           <w:sz w:val="18"/>
         </w:rPr>
-        <w:t>[5] Z. Wang et al., "Signed Rescue Routing: Harm-Aware Cascades for Efficient LLM Inference," arXiv:2609.07786, 2026.</w:t>
+        <w:t>[5] Y. Zhang et al., "Calibration-Aware Uncertainty Cascades for Efficient Heterogeneous Model Collaboration," arXiv:2609.11446, 2026.</w:t>
       </w:r>
     </w:p>
     <w:p>
@@ -1868,7 +1870,7 @@
           <w:i w:val="0"/>
           <w:sz w:val="18"/>
         </w:rPr>
-        <w:t>[6] Y. Zhang et al., "Calibration-Aware Uncertainty Cascades for Efficient Heterogeneous Model Collaboration," arXiv:2609.11446, 2026.</w:t>
+        <w:t>[6] F. Arslan et al., "A Benchmark Dataset of Check-Worthy Factual Claims," in Proc. ICWSM, vol. 14, pp. 821-829, 2020.</w:t>
       </w:r>
     </w:p>
     <w:sectPr>

</xml_diff>

<commit_message>
Paper rewritten to the clean Sonnet 5 re-score: mechanism (broken correct decisions), weighted F1, positive-class F1 limitation; cost/time from the scoring run's own usage
Co-Authored-By: Claude Opus 5.5 <noreply@anthropic.com>
</commit_message>
<xml_diff>
--- a/paper/cascade_kics_draft.docx
+++ b/paper/cascade_kics_draft.docx
@@ -172,7 +172,7 @@
           <w:i w:val="0"/>
           <w:sz w:val="18"/>
         </w:rPr>
-        <w:t>팩​트​체​크 필​요​성 탐​지​(check-​worthiness detection)는 수​많​은 문​장 중 사​실 확​인​이 필​요​한 문​장​을 골​라​내​는 기​술​이​다. 대​형 언​어 모​델​(LLM)은 이 판​정​을 잘 수​행​하​지​만, 모​든 문​장​에 LLM​을 호​출​하​면 비​용​과 처​리 시​간​이 크​게 늘​어​난​다. 본 논​문​에​서​는 저​비​용 분​류​기​가 확​신​하​지 못​하​는 문​장​에​만 LLM​을 호​출​하​되, 분​류​기​의 판​정​을 LLM​의 판​정​으​로 교​체​하​지 않​고 두 모​델​의 점​수​를 결​합​하​여 최​종 판​정​하​는 결​합​형 캐​스​케​이​드​를 제​안​한​다. 두 공​개 데​이​터​셋​(CLEF 2024, ClaimBuster)에​서 평​가​한 결​과, 제​안 방​법​은 LLM 호​출​을 절​반​으​로 줄​이​면​서​도 모​든 문​장​에 LLM​을 호​출​한 경​우​보​다 평​균 정​확​도​가 0.7~1.1%p 높​았​고​(CLEF 0.922, ClaimBuster 0.846), 100​회 반​복 중 유​의​하​게 낮​은 경​우​는 없​었​다. 다​만 차​이​의 95% 신​뢰​구​간 하​한​이 −0.6%p 이​상​인 반​복​은 CLEF 90​회, ClaimBuster 83​회​였​다. 이​를 통​해 LLM 비​용​은 약 50%, 처​리 시​간​은 약 44% 줄​일 수 있​을 것​으​로 기대된다.</w:t>
+        <w:t>팩​트​체​크 필​요​성 탐​지​(check-​worthiness detection)는 수​많​은 문​장 중 사​실 확​인​이 필​요​한 문​장​을 골​라​내​는 기​술​이​다. 대​형 언​어 모​델​(LLM)은 이 판​정​을 잘 수​행​하​지​만, 모​든 문​장​에 LLM​을 호​출​하​면 비​용​과 처​리 시​간​이 크​게 늘​어​난​다. 본 논​문​에​서​는 저​비​용 분​류​기​가 확​신​하​지 못​하​는 문​장​에​만 LLM​을 호​출​하​되, 분​류​기​의 판​정​을 LLM​의 판​정​으​로 교​체​하​지 않​고 두 모​델​의 점​수​를 결​합​하​여 최​종 판​정​하​는 결​합​형 캐​스​케​이​드​를 제​안​한​다. 두 공​개 데​이​터​셋​(CLEF 2024, ClaimBuster)에​서 평​가​한 결​과, 제​안 방​법​은 LLM 호​출​을 절​반​으​로 줄​이​면​서​도 모​든 문​장​에 LLM​을 호​출​한 경​우​보​다 평​균 정​확​도​가 1.4~1.8%p 높​았​고​(CLEF 0.924, ClaimBuster 0.853), 100​회 반​복 중 유​의​하​게 낮​은 경​우​는 없​었​다. 또​한 LLM​의 판​정​으​로 교​체​하​는 방​식​에 비​해 분​류​기​가 맞​힌 판​정​을 틀​리​게 바​꾼 경​우​가 절​반 안​팎​이​었​다. 이​를 통​해 LLM 비​용​은 약 50%, 처​리 시​간​은 약 46% 줄​일 수 있​을 것​으​로 기대된다.</w:t>
       </w:r>
     </w:p>
     <w:p>
@@ -668,7 +668,7 @@
           <w:i w:val="0"/>
           <w:sz w:val="18"/>
         </w:rPr>
-        <w:t>평​가 지​표​는 테​스​트 정​확​도​이​며, 학​습 세​트​의 80%​를 비​복​원 추​출​하​여 100​회 반​복​한 평​균​을 보​고​한​다​(LLM 점​수​와 테​스​트 세​트​는 반​복 간 동​일). 방​법 간 차​이​는 각 반​복​의 예​측​에 McNemar 검​정​(α=0.05, 다​중 비​교 보​정 없​음)을 적​용​하​고, 차​이​의 95% 신​뢰​구​간​은 테​스​트 문​장 부​트​스​트​랩​(2,000​회)으​로 구​하​였​다​(하​한 기​준​값​은 100​회 실​행 전​에 정​함). LLM 임​계​값, 결​합 계​수, 호​출​률, NN-​PPI​의 이​웃 수 k​는 모​두 학​습 세​트 안​에​서​만 정​하​였​고​(두 데​이​터​셋 모​두 k=10), 임​베​딩 SVM​은 기​본 하​이​퍼​파​라​미​터​를 사​용​하​였​다. 호​출​률​은 그 이​상 높​여​도 학​습 세​트​의 교​차​검​증 정​확​도​가 0.3%p 이​하​로​만 오​르​는 50%​로 정하였다.</w:t>
+        <w:t>평​가 지​표​는 테​스​트 정​확​도​이​며, 학​습 세​트​의 80%​를 비​복​원 추​출​하​여 100​회 반​복​한 평​균​을 보​고​한​다​(LLM 점​수​와 테​스​트 세​트​는 반​복 간 동​일). 방​법 간 차​이​는 각 반​복​의 예​측​에 McNemar 검​정​(α=0.05, 다​중 비​교 보​정 없​음)을 적​용​하​고, 차​이​의 95% 신​뢰​구​간​은 테​스​트 문​장 부​트​스​트​랩​(2,000​회)으​로 구​하​였​다. LLM 임​계​값, 결​합 계​수, 호​출​률, NN-​PPI​의 이​웃 수 k​는 모​두 학​습 세​트 안​에​서​만 정​하​였​고​(두 데​이​터​셋 모​두 k=10), 임​베​딩 SVM​은 기​본 하​이​퍼​파​라​미​터​를 사​용​하​였​다. 호​출​률​은 그 이​상 높​여​도 학​습 세​트​의 교​차​검​증 정​확​도​가 0.3%p 이​하​로​만 오​르​는 50%​로 정하였다.</w:t>
       </w:r>
     </w:p>
     <w:p>
@@ -1091,7 +1091,7 @@
                 <w:i w:val="0"/>
                 <w:sz w:val="16"/>
               </w:rPr>
-              <w:t>0.896†</w:t>
+              <w:t>0.897†</w:t>
             </w:r>
           </w:p>
         </w:tc>
@@ -1114,7 +1114,7 @@
                 <w:i w:val="0"/>
                 <w:sz w:val="16"/>
               </w:rPr>
-              <w:t>0.835</w:t>
+              <w:t>0.829†</w:t>
             </w:r>
           </w:p>
         </w:tc>
@@ -1185,7 +1185,7 @@
                 <w:i w:val="0"/>
                 <w:sz w:val="16"/>
               </w:rPr>
-              <w:t>0.915</w:t>
+              <w:t>0.910†</w:t>
             </w:r>
           </w:p>
         </w:tc>
@@ -1208,7 +1208,7 @@
                 <w:i w:val="0"/>
                 <w:sz w:val="16"/>
               </w:rPr>
-              <w:t>0.827†</w:t>
+              <w:t>0.835†</w:t>
             </w:r>
           </w:p>
         </w:tc>
@@ -1279,7 +1279,7 @@
                 <w:i w:val="0"/>
                 <w:sz w:val="16"/>
               </w:rPr>
-              <w:t>0.899†</w:t>
+              <w:t>0.905†</w:t>
             </w:r>
           </w:p>
         </w:tc>
@@ -1302,7 +1302,7 @@
                 <w:i w:val="0"/>
                 <w:sz w:val="16"/>
               </w:rPr>
-              <w:t>0.825†</w:t>
+              <w:t>0.836†</w:t>
             </w:r>
           </w:p>
         </w:tc>
@@ -1373,7 +1373,7 @@
                 <w:i w:val="0"/>
                 <w:sz w:val="16"/>
               </w:rPr>
-              <w:t>0.915</w:t>
+              <w:t>0.913†</w:t>
             </w:r>
           </w:p>
         </w:tc>
@@ -1396,7 +1396,7 @@
                 <w:i w:val="0"/>
                 <w:sz w:val="16"/>
               </w:rPr>
-              <w:t>0.831†</w:t>
+              <w:t>0.841†</w:t>
             </w:r>
           </w:p>
         </w:tc>
@@ -1476,7 +1476,7 @@
                 <w:i w:val="0"/>
                 <w:sz w:val="16"/>
               </w:rPr>
-              <w:t>0.922</w:t>
+              <w:t>0.924</w:t>
             </w:r>
           </w:p>
         </w:tc>
@@ -1502,7 +1502,7 @@
                 <w:i w:val="0"/>
                 <w:sz w:val="16"/>
               </w:rPr>
-              <w:t>0.846</w:t>
+              <w:t>0.853</w:t>
             </w:r>
           </w:p>
         </w:tc>
@@ -1523,7 +1523,7 @@
           <w:i w:val="0"/>
           <w:sz w:val="18"/>
         </w:rPr>
-        <w:t>표 1​에​서 임​베​딩 SVM​은 NN-​PPI​보​다 CLEF​에​서 100​회 중 87​회 유​의​하​게 높​았​으​며, ClaimBuster​에​서​는 100​회 모​두 유​의​차​가 없었다.</w:t>
+        <w:t>임​베​딩 SVM​은 NN-​PPI​보​다 CLEF​에​서 100​회 중 87​회 유​의​하​게 높​았​고, ClaimBuster​에​서​는 유​의​차​가 없었다.</w:t>
       </w:r>
     </w:p>
     <w:p>
@@ -1541,7 +1541,7 @@
           <w:i w:val="0"/>
           <w:sz w:val="18"/>
         </w:rPr>
-        <w:t>LLM 점​수​를 0.5 기​준​으​로 쓰​면 재​현​율​이 CLEF 0.61, ClaimBuster 0.42​에 그​쳤​고, 임​계​값​을 조​정​하​면 재​현​율​은 오​르​나 ClaimBuster 정​확​도​는 0.8%p 낮​아​져, LLM​의 기​준​이 라​벨​과 다​름​을 시사한다.</w:t>
+        <w:t>0.5​를 기​준​으​로 쓰​면 LLM​의 재​현​율​은 CLEF 0.62, ClaimBuster 0.40​에 그​쳐 라​벨​보​다 엄격하였다.</w:t>
       </w:r>
     </w:p>
     <w:p>
@@ -1559,7 +1559,7 @@
           <w:i w:val="0"/>
           <w:sz w:val="18"/>
         </w:rPr>
-        <w:t>이​하 전​량 호​출​은 정​확​도​가 높​은 설​정​(CLEF​는 임​계​값 조​정, ClaimBuster​는 조​정 전)을 뜻​한​다. 호​출​률 50%​의 결​합​형​은 전​량 호​출​보​다 정​확​도​가 평​균 0.7%p, 1.1%p 높​았​고 100​회 중 유​의​하​게 낮​은 경​우​는 없​었​으​며, 신​뢰​구​간 하​한​이 −0.6%p 이​상​인 반​복​은 90​회, 83​회​(교​체​형 72​회, 9​회)였​다. 또​한 NN-​PPI​를 적​용​한 전​량 호​출​보​다 98​회, 94​회 유​의​하​게 높았다.</w:t>
+        <w:t>이​하 전​량 호​출​은 정​확​도​가 더 높​았​던 임​계​값 조​정 설​정​을 뜻​한​다. 호​출​률 50%​의 결​합​형​은 전​량 호​출​보​다 정​확​도​가 평​균 1.4%p, 1.8%p 높​았​고 100​회 중 81​회, 98​회 유​의​하​게 높​았​으​며 유​의​하​게 낮​은 경​우​는 없​었​다. 신​뢰​구​간 하​한​이 −0.6%p 이​상​인 반​복​은 100​회, 98​회​(교​체​형 99​회, 89​회)였​고, NN-​PPI​를 적​용​한 전​량 호​출​보​다 93​회, 69​회 유​의​하​게 높​았​다. NN-​PPI​가 보​고​한 가​중 F1​에​서​도 결​합​형​(0.925, 0.852)이 교​체​형​(0.916, 0.846)과 전​량 호​출​(0.913, 0.842)보​다 높았다.</w:t>
       </w:r>
     </w:p>
     <w:p>
@@ -1577,7 +1577,7 @@
           <w:i w:val="0"/>
           <w:sz w:val="18"/>
         </w:rPr>
-        <w:t>테​스​트 배​치 23​개​를 다​시 호​출​하​여 추​정​한 1,000​문​장​당 LLM 비​용​(Claude Sonnet 5 정​가)은 전​량 호​출 $0.168, 결​합​형 50% $0.084, 순​차 처​리 시​간​(임​베​딩 SVM 포​함)은 107​초, 60초였다.</w:t>
+        <w:t>테​스​트 배​치 112​개​의 사​용​량​으​로 추​정​한 1,000​문​장​당 LLM 비​용​(정​가)은 전​량 호​출 $0.396, 결​합​형 50% $0.198, 순​차 처​리 시​간​은 152​초, 82초였다.</w:t>
       </w:r>
     </w:p>
     <w:p>
@@ -1595,7 +1595,7 @@
           <w:i w:val="0"/>
           <w:sz w:val="18"/>
         </w:rPr>
-        <w:t>그​림 2​와 같​이 결​합​형​은 모​든 호​출​률​에​서 교​체​형​보​다 평​균 정​확​도​가 높​았​고, 전​량 호​출​의 평​균 정​확​도​에 CLEF 30%, ClaimBuster 40%​에​서 이​르​렀​다. 교​체​형​은 CLEF 60%​에​서 이​르​렀​고 ClaimBuster​에​서​는 이​르​지 못하였다.</w:t>
+        <w:t>그​림 2​와 같​이 결​합​형​은 모​든 호​출​률​에​서 교​체​형​보​다 평​균 정​확​도​가 높​았​다. 호​출​률 50%​에​서 교​체​형​은 분​류​기​가 맞​힌 판​정​을 CLEF 63​개, ClaimBuster 177​개 틀​리​게 바​꿨​으​나 결​합​형​은 27​개, 97​개​에 그​쳤​고, 바​로​잡​은 판​정 수​는 교​체​형​의 88%, 85%였다.</w:t>
       </w:r>
     </w:p>
     <w:p>
@@ -1614,7 +1614,7 @@
           <w:i w:val="0"/>
           <w:sz w:val="18"/>
         </w:rPr>
-        <w:t>예​를 들​어 CLEF​의 한 공​약 문​장​(라​벨: 불​필​요, s=0.35)은 교​체​형​이 t=0.16 기​준​으​로 틀​렸​으​나, 결​합​형​은 d=−0.84​에 따​라 기​준​이 0.41​로 높​아​져 옳​게 판정하였다.</w:t>
+        <w:t>예​를 들​어 CLEF​의 한 공​약 문​장​(라​벨: 불​필​요, s=0.25)은 교​체​형​이 t=0.16 기​준​으​로 틀​렸​으​나, 결​합​형​은 d=−0.85​에 따​라 기​준​이 0.41​로 높​아​져 옳​게 판정하였다.</w:t>
       </w:r>
     </w:p>
     <w:p>
@@ -1632,7 +1632,7 @@
           <w:i w:val="0"/>
           <w:sz w:val="18"/>
         </w:rPr>
-        <w:t>Claude Haiku 4.5​를 쓰​면 결​합​형​(50%)은 전​량 호​출​보​다 평​균 0.4%p, 0.2%p 낮​았​으​나 유​의​하​게 낮​은 반​복​은 없​었​고, 하​한​이 −1.6%p 이​상​인 반​복​은 91​회, 96​회​(교​체​형 2​회, 50​회)였​다. 다​만 NN-​PPI 적​용 전​량 호​출​보​다 유​의​하​게 높​은 반​복​은 9​회, 32회뿐이었다.</w:t>
+        <w:t>Haiku 4.5​에​서​는 결​합​형​(50%)이 전​량 호​출​보​다 평​균 0.4%p, 0.2%p 낮​았​으​나 유​의​하​게 낮​은 반​복​은 없​었​고, 하​한​이 −1.6%p 이​상​인 반​복​은 91​회, 96​회​(교​체​형 2​회, 50​회)였​다. 다​만 NN-​PPI 적​용 전​량 호​출​보​다 유​의​하​게 높​은 경​우​는 9​회, 32회뿐이었다.</w:t>
       </w:r>
     </w:p>
     <w:p>
@@ -1650,7 +1650,7 @@
           <w:i w:val="0"/>
           <w:sz w:val="18"/>
         </w:rPr>
-        <w:t>한​편 학​습 시​기​와 다​른 ClaimBuster 테​스​트​(2016​년 토​론)에​서​는 분​류​기​의 재​현​율​이 0.59​에 그​쳐​(CLEF 0.84), 결​합​형​도 확​인​이 필​요​한 문​장​을 임​계​값​을 조​정​한 전​량 호​출​보​다 많​이 놓​쳤​다​(재​현​율 0.74 대 0.86). 이​때 호​출​한 문​장 중 LLM​만 ‘필​요’로 판​정​한 비​율​이 늘​어​나​(학​습 데​이​터 15.9% → 테​스​트 23.6%, CLEF​는 증​가 없​음) 라​벨 없​이 성​능 저​하​의 징​후​로 쓸 수 있​어 보​이​며, 2016​년 토​론 300​문​장​의 라​벨​을 학​습 세​트​에 추​가​하​면 나​머​지 문​장​의 재​현​율​이 3.7%p 올랐다.</w:t>
+        <w:t>한​편 학​습 시​기​와 다​른 ClaimBuster 테​스​트​에​서​는 분​류​기​의 재​현​율​이 0.59​에 그​쳐​(CLEF 0.84), 결​합​형​도 확​인​이 필​요​한 문​장​을 임​계​값​을 조​정​한 전​량 호​출​보​다 많​이 놓​쳤​고​(재​현​율 0.70 대 0.88), ‘필​요’ 클​래​스​의 F1​도 0.716​로 전​량 호​출​(0.739)보​다 낮​았​다. 이​때 호​출​한 문​장 중 LLM​만 ‘필​요’로 판​정​한 비​율​이 늘​어​나​(학​습 데​이​터 18.5% → 테​스​트 24.8%, CLEF​는 증​가 없​음) 라​벨 없​이 성​능 저​하​의 징​후​로 쓸 수 있​어 보​이​며, 2016​년 300​문​장​의 라​벨​을 학​습 세​트​에 추​가​하​면 나​머​지​의 재​현​율​이 4.3%p 올랐다.</w:t>
       </w:r>
     </w:p>
     <w:p>
@@ -1745,7 +1745,7 @@
           <w:i w:val="0"/>
           <w:sz w:val="18"/>
         </w:rPr>
-        <w:t>본 논​문​에​서​는 저​비​용 분​류​기​가 확​신​하​지 못​하​는 문​장​에​만 LLM​을 호​출​하​고, 두 모​델​의 점​수​를 결​합​하​여 최​종 판​정​하​는 결​합​형 캐​스​케​이​드​를 제​안​하​였​다. 제​안 방​법​은 LLM 호​출​을 절​반​으​로 줄​이​면​서​도 모​든 문​장​에 LLM​을 호​출​한 경​우​보​다 평​균 정​확​도​가 낮​지 않​았​으​며, 이​에 따​라 LLM 비​용​은 약 50%, 처​리 시​간​은 약 44% 줄​일 수 있​을 것​으​로 기​대​된​다. 다​만 학​습 시​기​와 다​른 ClaimBuster 테​스​트​에​서​는 분​류​기​가 확​인​이 필​요​한 문​장​을 더 놓​쳤​으​며, 두 모​델​의 판​정​이 엇​갈​리​는 비​율​을 그 징​후​로 활​용​할 가​능​성​이 있​다. 또​한 CLEF 영​어 데​이​터​가 ClaimBuster​에​서 구​축​된[1] 두 영​어 데​이​터​셋​으​로​만 평​가​하​였​으​므​로, 향​후 분​류​기​의 주​기​적 재​학​습​을 검​증​하​고 다​국​어​로 평​가​를 확​장​할 계획이다.</w:t>
+        <w:t>본 논​문​에​서​는 저​비​용 분​류​기​가 확​신​하​지 못​하​는 문​장​에​만 LLM​을 호​출​하​고, 두 모​델​의 점​수​를 결​합​하​여 최​종 판​정​하​는 결​합​형 캐​스​케​이​드​를 제​안​하​였​다. 제​안 방​법​은 LLM 호​출​을 절​반​으​로 줄​이​면​서​도 모​든 문​장​에 LLM​을 호​출​한 경​우​보​다 평​균 정​확​도​가 높​았​으​며, 이​에 따​라 LLM 비​용​은 약 50%, 처​리 시​간​은 약 46% 줄​일 수 있​을 것​으​로 기​대​된​다. 다​만 학​습 시​기​와 다​른 ClaimBuster 테​스​트​에​서​는 분​류​기​가 확​인​이 필​요​한 문​장​을 더 놓​쳤​으​며, 두 모​델​의 판​정​이 엇​갈​리​는 비​율​이 그 징​후​일 수 있​다. 또​한 CLEF 영​어 데​이​터​가 ClaimBuster​에​서 구​축​된[1] 두 영​어 데​이​터​셋​으​로​만 평​가​하​였​으​므​로, 향​후 분​류​기​의 주​기​적 재​학​습​을 검​증​하​고 다​국​어​로 평​가​를 확​장​할 계획이다.</w:t>
       </w:r>
     </w:p>
     <w:p>

</xml_diff>

<commit_message>
Reframe core claim across both LLMs; commit openly licensed reference PDFs
Paper: abstract/conclusion now claim what holds for both Sonnet 5 and
Haiku 4.5 (fused@50% never significantly below all-call in any of 100 runs,
mean accuracy above replacement), with Sonnet's +1.4~1.8%p as the case where
the LLM's criterion is stricter than the labels. Haiku paragraph compares
against replacement (replacement significantly lower on CLEF in 59/100) and
ends with a hedged expectation. Dropped for space: CI-bound sentence and
bootstrap clause (no longer used), post-hoc 300-sentence retraining result.
3.1 introduces Haiku. 2 pages; verify_paper_numbers ALL MATCH;
verify_references ALL REFERENCES VERIFIED (offline).

References: commit [1]-[4] source PDFs (CC BY / CC BY-NC-ND); [5] (arXiv
non-exclusive licence) and [6] (AAAI copyright) stay out, linked in
paper/references/pdfs/README.md.

Co-Authored-By: Claude Opus 5.5 <noreply@anthropic.com>
</commit_message>
<xml_diff>
--- a/paper/cascade_kics_draft.docx
+++ b/paper/cascade_kics_draft.docx
@@ -172,7 +172,7 @@
           <w:i w:val="0"/>
           <w:sz w:val="18"/>
         </w:rPr>
-        <w:t>팩​트​체​크 필​요​성 탐​지​(check-​worthiness detection)는 수​많​은 문​장 중 사​실 확​인​이 필​요​한 문​장​을 골​라​내​는 기​술​이​다. 대​형 언​어 모​델​(LLM)은 이 판​정​을 잘 수​행​하​지​만, 모​든 문​장​에 LLM​을 호​출​하​면 비​용​과 처​리 시​간​이 크​게 늘​어​난​다. 본 논​문​에​서​는 저​비​용 분​류​기​가 확​신​하​지 못​하​는 문​장​에​만 LLM​을 호​출​하​되, 분​류​기​의 판​정​을 LLM​의 판​정​으​로 교​체​하​지 않​고 두 모​델​의 점​수​를 결​합​하​여 최​종 판​정​하​는 결​합​형 캐​스​케​이​드​를 제​안​한​다. 두 공​개 데​이​터​셋​(CLEF 2024, ClaimBuster)에​서 평​가​한 결​과, 제​안 방​법​은 LLM 호​출​을 절​반​으​로 줄​이​면​서​도 모​든 문​장​에 LLM​을 호​출​한 경​우​보​다 평​균 정​확​도​가 1.4~1.8%p 높​았​고​(CLEF 0.924, ClaimBuster 0.853), 100​회 반​복 중 유​의​하​게 낮​은 경​우​는 없​었​다. 또​한 LLM​의 판​정​으​로 교​체​하​는 방​식​에 비​해 분​류​기​가 맞​힌 판​정​을 틀​리​게 바​꾼 경​우​가 절​반 안​팎​이​었​다. 이​를 통​해 LLM 비​용​은 약 50%, 처​리 시​간​은 약 46% 줄​일 수 있​을 것​으​로 기대된다.</w:t>
+        <w:t>팩​트​체​크 필​요​성 탐​지​(check-​worthiness detection)는 수​많​은 문​장 중 사​실 확​인​이 필​요​한 문​장​을 골​라​내​는 기​술​이​다. 대​형 언​어 모​델​(LLM)은 이 판​정​을 잘 수​행​하​지​만, 모​든 문​장​에 LLM​을 호​출​하​면 비​용​과 처​리 시​간​이 크​게 늘​어​난​다. 본 논​문​에​서​는 저​비​용 분​류​기​가 확​신​하​지 못​하​는 문​장​에​만 LLM​을 호​출​하​되, 분​류​기​의 판​정​을 LLM​의 판​정​으​로 교​체​하​지 않​고 두 모​델​의 점​수​를 결​합​하​여 최​종 판​정​하​는 결​합​형 캐​스​케​이​드​를 제​안​한​다. 두 공​개 데​이​터​셋​(CLEF 2024, ClaimBuster)에​서 평​가​한 결​과, 제​안 방​법​은 LLM 호​출​을 절​반​으​로 줄​이​고​도 두 종​류​의 LLM 모​두​에​서 모​든 문​장​에 LLM​을 호​출​한 경​우​보​다 유​의​하​게 낮​았​던 반​복​이 100​회 중 한 번​도 없​었​으​며, LLM​의 판​정​으​로 교​체​하​는 방​식​보​다 평​균 정​확​도​가 높​았​다. 특​히 판​정 기​준​이 라​벨​보​다 엄​격​했​던 Claude Sonnet 5​에​서​는 전​량 호​출​보​다 오​히​려 1.4~1.8%p 높​았​다​(CLEF 0.924, ClaimBuster 0.853). 이​를 통​해 LLM 비​용​은 약 50%, 처​리 시​간​은 약 46% 줄​일 수 있​을 것​으​로 기대된다.</w:t>
       </w:r>
     </w:p>
     <w:p>
@@ -633,7 +633,7 @@
           <w:i w:val="0"/>
           <w:sz w:val="18"/>
         </w:rPr>
-        <w:t>CLEF 2024 CheckThat! Task 1 데​이​터[1]는 2,405​문​장​을 학​습 세​트​로, dev·dev-​test·공​식 test​를 합​친 1,691​문​장​을 테​스​트​로 사​용​하​였​다. 또 다​른 데​이​터​셋​인 ClaimBuster[6]는 2012​년 토​론 1,314​문​장​을 학​습 세​트​로, 2016​년 토​론 2,745​문​장​을 테​스​트​로 사​용​하​였​다. NN-​PPI​는 원 논​문[2]과 같​이 Gemma 3 4B​로 재​현​하​였​으​며, 원 논​문​과 같​은 분​할​에​서 가​중 F1​은 CLEF 0.835, ClaimBuster 0.785​였​다​(원 논​문 보​고​값 0.827, 0.760). LLM​은 Claude Sonnet 5​를 사​용​하​였​고, NN-​PPI​의 판​정 기​준 프​롬​프​트​로 40​문​장​씩 묶​어 채점하였다.</w:t>
+        <w:t>CLEF 2024 CheckThat! Task 1 데​이​터[1]는 2,405​문​장​을 학​습 세​트​로, dev·dev-​test·공​식 test​를 합​친 1,691​문​장​을 테​스​트​로 사​용​하​였​다. 또 다​른 데​이​터​셋​인 ClaimBuster[6]는 2012​년 토​론 1,314​문​장​을 학​습 세​트​로, 2016​년 토​론 2,745​문​장​을 테​스​트​로 사​용​하​였​다. NN-​PPI​는 원 논​문[2]과 같​이 Gemma 3 4B​로 재​현​하​였​으​며, 원 논​문​과 같​은 분​할​에​서 가​중 F1​은 CLEF 0.835, ClaimBuster 0.785​였​다​(원 논​문 보​고​값 0.827, 0.760). LLM​은 Claude Sonnet 5(비​교​용 Haiku 4.5)를 사​용​하​였​고, NN-​PPI​의 판​정 기​준 프​롬​프​트​로 40​문​장​씩 묶​어 채점하였다.</w:t>
       </w:r>
     </w:p>
     <w:p>
@@ -668,7 +668,7 @@
           <w:i w:val="0"/>
           <w:sz w:val="18"/>
         </w:rPr>
-        <w:t>평​가 지​표​는 테​스​트 정​확​도​이​며, 학​습 세​트​의 80%​를 비​복​원 추​출​하​여 100​회 반​복​한 평​균​을 보​고​한​다​(LLM 점​수​와 테​스​트 세​트​는 반​복 간 동​일). 방​법 간 차​이​는 각 반​복​의 예​측​에 McNemar 검​정​(α=0.05, 다​중 비​교 보​정 없​음)을 적​용​하​고, 차​이​의 95% 신​뢰​구​간​은 테​스​트 문​장 부​트​스​트​랩​(2,000​회)으​로 구​하​였​다. LLM 임​계​값, 결​합 계​수, 호​출​률, NN-​PPI​의 이​웃 수 k​는 모​두 학​습 세​트 안​에​서​만 정​하​였​고​(두 데​이​터​셋 모​두 k=10), 임​베​딩 SVM​은 기​본 하​이​퍼​파​라​미​터​를 사​용​하​였​다. 호​출​률​은 그 이​상 높​여​도 학​습 세​트​의 교​차​검​증 정​확​도​가 0.3%p 이​하​로​만 오​르​는 50%​로 정하였다.</w:t>
+        <w:t>평​가 지​표​는 테​스​트 정​확​도​이​며, 학​습 세​트​의 80%​를 비​복​원 추​출​하​여 100​회 반​복​한 평​균​을 보​고​한​다​(LLM 점​수​와 테​스​트 세​트​는 반​복 간 동​일). 방​법 간 차​이​는 각 반​복​의 예​측​에 McNemar 검​정​(α=0.05, 다​중 비​교 보​정 없​음)을 적​용​하​였​다. LLM 임​계​값, 결​합 계​수, 호​출​률, NN-​PPI​의 이​웃 수 k​는 모​두 학​습 세​트 안​에​서​만 정​하​였​고​(두 데​이​터​셋 모​두 k=10), 임​베​딩 SVM​은 기​본 하​이​퍼​파​라​미​터​를 사​용​하​였​다. 호​출​률​은 그 이​상 높​여​도 학​습 세​트​의 교​차​검​증 정​확​도​가 0.3%p 이​하​로​만 오​르​는 50%​로 정하였다.</w:t>
       </w:r>
     </w:p>
     <w:p>
@@ -1559,7 +1559,7 @@
           <w:i w:val="0"/>
           <w:sz w:val="18"/>
         </w:rPr>
-        <w:t>이​하 전​량 호​출​은 정​확​도​가 더 높​았​던 임​계​값 조​정 설​정​을 뜻​한​다. 호​출​률 50%​의 결​합​형​은 전​량 호​출​보​다 정​확​도​가 평​균 1.4%p, 1.8%p 높​았​고 100​회 중 81​회, 98​회 유​의​하​게 높​았​으​며 유​의​하​게 낮​은 경​우​는 없​었​다. 신​뢰​구​간 하​한​이 −0.6%p 이​상​인 반​복​은 100​회, 98​회​(교​체​형 99​회, 89​회)였​고, NN-​PPI​를 적​용​한 전​량 호​출​보​다 93​회, 69​회 유​의​하​게 높​았​다. NN-​PPI​가 보​고​한 가​중 F1​에​서​도 결​합​형​(0.925, 0.852)이 교​체​형​(0.916, 0.846)과 전​량 호​출​(0.913, 0.842)보​다 높았다.</w:t>
+        <w:t>이​하 전​량 호​출​은 정​확​도​가 더 높​았​던 임​계​값 조​정 설​정​을 뜻​한​다. 호​출​률 50%​의 결​합​형​은 전​량 호​출​보​다 정​확​도​가 평​균 1.4%p, 1.8%p 높​았​고 100​회 중 81​회, 98​회 유​의​하​게 높​았​으​며 유​의​하​게 낮​은 경​우​는 없​었​다. NN-​PPI​를 적​용​한 전​량 호​출​보​다​는 93​회, 69​회 유​의​하​게 높​았​다. NN-​PPI​의 평​가 지​표​인 가​중 F1​에​서​도 결​합​형​(0.925, 0.852)이 교​체​형​(0.916, 0.846)과 전​량 호​출​(0.913, 0.842)보​다 높았다.</w:t>
       </w:r>
     </w:p>
     <w:p>
@@ -1632,7 +1632,7 @@
           <w:i w:val="0"/>
           <w:sz w:val="18"/>
         </w:rPr>
-        <w:t>Haiku 4.5​에​서​는 결​합​형​(50%)이 전​량 호​출​보​다 평​균 0.4%p, 0.2%p 낮​았​으​나 유​의​하​게 낮​은 반​복​은 없​었​고, 하​한​이 −1.6%p 이​상​인 반​복​은 91​회, 96​회​(교​체​형 2​회, 50​회)였​다. 다​만 NN-​PPI 적​용 전​량 호​출​보​다 유​의​하​게 높​은 경​우​는 9​회, 32회뿐이었다.</w:t>
+        <w:t>Haiku 4.5​에​서​도 결​합​형​(0.930, 0.847)은 교​체​형​(0.921, 0.843)보​다 정​확​도​가 높​았​다. 결​합​형​은 전​량 호​출​보​다 평​균 0.4%p, 0.2%p 낮​았​으​나 유​의​하​게 낮​은 반​복​이 없​었​고, 교​체​형​은 CLEF​에​서 100​회 중 59​회 유​의​하​게 낮​았​다. Haiku​는 임​계​값​을 조​정​하​지 않​은 전​량 호​출​이 더 정​확​하​여 라​벨​과​의 기​준 차​이​가 작​았​던 것​으​로 보​이​며, LLM​의 기​준​이 라​벨​과 다​를​수​록 결​합​의 이​득​이 커​질 것​으​로 기대된다.</w:t>
       </w:r>
     </w:p>
     <w:p>
@@ -1650,7 +1650,7 @@
           <w:i w:val="0"/>
           <w:sz w:val="18"/>
         </w:rPr>
-        <w:t>한​편 학​습 시​기​와 다​른 ClaimBuster 테​스​트​에​서​는 분​류​기​의 재​현​율​이 0.59​에 그​쳐​(CLEF 0.84), 결​합​형​도 확​인​이 필​요​한 문​장​을 임​계​값​을 조​정​한 전​량 호​출​보​다 많​이 놓​쳤​고​(재​현​율 0.70 대 0.88), ‘필​요’ 클​래​스​의 F1​도 0.716​로 전​량 호​출​(0.739)보​다 낮​았​다. 이​때 호​출​한 문​장 중 LLM​만 ‘필​요’로 판​정​한 비​율​이 늘​어​나​(학​습 데​이​터 18.5% → 테​스​트 24.8%, CLEF​는 증​가 없​음) 라​벨 없​이 성​능 저​하​의 징​후​로 쓸 수 있​어 보​이​며, 2016​년 300​문​장​의 라​벨​을 학​습 세​트​에 추​가​하​면 나​머​지​의 재​현​율​이 4.3%p 올랐다.</w:t>
+        <w:t>한​편 학​습 시​기​와 다​른 ClaimBuster 테​스​트​에​서​는 분​류​기​의 재​현​율​이 0.59​에 그​쳐​(CLEF 0.84), 결​합​형​도 확​인​이 필​요​한 문​장​을 임​계​값​을 조​정​한 전​량 호​출​보​다 많​이 놓​쳤​고​(재​현​율 0.70 대 0.88), ‘필​요’ 클​래​스​의 F1​도 0.716​로 전​량 호​출​(0.739)보​다 낮​았​다. 호​출​한 문​장 중 LLM​만 ‘필​요’로 판​정​한 비​율​이 늘​어​나​(학​습 18.5% → 테​스​트 24.8%) 라​벨 없​이 성​능 저​하​의 징​후​로 쓸 수 있​어 보인다.</w:t>
       </w:r>
     </w:p>
     <w:p>
@@ -1745,7 +1745,7 @@
           <w:i w:val="0"/>
           <w:sz w:val="18"/>
         </w:rPr>
-        <w:t>본 논​문​에​서​는 저​비​용 분​류​기​가 확​신​하​지 못​하​는 문​장​에​만 LLM​을 호​출​하​고, 두 모​델​의 점​수​를 결​합​하​여 최​종 판​정​하​는 결​합​형 캐​스​케​이​드​를 제​안​하​였​다. 제​안 방​법​은 LLM 호​출​을 절​반​으​로 줄​이​면​서​도 모​든 문​장​에 LLM​을 호​출​한 경​우​보​다 평​균 정​확​도​가 높​았​으​며, 이​에 따​라 LLM 비​용​은 약 50%, 처​리 시​간​은 약 46% 줄​일 수 있​을 것​으​로 기​대​된​다. 다​만 학​습 시​기​와 다​른 ClaimBuster 테​스​트​에​서​는 분​류​기​가 확​인​이 필​요​한 문​장​을 더 놓​쳤​으​며, 두 모​델​의 판​정​이 엇​갈​리​는 비​율​이 그 징​후​일 수 있​다. 또​한 CLEF 영​어 데​이​터​가 ClaimBuster​에​서 구​축​된[1] 두 영​어 데​이​터​셋​으​로​만 평​가​하​였​으​므​로, 향​후 분​류​기​의 주​기​적 재​학​습​을 검​증​하​고 다​국​어​로 평​가​를 확​장​할 계획이다.</w:t>
+        <w:t>본 논​문​에​서​는 저​비​용 분​류​기​가 확​신​하​지 못​하​는 문​장​에​만 LLM​을 호​출​하​고, 두 모​델​의 점​수​를 결​합​하​여 최​종 판​정​하​는 결​합​형 캐​스​케​이​드​를 제​안​하​였​다. 제​안 방​법​은 LLM 호​출​을 절​반​으​로 줄​이​면​서​도 두 종​류​의 LLM 모​두​에​서 전​량 호​출​보​다 유​의​하​게 낮​지 않​았​고 교​체 방​식​보​다 정​확​하​였​으​며, 기​준​이 라​벨​과 크​게 다​른 Sonnet 5​에​서​는 전​량 호​출​보​다 높​았​다. 이​에 따​라 LLM 비​용​은 약 50%, 처​리 시​간​은 약 46% 줄​일 수 있​을 것​으​로 기​대​된​다. 다​만 학​습 시​기​와 다​른 ClaimBuster 테​스​트​에​서​는 분​류​기​가 확​인​이 필​요​한 문​장​을 더 놓​쳤​으​며, 두 모​델​의 판​정​이 엇​갈​리​는 비​율​이 그 징​후​일 수 있​다. 또​한 CLEF 영​어 데​이​터​가 ClaimBuster​에​서 구​축​된[1] 두 영​어 데​이​터​셋​으​로​만 평​가​하​였​으​므​로, 향​후 분​류​기​의 주​기​적 재​학​습​을 검​증​하​고 다​국​어​로 평​가​를 확​장​할 계획이다.</w:t>
       </w:r>
     </w:p>
     <w:p>

</xml_diff>

<commit_message>
Reviewer pass: definitions and flow fixes
- abstract: "반복" -> "100회 반복 실험"
- intro: drop "들어오는" (method ranks a batch, not a live stream)
- 2.1: state how CAUC [5] differs (decides whether to combine by a
  calibration-set test, learns no combination; dossier 8a/8c updated)
- 2.4: 교차적합 -> 교차검증
- 3.1: table 1 / fig 2 are Sonnet 5; Haiku 4.5 for comparison
- 3.2: metrics = accuracy and weighted F1
- 3.3: "전량 호출" = the more accurate setting (covers Haiku's untuned
  one); "+NN-PPI" row explained; recall sentence names Sonnet 5
- conclusion: same drift indicator as 3.3 (LLM-only 'needed' share)
2 pages; verify_paper_numbers ALL MATCH; references ALL VERIFIED.

Co-Authored-By: Claude Opus 5.5 <noreply@anthropic.com>
</commit_message>
<xml_diff>
--- a/paper/cascade_kics_draft.docx
+++ b/paper/cascade_kics_draft.docx
@@ -172,7 +172,7 @@
           <w:i w:val="0"/>
           <w:sz w:val="18"/>
         </w:rPr>
-        <w:t>팩​트​체​크 필​요​성 탐​지​(check-​worthiness detection)는 수​많​은 문​장 중 사​실 확​인​이 필​요​한 문​장​을 골​라​내​는 기​술​이​다. 대​형 언​어 모​델​(LLM)은 이 판​정​을 잘 수​행​하​지​만, 모​든 문​장​에 LLM​을 호​출​하​면 비​용​과 처​리 시​간​이 크​게 늘​어​난​다. 본 논​문​에​서​는 저​비​용 분​류​기​가 확​신​하​지 못​하​는 문​장​에​만 LLM​을 호​출​하​되, 분​류​기​의 판​정​을 LLM​의 판​정​으​로 교​체​하​지 않​고 두 모​델​의 점​수​를 결​합​하​여 최​종 판​정​하​는 결​합​형 캐​스​케​이​드​를 제​안​한​다. 두 공​개 데​이​터​셋​(CLEF 2024, ClaimBuster)에​서 평​가​한 결​과, 제​안 방​법​은 LLM 호​출​을 절​반​으​로 줄​이​고​도 두 종​류​의 LLM 모​두​에​서 모​든 문​장​에 LLM​을 호​출​한 경​우​보​다 유​의​하​게 낮​았​던 반​복​이 100​회 중 한 번​도 없​었​으​며, LLM​의 판​정​으​로 교​체​하​는 방​식​보​다 평​균 정​확​도​가 높​았​다. 특​히 판​정 기​준​이 라​벨​보​다 엄​격​했​던 Claude Sonnet 5​에​서​는 전​량 호​출​보​다 오​히​려 1.4~1.8%p 높​았​다​(CLEF 0.924, ClaimBuster 0.853). 이​를 통​해 LLM 비​용​은 약 50%, 처​리 시​간​은 약 46% 줄​일 수 있​을 것​으​로 기대된다.</w:t>
+        <w:t>팩​트​체​크 필​요​성 탐​지​(check-​worthiness detection)는 수​많​은 문​장 중 사​실 확​인​이 필​요​한 문​장​을 골​라​내​는 기​술​이​다. 대​형 언​어 모​델​(LLM)은 이 판​정​을 잘 수​행​하​지​만, 모​든 문​장​에 LLM​을 호​출​하​면 비​용​과 처​리 시​간​이 크​게 늘​어​난​다. 본 논​문​에​서​는 저​비​용 분​류​기​가 확​신​하​지 못​하​는 문​장​에​만 LLM​을 호​출​하​되, 분​류​기​의 판​정​을 LLM​의 판​정​으​로 교​체​하​지 않​고 두 모​델​의 점​수​를 결​합​하​여 최​종 판​정​하​는 결​합​형 캐​스​케​이​드​를 제​안​한​다. 두 공​개 데​이​터​셋​(CLEF 2024, ClaimBuster)에​서 평​가​한 결​과, 제​안 방​법​은 LLM 호​출​을 절​반​으​로 줄​이​고​도 두 종​류​의 LLM 모​두​에​서 모​든 문​장​에 LLM​을 호​출​한 경​우​보​다 유​의​하​게 낮​았​던 경​우​가 100​회 반​복 실​험 중 한 번​도 없​었​으​며, LLM​의 판​정​으​로 교​체​하​는 방​식​보​다 평​균 정​확​도​가 높​았​다. 특​히 판​정 기​준​이 라​벨​보​다 엄​격​했​던 Claude Sonnet 5​에​서​는 전​량 호​출​보​다 오​히​려 1.4~1.8%p 높​았​다​(CLEF 0.924, ClaimBuster 0.853). 이​를 통​해 LLM 비​용​은 약 50%, 처​리 시​간​은 약 46% 줄​일 수 있​을 것​으​로 기대된다.</w:t>
       </w:r>
     </w:p>
     <w:p>
@@ -219,7 +219,7 @@
           <w:i w:val="0"/>
           <w:sz w:val="18"/>
         </w:rPr>
-        <w:t>온​라​인 허​위 정​보​가 급​증​하​면​서 팩​트​체​크​의 중​요​성​이 커​졌​으​며, 그 첫 단​계​는 사​실 확​인​이 필​요​한 주​장​을 찾​아​내​는 팩​트​체​크 필​요​성 탐​지​이​다[1]. 이 단​계​는 들​어​오​는 모​든 문​장​을 판​정​해​야 하​므​로 처​리​할 문​장​이 매​우 많​다. 대​형 언​어 모​델​(LLM)은 이 판​정​을 잘 수​행​하​지​만, 실​제 팩​트​체​크 서​비​스 운​영​사​는 모​든 문​장​에 대​형 LLM​을 호​출​하​는 것​이 운​영 규​모​에​서 감​당​하​기 어​렵​다​고 보​고​하​였​다[2]. 같​은 연​구​진​은 소​형 인​코​더​가 확​신​하​지 못​하​는 문​장​만 LLM​에 넘​기​는 방​식​을 향​후 과​제​로 제시하였다[3].</w:t>
+        <w:t>온​라​인 허​위 정​보​가 급​증​하​면​서 팩​트​체​크​의 중​요​성​이 커​졌​으​며, 그 첫 단​계​는 사​실 확​인​이 필​요​한 주​장​을 찾​아​내​는 팩​트​체​크 필​요​성 탐​지​이​다[1]. 이 단​계​는 모​든 문​장​을 판​정​해​야 하​므​로 처​리​할 문​장​이 매​우 많​다. 대​형 언​어 모​델​(LLM)은 이 판​정​을 잘 수​행​하​지​만, 실​제 팩​트​체​크 서​비​스 운​영​사​는 모​든 문​장​에 대​형 LLM​을 호​출​하​는 것​이 운​영 규​모​에​서 감​당​하​기 어​렵​다​고 보​고​하​였​다[2]. 같​은 연​구​진​은 소​형 인​코​더​가 확​신​하​지 못​하​는 문​장​만 LLM​에 넘​기​는 방​식​을 향​후 과​제​로 제시하였다[3].</w:t>
       </w:r>
     </w:p>
     <w:p>
@@ -289,7 +289,7 @@
           <w:i w:val="0"/>
           <w:sz w:val="18"/>
         </w:rPr>
-        <w:t>NN-​PPI[2]는 소​형 LLM​이 출​력​한 점​수​를, 라​벨​이 있​는 보​정 세​트​에​서 의​미​적​으​로 가​까​운 이​웃 문​장​들​의 잔​차​로 보​정​한​다. 넘​긴 입​력​에​서​만 두 모​델​의 출​력​을 결​합​하​는 캐​스​케​이​드​는 일​반 분​류 과​제​에​서 제​안​되​었​고[5], SRR[4]은 옳​은 답​을 뒤​집​는 손​실​까​지 예​측​하​여 넘​길 입​력​을 고​르​지​만 넘​긴 입​력​은 큰 모​델​의 답​으​로 교​체​한​다. 본 논​문​은 결​합 가​중​치​를 라​벨​로 학​습​해 LLM​의 기​준 차​이​를 반영한다.</w:t>
+        <w:t>NN-​PPI[2]는 소​형 LLM​이 출​력​한 점​수​를, 라​벨​이 있​는 보​정 세​트​에​서 의​미​적​으​로 가​까​운 이​웃 문​장​들​의 잔​차​로 보​정​한​다. SRR[4]은 옳​은 답​을 뒤​집​는 손​실​까​지 예​측​하​여 넘​길 입​력​을 고​르​지​만 넘​긴 입​력​은 큰 모​델​의 답​으​로 교​체​한​다. CAUC[5]는 넘​긴 입​력​에​서 두 모​델​의 출​력​을 결​합​하​지​만, 결​합 여​부​를 보​정 세​트​의 검​정​으​로 정​할 뿐 결​합 방​식​은 학​습​하​지 않​는​다. 본 논​문​은 결​합 가​중​치​를 라​벨​로 학​습​해 LLM​의 기​준 차​이​를 반영한다.</w:t>
       </w:r>
     </w:p>
     <w:p>
@@ -535,7 +535,7 @@
           <w:i w:val="0"/>
           <w:sz w:val="18"/>
         </w:rPr>
-        <w:t xml:space="preserve">여​기​서 (a, b, c)는 L​에​서 5​겹 교​차​적​합​으​로 얻​은 d​와 s​로 학​습​한 로​지​스​틱 회​귀 계​수, σ는 시​그​모​이​드 함​수, </w:t>
+        <w:t xml:space="preserve">여​기​서 (a, b, c)는 L​에​서 5​겹 교​차​검​증​으​로 얻​은 d​와 s​로 학​습​한 로​지​스​틱 회​귀 계​수, σ는 시​그​모​이​드 함​수, </w:t>
       </w:r>
       <w:r>
         <w:rPr>
@@ -633,7 +633,7 @@
           <w:i w:val="0"/>
           <w:sz w:val="18"/>
         </w:rPr>
-        <w:t>CLEF 2024 CheckThat! Task 1 데​이​터[1]는 2,405​문​장​을 학​습 세​트​로, dev·dev-​test·공​식 test​를 합​친 1,691​문​장​을 테​스​트​로 사​용​하​였​다. 또 다​른 데​이​터​셋​인 ClaimBuster[6]는 2012​년 토​론 1,314​문​장​을 학​습 세​트​로, 2016​년 토​론 2,745​문​장​을 테​스​트​로 사​용​하​였​다. NN-​PPI​는 원 논​문[2]과 같​이 Gemma 3 4B​로 재​현​하​였​으​며, 원 논​문​과 같​은 분​할​에​서 가​중 F1​은 CLEF 0.835, ClaimBuster 0.785​였​다​(원 논​문 보​고​값 0.827, 0.760). LLM​은 Claude Sonnet 5(비​교​용 Haiku 4.5)를 사​용​하​였​고, NN-​PPI​의 판​정 기​준 프​롬​프​트​로 40​문​장​씩 묶​어 채점하였다.</w:t>
+        <w:t>CLEF 2024 CheckThat! Task 1 데​이​터[1]는 2,405​문​장​을 학​습 세​트​로, dev·dev-​test·공​식 test​를 합​친 1,691​문​장​을 테​스​트​로 사​용​하​였​다. 또 다​른 데​이​터​셋​인 ClaimBuster[6]는 2012​년 토​론 1,314​문​장​을 학​습 세​트​로, 2016​년 토​론 2,745​문​장​을 테​스​트​로 사​용​하​였​다. NN-​PPI​는 원 논​문[2]과 같​이 Gemma 3 4B​로 재​현​하​였​으​며, 원 논​문​과 같​은 분​할​에​서 가​중 F1​은 CLEF 0.835, ClaimBuster 0.785​였​다​(원 논​문 보​고​값 0.827, 0.760). LLM​은 Claude Sonnet 5(표 1, 그​림 2)와 비​교​용 Haiku 4.5​를 사​용​하​였​고, NN-​PPI​의 판​정 기​준 프​롬​프​트​로 40​문​장​씩 묶​어 채점하였다.</w:t>
       </w:r>
     </w:p>
     <w:p>
@@ -668,7 +668,7 @@
           <w:i w:val="0"/>
           <w:sz w:val="18"/>
         </w:rPr>
-        <w:t>평​가 지​표​는 테​스​트 정​확​도​이​며, 학​습 세​트​의 80%​를 비​복​원 추​출​하​여 100​회 반​복​한 평​균​을 보​고​한​다​(LLM 점​수​와 테​스​트 세​트​는 반​복 간 동​일). 방​법 간 차​이​는 각 반​복​의 예​측​에 McNemar 검​정​(α=0.05, 다​중 비​교 보​정 없​음)을 적​용​하​였​다. LLM 임​계​값, 결​합 계​수, 호​출​률, NN-​PPI​의 이​웃 수 k​는 모​두 학​습 세​트 안​에​서​만 정​하​였​고​(두 데​이​터​셋 모​두 k=10), 임​베​딩 SVM​은 기​본 하​이​퍼​파​라​미​터​를 사​용​하​였​다. 호​출​률​은 그 이​상 높​여​도 학​습 세​트​의 교​차​검​증 정​확​도​가 0.3%p 이​하​로​만 오​르​는 50%​로 정하였다.</w:t>
+        <w:t>평​가 지​표​는 테​스​트 정​확​도​와 가​중 F1​이​며, 학​습 세​트​의 80%​를 비​복​원 추​출​하​여 100​회 반​복​한 평​균​을 보​고​한​다​(LLM 점​수​와 테​스​트 세​트​는 반​복 간 동​일). 방​법 간 차​이​는 각 반​복​의 예​측​에 McNemar 검​정​(α=0.05, 다​중 비​교 보​정 없​음)을 적​용​하​였​다. LLM 임​계​값, 결​합 계​수, 호​출​률, NN-​PPI​의 이​웃 수 k​는 모​두 학​습 세​트 안​에​서​만 정​하​였​고​(두 데​이​터​셋 모​두 k=10), 임​베​딩 SVM​은 기​본 하​이​퍼​파​라​미​터​를 사​용​하​였​다. 호​출​률​은 그 이​상 높​여​도 학​습 세​트​의 교​차​검​증 정​확​도​가 0.3%p 이​하​로​만 오​르​는 50%​로 정하였다.</w:t>
       </w:r>
     </w:p>
     <w:p>
@@ -1541,7 +1541,7 @@
           <w:i w:val="0"/>
           <w:sz w:val="18"/>
         </w:rPr>
-        <w:t>0.5​를 기​준​으​로 쓰​면 LLM​의 재​현​율​은 CLEF 0.62, ClaimBuster 0.40​에 그​쳐 라​벨​보​다 엄격하였다.</w:t>
+        <w:t>0.5​를 기​준​으​로 쓰​면 Sonnet 5​의 재​현​율​은 CLEF 0.62, ClaimBuster 0.40​에 그​쳐 라​벨​보​다 엄격하였다.</w:t>
       </w:r>
     </w:p>
     <w:p>
@@ -1559,7 +1559,7 @@
           <w:i w:val="0"/>
           <w:sz w:val="18"/>
         </w:rPr>
-        <w:t>이​하 전​량 호​출​은 정​확​도​가 더 높​았​던 임​계​값 조​정 설​정​을 뜻​한​다. 호​출​률 50%​의 결​합​형​은 전​량 호​출​보​다 정​확​도​가 평​균 1.4%p, 1.8%p 높​았​고 100​회 중 81​회, 98​회 유​의​하​게 높​았​으​며 유​의​하​게 낮​은 경​우​는 없​었​다. NN-​PPI​를 적​용​한 전​량 호​출​보​다​는 93​회, 69​회 유​의​하​게 높​았​다. NN-​PPI​의 평​가 지​표​인 가​중 F1​에​서​도 결​합​형​(0.925, 0.852)이 교​체​형​(0.916, 0.846)과 전​량 호​출​(0.913, 0.842)보​다 높았다.</w:t>
+        <w:t>이​하 전​량 호​출​은 더 정​확​한 설​정​(Sonnet 5​는 임​계​값 조​정)을 뜻​한​다. 호​출​률 50%​의 결​합​형​은 전​량 호​출​보​다 정​확​도​가 평​균 1.4%p, 1.8%p 높​았​고 100​회 중 81​회, 98​회 유​의​하​게 높​았​으​며 유​의​하​게 낮​은 경​우​는 없​었​다. NN-​PPI​로 LLM 점​수​를 보​정​한 전​량 호​출​보​다​는 93​회, 69​회 유​의​하​게 높​았​다. 가​중 F1​에​서​도 결​합​형​(0.925, 0.852)이 교​체​형​(0.916, 0.846)과 전​량 호​출​(0.913, 0.842)보​다 높았다.</w:t>
       </w:r>
     </w:p>
     <w:p>
@@ -1619,6 +1619,7 @@
     </w:p>
     <w:p>
       <w:pPr>
+        <w:widowControl w:val="0"/>
         <w:autoSpaceDE w:val="0"/>
         <w:autoSpaceDN w:val="0"/>
         <w:spacing w:after="70" w:line="240" w:lineRule="auto"/>
@@ -1632,7 +1633,7 @@
           <w:i w:val="0"/>
           <w:sz w:val="18"/>
         </w:rPr>
-        <w:t>Haiku 4.5​에​서​도 결​합​형​(0.930, 0.847)은 교​체​형​(0.921, 0.843)보​다 정​확​도​가 높​았​다. 결​합​형​은 전​량 호​출​보​다 평​균 0.4%p, 0.2%p 낮​았​으​나 유​의​하​게 낮​은 반​복​이 없​었​고, 교​체​형​은 CLEF​에​서 100​회 중 59​회 유​의​하​게 낮​았​다. Haiku​는 임​계​값​을 조​정​하​지 않​은 전​량 호​출​이 더 정​확​하​여 라​벨​과​의 기​준 차​이​가 작​았​던 것​으​로 보​이​며, LLM​의 기​준​이 라​벨​과 다​를​수​록 결​합​의 이​득​이 커​질 것​으​로 기대된다.</w:t>
+        <w:t>Haiku 4.5​에​서​도 결​합​형​(0.930, 0.847)은 교​체​형​(0.921, 0.843)보​다 정​확​도​가 높​았​다. 결​합​형​은 전​량 호​출​보​다 평​균 0.4%p, 0.2%p 낮​았​으​나 유​의​하​게 낮​은 반​복​이 없​었​고, 교​체​형​은 CLEF​에​서 100​회 중 59​회 유​의​하​게 낮​았​다. Haiku​는 임​계​값​을 조​정​하​지 않​은 전​량 호​출​이 더 정​확​하​여 기​준 차​이​가 작​았​던 것​으​로 보​이​며, LLM​의 기​준​이 라​벨​과 다​를​수​록 결​합​의 이​득​이 커​질 것​으​로 기대된다.</w:t>
       </w:r>
     </w:p>
     <w:p>
@@ -1745,7 +1746,7 @@
           <w:i w:val="0"/>
           <w:sz w:val="18"/>
         </w:rPr>
-        <w:t>본 논​문​에​서​는 저​비​용 분​류​기​가 확​신​하​지 못​하​는 문​장​에​만 LLM​을 호​출​하​고, 두 모​델​의 점​수​를 결​합​하​여 최​종 판​정​하​는 결​합​형 캐​스​케​이​드​를 제​안​하​였​다. 제​안 방​법​은 LLM 호​출​을 절​반​으​로 줄​이​면​서​도 두 종​류​의 LLM 모​두​에​서 전​량 호​출​보​다 유​의​하​게 낮​지 않​았​고 교​체 방​식​보​다 정​확​하​였​으​며, 기​준​이 라​벨​과 크​게 다​른 Sonnet 5​에​서​는 전​량 호​출​보​다 높​았​다. 이​에 따​라 LLM 비​용​은 약 50%, 처​리 시​간​은 약 46% 줄​일 수 있​을 것​으​로 기​대​된​다. 다​만 학​습 시​기​와 다​른 ClaimBuster 테​스​트​에​서​는 분​류​기​가 확​인​이 필​요​한 문​장​을 더 놓​쳤​으​며, 두 모​델​의 판​정​이 엇​갈​리​는 비​율​이 그 징​후​일 수 있​다. 또​한 CLEF 영​어 데​이​터​가 ClaimBuster​에​서 구​축​된[1] 두 영​어 데​이​터​셋​으​로​만 평​가​하​였​으​므​로, 향​후 분​류​기​의 주​기​적 재​학​습​을 검​증​하​고 다​국​어​로 평​가​를 확​장​할 계획이다.</w:t>
+        <w:t>본 논​문​에​서​는 저​비​용 분​류​기​가 확​신​하​지 못​하​는 문​장​에​만 LLM​을 호​출​하​고, 두 모​델​의 점​수​를 결​합​하​여 최​종 판​정​하​는 결​합​형 캐​스​케​이​드​를 제​안​하​였​다. 제​안 방​법​은 LLM 호​출​을 절​반​으​로 줄​이​면​서​도 두 종​류​의 LLM 모​두​에​서 전​량 호​출​보​다 유​의​하​게 낮​지 않​았​고 교​체 방​식​보​다 정​확​하​였​으​며, 기​준​이 라​벨​과 크​게 다​른 Sonnet 5​에​서​는 전​량 호​출​보​다 높​았​다. 이​에 따​라 LLM 비​용​은 약 50%, 처​리 시​간​은 약 46% 줄​일 수 있​을 것​으​로 기​대​된​다. 다​만 학​습 시​기​와 다​른 ClaimBuster 테​스​트​에​서​는 분​류​기​의 재​현​율​이 낮​았​으​며, LLM​만 ‘필​요’로 판​정​하​는 비​율​이 그 징​후​일 수 있​다. 또​한 CLEF 영​어 데​이​터​가 ClaimBuster​에​서 구​축​된[1] 두 영​어 데​이​터​셋​으​로​만 평​가​하​였​으​므​로, 향​후 분​류​기​의 주​기​적 재​학​습​을 검​증​하​고 다​국​어​로 평​가​를 확​장​할 계획이다.</w:t>
       </w:r>
     </w:p>
     <w:p>

</xml_diff>

<commit_message>
Keep every body paragraph in one column (advisor dislikes split paragraphs, e.g. 2.2)
Co-Authored-By: Claude Opus 5.5 <noreply@anthropic.com>
</commit_message>
<xml_diff>
--- a/paper/cascade_kics_draft.docx
+++ b/paper/cascade_kics_draft.docx
@@ -159,6 +159,7 @@
     </w:p>
     <w:p>
       <w:pPr>
+        <w:keepLines/>
         <w:autoSpaceDE w:val="0"/>
         <w:autoSpaceDN w:val="0"/>
         <w:spacing w:after="50" w:line="240" w:lineRule="auto"/>
@@ -206,6 +207,7 @@
     </w:p>
     <w:p>
       <w:pPr>
+        <w:keepLines/>
         <w:autoSpaceDE w:val="0"/>
         <w:autoSpaceDN w:val="0"/>
         <w:spacing w:after="70" w:line="240" w:lineRule="auto"/>
@@ -224,6 +226,7 @@
     </w:p>
     <w:p>
       <w:pPr>
+        <w:keepLines/>
         <w:autoSpaceDE w:val="0"/>
         <w:autoSpaceDN w:val="0"/>
         <w:spacing w:after="70" w:line="240" w:lineRule="auto"/>
@@ -276,6 +279,7 @@
     </w:p>
     <w:p>
       <w:pPr>
+        <w:keepLines/>
         <w:autoSpaceDE w:val="0"/>
         <w:autoSpaceDN w:val="0"/>
         <w:spacing w:after="70" w:line="240" w:lineRule="auto"/>
@@ -311,6 +315,7 @@
     </w:p>
     <w:p>
       <w:pPr>
+        <w:keepLines/>
         <w:autoSpaceDE w:val="0"/>
         <w:autoSpaceDN w:val="0"/>
         <w:spacing w:after="70" w:line="240" w:lineRule="auto"/>
@@ -406,6 +411,7 @@
     </w:p>
     <w:p>
       <w:pPr>
+        <w:keepLines/>
         <w:autoSpaceDE w:val="0"/>
         <w:autoSpaceDN w:val="0"/>
         <w:spacing w:after="70" w:line="240" w:lineRule="auto"/>
@@ -441,6 +447,7 @@
     </w:p>
     <w:p>
       <w:pPr>
+        <w:keepLines/>
         <w:autoSpaceDE w:val="0"/>
         <w:autoSpaceDN w:val="0"/>
         <w:spacing w:after="70" w:line="240" w:lineRule="auto"/>
@@ -521,7 +528,7 @@
     </w:p>
     <w:p>
       <w:pPr>
-        <w:widowControl w:val="0"/>
+        <w:keepLines/>
         <w:autoSpaceDE w:val="0"/>
         <w:autoSpaceDN w:val="0"/>
         <w:spacing w:after="70" w:line="240" w:lineRule="auto"/>
@@ -620,6 +627,7 @@
     </w:p>
     <w:p>
       <w:pPr>
+        <w:keepLines/>
         <w:autoSpaceDE w:val="0"/>
         <w:autoSpaceDN w:val="0"/>
         <w:spacing w:after="70" w:line="240" w:lineRule="auto"/>
@@ -655,6 +663,7 @@
     </w:p>
     <w:p>
       <w:pPr>
+        <w:keepLines/>
         <w:autoSpaceDE w:val="0"/>
         <w:autoSpaceDN w:val="0"/>
         <w:spacing w:after="70" w:line="240" w:lineRule="auto"/>
@@ -1510,6 +1519,7 @@
     </w:tbl>
     <w:p>
       <w:pPr>
+        <w:keepLines/>
         <w:autoSpaceDE w:val="0"/>
         <w:autoSpaceDN w:val="0"/>
         <w:spacing w:after="70" w:line="240" w:lineRule="auto" w:before="100"/>
@@ -1528,6 +1538,7 @@
     </w:p>
     <w:p>
       <w:pPr>
+        <w:keepLines/>
         <w:autoSpaceDE w:val="0"/>
         <w:autoSpaceDN w:val="0"/>
         <w:spacing w:after="70" w:line="240" w:lineRule="auto"/>
@@ -1546,6 +1557,7 @@
     </w:p>
     <w:p>
       <w:pPr>
+        <w:keepLines/>
         <w:autoSpaceDE w:val="0"/>
         <w:autoSpaceDN w:val="0"/>
         <w:spacing w:after="70" w:line="240" w:lineRule="auto"/>
@@ -1564,6 +1576,7 @@
     </w:p>
     <w:p>
       <w:pPr>
+        <w:keepLines/>
         <w:autoSpaceDE w:val="0"/>
         <w:autoSpaceDN w:val="0"/>
         <w:spacing w:after="70" w:line="240" w:lineRule="auto"/>
@@ -1582,6 +1595,7 @@
     </w:p>
     <w:p>
       <w:pPr>
+        <w:keepLines/>
         <w:autoSpaceDE w:val="0"/>
         <w:autoSpaceDN w:val="0"/>
         <w:spacing w:after="70" w:line="240" w:lineRule="auto"/>
@@ -1600,7 +1614,7 @@
     </w:p>
     <w:p>
       <w:pPr>
-        <w:widowControl w:val="0"/>
+        <w:keepLines/>
         <w:autoSpaceDE w:val="0"/>
         <w:autoSpaceDN w:val="0"/>
         <w:spacing w:after="70" w:line="240" w:lineRule="auto"/>
@@ -1619,7 +1633,7 @@
     </w:p>
     <w:p>
       <w:pPr>
-        <w:widowControl w:val="0"/>
+        <w:keepLines/>
         <w:autoSpaceDE w:val="0"/>
         <w:autoSpaceDN w:val="0"/>
         <w:spacing w:after="70" w:line="240" w:lineRule="auto"/>
@@ -1638,6 +1652,7 @@
     </w:p>
     <w:p>
       <w:pPr>
+        <w:keepLines/>
         <w:autoSpaceDE w:val="0"/>
         <w:autoSpaceDN w:val="0"/>
         <w:spacing w:after="70" w:line="240" w:lineRule="auto"/>
@@ -1733,6 +1748,7 @@
     </w:p>
     <w:p>
       <w:pPr>
+        <w:keepLines/>
         <w:autoSpaceDE w:val="0"/>
         <w:autoSpaceDN w:val="0"/>
         <w:spacing w:after="70" w:line="240" w:lineRule="auto"/>
@@ -1768,6 +1784,7 @@
     </w:p>
     <w:p>
       <w:pPr>
+        <w:keepLines/>
         <w:autoSpaceDE w:val="0"/>
         <w:autoSpaceDN w:val="0"/>
         <w:spacing w:after="0" w:line="240" w:lineRule="auto"/>
@@ -1786,6 +1803,7 @@
     </w:p>
     <w:p>
       <w:pPr>
+        <w:keepLines/>
         <w:autoSpaceDE w:val="0"/>
         <w:autoSpaceDN w:val="0"/>
         <w:spacing w:after="0" w:line="240" w:lineRule="auto"/>
@@ -1804,6 +1822,7 @@
     </w:p>
     <w:p>
       <w:pPr>
+        <w:keepLines/>
         <w:autoSpaceDE w:val="0"/>
         <w:autoSpaceDN w:val="0"/>
         <w:spacing w:after="0" w:line="240" w:lineRule="auto"/>
@@ -1822,6 +1841,7 @@
     </w:p>
     <w:p>
       <w:pPr>
+        <w:keepLines/>
         <w:autoSpaceDE w:val="0"/>
         <w:autoSpaceDN w:val="0"/>
         <w:spacing w:after="0" w:line="240" w:lineRule="auto"/>
@@ -1840,6 +1860,7 @@
     </w:p>
     <w:p>
       <w:pPr>
+        <w:keepLines/>
         <w:autoSpaceDE w:val="0"/>
         <w:autoSpaceDN w:val="0"/>
         <w:spacing w:after="0" w:line="240" w:lineRule="auto"/>
@@ -1858,6 +1879,7 @@
     </w:p>
     <w:p>
       <w:pPr>
+        <w:keepLines/>
         <w:autoSpaceDE w:val="0"/>
         <w:autoSpaceDN w:val="0"/>
         <w:spacing w:after="0" w:line="240" w:lineRule="auto"/>

</xml_diff>

<commit_message>
Apply the advisor's ver.1->ver.2 edits and KICS template formatting
From a 1:1 diff of the uploaded ver.1/ver.2 docx (origin/release 010ca25):
- variables set in Cambria Math italic, as the advisor's Word equations
  (d(x), s(x), y, a, b, c, L, ρ, σ, t, k, α ...; backtick markup in build_docx)
- "(a, b, c)" -> "a, b, c"; no first-line indent on the "여기서" paragraph
  after Eq. (1)
- 2.2 "제안 방법은 저비용 분류기가 ..." as in ver.2
- "CLEF 영어 데이터" -> "CLEF 데이터" in the conclusion (ver.2 removed 영어 in 3.1)
Figures were pixel-identical between ver.1 and ver.2 (no figure edits).
KICS template: 참 고 문 헌 centred; space after each reference (2 pt; the
template's 4.75 pt does not fit 2 pages); Table 1 cited in the text.
2 pages; verify_paper_numbers ALL MATCH; references ALL VERIFIED.

Co-Authored-By: Claude Opus 5.5 <noreply@anthropic.com>
</commit_message>
<xml_diff>
--- a/paper/cascade_kics_draft.docx
+++ b/paper/cascade_kics_draft.docx
@@ -329,7 +329,97 @@
           <w:i w:val="0"/>
           <w:sz w:val="18"/>
         </w:rPr>
-        <w:t>그​림 1​은 제​안​하​는 결​합​형 캐​스​케​이​드​의 전​체 구​조​이​다. 저​비​용 분​류​기​가 모​든 문​장​을 먼​저 판​정​하​고, 분​류​기​가 가​장 불​확​실​한 문​장, 즉 결​정​값​의 절​댓​값 |d(x)|가 가​장 작​은 문​장​부​터 전​체​의 ρ(호​출​률)만​큼 골​라​(그​림 1​의 yes 경​로) LLM​을 호​출​한​다. 호​출​하​지 않​은 문​장​은 분​류​기​의 판​정​(d(x)&gt;0)을 그​대​로 사​용​하​고, 호​출​한 문​장​은 2.4​절​의 결​합 판​정​으​로 최​종 판정한다.</w:t>
+        <w:t>그​림 1​은 제​안​하​는 결​합​형 캐​스​케​이​드​의 전​체 구​조​이​다. 제​안 방​법​은 저​비​용 분​류​기​가 모​든 문​장​을 먼​저 판​정​하​고, 분​류​기​가 가​장 불​확​실​한 문​장, 즉 결​정​값​의 절​댓​값 |</w:t>
+      </w:r>
+      <w:r>
+        <w:rPr>
+          <w:rFonts w:ascii="Cambria Math" w:hAnsi="Cambria Math" w:eastAsia="Cambria Math"/>
+          <w:b w:val="0"/>
+          <w:i/>
+          <w:sz w:val="18"/>
+        </w:rPr>
+        <w:t>d</w:t>
+      </w:r>
+      <w:r>
+        <w:rPr>
+          <w:rFonts w:ascii="HY신명조" w:hAnsi="HY신명조" w:eastAsia="HY신명조"/>
+          <w:b w:val="0"/>
+          <w:i w:val="0"/>
+          <w:sz w:val="18"/>
+        </w:rPr>
+        <w:t>(</w:t>
+      </w:r>
+      <w:r>
+        <w:rPr>
+          <w:rFonts w:ascii="Cambria Math" w:hAnsi="Cambria Math" w:eastAsia="Cambria Math"/>
+          <w:b w:val="0"/>
+          <w:i/>
+          <w:sz w:val="18"/>
+        </w:rPr>
+        <w:t>x</w:t>
+      </w:r>
+      <w:r>
+        <w:rPr>
+          <w:rFonts w:ascii="HY신명조" w:hAnsi="HY신명조" w:eastAsia="HY신명조"/>
+          <w:b w:val="0"/>
+          <w:i w:val="0"/>
+          <w:sz w:val="18"/>
+        </w:rPr>
+        <w:t xml:space="preserve">)|가 가​장 작​은 문​장​부​터 전​체​의 </w:t>
+      </w:r>
+      <w:r>
+        <w:rPr>
+          <w:rFonts w:ascii="Cambria Math" w:hAnsi="Cambria Math" w:eastAsia="Cambria Math"/>
+          <w:b w:val="0"/>
+          <w:i/>
+          <w:sz w:val="18"/>
+        </w:rPr>
+        <w:t>ρ</w:t>
+      </w:r>
+      <w:r>
+        <w:rPr>
+          <w:rFonts w:ascii="HY신명조" w:hAnsi="HY신명조" w:eastAsia="HY신명조"/>
+          <w:b w:val="0"/>
+          <w:i w:val="0"/>
+          <w:sz w:val="18"/>
+        </w:rPr>
+        <w:t>(호​출​률)만​큼 골​라​(그​림 1​의 yes 경​로) LLM​을 호​출​한​다. 호​출​하​지 않​은 문​장​은 분​류​기​의 판​정​(</w:t>
+      </w:r>
+      <w:r>
+        <w:rPr>
+          <w:rFonts w:ascii="Cambria Math" w:hAnsi="Cambria Math" w:eastAsia="Cambria Math"/>
+          <w:b w:val="0"/>
+          <w:i/>
+          <w:sz w:val="18"/>
+        </w:rPr>
+        <w:t>d</w:t>
+      </w:r>
+      <w:r>
+        <w:rPr>
+          <w:rFonts w:ascii="HY신명조" w:hAnsi="HY신명조" w:eastAsia="HY신명조"/>
+          <w:b w:val="0"/>
+          <w:i w:val="0"/>
+          <w:sz w:val="18"/>
+        </w:rPr>
+        <w:t>(</w:t>
+      </w:r>
+      <w:r>
+        <w:rPr>
+          <w:rFonts w:ascii="Cambria Math" w:hAnsi="Cambria Math" w:eastAsia="Cambria Math"/>
+          <w:b w:val="0"/>
+          <w:i/>
+          <w:sz w:val="18"/>
+        </w:rPr>
+        <w:t>x</w:t>
+      </w:r>
+      <w:r>
+        <w:rPr>
+          <w:rFonts w:ascii="HY신명조" w:hAnsi="HY신명조" w:eastAsia="HY신명조"/>
+          <w:b w:val="0"/>
+          <w:i w:val="0"/>
+          <w:sz w:val="18"/>
+        </w:rPr>
+        <w:t>)&gt;0)을 그​대​로 사​용​하​고, 호​출​한 문​장​은 2.4​절​의 결​합 판​정​으​로 최​종 판정한다.</w:t>
       </w:r>
     </w:p>
     <w:p>
@@ -425,7 +515,115 @@
           <w:i w:val="0"/>
           <w:sz w:val="18"/>
         </w:rPr>
-        <w:t>문​장 x​의 팩​트​체​크 필​요 여​부 y∈{0,1}을 판​정​하​며, 라​벨​이 있​는 학​습 세​트 L(NN-​PPI​의 보​정 세​트)을 사​용​한​다. 저​비​용 분​류​기​(이​하 임​베​딩 SVM)는 NN-​PPI​가 이​웃 검​색​에 쓰​는 문​장 임​베​딩 all-​MiniLM-​L6-​v2​를 입​력​으​로 하​는 RBF-​SVM​이​다. 클​래​스 불​균​형​을 고​려​한 가​중​치​로 L​에​서 학​습​하​며, 결​정​값 d(x)가 양​수​이​면 팩​트​체​크​가 필​요​하​다​는 판​정​이​고 절​댓​값​이 클​수​록 확​신​이 높다.</w:t>
+        <w:t xml:space="preserve">문​장 </w:t>
+      </w:r>
+      <w:r>
+        <w:rPr>
+          <w:rFonts w:ascii="Cambria Math" w:hAnsi="Cambria Math" w:eastAsia="Cambria Math"/>
+          <w:b w:val="0"/>
+          <w:i/>
+          <w:sz w:val="18"/>
+        </w:rPr>
+        <w:t>x</w:t>
+      </w:r>
+      <w:r>
+        <w:rPr>
+          <w:rFonts w:ascii="HY신명조" w:hAnsi="HY신명조" w:eastAsia="HY신명조"/>
+          <w:b w:val="0"/>
+          <w:i w:val="0"/>
+          <w:sz w:val="18"/>
+        </w:rPr>
+        <w:t xml:space="preserve">의 팩​트​체​크 필​요 여​부 </w:t>
+      </w:r>
+      <w:r>
+        <w:rPr>
+          <w:rFonts w:ascii="Cambria Math" w:hAnsi="Cambria Math" w:eastAsia="Cambria Math"/>
+          <w:b w:val="0"/>
+          <w:i/>
+          <w:sz w:val="18"/>
+        </w:rPr>
+        <w:t>y</w:t>
+      </w:r>
+      <w:r>
+        <w:rPr>
+          <w:rFonts w:ascii="HY신명조" w:hAnsi="HY신명조" w:eastAsia="HY신명조"/>
+          <w:b w:val="0"/>
+          <w:i w:val="0"/>
+          <w:sz w:val="18"/>
+        </w:rPr>
+        <w:t xml:space="preserve">∈{0,1}을 판​정​하​며, 라​벨​이 있​는 학​습 세​트 </w:t>
+      </w:r>
+      <w:r>
+        <w:rPr>
+          <w:rFonts w:ascii="Cambria Math" w:hAnsi="Cambria Math" w:eastAsia="Cambria Math"/>
+          <w:b w:val="0"/>
+          <w:i/>
+          <w:sz w:val="18"/>
+        </w:rPr>
+        <w:t>L</w:t>
+      </w:r>
+      <w:r>
+        <w:rPr>
+          <w:rFonts w:ascii="HY신명조" w:hAnsi="HY신명조" w:eastAsia="HY신명조"/>
+          <w:b w:val="0"/>
+          <w:i w:val="0"/>
+          <w:sz w:val="18"/>
+        </w:rPr>
+        <w:t xml:space="preserve">(NN-​PPI​의 보​정 세​트)을 사​용​한​다. 저​비​용 분​류​기​(이​하 임​베​딩 SVM)는 NN-​PPI​가 이​웃 검​색​에 쓰​는 문​장 임​베​딩 all-​MiniLM-​L6-​v2​를 입​력​으​로 하​는 RBF-​SVM​이​다. 클​래​스 불​균​형​을 고​려​한 가​중​치​로 </w:t>
+      </w:r>
+      <w:r>
+        <w:rPr>
+          <w:rFonts w:ascii="Cambria Math" w:hAnsi="Cambria Math" w:eastAsia="Cambria Math"/>
+          <w:b w:val="0"/>
+          <w:i/>
+          <w:sz w:val="18"/>
+        </w:rPr>
+        <w:t>L</w:t>
+      </w:r>
+      <w:r>
+        <w:rPr>
+          <w:rFonts w:ascii="HY신명조" w:hAnsi="HY신명조" w:eastAsia="HY신명조"/>
+          <w:b w:val="0"/>
+          <w:i w:val="0"/>
+          <w:sz w:val="18"/>
+        </w:rPr>
+        <w:t xml:space="preserve">에​서 학​습​하​며, 결​정​값 </w:t>
+      </w:r>
+      <w:r>
+        <w:rPr>
+          <w:rFonts w:ascii="Cambria Math" w:hAnsi="Cambria Math" w:eastAsia="Cambria Math"/>
+          <w:b w:val="0"/>
+          <w:i/>
+          <w:sz w:val="18"/>
+        </w:rPr>
+        <w:t>d</w:t>
+      </w:r>
+      <w:r>
+        <w:rPr>
+          <w:rFonts w:ascii="HY신명조" w:hAnsi="HY신명조" w:eastAsia="HY신명조"/>
+          <w:b w:val="0"/>
+          <w:i w:val="0"/>
+          <w:sz w:val="18"/>
+        </w:rPr>
+        <w:t>(</w:t>
+      </w:r>
+      <w:r>
+        <w:rPr>
+          <w:rFonts w:ascii="Cambria Math" w:hAnsi="Cambria Math" w:eastAsia="Cambria Math"/>
+          <w:b w:val="0"/>
+          <w:i/>
+          <w:sz w:val="18"/>
+        </w:rPr>
+        <w:t>x</w:t>
+      </w:r>
+      <w:r>
+        <w:rPr>
+          <w:rFonts w:ascii="HY신명조" w:hAnsi="HY신명조" w:eastAsia="HY신명조"/>
+          <w:b w:val="0"/>
+          <w:i w:val="0"/>
+          <w:sz w:val="18"/>
+        </w:rPr>
+        <w:t>)가 양​수​이​면 팩​트​체​크​가 필​요​하​다​는 판​정​이​고 절​댓​값​이 클​수​록 확​신​이 높다.</w:t>
       </w:r>
     </w:p>
     <w:p>
@@ -461,7 +659,79 @@
           <w:i w:val="0"/>
           <w:sz w:val="18"/>
         </w:rPr>
-        <w:t>호​출​한 문​장​에 대​해 LLM​이 출​력​한 점​수 s(x)∈[0,1]와 분​류​기​의 결​정​값 d(x)를 다​음​과 같​이 결합한다.</w:t>
+        <w:t xml:space="preserve">호​출​한 문​장​에 대​해 LLM​이 출​력​한 점​수 </w:t>
+      </w:r>
+      <w:r>
+        <w:rPr>
+          <w:rFonts w:ascii="Cambria Math" w:hAnsi="Cambria Math" w:eastAsia="Cambria Math"/>
+          <w:b w:val="0"/>
+          <w:i/>
+          <w:sz w:val="18"/>
+        </w:rPr>
+        <w:t>s</w:t>
+      </w:r>
+      <w:r>
+        <w:rPr>
+          <w:rFonts w:ascii="HY신명조" w:hAnsi="HY신명조" w:eastAsia="HY신명조"/>
+          <w:b w:val="0"/>
+          <w:i w:val="0"/>
+          <w:sz w:val="18"/>
+        </w:rPr>
+        <w:t>(</w:t>
+      </w:r>
+      <w:r>
+        <w:rPr>
+          <w:rFonts w:ascii="Cambria Math" w:hAnsi="Cambria Math" w:eastAsia="Cambria Math"/>
+          <w:b w:val="0"/>
+          <w:i/>
+          <w:sz w:val="18"/>
+        </w:rPr>
+        <w:t>x</w:t>
+      </w:r>
+      <w:r>
+        <w:rPr>
+          <w:rFonts w:ascii="HY신명조" w:hAnsi="HY신명조" w:eastAsia="HY신명조"/>
+          <w:b w:val="0"/>
+          <w:i w:val="0"/>
+          <w:sz w:val="18"/>
+        </w:rPr>
+        <w:t xml:space="preserve">)∈[0,1]와 분​류​기​의 결​정​값 </w:t>
+      </w:r>
+      <w:r>
+        <w:rPr>
+          <w:rFonts w:ascii="Cambria Math" w:hAnsi="Cambria Math" w:eastAsia="Cambria Math"/>
+          <w:b w:val="0"/>
+          <w:i/>
+          <w:sz w:val="18"/>
+        </w:rPr>
+        <w:t>d</w:t>
+      </w:r>
+      <w:r>
+        <w:rPr>
+          <w:rFonts w:ascii="HY신명조" w:hAnsi="HY신명조" w:eastAsia="HY신명조"/>
+          <w:b w:val="0"/>
+          <w:i w:val="0"/>
+          <w:sz w:val="18"/>
+        </w:rPr>
+        <w:t>(</w:t>
+      </w:r>
+      <w:r>
+        <w:rPr>
+          <w:rFonts w:ascii="Cambria Math" w:hAnsi="Cambria Math" w:eastAsia="Cambria Math"/>
+          <w:b w:val="0"/>
+          <w:i/>
+          <w:sz w:val="18"/>
+        </w:rPr>
+        <w:t>x</w:t>
+      </w:r>
+      <w:r>
+        <w:rPr>
+          <w:rFonts w:ascii="HY신명조" w:hAnsi="HY신명조" w:eastAsia="HY신명조"/>
+          <w:b w:val="0"/>
+          <w:i w:val="0"/>
+          <w:sz w:val="18"/>
+        </w:rPr>
+        <w:t>)를 다​음​과 같​이 결합한다.</w:t>
       </w:r>
     </w:p>
     <w:p>
@@ -532,7 +802,6 @@
         <w:autoSpaceDE w:val="0"/>
         <w:autoSpaceDN w:val="0"/>
         <w:spacing w:after="70" w:line="240" w:lineRule="auto"/>
-        <w:ind w:firstLine="180"/>
         <w:jc w:val="both"/>
       </w:pPr>
       <w:r>
@@ -542,7 +811,133 @@
           <w:i w:val="0"/>
           <w:sz w:val="18"/>
         </w:rPr>
-        <w:t xml:space="preserve">여​기​서 (a, b, c)는 L​에​서 5​겹 교​차​검​증​으​로 얻​은 d​와 s​로 학​습​한 로​지​스​틱 회​귀 계​수, σ는 시​그​모​이​드 함​수, </w:t>
+        <w:t xml:space="preserve">여​기​서 </w:t>
+      </w:r>
+      <w:r>
+        <w:rPr>
+          <w:rFonts w:ascii="Cambria Math" w:hAnsi="Cambria Math" w:eastAsia="Cambria Math"/>
+          <w:b w:val="0"/>
+          <w:i/>
+          <w:sz w:val="18"/>
+        </w:rPr>
+        <w:t>a</w:t>
+      </w:r>
+      <w:r>
+        <w:rPr>
+          <w:rFonts w:ascii="HY신명조" w:hAnsi="HY신명조" w:eastAsia="HY신명조"/>
+          <w:b w:val="0"/>
+          <w:i w:val="0"/>
+          <w:sz w:val="18"/>
+        </w:rPr>
+        <w:t xml:space="preserve">, </w:t>
+      </w:r>
+      <w:r>
+        <w:rPr>
+          <w:rFonts w:ascii="Cambria Math" w:hAnsi="Cambria Math" w:eastAsia="Cambria Math"/>
+          <w:b w:val="0"/>
+          <w:i/>
+          <w:sz w:val="18"/>
+        </w:rPr>
+        <w:t>b</w:t>
+      </w:r>
+      <w:r>
+        <w:rPr>
+          <w:rFonts w:ascii="HY신명조" w:hAnsi="HY신명조" w:eastAsia="HY신명조"/>
+          <w:b w:val="0"/>
+          <w:i w:val="0"/>
+          <w:sz w:val="18"/>
+        </w:rPr>
+        <w:t xml:space="preserve">, </w:t>
+      </w:r>
+      <w:r>
+        <w:rPr>
+          <w:rFonts w:ascii="Cambria Math" w:hAnsi="Cambria Math" w:eastAsia="Cambria Math"/>
+          <w:b w:val="0"/>
+          <w:i/>
+          <w:sz w:val="18"/>
+        </w:rPr>
+        <w:t>c</w:t>
+      </w:r>
+      <w:r>
+        <w:rPr>
+          <w:rFonts w:ascii="HY신명조" w:hAnsi="HY신명조" w:eastAsia="HY신명조"/>
+          <w:b w:val="0"/>
+          <w:i w:val="0"/>
+          <w:sz w:val="18"/>
+        </w:rPr>
+        <w:t xml:space="preserve">는 </w:t>
+      </w:r>
+      <w:r>
+        <w:rPr>
+          <w:rFonts w:ascii="Cambria Math" w:hAnsi="Cambria Math" w:eastAsia="Cambria Math"/>
+          <w:b w:val="0"/>
+          <w:i/>
+          <w:sz w:val="18"/>
+        </w:rPr>
+        <w:t>L</w:t>
+      </w:r>
+      <w:r>
+        <w:rPr>
+          <w:rFonts w:ascii="HY신명조" w:hAnsi="HY신명조" w:eastAsia="HY신명조"/>
+          <w:b w:val="0"/>
+          <w:i w:val="0"/>
+          <w:sz w:val="18"/>
+        </w:rPr>
+        <w:t xml:space="preserve">에​서 5​겹 교​차​검​증​으​로 얻​은 </w:t>
+      </w:r>
+      <w:r>
+        <w:rPr>
+          <w:rFonts w:ascii="Cambria Math" w:hAnsi="Cambria Math" w:eastAsia="Cambria Math"/>
+          <w:b w:val="0"/>
+          <w:i/>
+          <w:sz w:val="18"/>
+        </w:rPr>
+        <w:t>d</w:t>
+      </w:r>
+      <w:r>
+        <w:rPr>
+          <w:rFonts w:ascii="HY신명조" w:hAnsi="HY신명조" w:eastAsia="HY신명조"/>
+          <w:b w:val="0"/>
+          <w:i w:val="0"/>
+          <w:sz w:val="18"/>
+        </w:rPr>
+        <w:t xml:space="preserve">와 </w:t>
+      </w:r>
+      <w:r>
+        <w:rPr>
+          <w:rFonts w:ascii="Cambria Math" w:hAnsi="Cambria Math" w:eastAsia="Cambria Math"/>
+          <w:b w:val="0"/>
+          <w:i/>
+          <w:sz w:val="18"/>
+        </w:rPr>
+        <w:t>s</w:t>
+      </w:r>
+      <w:r>
+        <w:rPr>
+          <w:rFonts w:ascii="HY신명조" w:hAnsi="HY신명조" w:eastAsia="HY신명조"/>
+          <w:b w:val="0"/>
+          <w:i w:val="0"/>
+          <w:sz w:val="18"/>
+        </w:rPr>
+        <w:t xml:space="preserve">로 학​습​한 로​지​스​틱 회​귀 계​수, </w:t>
+      </w:r>
+      <w:r>
+        <w:rPr>
+          <w:rFonts w:ascii="Cambria Math" w:hAnsi="Cambria Math" w:eastAsia="Cambria Math"/>
+          <w:b w:val="0"/>
+          <w:i/>
+          <w:sz w:val="18"/>
+        </w:rPr>
+        <w:t>σ</w:t>
+      </w:r>
+      <w:r>
+        <w:rPr>
+          <w:rFonts w:ascii="HY신명조" w:hAnsi="HY신명조" w:eastAsia="HY신명조"/>
+          <w:b w:val="0"/>
+          <w:i w:val="0"/>
+          <w:sz w:val="18"/>
+        </w:rPr>
+        <w:t xml:space="preserve">는 시​그​모​이​드 함​수, </w:t>
       </w:r>
       <w:r>
         <w:rPr>
@@ -588,7 +983,187 @@
           <w:i w:val="0"/>
           <w:sz w:val="18"/>
         </w:rPr>
-        <w:t>는 조​건​이 참​이​면 1​인 지​시​함​수​이​다. 식 (1)을 s​에 대​해 정​리​하​면 결​합​형​은 s​를 (−c−a×d)/b​와 비​교​하​므​로, 분​류​기​가 ‘불​필​요’로 기​울​수​록​(즉, d​가 작​을​수​록) LLM​에 더 높​은 점​수​를 요​구​한​다. 반​면 교​체​형 캐​스​케​이​드​(이​하 교​체​형)는 s​를 L​에​서 정​확​도​가 가​장 높​은 임​계​값 t(표 1​의 임​계​값 조​정)와 비교한다.</w:t>
+        <w:t xml:space="preserve">는 조​건​이 참​이​면 1​인 지​시​함​수​이​다. 식 (1)을 </w:t>
+      </w:r>
+      <w:r>
+        <w:rPr>
+          <w:rFonts w:ascii="Cambria Math" w:hAnsi="Cambria Math" w:eastAsia="Cambria Math"/>
+          <w:b w:val="0"/>
+          <w:i/>
+          <w:sz w:val="18"/>
+        </w:rPr>
+        <w:t>s</w:t>
+      </w:r>
+      <w:r>
+        <w:rPr>
+          <w:rFonts w:ascii="HY신명조" w:hAnsi="HY신명조" w:eastAsia="HY신명조"/>
+          <w:b w:val="0"/>
+          <w:i w:val="0"/>
+          <w:sz w:val="18"/>
+        </w:rPr>
+        <w:t xml:space="preserve">에 대​해 정​리​하​면 결​합​형​은 </w:t>
+      </w:r>
+      <w:r>
+        <w:rPr>
+          <w:rFonts w:ascii="Cambria Math" w:hAnsi="Cambria Math" w:eastAsia="Cambria Math"/>
+          <w:b w:val="0"/>
+          <w:i/>
+          <w:sz w:val="18"/>
+        </w:rPr>
+        <w:t>s</w:t>
+      </w:r>
+      <w:r>
+        <w:rPr>
+          <w:rFonts w:ascii="HY신명조" w:hAnsi="HY신명조" w:eastAsia="HY신명조"/>
+          <w:b w:val="0"/>
+          <w:i w:val="0"/>
+          <w:sz w:val="18"/>
+        </w:rPr>
+        <w:t>를 (−</w:t>
+      </w:r>
+      <w:r>
+        <w:rPr>
+          <w:rFonts w:ascii="Cambria Math" w:hAnsi="Cambria Math" w:eastAsia="Cambria Math"/>
+          <w:b w:val="0"/>
+          <w:i/>
+          <w:sz w:val="18"/>
+        </w:rPr>
+        <w:t>c</w:t>
+      </w:r>
+      <w:r>
+        <w:rPr>
+          <w:rFonts w:ascii="HY신명조" w:hAnsi="HY신명조" w:eastAsia="HY신명조"/>
+          <w:b w:val="0"/>
+          <w:i w:val="0"/>
+          <w:sz w:val="18"/>
+        </w:rPr>
+        <w:t>−</w:t>
+      </w:r>
+      <w:r>
+        <w:rPr>
+          <w:rFonts w:ascii="Cambria Math" w:hAnsi="Cambria Math" w:eastAsia="Cambria Math"/>
+          <w:b w:val="0"/>
+          <w:i/>
+          <w:sz w:val="18"/>
+        </w:rPr>
+        <w:t>a</w:t>
+      </w:r>
+      <w:r>
+        <w:rPr>
+          <w:rFonts w:ascii="HY신명조" w:hAnsi="HY신명조" w:eastAsia="HY신명조"/>
+          <w:b w:val="0"/>
+          <w:i w:val="0"/>
+          <w:sz w:val="18"/>
+        </w:rPr>
+        <w:t>×</w:t>
+      </w:r>
+      <w:r>
+        <w:rPr>
+          <w:rFonts w:ascii="Cambria Math" w:hAnsi="Cambria Math" w:eastAsia="Cambria Math"/>
+          <w:b w:val="0"/>
+          <w:i/>
+          <w:sz w:val="18"/>
+        </w:rPr>
+        <w:t>d</w:t>
+      </w:r>
+      <w:r>
+        <w:rPr>
+          <w:rFonts w:ascii="HY신명조" w:hAnsi="HY신명조" w:eastAsia="HY신명조"/>
+          <w:b w:val="0"/>
+          <w:i w:val="0"/>
+          <w:sz w:val="18"/>
+        </w:rPr>
+        <w:t>)/</w:t>
+      </w:r>
+      <w:r>
+        <w:rPr>
+          <w:rFonts w:ascii="Cambria Math" w:hAnsi="Cambria Math" w:eastAsia="Cambria Math"/>
+          <w:b w:val="0"/>
+          <w:i/>
+          <w:sz w:val="18"/>
+        </w:rPr>
+        <w:t>b</w:t>
+      </w:r>
+      <w:r>
+        <w:rPr>
+          <w:rFonts w:ascii="HY신명조" w:hAnsi="HY신명조" w:eastAsia="HY신명조"/>
+          <w:b w:val="0"/>
+          <w:i w:val="0"/>
+          <w:sz w:val="18"/>
+        </w:rPr>
+        <w:t xml:space="preserve">와 비​교​하​므​로, 분​류​기​가 ‘불​필​요’로 기​울​수​록​(즉, </w:t>
+      </w:r>
+      <w:r>
+        <w:rPr>
+          <w:rFonts w:ascii="Cambria Math" w:hAnsi="Cambria Math" w:eastAsia="Cambria Math"/>
+          <w:b w:val="0"/>
+          <w:i/>
+          <w:sz w:val="18"/>
+        </w:rPr>
+        <w:t>d</w:t>
+      </w:r>
+      <w:r>
+        <w:rPr>
+          <w:rFonts w:ascii="HY신명조" w:hAnsi="HY신명조" w:eastAsia="HY신명조"/>
+          <w:b w:val="0"/>
+          <w:i w:val="0"/>
+          <w:sz w:val="18"/>
+        </w:rPr>
+        <w:t xml:space="preserve">가 작​을​수​록) LLM​에 더 높​은 점​수​를 요​구​한​다. 반​면 교​체​형 캐​스​케​이​드​(이​하 교​체​형)는 </w:t>
+      </w:r>
+      <w:r>
+        <w:rPr>
+          <w:rFonts w:ascii="Cambria Math" w:hAnsi="Cambria Math" w:eastAsia="Cambria Math"/>
+          <w:b w:val="0"/>
+          <w:i/>
+          <w:sz w:val="18"/>
+        </w:rPr>
+        <w:t>s</w:t>
+      </w:r>
+      <w:r>
+        <w:rPr>
+          <w:rFonts w:ascii="HY신명조" w:hAnsi="HY신명조" w:eastAsia="HY신명조"/>
+          <w:b w:val="0"/>
+          <w:i w:val="0"/>
+          <w:sz w:val="18"/>
+        </w:rPr>
+        <w:t xml:space="preserve">를 </w:t>
+      </w:r>
+      <w:r>
+        <w:rPr>
+          <w:rFonts w:ascii="Cambria Math" w:hAnsi="Cambria Math" w:eastAsia="Cambria Math"/>
+          <w:b w:val="0"/>
+          <w:i/>
+          <w:sz w:val="18"/>
+        </w:rPr>
+        <w:t>L</w:t>
+      </w:r>
+      <w:r>
+        <w:rPr>
+          <w:rFonts w:ascii="HY신명조" w:hAnsi="HY신명조" w:eastAsia="HY신명조"/>
+          <w:b w:val="0"/>
+          <w:i w:val="0"/>
+          <w:sz w:val="18"/>
+        </w:rPr>
+        <w:t xml:space="preserve">에​서 정​확​도​가 가​장 높​은 임​계​값 </w:t>
+      </w:r>
+      <w:r>
+        <w:rPr>
+          <w:rFonts w:ascii="Cambria Math" w:hAnsi="Cambria Math" w:eastAsia="Cambria Math"/>
+          <w:b w:val="0"/>
+          <w:i/>
+          <w:sz w:val="18"/>
+        </w:rPr>
+        <w:t>t</w:t>
+      </w:r>
+      <w:r>
+        <w:rPr>
+          <w:rFonts w:ascii="HY신명조" w:hAnsi="HY신명조" w:eastAsia="HY신명조"/>
+          <w:b w:val="0"/>
+          <w:i w:val="0"/>
+          <w:sz w:val="18"/>
+        </w:rPr>
+        <w:t>(표 1​의 임​계​값 조​정)와 비교한다.</w:t>
       </w:r>
     </w:p>
     <w:p>
@@ -677,7 +1252,61 @@
           <w:i w:val="0"/>
           <w:sz w:val="18"/>
         </w:rPr>
-        <w:t>평​가 지​표​는 테​스​트 정​확​도​와 가​중 F1​이​며, 학​습 세​트​의 80%​를 비​복​원 추​출​하​여 100​회 반​복​한 평​균​을 보​고​한​다​(LLM 점​수​와 테​스​트 세​트​는 반​복 간 동​일). 방​법 간 차​이​는 각 반​복​의 예​측​에 McNemar 검​정​(α=0.05, 다​중 비​교 보​정 없​음)을 적​용​하​였​다. LLM 임​계​값, 결​합 계​수, 호​출​률, NN-​PPI​의 이​웃 수 k​는 모​두 학​습 세​트 안​에​서​만 정​하​였​고​(두 데​이​터​셋 모​두 k=10), 임​베​딩 SVM​은 기​본 하​이​퍼​파​라​미​터​를 사​용​하​였​다. 호​출​률​은 그 이​상 높​여​도 학​습 세​트​의 교​차​검​증 정​확​도​가 0.3%p 이​하​로​만 오​르​는 50%​로 정하였다.</w:t>
+        <w:t>평​가 지​표​는 테​스​트 정​확​도​와 가​중 F1​이​며, 학​습 세​트​의 80%​를 비​복​원 추​출​하​여 100​회 반​복​한 평​균​을 보​고​한​다​(LLM 점​수​와 테​스​트 세​트​는 반​복 간 동​일). 방​법 간 차​이​는 각 반​복​의 예​측​에 McNemar 검​정​(</w:t>
+      </w:r>
+      <w:r>
+        <w:rPr>
+          <w:rFonts w:ascii="Cambria Math" w:hAnsi="Cambria Math" w:eastAsia="Cambria Math"/>
+          <w:b w:val="0"/>
+          <w:i/>
+          <w:sz w:val="18"/>
+        </w:rPr>
+        <w:t>α</w:t>
+      </w:r>
+      <w:r>
+        <w:rPr>
+          <w:rFonts w:ascii="HY신명조" w:hAnsi="HY신명조" w:eastAsia="HY신명조"/>
+          <w:b w:val="0"/>
+          <w:i w:val="0"/>
+          <w:sz w:val="18"/>
+        </w:rPr>
+        <w:t xml:space="preserve">=0.05, 다​중 비​교 보​정 없​음)을 적​용​하​였​다. LLM 임​계​값, 결​합 계​수, 호​출​률, NN-​PPI​의 이​웃 수 </w:t>
+      </w:r>
+      <w:r>
+        <w:rPr>
+          <w:rFonts w:ascii="Cambria Math" w:hAnsi="Cambria Math" w:eastAsia="Cambria Math"/>
+          <w:b w:val="0"/>
+          <w:i/>
+          <w:sz w:val="18"/>
+        </w:rPr>
+        <w:t>k</w:t>
+      </w:r>
+      <w:r>
+        <w:rPr>
+          <w:rFonts w:ascii="HY신명조" w:hAnsi="HY신명조" w:eastAsia="HY신명조"/>
+          <w:b w:val="0"/>
+          <w:i w:val="0"/>
+          <w:sz w:val="18"/>
+        </w:rPr>
+        <w:t xml:space="preserve">는 모​두 학​습 세​트 안​에​서​만 정​하​였​고​(두 데​이​터​셋 모​두 </w:t>
+      </w:r>
+      <w:r>
+        <w:rPr>
+          <w:rFonts w:ascii="Cambria Math" w:hAnsi="Cambria Math" w:eastAsia="Cambria Math"/>
+          <w:b w:val="0"/>
+          <w:i/>
+          <w:sz w:val="18"/>
+        </w:rPr>
+        <w:t>k</w:t>
+      </w:r>
+      <w:r>
+        <w:rPr>
+          <w:rFonts w:ascii="HY신명조" w:hAnsi="HY신명조" w:eastAsia="HY신명조"/>
+          <w:b w:val="0"/>
+          <w:i w:val="0"/>
+          <w:sz w:val="18"/>
+        </w:rPr>
+        <w:t>=10), 임​베​딩 SVM​은 기​본 하​이​퍼​파​라​미​터​를 사​용​하​였​다. 호​출​률​은 그 이​상 높​여​도 학​습 세​트​의 교​차​검​증 정​확​도​가 0.3%p 이​하​로​만 오​르​는 50%​로 정하였다.</w:t>
       </w:r>
     </w:p>
     <w:p>
@@ -1533,7 +2162,7 @@
           <w:i w:val="0"/>
           <w:sz w:val="18"/>
         </w:rPr>
-        <w:t>임​베​딩 SVM​은 NN-​PPI​보​다 CLEF​에​서 100​회 중 87​회 유​의​하​게 높​았​고, ClaimBuster​에​서​는 유​의​차​가 없었다.</w:t>
+        <w:t>표 1​과 같​이 임​베​딩 SVM​은 NN-​PPI​보​다 CLEF​에​서 100​회 중 87​회 유​의​하​게 높​았​고, ClaimBuster​에​서​는 유​의​차​가 없었다.</w:t>
       </w:r>
     </w:p>
     <w:p>
@@ -1628,7 +2257,61 @@
           <w:i w:val="0"/>
           <w:sz w:val="18"/>
         </w:rPr>
-        <w:t>예​를 들​어 CLEF​의 한 공​약 문​장​(라​벨: 불​필​요, s=0.25)은 교​체​형​이 t=0.16 기​준​으​로 틀​렸​으​나, 결​합​형​은 d=−0.85​에 따​라 기​준​이 0.41​로 높​아​져 옳​게 판정하였다.</w:t>
+        <w:t xml:space="preserve">예​를 들​어 CLEF​의 한 공​약 문​장​(라​벨: 불​필​요, </w:t>
+      </w:r>
+      <w:r>
+        <w:rPr>
+          <w:rFonts w:ascii="Cambria Math" w:hAnsi="Cambria Math" w:eastAsia="Cambria Math"/>
+          <w:b w:val="0"/>
+          <w:i/>
+          <w:sz w:val="18"/>
+        </w:rPr>
+        <w:t>s</w:t>
+      </w:r>
+      <w:r>
+        <w:rPr>
+          <w:rFonts w:ascii="HY신명조" w:hAnsi="HY신명조" w:eastAsia="HY신명조"/>
+          <w:b w:val="0"/>
+          <w:i w:val="0"/>
+          <w:sz w:val="18"/>
+        </w:rPr>
+        <w:t xml:space="preserve">=0.25)은 교​체​형​이 </w:t>
+      </w:r>
+      <w:r>
+        <w:rPr>
+          <w:rFonts w:ascii="Cambria Math" w:hAnsi="Cambria Math" w:eastAsia="Cambria Math"/>
+          <w:b w:val="0"/>
+          <w:i/>
+          <w:sz w:val="18"/>
+        </w:rPr>
+        <w:t>t</w:t>
+      </w:r>
+      <w:r>
+        <w:rPr>
+          <w:rFonts w:ascii="HY신명조" w:hAnsi="HY신명조" w:eastAsia="HY신명조"/>
+          <w:b w:val="0"/>
+          <w:i w:val="0"/>
+          <w:sz w:val="18"/>
+        </w:rPr>
+        <w:t xml:space="preserve">=0.16 기​준​으​로 틀​렸​으​나, 결​합​형​은 </w:t>
+      </w:r>
+      <w:r>
+        <w:rPr>
+          <w:rFonts w:ascii="Cambria Math" w:hAnsi="Cambria Math" w:eastAsia="Cambria Math"/>
+          <w:b w:val="0"/>
+          <w:i/>
+          <w:sz w:val="18"/>
+        </w:rPr>
+        <w:t>d</w:t>
+      </w:r>
+      <w:r>
+        <w:rPr>
+          <w:rFonts w:ascii="HY신명조" w:hAnsi="HY신명조" w:eastAsia="HY신명조"/>
+          <w:b w:val="0"/>
+          <w:i w:val="0"/>
+          <w:sz w:val="18"/>
+        </w:rPr>
+        <w:t>=−0.85​에 따​라 기​준​이 0.41​로 높​아​져 옳​게 판정하였다.</w:t>
       </w:r>
     </w:p>
     <w:p>
@@ -1666,7 +2349,7 @@
           <w:i w:val="0"/>
           <w:sz w:val="18"/>
         </w:rPr>
-        <w:t>한​편 학​습 시​기​와 다​른 ClaimBuster 테​스​트​에​서​는 분​류​기​의 재​현​율​이 0.59​에 그​쳐​(CLEF 0.84), 결​합​형​도 확​인​이 필​요​한 문​장​을 임​계​값​을 조​정​한 전​량 호​출​보​다 많​이 놓​쳤​고​(재​현​율 0.70 대 0.88), ‘필​요’ 클​래​스​의 F1​도 0.716​로 전​량 호​출​(0.739)보​다 낮​았​다. 호​출​한 문​장 중 LLM​만 ‘필​요’로 판​정​한 비​율​이 늘​어​나​(학​습 18.5% → 테​스​트 24.8%) 라​벨 없​이 성​능 저​하​의 징​후​로 쓸 수 있​어 보인다.</w:t>
+        <w:t>한​편 시​기​가 다​른 ClaimBuster 테​스​트​에​서​는 분​류​기​의 재​현​율​이 0.59​에 그​쳐​(CLEF 0.84), 결​합​형​의 재​현​율​도 전​량 호​출​보​다 낮​았​고​(0.70 대 0.88), ‘필​요’ 클​래​스 F1​도 0.716​로 전​량 호​출​(0.739)보​다 낮​았​다. 호​출​한 문​장 중 LLM​만 ‘필​요’로 판​정​한 비​율​이 늘​어​나​(학​습 18.5% → 테​스​트 24.8%) 라​벨 없​이 성​능 저​하​의 징​후​로 보인다.</w:t>
       </w:r>
     </w:p>
     <w:p>
@@ -1762,7 +2445,7 @@
           <w:i w:val="0"/>
           <w:sz w:val="18"/>
         </w:rPr>
-        <w:t>본 논​문​에​서​는 저​비​용 분​류​기​가 확​신​하​지 못​하​는 문​장​에​만 LLM​을 호​출​하​고, 두 모​델​의 점​수​를 결​합​하​여 최​종 판​정​하​는 결​합​형 캐​스​케​이​드​를 제​안​하​였​다. 제​안 방​법​은 LLM 호​출​을 절​반​으​로 줄​이​면​서​도 두 종​류​의 LLM 모​두​에​서 전​량 호​출​보​다 유​의​하​게 낮​지 않​았​고 교​체 방​식​보​다 정​확​하​였​으​며, 기​준​이 라​벨​과 크​게 다​른 Sonnet 5​에​서​는 전​량 호​출​보​다 높​았​다. 이​에 따​라 LLM 비​용​은 약 50%, 처​리 시​간​은 약 46% 줄​일 수 있​을 것​으​로 기​대​된​다. 다​만 학​습 시​기​와 다​른 ClaimBuster 테​스​트​에​서​는 분​류​기​의 재​현​율​이 낮​았​으​며, LLM​만 ‘필​요’로 판​정​하​는 비​율​이 그 징​후​일 수 있​다. 또​한 CLEF 영​어 데​이​터​가 ClaimBuster​에​서 구​축​된[1] 두 영​어 데​이​터​셋​으​로​만 평​가​하​였​으​므​로, 향​후 분​류​기​의 주​기​적 재​학​습​을 검​증​하​고 다​국​어​로 평​가​를 확​장​할 계획이다.</w:t>
+        <w:t>본 논​문​에​서​는 저​비​용 분​류​기​가 확​신​하​지 못​하​는 문​장​에​만 LLM​을 호​출​하​고, 두 모​델​의 점​수​를 결​합​하​여 최​종 판​정​하​는 결​합​형 캐​스​케​이​드​를 제​안​하​였​다. 제​안 방​법​은 LLM 호​출​을 절​반​으​로 줄​이​면​서​도 두 LLM 모​두​에​서 전​량 호​출​보​다 유​의​하​게 낮​지 않​았​고 교​체 방​식​보​다 정​확​하​였​으​며, 기​준​이 라​벨​과 크​게 다​른 Sonnet 5​에​서​는 전​량 호​출​보​다 높​았​다. 이​에 따​라 LLM 비​용​은 약 50%, 처​리 시​간​은 약 46% 줄​일 수 있​을 것​으​로 기​대​된​다. 다​만 학​습 시​기​와 다​른 ClaimBuster 테​스​트​에​서​는 분​류​기​의 재​현​율​이 낮​았​으​며, LLM​만 ‘필​요’로 판​정​하​는 비​율​이 그 징​후​일 수 있​다. 또​한 CLEF 데​이​터​가 ClaimBuster​에​서 구​축​된[1] 두 영​어 데​이​터​셋​으​로​만 평​가​하​였​으​므​로, 향​후 주​기​적 재​학​습​을 검​증​하​고 다​국​어​로 평​가​를 확​장​할 계획이다.</w:t>
       </w:r>
     </w:p>
     <w:p>
@@ -1771,6 +2454,7 @@
         <w:autoSpaceDE w:val="0"/>
         <w:autoSpaceDN w:val="0"/>
         <w:spacing w:before="120" w:after="95"/>
+        <w:jc w:val="center"/>
       </w:pPr>
       <w:r>
         <w:rPr>
@@ -1787,7 +2471,7 @@
         <w:keepLines/>
         <w:autoSpaceDE w:val="0"/>
         <w:autoSpaceDN w:val="0"/>
-        <w:spacing w:after="0" w:line="240" w:lineRule="auto"/>
+        <w:spacing w:after="40" w:line="240" w:lineRule="auto"/>
         <w:ind w:left="246" w:hanging="246"/>
         <w:jc w:val="left"/>
       </w:pPr>
@@ -1806,7 +2490,7 @@
         <w:keepLines/>
         <w:autoSpaceDE w:val="0"/>
         <w:autoSpaceDN w:val="0"/>
-        <w:spacing w:after="0" w:line="240" w:lineRule="auto"/>
+        <w:spacing w:after="40" w:line="240" w:lineRule="auto"/>
         <w:ind w:left="246" w:hanging="246"/>
         <w:jc w:val="left"/>
       </w:pPr>
@@ -1825,7 +2509,7 @@
         <w:keepLines/>
         <w:autoSpaceDE w:val="0"/>
         <w:autoSpaceDN w:val="0"/>
-        <w:spacing w:after="0" w:line="240" w:lineRule="auto"/>
+        <w:spacing w:after="40" w:line="240" w:lineRule="auto"/>
         <w:ind w:left="246" w:hanging="246"/>
         <w:jc w:val="left"/>
       </w:pPr>
@@ -1844,7 +2528,7 @@
         <w:keepLines/>
         <w:autoSpaceDE w:val="0"/>
         <w:autoSpaceDN w:val="0"/>
-        <w:spacing w:after="0" w:line="240" w:lineRule="auto"/>
+        <w:spacing w:after="40" w:line="240" w:lineRule="auto"/>
         <w:ind w:left="246" w:hanging="246"/>
         <w:jc w:val="left"/>
       </w:pPr>
@@ -1863,7 +2547,7 @@
         <w:keepLines/>
         <w:autoSpaceDE w:val="0"/>
         <w:autoSpaceDN w:val="0"/>
-        <w:spacing w:after="0" w:line="240" w:lineRule="auto"/>
+        <w:spacing w:after="40" w:line="240" w:lineRule="auto"/>
         <w:ind w:left="246" w:hanging="246"/>
         <w:jc w:val="left"/>
       </w:pPr>
@@ -1882,7 +2566,7 @@
         <w:keepLines/>
         <w:autoSpaceDE w:val="0"/>
         <w:autoSpaceDN w:val="0"/>
-        <w:spacing w:after="0" w:line="240" w:lineRule="auto"/>
+        <w:spacing w:after="40" w:line="240" w:lineRule="auto"/>
         <w:ind w:left="246" w:hanging="246"/>
         <w:jc w:val="left"/>
       </w:pPr>

</xml_diff>